<commit_message>
dist: rebuild stale CD1/CD2 docx artifacts; sync source_md snapshots
CD2 dist docx was 4 commits stale (missing Bảng 2.13, H4a/b/c split,
§heading fix, Kim et al. §3.3 addition). Now rebuilt to 776KB with figures.
CD1 dist docx was many commits stale (ICRV label fixes, Nepal 2025 data,
cohort count 17,107→15,313, P3/P4 labeling). Now rebuilt to 56KB.
CD1 submission final also rebuilt. Source_md snapshots synced:
- dist/chuyen_de_1/source_md/00_cd2_ctu_final_vi.md (Kim et al. §3.3)
- dist/luan_an/source_md/04_references_apa7.md (v2.9: 5 WB working papers)
- dist/manuscripts/en/source_md/p3_vietnam_en_clean.md (Agarwal+Barattieri §5)
- dist/manuscripts/en/source_md/p6_meta_manuscript_en.md (k=237, K=287)
- dist/manuscripts/en/source_md/p8_pacific_sids_en_clean.md (Mahler 2026b §1)

https://claude.ai/code/session_01GMFmEtt6FYiJ4MKzBNCLqb
</commit_message>
<xml_diff>
--- a/dist/chuyen_de_1/00_cd1_ctu_final_vi.docx
+++ b/dist/chuyen_de_1/00_cd1_ctu_final_vi.docx
@@ -21147,7 +21147,7 @@
     <w:bookmarkEnd w:id="89"/>
     <w:sectPr>
       <w:pgSz w:h="16838" w:w="11906"/>
-      <w:pgMar w:bottom="1134" w:left="1701" w:right="1134" w:top="1134"/>
+      <w:pgMar w:bottom="1417" w:left="1417" w:right="1417" w:top="1417"/>
     </w:sectPr>
   </w:body>
 </w:document>
@@ -21491,13 +21491,13 @@
     <w:name w:val="Normal"/>
     <w:qFormat/>
     <w:pPr>
-      <w:spacing w:line="360" w:lineRule="auto"/>
+      <w:spacing w:line="276" w:lineRule="auto"/>
       <w:jc w:val="both"/>
     </w:pPr>
     <w:rPr>
       <w:rFonts w:ascii="Times New Roman" w:eastAsia="Times New Roman" w:hAnsi="Times New Roman"/>
       <w:color w:val="000000"/>
-      <w:sz w:val="26"/>
+      <w:sz w:val="24"/>
     </w:rPr>
   </w:style>
   <w:style w:styleId="BodyText" w:type="paragraph">
@@ -21505,14 +21505,14 @@
     <w:basedOn w:val="Normal"/>
     <w:link w:val="BodyTextChar"/>
     <w:pPr>
-      <w:spacing w:after="180" w:before="180" w:line="360" w:lineRule="auto"/>
+      <w:spacing w:after="180" w:before="180" w:line="276" w:lineRule="auto"/>
       <w:jc w:val="both"/>
     </w:pPr>
     <w:qFormat/>
     <w:rPr>
       <w:rFonts w:ascii="Times New Roman" w:eastAsia="Times New Roman" w:hAnsi="Times New Roman"/>
       <w:color w:val="000000"/>
-      <w:sz w:val="26"/>
+      <w:sz w:val="24"/>
     </w:rPr>
   </w:style>
   <w:style w:customStyle="1" w:styleId="FirstParagraph" w:type="paragraph">
@@ -21521,13 +21521,13 @@
     <w:next w:val="BodyText"/>
     <w:qFormat/>
     <w:pPr>
-      <w:spacing w:line="360" w:lineRule="auto"/>
+      <w:spacing w:line="276" w:lineRule="auto"/>
       <w:jc w:val="both"/>
     </w:pPr>
     <w:rPr>
       <w:rFonts w:ascii="Times New Roman" w:eastAsia="Times New Roman" w:hAnsi="Times New Roman"/>
       <w:color w:val="000000"/>
-      <w:sz w:val="26"/>
+      <w:sz w:val="24"/>
     </w:rPr>
   </w:style>
   <w:style w:customStyle="1" w:styleId="Compact" w:type="paragraph">
@@ -21535,13 +21535,13 @@
     <w:basedOn w:val="BodyText"/>
     <w:qFormat/>
     <w:pPr>
-      <w:spacing w:after="36" w:before="36" w:line="360" w:lineRule="auto"/>
+      <w:spacing w:after="36" w:before="36" w:line="276" w:lineRule="auto"/>
       <w:jc w:val="both"/>
     </w:pPr>
     <w:rPr>
       <w:rFonts w:ascii="Times New Roman" w:eastAsia="Times New Roman" w:hAnsi="Times New Roman"/>
       <w:color w:val="000000"/>
-      <w:sz w:val="26"/>
+      <w:sz w:val="24"/>
     </w:rPr>
   </w:style>
   <w:style w:styleId="Title" w:type="paragraph">
@@ -21552,7 +21552,7 @@
     <w:pPr>
       <w:keepNext/>
       <w:keepLines/>
-      <w:spacing w:after="240" w:before="480" w:line="360" w:lineRule="auto"/>
+      <w:spacing w:after="240" w:before="480" w:line="276" w:lineRule="auto"/>
       <w:jc w:val="both"/>
     </w:pPr>
     <w:rPr>
@@ -21560,7 +21560,7 @@
       <w:b/>
       <w:bCs/>
       <w:color w:val="000000"/>
-      <w:sz w:val="26"/>
+      <w:sz w:val="24"/>
       <w:szCs w:val="36"/>
     </w:rPr>
   </w:style>
@@ -21572,13 +21572,13 @@
     <w:pPr>
       <w:keepNext/>
       <w:keepLines/>
-      <w:spacing w:after="240" w:before="240" w:line="360" w:lineRule="auto"/>
+      <w:spacing w:after="240" w:before="240" w:line="276" w:lineRule="auto"/>
       <w:jc w:val="both"/>
     </w:pPr>
     <w:rPr>
       <w:rFonts w:ascii="Times New Roman" w:eastAsia="Times New Roman" w:hAnsi="Times New Roman"/>
       <w:color w:val="000000"/>
-      <w:sz w:val="26"/>
+      <w:sz w:val="24"/>
       <w:szCs w:val="30"/>
     </w:rPr>
   </w:style>
@@ -21589,13 +21589,13 @@
     <w:pPr>
       <w:keepNext/>
       <w:keepLines/>
-      <w:spacing w:line="360" w:lineRule="auto"/>
+      <w:spacing w:line="276" w:lineRule="auto"/>
       <w:jc w:val="both"/>
     </w:pPr>
     <w:rPr>
       <w:rFonts w:ascii="Times New Roman" w:eastAsia="Times New Roman" w:hAnsi="Times New Roman"/>
       <w:color w:val="000000"/>
-      <w:sz w:val="26"/>
+      <w:sz w:val="24"/>
     </w:rPr>
   </w:style>
   <w:style w:styleId="Date" w:type="paragraph">
@@ -21605,13 +21605,13 @@
     <w:pPr>
       <w:keepNext/>
       <w:keepLines/>
-      <w:spacing w:line="360" w:lineRule="auto"/>
+      <w:spacing w:line="276" w:lineRule="auto"/>
       <w:jc w:val="both"/>
     </w:pPr>
     <w:rPr>
       <w:rFonts w:ascii="Times New Roman" w:eastAsia="Times New Roman" w:hAnsi="Times New Roman"/>
       <w:color w:val="000000"/>
-      <w:sz w:val="26"/>
+      <w:sz w:val="24"/>
     </w:rPr>
   </w:style>
   <w:style w:customStyle="1" w:styleId="AbstractTitle" w:type="paragraph">
@@ -21623,11 +21623,11 @@
       <w:keepNext/>
       <w:keepLines/>
       <w:jc w:val="both"/>
-      <w:spacing w:after="0" w:before="300" w:line="360" w:lineRule="auto"/>
+      <w:spacing w:after="0" w:before="300" w:line="276" w:lineRule="auto"/>
     </w:pPr>
     <w:rPr>
       <w:color w:val="000000"/>
-      <w:sz w:val="26"/>
+      <w:sz w:val="24"/>
       <w:szCs w:val="20"/>
       <w:rFonts w:ascii="Times New Roman" w:eastAsia="Times New Roman" w:hAnsi="Times New Roman"/>
       <w:b/>
@@ -21641,13 +21641,13 @@
     <w:pPr>
       <w:keepNext/>
       <w:keepLines/>
-      <w:spacing w:after="300" w:before="100" w:line="360" w:lineRule="auto"/>
+      <w:spacing w:after="300" w:before="100" w:line="276" w:lineRule="auto"/>
       <w:jc w:val="both"/>
     </w:pPr>
     <w:rPr>
       <w:rFonts w:ascii="Times New Roman" w:eastAsia="Times New Roman" w:hAnsi="Times New Roman"/>
       <w:color w:val="000000"/>
-      <w:sz w:val="26"/>
+      <w:sz w:val="24"/>
       <w:szCs w:val="20"/>
     </w:rPr>
   </w:style>
@@ -21657,13 +21657,13 @@
     <w:next w:val="Bibliography"/>
     <w:qFormat/>
     <w:pPr>
-      <w:spacing w:line="360" w:lineRule="auto"/>
+      <w:spacing w:line="276" w:lineRule="auto"/>
       <w:jc w:val="both"/>
     </w:pPr>
     <w:rPr>
       <w:rFonts w:ascii="Times New Roman" w:eastAsia="Times New Roman" w:hAnsi="Times New Roman"/>
       <w:color w:val="000000"/>
-      <w:sz w:val="26"/>
+      <w:sz w:val="24"/>
     </w:rPr>
   </w:style>
   <w:style w:styleId="Heading1" w:type="paragraph">
@@ -21675,7 +21675,7 @@
     <w:pPr>
       <w:keepNext/>
       <w:keepLines/>
-      <w:spacing w:after="0" w:before="480" w:line="360" w:lineRule="auto"/>
+      <w:spacing w:after="0" w:before="480" w:line="276" w:lineRule="auto"/>
       <w:jc w:val="both"/>
       <w:outlineLvl w:val="0"/>
     </w:pPr>
@@ -21684,7 +21684,7 @@
       <w:b/>
       <w:bCs/>
       <w:color w:val="000000"/>
-      <w:sz w:val="26"/>
+      <w:sz w:val="24"/>
       <w:szCs w:val="32"/>
     </w:rPr>
   </w:style>
@@ -21698,7 +21698,7 @@
     <w:pPr>
       <w:keepNext/>
       <w:keepLines/>
-      <w:spacing w:after="0" w:before="200" w:line="360" w:lineRule="auto"/>
+      <w:spacing w:after="0" w:before="200" w:line="276" w:lineRule="auto"/>
       <w:jc w:val="both"/>
       <w:outlineLvl w:val="1"/>
     </w:pPr>
@@ -21707,7 +21707,7 @@
       <w:b/>
       <w:bCs/>
       <w:color w:val="000000"/>
-      <w:sz w:val="26"/>
+      <w:sz w:val="24"/>
       <w:szCs w:val="28"/>
     </w:rPr>
   </w:style>
@@ -21721,7 +21721,7 @@
     <w:pPr>
       <w:keepNext/>
       <w:keepLines/>
-      <w:spacing w:after="0" w:before="200" w:line="360" w:lineRule="auto"/>
+      <w:spacing w:after="0" w:before="200" w:line="276" w:lineRule="auto"/>
       <w:jc w:val="both"/>
       <w:outlineLvl w:val="2"/>
     </w:pPr>
@@ -21730,7 +21730,7 @@
       <w:b/>
       <w:bCs/>
       <w:color w:val="000000"/>
-      <w:sz w:val="26"/>
+      <w:sz w:val="24"/>
       <w:szCs w:val="24"/>
     </w:rPr>
   </w:style>
@@ -21744,7 +21744,7 @@
     <w:pPr>
       <w:keepNext/>
       <w:keepLines/>
-      <w:spacing w:after="0" w:before="200" w:line="360" w:lineRule="auto"/>
+      <w:spacing w:after="0" w:before="200" w:line="276" w:lineRule="auto"/>
       <w:jc w:val="both"/>
       <w:outlineLvl w:val="3"/>
     </w:pPr>
@@ -21753,7 +21753,7 @@
       <w:i/>
       <w:bCs/>
       <w:color w:val="000000"/>
-      <w:sz w:val="26"/>
+      <w:sz w:val="24"/>
       <w:szCs w:val="24"/>
     </w:rPr>
   </w:style>
@@ -21767,7 +21767,7 @@
     <w:pPr>
       <w:keepNext/>
       <w:keepLines/>
-      <w:spacing w:after="0" w:before="200" w:line="360" w:lineRule="auto"/>
+      <w:spacing w:after="0" w:before="200" w:line="276" w:lineRule="auto"/>
       <w:jc w:val="both"/>
       <w:outlineLvl w:val="4"/>
     </w:pPr>
@@ -21775,7 +21775,7 @@
       <w:rFonts w:ascii="Times New Roman" w:asciiTheme="majorHAnsi" w:cstheme="majorBidi" w:eastAsia="Times New Roman" w:eastAsiaTheme="majorEastAsia" w:hAnsi="Times New Roman" w:hAnsiTheme="majorHAnsi"/>
       <w:iCs/>
       <w:color w:val="000000"/>
-      <w:sz w:val="26"/>
+      <w:sz w:val="24"/>
       <w:szCs w:val="24"/>
     </w:rPr>
   </w:style>
@@ -21789,14 +21789,14 @@
     <w:pPr>
       <w:keepNext/>
       <w:keepLines/>
-      <w:spacing w:after="0" w:before="200" w:line="360" w:lineRule="auto"/>
+      <w:spacing w:after="0" w:before="200" w:line="276" w:lineRule="auto"/>
       <w:jc w:val="both"/>
       <w:outlineLvl w:val="5"/>
     </w:pPr>
     <w:rPr>
       <w:rFonts w:ascii="Times New Roman" w:asciiTheme="majorHAnsi" w:cstheme="majorBidi" w:eastAsia="Times New Roman" w:eastAsiaTheme="majorEastAsia" w:hAnsi="Times New Roman" w:hAnsiTheme="majorHAnsi"/>
       <w:color w:val="000000"/>
-      <w:sz w:val="26"/>
+      <w:sz w:val="24"/>
       <w:szCs w:val="24"/>
     </w:rPr>
   </w:style>
@@ -21810,14 +21810,14 @@
     <w:pPr>
       <w:keepNext/>
       <w:keepLines/>
-      <w:spacing w:after="0" w:before="200" w:line="360" w:lineRule="auto"/>
+      <w:spacing w:after="0" w:before="200" w:line="276" w:lineRule="auto"/>
       <w:jc w:val="both"/>
       <w:outlineLvl w:val="6"/>
     </w:pPr>
     <w:rPr>
       <w:rFonts w:ascii="Times New Roman" w:asciiTheme="majorHAnsi" w:cstheme="majorBidi" w:eastAsia="Times New Roman" w:eastAsiaTheme="majorEastAsia" w:hAnsi="Times New Roman" w:hAnsiTheme="majorHAnsi"/>
       <w:color w:val="000000"/>
-      <w:sz w:val="26"/>
+      <w:sz w:val="24"/>
       <w:szCs w:val="24"/>
     </w:rPr>
   </w:style>
@@ -21831,14 +21831,14 @@
     <w:pPr>
       <w:keepNext/>
       <w:keepLines/>
-      <w:spacing w:after="0" w:before="200" w:line="360" w:lineRule="auto"/>
+      <w:spacing w:after="0" w:before="200" w:line="276" w:lineRule="auto"/>
       <w:jc w:val="both"/>
       <w:outlineLvl w:val="7"/>
     </w:pPr>
     <w:rPr>
       <w:rFonts w:ascii="Times New Roman" w:asciiTheme="majorHAnsi" w:cstheme="majorBidi" w:eastAsia="Times New Roman" w:eastAsiaTheme="majorEastAsia" w:hAnsi="Times New Roman" w:hAnsiTheme="majorHAnsi"/>
       <w:color w:val="000000"/>
-      <w:sz w:val="26"/>
+      <w:sz w:val="24"/>
       <w:szCs w:val="24"/>
     </w:rPr>
   </w:style>
@@ -21852,14 +21852,14 @@
     <w:pPr>
       <w:keepNext/>
       <w:keepLines/>
-      <w:spacing w:after="0" w:before="200" w:line="360" w:lineRule="auto"/>
+      <w:spacing w:after="0" w:before="200" w:line="276" w:lineRule="auto"/>
       <w:jc w:val="both"/>
       <w:outlineLvl w:val="8"/>
     </w:pPr>
     <w:rPr>
       <w:rFonts w:ascii="Times New Roman" w:asciiTheme="majorHAnsi" w:cstheme="majorBidi" w:eastAsia="Times New Roman" w:eastAsiaTheme="majorEastAsia" w:hAnsi="Times New Roman" w:hAnsiTheme="majorHAnsi"/>
       <w:color w:val="000000"/>
-      <w:sz w:val="26"/>
+      <w:sz w:val="24"/>
       <w:szCs w:val="24"/>
     </w:rPr>
   </w:style>
@@ -21871,14 +21871,14 @@
     <w:unhideWhenUsed/>
     <w:qFormat/>
     <w:pPr>
-      <w:spacing w:after="100" w:before="100" w:line="360" w:lineRule="auto"/>
+      <w:spacing w:after="100" w:before="100" w:line="276" w:lineRule="auto"/>
       <w:ind w:firstLine="0" w:left="480" w:right="480"/>
       <w:jc w:val="both"/>
     </w:pPr>
     <w:rPr>
       <w:rFonts w:ascii="Times New Roman" w:eastAsia="Times New Roman" w:hAnsi="Times New Roman"/>
       <w:color w:val="000000"/>
-      <w:sz w:val="26"/>
+      <w:sz w:val="24"/>
     </w:rPr>
   </w:style>
   <w:style w:styleId="FootnoteText" w:type="paragraph">
@@ -21889,13 +21889,13 @@
     <w:unhideWhenUsed/>
     <w:qFormat/>
     <w:pPr>
-      <w:spacing w:line="360" w:lineRule="auto"/>
+      <w:spacing w:line="276" w:lineRule="auto"/>
       <w:jc w:val="both"/>
     </w:pPr>
     <w:rPr>
       <w:rFonts w:ascii="Times New Roman" w:eastAsia="Times New Roman" w:hAnsi="Times New Roman"/>
       <w:color w:val="000000"/>
-      <w:sz w:val="26"/>
+      <w:sz w:val="24"/>
     </w:rPr>
   </w:style>
   <w:style w:default="1" w:styleId="DefaultParagraphFont" w:type="character">
@@ -21905,7 +21905,7 @@
     <w:rPr>
       <w:rFonts w:ascii="Times New Roman" w:eastAsia="Times New Roman" w:hAnsi="Times New Roman"/>
       <w:color w:val="000000"/>
-      <w:sz w:val="26"/>
+      <w:sz w:val="24"/>
     </w:rPr>
   </w:style>
   <w:style w:default="1" w:styleId="Table" w:type="table">
@@ -21915,13 +21915,13 @@
     <w:unhideWhenUsed/>
     <w:qFormat/>
     <w:pPr>
-      <w:spacing w:line="360" w:lineRule="auto"/>
+      <w:spacing w:line="276" w:lineRule="auto"/>
       <w:jc w:val="both"/>
     </w:pPr>
     <w:rPr>
       <w:rFonts w:ascii="Times New Roman" w:eastAsia="Times New Roman" w:hAnsi="Times New Roman"/>
       <w:color w:val="000000"/>
-      <w:sz w:val="26"/>
+      <w:sz w:val="24"/>
     </w:rPr>
     <w:tblPr>
       <w:tblInd w:type="dxa" w:w="0"/>
@@ -21955,27 +21955,27 @@
     <w:pPr>
       <w:keepNext/>
       <w:keepLines/>
-      <w:spacing w:after="0" w:line="360" w:lineRule="auto"/>
+      <w:spacing w:after="0" w:line="276" w:lineRule="auto"/>
       <w:jc w:val="both"/>
     </w:pPr>
     <w:rPr>
       <w:rFonts w:ascii="Times New Roman" w:eastAsia="Times New Roman" w:hAnsi="Times New Roman"/>
       <w:b/>
       <w:color w:val="000000"/>
-      <w:sz w:val="26"/>
+      <w:sz w:val="24"/>
     </w:rPr>
   </w:style>
   <w:style w:customStyle="1" w:styleId="Definition" w:type="paragraph">
     <w:name w:val="Definition"/>
     <w:basedOn w:val="Normal"/>
     <w:pPr>
-      <w:spacing w:line="360" w:lineRule="auto"/>
+      <w:spacing w:line="276" w:lineRule="auto"/>
       <w:jc w:val="both"/>
     </w:pPr>
     <w:rPr>
       <w:rFonts w:ascii="Times New Roman" w:eastAsia="Times New Roman" w:hAnsi="Times New Roman"/>
       <w:color w:val="000000"/>
-      <w:sz w:val="26"/>
+      <w:sz w:val="24"/>
     </w:rPr>
   </w:style>
   <w:style w:styleId="Caption" w:type="paragraph">
@@ -21983,14 +21983,14 @@
     <w:basedOn w:val="Normal"/>
     <w:link w:val="BodyTextChar"/>
     <w:pPr>
-      <w:spacing w:after="120" w:before="0" w:line="360" w:lineRule="auto"/>
+      <w:spacing w:after="120" w:before="0" w:line="276" w:lineRule="auto"/>
       <w:jc w:val="both"/>
     </w:pPr>
     <w:rPr>
       <w:rFonts w:ascii="Times New Roman" w:eastAsia="Times New Roman" w:hAnsi="Times New Roman"/>
       <w:i/>
       <w:color w:val="000000"/>
-      <w:sz w:val="26"/>
+      <w:sz w:val="24"/>
     </w:rPr>
   </w:style>
   <w:style w:customStyle="1" w:styleId="TableCaption" w:type="paragraph">
@@ -21998,39 +21998,39 @@
     <w:basedOn w:val="Caption"/>
     <w:pPr>
       <w:keepNext/>
-      <w:spacing w:line="360" w:lineRule="auto"/>
+      <w:spacing w:line="276" w:lineRule="auto"/>
       <w:jc w:val="both"/>
     </w:pPr>
     <w:rPr>
       <w:rFonts w:ascii="Times New Roman" w:eastAsia="Times New Roman" w:hAnsi="Times New Roman"/>
       <w:color w:val="000000"/>
-      <w:sz w:val="26"/>
+      <w:sz w:val="24"/>
     </w:rPr>
   </w:style>
   <w:style w:customStyle="1" w:styleId="ImageCaption" w:type="paragraph">
     <w:name w:val="Image Caption"/>
     <w:basedOn w:val="Caption"/>
     <w:pPr>
-      <w:spacing w:line="360" w:lineRule="auto"/>
+      <w:spacing w:line="276" w:lineRule="auto"/>
       <w:jc w:val="both"/>
     </w:pPr>
     <w:rPr>
       <w:rFonts w:ascii="Times New Roman" w:eastAsia="Times New Roman" w:hAnsi="Times New Roman"/>
       <w:color w:val="000000"/>
-      <w:sz w:val="26"/>
+      <w:sz w:val="24"/>
     </w:rPr>
   </w:style>
   <w:style w:customStyle="1" w:styleId="Figure" w:type="paragraph">
     <w:name w:val="Figure"/>
     <w:basedOn w:val="Normal"/>
     <w:pPr>
-      <w:spacing w:line="360" w:lineRule="auto"/>
+      <w:spacing w:line="276" w:lineRule="auto"/>
       <w:jc w:val="both"/>
     </w:pPr>
     <w:rPr>
       <w:rFonts w:ascii="Times New Roman" w:eastAsia="Times New Roman" w:hAnsi="Times New Roman"/>
       <w:color w:val="000000"/>
-      <w:sz w:val="26"/>
+      <w:sz w:val="24"/>
     </w:rPr>
   </w:style>
   <w:style w:customStyle="1" w:styleId="CaptionedFigure" w:type="paragraph">
@@ -22038,13 +22038,13 @@
     <w:basedOn w:val="Figure"/>
     <w:pPr>
       <w:keepNext/>
-      <w:spacing w:line="360" w:lineRule="auto"/>
+      <w:spacing w:line="276" w:lineRule="auto"/>
       <w:jc w:val="both"/>
     </w:pPr>
     <w:rPr>
       <w:rFonts w:ascii="Times New Roman" w:eastAsia="Times New Roman" w:hAnsi="Times New Roman"/>
       <w:color w:val="000000"/>
-      <w:sz w:val="26"/>
+      <w:sz w:val="24"/>
     </w:rPr>
   </w:style>
   <w:style w:customStyle="1" w:styleId="BodyTextChar" w:type="character">
@@ -22054,7 +22054,7 @@
     <w:rPr>
       <w:rFonts w:ascii="Times New Roman" w:eastAsia="Times New Roman" w:hAnsi="Times New Roman"/>
       <w:color w:val="000000"/>
-      <w:sz w:val="26"/>
+      <w:sz w:val="24"/>
     </w:rPr>
   </w:style>
   <w:style w:customStyle="1" w:styleId="VerbatimChar" w:type="character">
@@ -22063,7 +22063,7 @@
     <w:rPr>
       <w:rFonts w:ascii="Times New Roman" w:eastAsia="Times New Roman" w:hAnsi="Times New Roman"/>
       <w:color w:val="000000"/>
-      <w:sz w:val="26"/>
+      <w:sz w:val="24"/>
     </w:rPr>
   </w:style>
   <w:style w:customStyle="1" w:styleId="SectionNumber" w:type="character">
@@ -22072,7 +22072,7 @@
     <w:rPr>
       <w:rFonts w:ascii="Times New Roman" w:eastAsia="Times New Roman" w:hAnsi="Times New Roman"/>
       <w:color w:val="000000"/>
-      <w:sz w:val="26"/>
+      <w:sz w:val="24"/>
     </w:rPr>
   </w:style>
   <w:style w:styleId="FootnoteReference" w:type="character">
@@ -22081,7 +22081,7 @@
     <w:rPr>
       <w:rFonts w:ascii="Times New Roman" w:eastAsia="Times New Roman" w:hAnsi="Times New Roman"/>
       <w:color w:val="000000"/>
-      <w:sz w:val="26"/>
+      <w:sz w:val="24"/>
       <w:vertAlign w:val="superscript"/>
     </w:rPr>
   </w:style>
@@ -22091,7 +22091,7 @@
     <w:rPr>
       <w:rFonts w:ascii="Times New Roman" w:eastAsia="Times New Roman" w:hAnsi="Times New Roman"/>
       <w:color w:val="000000"/>
-      <w:sz w:val="26"/>
+      <w:sz w:val="24"/>
     </w:rPr>
   </w:style>
   <w:style w:styleId="TOCHeading" w:type="paragraph">
@@ -22102,7 +22102,7 @@
     <w:unhideWhenUsed/>
     <w:qFormat/>
     <w:pPr>
-      <w:spacing w:before="240" w:line="360" w:lineRule="auto"/>
+      <w:spacing w:before="240" w:line="276" w:lineRule="auto"/>
       <w:jc w:val="both"/>
       <w:outlineLvl w:val="9"/>
     </w:pPr>
@@ -22111,7 +22111,7 @@
       <w:b w:val="0"/>
       <w:bCs w:val="0"/>
       <w:color w:val="000000"/>
-      <w:sz w:val="26"/>
+      <w:sz w:val="24"/>
     </w:rPr>
   </w:style>
   <w:style w:type="paragraph" w:customStyle="1" w:styleId="SourceCode">

</xml_diff>

<commit_message>
build(dist): regenerate dossier DOCX from corrected sources (P4 82%, k=259 et al.)
Ran build_ctu_docx.sh --no-templates + rebuilt CD1/CD2 main DOCX. Propagates all
source corrections into dist/ artifacts: P4 turning point 82%, P7 M10 coefs +
49 economies, thesis k=259/SIDS=9/Singapore N, CD1 FSTS=d3c/100, CD2 decimals.
Regenerated: dist/manuscripts/en (p3-p8), dist/manuscripts/vi (p3-p5),
dist/luan_an + luan_an_ctu (5 chapters), dist/chuyen_de_1 (CD1/CD2 + parts).

Note: chapter-figure embeds show pandoc resource warnings (figures live in
thesis/figures/; build runs from repo root) — pre-existing build-path quirk,
text content is correct. dist/submission/ is gitignored.

https://claude.ai/code/session_01GMFmEtt6FYiJ4MKzBNCLqb
</commit_message>
<xml_diff>
--- a/dist/chuyen_de_1/00_cd1_ctu_final_vi.docx
+++ b/dist/chuyen_de_1/00_cd1_ctu_final_vi.docx
@@ -2163,19 +2163,19 @@
               <w:jc w:val="left"/>
             </w:pPr>
             <w:r>
-              <w:t xml:space="preserve">Context-Contingent Digital Capability Model</w:t>
-            </w:r>
-          </w:p>
-        </w:tc>
-        <w:tc>
-          <w:tcPr/>
-          <w:p>
-            <w:pPr>
-              <w:pStyle w:val="Compact"/>
-              <w:jc w:val="left"/>
-            </w:pPr>
-            <w:r>
-              <w:t xml:space="preserve">Mô hình năng lực số phụ thuộc bối cảnh</w:t>
+              <w:t xml:space="preserve">Context-Contingent Digital-and-Capability Model</w:t>
+            </w:r>
+          </w:p>
+        </w:tc>
+        <w:tc>
+          <w:tcPr/>
+          <w:p>
+            <w:pPr>
+              <w:pStyle w:val="Compact"/>
+              <w:jc w:val="left"/>
+            </w:pPr>
+            <w:r>
+              <w:t xml:space="preserve">Mô hình Áp dụng số và Năng lực phụ thuộc bối cảnh</w:t>
             </w:r>
           </w:p>
         </w:tc>
@@ -4768,7 +4768,7 @@
           <w:bCs/>
           <w:b/>
         </w:rPr>
-        <w:t xml:space="preserve">Biến FSTS (Foreign Trade Sales to Total Sales)</w:t>
+        <w:t xml:space="preserve">Biến FSTS (Foreign Sales to Total Sales)</w:t>
       </w:r>
       <w:r>
         <w:t xml:space="preserve">:</w:t>
@@ -4780,10 +4780,10 @@
         <w:rPr>
           <w:rStyle w:val="VerbatimChar"/>
         </w:rPr>
-        <w:t xml:space="preserve">FSTS = (d3b + d3c) / 100</w:t>
-      </w:r>
-      <w:r>
-        <w:t xml:space="preserve">, trong đó d3b là tỷ lệ doanh thu xuất khẩu trực tiếp và d3c là tỷ lệ doanh thu xuất khẩu gián tiếp. Quan sát thiếu FSTS được gán bằng 0 nếu doanh nghiệp không xuất khẩu (d3a = "Không"); gán missing nếu không trả lời.</w:t>
+        <w:t xml:space="preserve">FSTS = d3c / 100</w:t>
+      </w:r>
+      <w:r>
+        <w:t xml:space="preserve">, trong đó d3c là tỷ lệ doanh thu xuất khẩu trực tiếp trên tổng doanh thu (nhất quán với định nghĩa trong CĐ2 và các bản thảo P3–P5/P7/P8). Quan sát thiếu FSTS được gán bằng 0 nếu doanh nghiệp không xuất khẩu (d3a = "Không"); gán missing nếu không trả lời.</w:t>
       </w:r>
     </w:p>
     <w:p>
@@ -4894,7 +4894,7 @@
         <w:t xml:space="preserve"> </w:t>
       </w:r>
       <w:r>
-        <w:t xml:space="preserve">(Aguinis et al., 2019): chuyên đề trình bày rõ (i) định nghĩa tổng thể (47 nền kinh tế châu Á và Thái Bình Dương, phân tách 41 và 7); (ii) quy trình lấy mẫu (lấy mẫu chính thức WBES); (iii) lý giải quy mô mẫu (pool 101.185); (iv) xử lý giá trị thiếu (FSTS = d3b + d3c, winsorize 1/99); (v) xây dựng biến; (vi) độ tin cậy và giá trị (TCI đa thành phần; DAI đơn thành phần Spec 1, đa thành phần Spec 2); (vii) phương pháp ước lượng (mô tả trong CĐ1; OLS và biến công cụ trong CĐ2); (viii) khoa học mở.</w:t>
+        <w:t xml:space="preserve">(Aguinis et al., 2019): chuyên đề trình bày rõ (i) định nghĩa tổng thể (47 nền kinh tế châu Á và Thái Bình Dương, phân tách 41 và 7); (ii) quy trình lấy mẫu (lấy mẫu chính thức WBES); (iii) lý giải quy mô mẫu (pool 101.185); (iv) xử lý giá trị thiếu (FSTS = d3c/100, winsorize 1/99); (v) xây dựng biến; (vi) độ tin cậy và giá trị (TCI đa thành phần; DAI đơn thành phần Spec 1, đa thành phần Spec 2); (vii) phương pháp ước lượng (mô tả trong CĐ1; OLS và biến công cụ trong CĐ2); (viii) khoa học mở.</w:t>
       </w:r>
     </w:p>
     <w:p>
@@ -7577,7 +7577,7 @@
               <w:jc w:val="left"/>
             </w:pPr>
             <w:r>
-              <w:t xml:space="preserve">U ngược; điểm uốn ~47% (CHN Đỗ &amp; Phan, 2026)</w:t>
+              <w:t xml:space="preserve">U ngược; điểm uốn ~47%</w:t>
             </w:r>
           </w:p>
         </w:tc>
@@ -12186,7 +12186,7 @@
           <w:iCs/>
           <w:i/>
         </w:rPr>
-        <w:t xml:space="preserve">Khung phân loại 9 ngành ISIC Rev. 4 (bao gồm cột Dynamism profile theo Kafouros et al., 2023).</w:t>
+        <w:t xml:space="preserve">Khung phân loại 9 ngành ISIC Rev. 4, bao gồm cột Dynamism profile per Kafouros et al. (2023).</w:t>
       </w:r>
     </w:p>
     <w:tbl>
@@ -15599,7 +15599,7 @@
         <w:t xml:space="preserve"> </w:t>
       </w:r>
       <w:r>
-        <w:t xml:space="preserve">của nhóm Advanced đổi mới sáng tạo dẫn dắt. Theo nghiên cứu Singapore (Mar, Đỗ &amp; Phan, 2026 — MIR under review): R² hiệu chỉnh = 0,196; tương tác FSTS² × DAI = 3,119 (p=0,005); điểm uốn ~88,6%.</w:t>
+        <w:t xml:space="preserve">của nhóm Advanced đổi mới sáng tạo dẫn dắt. Theo nghiên cứu Singapore (Mar, Đỗ &amp; Phan, 2026 — MIR under review): R² hiệu chỉnh = 0,196; tương tác FSTS² × DAI = 3,119 (p=0,005); điểm uốn ~82%.</w:t>
       </w:r>
     </w:p>
     <w:p>
@@ -16195,7 +16195,7 @@
         <w:pStyle w:val="FirstParagraph"/>
       </w:pPr>
       <w:r>
-        <w:t xml:space="preserve">FSTS 10,9% → 8,8%; FDI ≥10% chiếm 6,0%. Quan hệ FSTS – năng suất là hàm bậc ba với điểm uốn ~47,8% (Đỗ &amp; Phan, 2026 — JFAR).</w:t>
+        <w:t xml:space="preserve">FSTS 10,9% → 8,8%; FDI ≥10% chiếm 6,0%. Quan hệ FSTS – năng suất có dạng hàm bậc hai (U ngược) với điểm uốn ~47,5% (Đỗ &amp; Phan, 2026 — JFAR).</w:t>
       </w:r>
       <w:r>
         <w:t xml:space="preserve"> </w:t>
@@ -18234,7 +18234,7 @@
         <w:pStyle w:val="BodyText"/>
       </w:pPr>
       <w:r>
-        <w:t xml:space="preserve">Bốn quan sát: (a) EAP paradox — quản lý dẫn đầu toàn cầu nhưng ownership ceiling thấp hơn management ceiling 7,7 điểm; (b) MENA bottleneck — rào cản thể chế kép trong bối cảnh nhà nước tô (Beblawi, 1987); (c) 43/50 nền kinh tế có tỷ lệ nữ trong nhóm quản trị cấp cao cao hơn nữ sở hữu đa số; (d) hàm ý cho Chuyên đề 2: tương tác giới tính × FSTS dương tại Emerging (kênh quan hệ, Hambrick &amp; Mason, 1984) nhưng không có ý nghĩa thống kê tại Advanced.</w:t>
+        <w:t xml:space="preserve">Bốn quan sát: (a) EAP paradox — quản lý dẫn đầu toàn cầu nhưng ownership ceiling thấp hơn management ceiling 7,7 điểm; (b) MENA bottleneck — rào cản thể chế kép trong bối cảnh nhà nước tô (Beblawi, 1987); (c) 43/50 nền kinh tế có tỷ lệ nữ trong nhóm quản trị cấp cao cao hơn nữ sở hữu đa số; (d) hàm ý cho Chuyên đề 2: tương tác giới tính × FSTS dương tại Emerging qua kênh quan hệ (Hambrick &amp; Mason, 1984) nhưng không có ý nghĩa thống kê tại Advanced.</w:t>
       </w:r>
     </w:p>
     <w:bookmarkEnd w:id="73"/>
@@ -18890,7 +18890,7 @@
         <w:t xml:space="preserve">KL1 — Phi tuyến xuyên chế độ thể chế là quy luật</w:t>
       </w:r>
       <w:r>
-        <w:t xml:space="preserve">: U ngược tại Emerging (Việt Nam điểm uốn 39–46%; Trung Quốc điểm uốn 47–49%); gần tuyến tính tại Advanced (Singapore điểm uốn 88,6%); chi phí buộc phải tại SIDS.</w:t>
+        <w:t xml:space="preserve">: U ngược tại Emerging (Việt Nam điểm uốn 39–46%; Trung Quốc điểm uốn 47–49%); gần tuyến tính tại Advanced (Singapore điểm uốn 82%); chi phí buộc phải tại SIDS.</w:t>
       </w:r>
     </w:p>
     <w:p>
@@ -19074,7 +19074,7 @@
         <w:t xml:space="preserve">(4) Tái định vị chuỗi giá trị toàn cầu: lắp ráp downstream → thiết kế và R&amp;D mid-stream</w:t>
       </w:r>
       <w:r>
-        <w:t xml:space="preserve">: Việt Nam ở điểm uốn (39–46%). Trung Quốc R&amp;D 39,4% và điểm uốn cao hơn (47–49%) cho thấy: TCI cao → điểm uốn cao → chịu đựng được mức độ quốc tế hóa cao hơn.</w:t>
+        <w:t xml:space="preserve">: Việt Nam ở điểm uốn (39–46%). Trung Quốc R&amp;D 39,4% và điểm uốn cao hơn (47–49%) cho thấy: Sự chênh lệch điểm uốn giữa Trung Quốc (TP ~47–49%, Nhóm III) và Việt Nam (TP ~39–46%, Nhóm IV) phản ánh gradient ICRV, không phải gradient TCI. TCI nâng mặt bằng năng suất ở mọi mức FSTS (hiệu ứng level-shift) nhưng không trực tiếp quyết định vị trí điểm uốn — phân biệt hai cơ chế này là quan trọng cho hàm ý chính sách.</w:t>
       </w:r>
     </w:p>
     <w:p>
@@ -19500,7 +19500,7 @@
         <w:pStyle w:val="BodyText"/>
       </w:pPr>
       <w:r>
-        <w:t xml:space="preserve">Bausch, A., &amp; Krist, M. (2007). The effect of context-related moderators on the internationalization–performance relationship: Evidence from meta-analysis.</w:t>
+        <w:t xml:space="preserve">Banalieva, E. R., &amp; Dhanaraj, C. (2019). Internalization theory for the digital economy.</w:t>
       </w:r>
       <w:r>
         <w:t xml:space="preserve"> </w:t>
@@ -19510,10 +19510,10 @@
           <w:iCs/>
           <w:i/>
         </w:rPr>
-        <w:t xml:space="preserve">Management International Review, 47</w:t>
-      </w:r>
-      <w:r>
-        <w:t xml:space="preserve">(3), 319–347.</w:t>
+        <w:t xml:space="preserve">Journal of International Business Studies, 50</w:t>
+      </w:r>
+      <w:r>
+        <w:t xml:space="preserve">(8), 1372–1387.</w:t>
       </w:r>
     </w:p>
     <w:p>
@@ -19521,7 +19521,7 @@
         <w:pStyle w:val="BodyText"/>
       </w:pPr>
       <w:r>
-        <w:t xml:space="preserve">Beblawi, H. (1987). The rentier state in the Arab world. In H. Beblawi &amp; G. Luciani (Eds.),</w:t>
+        <w:t xml:space="preserve">Bausch, A., &amp; Krist, M. (2007). The effect of context-related moderators on the internationalization–performance relationship: Evidence from meta-analysis.</w:t>
       </w:r>
       <w:r>
         <w:t xml:space="preserve"> </w:t>
@@ -19531,13 +19531,10 @@
           <w:iCs/>
           <w:i/>
         </w:rPr>
-        <w:t xml:space="preserve">The rentier state</w:t>
-      </w:r>
-      <w:r>
-        <w:t xml:space="preserve"> </w:t>
-      </w:r>
-      <w:r>
-        <w:t xml:space="preserve">(pp. 49–62). Croom Helm.</w:t>
+        <w:t xml:space="preserve">Management International Review, 47</w:t>
+      </w:r>
+      <w:r>
+        <w:t xml:space="preserve">(3), 319–347.</w:t>
       </w:r>
     </w:p>
     <w:p>
@@ -19545,7 +19542,7 @@
         <w:pStyle w:val="BodyText"/>
       </w:pPr>
       <w:r>
-        <w:t xml:space="preserve">Bertram, G. (2006). Introduction: The MIRAB model in the twenty-first century.</w:t>
+        <w:t xml:space="preserve">Beblawi, H. (1987). The rentier state in the Arab world. In H. Beblawi &amp; G. Luciani (Eds.),</w:t>
       </w:r>
       <w:r>
         <w:t xml:space="preserve"> </w:t>
@@ -19555,10 +19552,13 @@
           <w:iCs/>
           <w:i/>
         </w:rPr>
-        <w:t xml:space="preserve">Asia Pacific Viewpoint, 47</w:t>
-      </w:r>
-      <w:r>
-        <w:t xml:space="preserve">(1), 1–13.</w:t>
+        <w:t xml:space="preserve">The rentier state</w:t>
+      </w:r>
+      <w:r>
+        <w:t xml:space="preserve"> </w:t>
+      </w:r>
+      <w:r>
+        <w:t xml:space="preserve">(pp. 49–62). Croom Helm.</w:t>
       </w:r>
     </w:p>
     <w:p>
@@ -19566,7 +19566,7 @@
         <w:pStyle w:val="BodyText"/>
       </w:pPr>
       <w:r>
-        <w:t xml:space="preserve">Briguglio, L. (1995). Small island developing states and their economic vulnerabilities.</w:t>
+        <w:t xml:space="preserve">Bertram, G. (2006). Introduction: The MIRAB model in the twenty-first century.</w:t>
       </w:r>
       <w:r>
         <w:t xml:space="preserve"> </w:t>
@@ -19576,10 +19576,10 @@
           <w:iCs/>
           <w:i/>
         </w:rPr>
-        <w:t xml:space="preserve">World Development, 23</w:t>
-      </w:r>
-      <w:r>
-        <w:t xml:space="preserve">(9), 1615–1632.</w:t>
+        <w:t xml:space="preserve">Asia Pacific Viewpoint, 47</w:t>
+      </w:r>
+      <w:r>
+        <w:t xml:space="preserve">(1), 1–13.</w:t>
       </w:r>
     </w:p>
     <w:p>
@@ -19587,7 +19587,7 @@
         <w:pStyle w:val="BodyText"/>
       </w:pPr>
       <w:r>
-        <w:t xml:space="preserve">Brynjolfsson, E., &amp; McAfee, A. (2014).</w:t>
+        <w:t xml:space="preserve">Briguglio, L. (1995). Small island developing states and their economic vulnerabilities.</w:t>
       </w:r>
       <w:r>
         <w:t xml:space="preserve"> </w:t>
@@ -19597,10 +19597,10 @@
           <w:iCs/>
           <w:i/>
         </w:rPr>
-        <w:t xml:space="preserve">The second machine age: Work, progress, and prosperity in a time of brilliant technologies</w:t>
-      </w:r>
-      <w:r>
-        <w:t xml:space="preserve">. W. W. Norton &amp; Company.</w:t>
+        <w:t xml:space="preserve">World Development, 23</w:t>
+      </w:r>
+      <w:r>
+        <w:t xml:space="preserve">(9), 1615–1632.</w:t>
       </w:r>
     </w:p>
     <w:p>
@@ -19608,7 +19608,7 @@
         <w:pStyle w:val="BodyText"/>
       </w:pPr>
       <w:r>
-        <w:t xml:space="preserve">Cohen, W. M., &amp; Levinthal, D. A. (1990). Absorptive capacity: A new perspective on learning and innovation.</w:t>
+        <w:t xml:space="preserve">Brynjolfsson, E., &amp; McAfee, A. (2014).</w:t>
       </w:r>
       <w:r>
         <w:t xml:space="preserve"> </w:t>
@@ -19618,10 +19618,10 @@
           <w:iCs/>
           <w:i/>
         </w:rPr>
-        <w:t xml:space="preserve">Administrative Science Quarterly, 35</w:t>
-      </w:r>
-      <w:r>
-        <w:t xml:space="preserve">(1), 128–152.</w:t>
+        <w:t xml:space="preserve">The second machine age: Work, progress, and prosperity in a time of brilliant technologies</w:t>
+      </w:r>
+      <w:r>
+        <w:t xml:space="preserve">. W. W. Norton &amp; Company.</w:t>
       </w:r>
     </w:p>
     <w:p>
@@ -19629,7 +19629,7 @@
         <w:pStyle w:val="BodyText"/>
       </w:pPr>
       <w:r>
-        <w:t xml:space="preserve">Contractor, F. J., Kundu, S. K., &amp; Hsu, C. C. (2003). A three-stage theory of international expansion.</w:t>
+        <w:t xml:space="preserve">Cohen, W. M., &amp; Levinthal, D. A. (1990). Absorptive capacity: A new perspective on learning and innovation.</w:t>
       </w:r>
       <w:r>
         <w:t xml:space="preserve"> </w:t>
@@ -19639,10 +19639,10 @@
           <w:iCs/>
           <w:i/>
         </w:rPr>
-        <w:t xml:space="preserve">Journal of International Business Studies, 34</w:t>
-      </w:r>
-      <w:r>
-        <w:t xml:space="preserve">(1), 5–18.</w:t>
+        <w:t xml:space="preserve">Administrative Science Quarterly, 35</w:t>
+      </w:r>
+      <w:r>
+        <w:t xml:space="preserve">(1), 128–152.</w:t>
       </w:r>
     </w:p>
     <w:p>
@@ -19650,7 +19650,7 @@
         <w:pStyle w:val="BodyText"/>
       </w:pPr>
       <w:r>
-        <w:t xml:space="preserve">Cusolito, A. P., &amp; Maloney, W. F. (2018).</w:t>
+        <w:t xml:space="preserve">Contractor, F. J., Kundu, S. K., &amp; Hsu, C. C. (2003). A three-stage theory of international expansion.</w:t>
       </w:r>
       <w:r>
         <w:t xml:space="preserve"> </w:t>
@@ -19660,10 +19660,10 @@
           <w:iCs/>
           <w:i/>
         </w:rPr>
-        <w:t xml:space="preserve">Productivity revisited: Shifting paradigms in analysis and policy</w:t>
-      </w:r>
-      <w:r>
-        <w:t xml:space="preserve">. World Bank Group.</w:t>
+        <w:t xml:space="preserve">Journal of International Business Studies, 34</w:t>
+      </w:r>
+      <w:r>
+        <w:t xml:space="preserve">(1), 5–18.</w:t>
       </w:r>
     </w:p>
     <w:p>
@@ -19671,7 +19671,7 @@
         <w:pStyle w:val="BodyText"/>
       </w:pPr>
       <w:r>
-        <w:t xml:space="preserve">David, P. A. (1990). The dynamo and the computer: An historical perspective on the modern productivity paradox.</w:t>
+        <w:t xml:space="preserve">Cusolito, A. P., &amp; Maloney, W. F. (2018).</w:t>
       </w:r>
       <w:r>
         <w:t xml:space="preserve"> </w:t>
@@ -19681,10 +19681,10 @@
           <w:iCs/>
           <w:i/>
         </w:rPr>
-        <w:t xml:space="preserve">American Economic Review, 80</w:t>
-      </w:r>
-      <w:r>
-        <w:t xml:space="preserve">(2), 355–361.</w:t>
+        <w:t xml:space="preserve">Productivity revisited: Shifting paradigms in analysis and policy</w:t>
+      </w:r>
+      <w:r>
+        <w:t xml:space="preserve">. World Bank Group.</w:t>
       </w:r>
     </w:p>
     <w:p>
@@ -19692,7 +19692,7 @@
         <w:pStyle w:val="BodyText"/>
       </w:pPr>
       <w:r>
-        <w:t xml:space="preserve">Đỗ, T. H., &amp; Phan, A. T. (2026). Internationalization and firm performance in Vietnam.</w:t>
+        <w:t xml:space="preserve">David, P. A. (1990). The dynamo and the computer: An historical perspective on the modern productivity paradox.</w:t>
       </w:r>
       <w:r>
         <w:t xml:space="preserve"> </w:t>
@@ -19702,13 +19702,10 @@
           <w:iCs/>
           <w:i/>
         </w:rPr>
-        <w:t xml:space="preserve">Journal of Asia Business Studies</w:t>
-      </w:r>
-      <w:r>
-        <w:t xml:space="preserve"> </w:t>
-      </w:r>
-      <w:r>
-        <w:t xml:space="preserve">(under review).</w:t>
+        <w:t xml:space="preserve">American Economic Review, 80</w:t>
+      </w:r>
+      <w:r>
+        <w:t xml:space="preserve">(2), 355–361.</w:t>
       </w:r>
     </w:p>
     <w:p>
@@ -19716,7 +19713,7 @@
         <w:pStyle w:val="BodyText"/>
       </w:pPr>
       <w:r>
-        <w:t xml:space="preserve">Hall, P. A., &amp; Soskice, D. (Eds.). (2001).</w:t>
+        <w:t xml:space="preserve">Đỗ, T. H., &amp; Phan, A. T. (2026). Internationalization and firm performance in Vietnam.</w:t>
       </w:r>
       <w:r>
         <w:t xml:space="preserve"> </w:t>
@@ -19726,10 +19723,13 @@
           <w:iCs/>
           <w:i/>
         </w:rPr>
-        <w:t xml:space="preserve">Varieties of capitalism: The institutional foundations of comparative advantage</w:t>
-      </w:r>
-      <w:r>
-        <w:t xml:space="preserve">. Oxford University Press.</w:t>
+        <w:t xml:space="preserve">Journal of Asia Business Studies</w:t>
+      </w:r>
+      <w:r>
+        <w:t xml:space="preserve"> </w:t>
+      </w:r>
+      <w:r>
+        <w:t xml:space="preserve">(under review).</w:t>
       </w:r>
     </w:p>
     <w:p>
@@ -19737,7 +19737,7 @@
         <w:pStyle w:val="BodyText"/>
       </w:pPr>
       <w:r>
-        <w:t xml:space="preserve">Hertog, S. (2010).</w:t>
+        <w:t xml:space="preserve">Hall, P. A., &amp; Soskice, D. (Eds.). (2001).</w:t>
       </w:r>
       <w:r>
         <w:t xml:space="preserve"> </w:t>
@@ -19747,10 +19747,10 @@
           <w:iCs/>
           <w:i/>
         </w:rPr>
-        <w:t xml:space="preserve">Princes, brokers, and bureaucrats: Oil and the state in Saudi Arabia</w:t>
-      </w:r>
-      <w:r>
-        <w:t xml:space="preserve">. Cornell University Press.</w:t>
+        <w:t xml:space="preserve">Varieties of capitalism: The institutional foundations of comparative advantage</w:t>
+      </w:r>
+      <w:r>
+        <w:t xml:space="preserve">. Oxford University Press.</w:t>
       </w:r>
     </w:p>
     <w:p>
@@ -19758,7 +19758,7 @@
         <w:pStyle w:val="BodyText"/>
       </w:pPr>
       <w:r>
-        <w:t xml:space="preserve">Hsieh, C.-T., &amp; Klenow, P. J. (2009). Misallocation and manufacturing TFP in China and India.</w:t>
+        <w:t xml:space="preserve">Hertog, S. (2010).</w:t>
       </w:r>
       <w:r>
         <w:t xml:space="preserve"> </w:t>
@@ -19768,10 +19768,10 @@
           <w:iCs/>
           <w:i/>
         </w:rPr>
-        <w:t xml:space="preserve">Quarterly Journal of Economics, 124</w:t>
-      </w:r>
-      <w:r>
-        <w:t xml:space="preserve">(4), 1403–1448.</w:t>
+        <w:t xml:space="preserve">Princes, brokers, and bureaucrats: Oil and the state in Saudi Arabia</w:t>
+      </w:r>
+      <w:r>
+        <w:t xml:space="preserve">. Cornell University Press.</w:t>
       </w:r>
     </w:p>
     <w:p>
@@ -19779,7 +19779,7 @@
         <w:pStyle w:val="BodyText"/>
       </w:pPr>
       <w:r>
-        <w:t xml:space="preserve">Hsieh, C.-T., &amp; Klenow, P. J. (2014). The life cycle of plants in India and Mexico.</w:t>
+        <w:t xml:space="preserve">Hsieh, C.-T., &amp; Klenow, P. J. (2009). Misallocation and manufacturing TFP in China and India.</w:t>
       </w:r>
       <w:r>
         <w:t xml:space="preserve"> </w:t>
@@ -19789,10 +19789,10 @@
           <w:iCs/>
           <w:i/>
         </w:rPr>
-        <w:t xml:space="preserve">Quarterly Journal of Economics, 129</w:t>
-      </w:r>
-      <w:r>
-        <w:t xml:space="preserve">(3), 1035–1084.</w:t>
+        <w:t xml:space="preserve">Quarterly Journal of Economics, 124</w:t>
+      </w:r>
+      <w:r>
+        <w:t xml:space="preserve">(4), 1403–1448.</w:t>
       </w:r>
     </w:p>
     <w:p>
@@ -19800,7 +19800,7 @@
         <w:pStyle w:val="BodyText"/>
       </w:pPr>
       <w:r>
-        <w:t xml:space="preserve">Johanson, J., &amp; Vahlne, J.-E. (1977). The internationalization process of the firm.</w:t>
+        <w:t xml:space="preserve">Hsieh, C.-T., &amp; Klenow, P. J. (2014). The life cycle of plants in India and Mexico.</w:t>
       </w:r>
       <w:r>
         <w:t xml:space="preserve"> </w:t>
@@ -19810,10 +19810,10 @@
           <w:iCs/>
           <w:i/>
         </w:rPr>
-        <w:t xml:space="preserve">Journal of International Business Studies, 8</w:t>
-      </w:r>
-      <w:r>
-        <w:t xml:space="preserve">(1), 23–32.</w:t>
+        <w:t xml:space="preserve">Quarterly Journal of Economics, 129</w:t>
+      </w:r>
+      <w:r>
+        <w:t xml:space="preserve">(3), 1035–1084.</w:t>
       </w:r>
     </w:p>
     <w:p>
@@ -19821,7 +19821,7 @@
         <w:pStyle w:val="BodyText"/>
       </w:pPr>
       <w:r>
-        <w:t xml:space="preserve">Johanson, J., &amp; Vahlne, J.-E. (2009). The Uppsala internationalization process model revisited.</w:t>
+        <w:t xml:space="preserve">Johanson, J., &amp; Vahlne, J.-E. (1977). The internationalization process of the firm.</w:t>
       </w:r>
       <w:r>
         <w:t xml:space="preserve"> </w:t>
@@ -19831,10 +19831,10 @@
           <w:iCs/>
           <w:i/>
         </w:rPr>
-        <w:t xml:space="preserve">Journal of International Business Studies, 40</w:t>
-      </w:r>
-      <w:r>
-        <w:t xml:space="preserve">(9), 1411–1431.</w:t>
+        <w:t xml:space="preserve">Journal of International Business Studies, 8</w:t>
+      </w:r>
+      <w:r>
+        <w:t xml:space="preserve">(1), 23–32.</w:t>
       </w:r>
     </w:p>
     <w:p>
@@ -19842,7 +19842,7 @@
         <w:pStyle w:val="BodyText"/>
       </w:pPr>
       <w:r>
-        <w:t xml:space="preserve">Kafouros, M., Wang, C., Piperopoulos, P., &amp; Zhang, M. (2023). Academic publishing in business and management.</w:t>
+        <w:t xml:space="preserve">Johanson, J., &amp; Vahlne, J.-E. (2009). The Uppsala internationalization process model revisited.</w:t>
       </w:r>
       <w:r>
         <w:t xml:space="preserve"> </w:t>
@@ -19852,10 +19852,10 @@
           <w:iCs/>
           <w:i/>
         </w:rPr>
-        <w:t xml:space="preserve">Global Strategy Journal, 13</w:t>
-      </w:r>
-      <w:r>
-        <w:t xml:space="preserve">(1), 3–28.</w:t>
+        <w:t xml:space="preserve">Journal of International Business Studies, 40</w:t>
+      </w:r>
+      <w:r>
+        <w:t xml:space="preserve">(9), 1411–1431.</w:t>
       </w:r>
     </w:p>
     <w:p>
@@ -19863,7 +19863,7 @@
         <w:pStyle w:val="BodyText"/>
       </w:pPr>
       <w:r>
-        <w:t xml:space="preserve">Kaufmann, D., Kraay, A., &amp; Mastruzzi, M. (2011). The worldwide governance indicators: Methodology and analytical issues.</w:t>
+        <w:t xml:space="preserve">Kafouros, M., Wang, C., Piperopoulos, P., &amp; Zhang, M. (2023). Academic publishing in business and management.</w:t>
       </w:r>
       <w:r>
         <w:t xml:space="preserve"> </w:t>
@@ -19873,10 +19873,10 @@
           <w:iCs/>
           <w:i/>
         </w:rPr>
-        <w:t xml:space="preserve">Hague Journal on the Rule of Law, 3</w:t>
-      </w:r>
-      <w:r>
-        <w:t xml:space="preserve">(2), 220–246.</w:t>
+        <w:t xml:space="preserve">Global Strategy Journal, 13</w:t>
+      </w:r>
+      <w:r>
+        <w:t xml:space="preserve">(1), 3–28.</w:t>
       </w:r>
     </w:p>
     <w:p>
@@ -19884,7 +19884,7 @@
         <w:pStyle w:val="BodyText"/>
       </w:pPr>
       <w:r>
-        <w:t xml:space="preserve">Khanna, T., &amp; Palepu, K. G. (2010).</w:t>
+        <w:t xml:space="preserve">Kaufmann, D., Kraay, A., &amp; Mastruzzi, M. (2011). The worldwide governance indicators: Methodology and analytical issues.</w:t>
       </w:r>
       <w:r>
         <w:t xml:space="preserve"> </w:t>
@@ -19894,10 +19894,10 @@
           <w:iCs/>
           <w:i/>
         </w:rPr>
-        <w:t xml:space="preserve">Winning in emerging markets: A road map for strategy and execution</w:t>
-      </w:r>
-      <w:r>
-        <w:t xml:space="preserve">. Harvard Business Press.</w:t>
+        <w:t xml:space="preserve">Hague Journal on the Rule of Law, 3</w:t>
+      </w:r>
+      <w:r>
+        <w:t xml:space="preserve">(2), 220–246.</w:t>
       </w:r>
     </w:p>
     <w:p>
@@ -19905,7 +19905,7 @@
         <w:pStyle w:val="BodyText"/>
       </w:pPr>
       <w:r>
-        <w:t xml:space="preserve">Kirca, A. H., Hult, G. T. M., Deligonul, S., Perryy, M. Z., &amp; Cavusgil, S. T. (2012). A multilevel examination of the drivers of firm multinationality.</w:t>
+        <w:t xml:space="preserve">Khanna, T., &amp; Palepu, K. G. (2010).</w:t>
       </w:r>
       <w:r>
         <w:t xml:space="preserve"> </w:t>
@@ -19915,10 +19915,10 @@
           <w:iCs/>
           <w:i/>
         </w:rPr>
-        <w:t xml:space="preserve">Journal of Management, 38</w:t>
-      </w:r>
-      <w:r>
-        <w:t xml:space="preserve">(2), 502–530.</w:t>
+        <w:t xml:space="preserve">Winning in emerging markets: A road map for strategy and execution</w:t>
+      </w:r>
+      <w:r>
+        <w:t xml:space="preserve">. Harvard Business Press.</w:t>
       </w:r>
     </w:p>
     <w:p>
@@ -19926,7 +19926,7 @@
         <w:pStyle w:val="BodyText"/>
       </w:pPr>
       <w:r>
-        <w:t xml:space="preserve">Lu, J. W., &amp; Beamish, P. W. (2004). International diversification and firm performance: The S-curve hypothesis.</w:t>
+        <w:t xml:space="preserve">Kirca, A. H., Hult, G. T. M., Deligonul, S., Perryy, M. Z., &amp; Cavusgil, S. T. (2012). A multilevel examination of the drivers of firm multinationality.</w:t>
       </w:r>
       <w:r>
         <w:t xml:space="preserve"> </w:t>
@@ -19936,10 +19936,10 @@
           <w:iCs/>
           <w:i/>
         </w:rPr>
-        <w:t xml:space="preserve">Academy of Management Journal, 47</w:t>
-      </w:r>
-      <w:r>
-        <w:t xml:space="preserve">(4), 598–609.</w:t>
+        <w:t xml:space="preserve">Journal of Management, 38</w:t>
+      </w:r>
+      <w:r>
+        <w:t xml:space="preserve">(2), 502–530.</w:t>
       </w:r>
     </w:p>
     <w:p>
@@ -19947,7 +19947,7 @@
         <w:pStyle w:val="BodyText"/>
       </w:pPr>
       <w:r>
-        <w:t xml:space="preserve">Mar, J., Đỗ, T. H., &amp; Phan, A. T. (2026). Digital adoption and internationalization in Singapore.</w:t>
+        <w:t xml:space="preserve">Lu, J. W., &amp; Beamish, P. W. (2004). International diversification and firm performance: The S-curve hypothesis.</w:t>
       </w:r>
       <w:r>
         <w:t xml:space="preserve"> </w:t>
@@ -19957,13 +19957,10 @@
           <w:iCs/>
           <w:i/>
         </w:rPr>
-        <w:t xml:space="preserve">Management International Review</w:t>
-      </w:r>
-      <w:r>
-        <w:t xml:space="preserve"> </w:t>
-      </w:r>
-      <w:r>
-        <w:t xml:space="preserve">(under review).</w:t>
+        <w:t xml:space="preserve">Academy of Management Journal, 47</w:t>
+      </w:r>
+      <w:r>
+        <w:t xml:space="preserve">(4), 598–609.</w:t>
       </w:r>
     </w:p>
     <w:p>
@@ -19971,7 +19968,7 @@
         <w:pStyle w:val="BodyText"/>
       </w:pPr>
       <w:r>
-        <w:t xml:space="preserve">Marano, V., Arregle, J.-L., Hitt, M. A., Spadafora, E., &amp; van Essen, M. (2016). Home country institutions and the internationalization-performance relationship.</w:t>
+        <w:t xml:space="preserve">Mar, J., Đỗ, T. H., &amp; Phan, A. T. (2026). Digital adoption and internationalization in Singapore.</w:t>
       </w:r>
       <w:r>
         <w:t xml:space="preserve"> </w:t>
@@ -19981,10 +19978,13 @@
           <w:iCs/>
           <w:i/>
         </w:rPr>
-        <w:t xml:space="preserve">Journal of Management, 42</w:t>
-      </w:r>
-      <w:r>
-        <w:t xml:space="preserve">(5), 1075–1110.</w:t>
+        <w:t xml:space="preserve">Management International Review</w:t>
+      </w:r>
+      <w:r>
+        <w:t xml:space="preserve"> </w:t>
+      </w:r>
+      <w:r>
+        <w:t xml:space="preserve">(under review).</w:t>
       </w:r>
     </w:p>
     <w:p>
@@ -19992,7 +19992,7 @@
         <w:pStyle w:val="BodyText"/>
       </w:pPr>
       <w:r>
-        <w:t xml:space="preserve">North, D. C. (1990).</w:t>
+        <w:t xml:space="preserve">Marano, V., Arregle, J.-L., Hitt, M. A., Spadafora, E., &amp; van Essen, M. (2016). Home country institutions and the internationalization-performance relationship.</w:t>
       </w:r>
       <w:r>
         <w:t xml:space="preserve"> </w:t>
@@ -20002,10 +20002,10 @@
           <w:iCs/>
           <w:i/>
         </w:rPr>
-        <w:t xml:space="preserve">Institutions, institutional change and economic performance</w:t>
-      </w:r>
-      <w:r>
-        <w:t xml:space="preserve">. Cambridge University Press.</w:t>
+        <w:t xml:space="preserve">Journal of Management, 42</w:t>
+      </w:r>
+      <w:r>
+        <w:t xml:space="preserve">(5), 1075–1110.</w:t>
       </w:r>
     </w:p>
     <w:p>
@@ -20013,7 +20013,7 @@
         <w:pStyle w:val="BodyText"/>
       </w:pPr>
       <w:r>
-        <w:t xml:space="preserve">Peng, M. W. (2001). The resource-based view and international business.</w:t>
+        <w:t xml:space="preserve">North, D. C. (1990).</w:t>
       </w:r>
       <w:r>
         <w:t xml:space="preserve"> </w:t>
@@ -20023,10 +20023,10 @@
           <w:iCs/>
           <w:i/>
         </w:rPr>
-        <w:t xml:space="preserve">Journal of Management, 27</w:t>
-      </w:r>
-      <w:r>
-        <w:t xml:space="preserve">(6), 803–829.</w:t>
+        <w:t xml:space="preserve">Institutions, institutional change and economic performance</w:t>
+      </w:r>
+      <w:r>
+        <w:t xml:space="preserve">. Cambridge University Press.</w:t>
       </w:r>
     </w:p>
     <w:p>
@@ -20034,7 +20034,7 @@
         <w:pStyle w:val="BodyText"/>
       </w:pPr>
       <w:r>
-        <w:t xml:space="preserve">Peng, M. W. (2003). Institutional transitions and strategic choices.</w:t>
+        <w:t xml:space="preserve">Peng, M. W. (2001). The resource-based view and international business.</w:t>
       </w:r>
       <w:r>
         <w:t xml:space="preserve"> </w:t>
@@ -20044,10 +20044,10 @@
           <w:iCs/>
           <w:i/>
         </w:rPr>
-        <w:t xml:space="preserve">Academy of Management Review, 28</w:t>
-      </w:r>
-      <w:r>
-        <w:t xml:space="preserve">(2), 275–296.</w:t>
+        <w:t xml:space="preserve">Journal of Management, 27</w:t>
+      </w:r>
+      <w:r>
+        <w:t xml:space="preserve">(6), 803–829.</w:t>
       </w:r>
     </w:p>
     <w:p>
@@ -20055,7 +20055,7 @@
         <w:pStyle w:val="BodyText"/>
       </w:pPr>
       <w:r>
-        <w:t xml:space="preserve">Sachs, J. D., &amp; Warner, A. M. (2001). The curse of natural resources.</w:t>
+        <w:t xml:space="preserve">Peng, M. W. (2003). Institutional transitions and strategic choices.</w:t>
       </w:r>
       <w:r>
         <w:t xml:space="preserve"> </w:t>
@@ -20065,10 +20065,10 @@
           <w:iCs/>
           <w:i/>
         </w:rPr>
-        <w:t xml:space="preserve">European Economic Review, 45</w:t>
-      </w:r>
-      <w:r>
-        <w:t xml:space="preserve">(4–6), 827–838.</w:t>
+        <w:t xml:space="preserve">Academy of Management Review, 28</w:t>
+      </w:r>
+      <w:r>
+        <w:t xml:space="preserve">(2), 275–296.</w:t>
       </w:r>
     </w:p>
     <w:p>
@@ -20076,7 +20076,7 @@
         <w:pStyle w:val="BodyText"/>
       </w:pPr>
       <w:r>
-        <w:t xml:space="preserve">Schwens, C., Zapkau, F. B., Brouthers, K. D., &amp; Hollender, L. (2018). How overconfidence can blind internationalization performance predictions.</w:t>
+        <w:t xml:space="preserve">Sachs, J. D., &amp; Warner, A. M. (2001). The curse of natural resources.</w:t>
       </w:r>
       <w:r>
         <w:t xml:space="preserve"> </w:t>
@@ -20086,10 +20086,10 @@
           <w:iCs/>
           <w:i/>
         </w:rPr>
-        <w:t xml:space="preserve">Journal of World Business, 53</w:t>
-      </w:r>
-      <w:r>
-        <w:t xml:space="preserve">(3), 290–301.</w:t>
+        <w:t xml:space="preserve">European Economic Review, 45</w:t>
+      </w:r>
+      <w:r>
+        <w:t xml:space="preserve">(4–6), 827–838.</w:t>
       </w:r>
     </w:p>
     <w:p>
@@ -20097,7 +20097,7 @@
         <w:pStyle w:val="BodyText"/>
       </w:pPr>
       <w:r>
-        <w:t xml:space="preserve">Sikdar, A., &amp; Mukhopadhyay, A. (2026). Technology spillovers and firm performance in India.</w:t>
+        <w:t xml:space="preserve">Schwens, C., Zapkau, F. B., Brouthers, K. D., &amp; Hollender, L. (2018). How overconfidence can blind internationalization performance predictions.</w:t>
       </w:r>
       <w:r>
         <w:t xml:space="preserve"> </w:t>
@@ -20107,10 +20107,10 @@
           <w:iCs/>
           <w:i/>
         </w:rPr>
-        <w:t xml:space="preserve">Asian Development Review, 43</w:t>
-      </w:r>
-      <w:r>
-        <w:t xml:space="preserve">(1), 37–75.</w:t>
+        <w:t xml:space="preserve">Journal of World Business, 53</w:t>
+      </w:r>
+      <w:r>
+        <w:t xml:space="preserve">(3), 290–301.</w:t>
       </w:r>
     </w:p>
     <w:p>
@@ -20118,7 +20118,7 @@
         <w:pStyle w:val="BodyText"/>
       </w:pPr>
       <w:r>
-        <w:t xml:space="preserve">Stallkamp, M., &amp; Schotter, A. P. J. (2021). Platforms without borders?</w:t>
+        <w:t xml:space="preserve">Sikdar, A., &amp; Mukhopadhyay, A. (2026). Technology spillovers and firm performance in India.</w:t>
       </w:r>
       <w:r>
         <w:t xml:space="preserve"> </w:t>
@@ -20128,10 +20128,10 @@
           <w:iCs/>
           <w:i/>
         </w:rPr>
-        <w:t xml:space="preserve">Global Strategy Journal, 11</w:t>
-      </w:r>
-      <w:r>
-        <w:t xml:space="preserve">(1), 58–80.</w:t>
+        <w:t xml:space="preserve">Asian Development Review, 43</w:t>
+      </w:r>
+      <w:r>
+        <w:t xml:space="preserve">(1), 37–75.</w:t>
       </w:r>
     </w:p>
     <w:p>
@@ -20139,7 +20139,7 @@
         <w:pStyle w:val="BodyText"/>
       </w:pPr>
       <w:r>
-        <w:t xml:space="preserve">Teece, D. J., Pisano, G., &amp; Shuen, A. (1997). Dynamic capabilities and strategic management.</w:t>
+        <w:t xml:space="preserve">StartupBlink. (2026).</w:t>
       </w:r>
       <w:r>
         <w:t xml:space="preserve"> </w:t>
@@ -20149,10 +20149,10 @@
           <w:iCs/>
           <w:i/>
         </w:rPr>
-        <w:t xml:space="preserve">Strategic Management Journal, 18</w:t>
-      </w:r>
-      <w:r>
-        <w:t xml:space="preserve">(7), 509–533.</w:t>
+        <w:t xml:space="preserve">Global startup ecosystem index 2026</w:t>
+      </w:r>
+      <w:r>
+        <w:t xml:space="preserve">. StartupBlink Research.</w:t>
       </w:r>
     </w:p>
     <w:p>
@@ -20160,7 +20160,7 @@
         <w:pStyle w:val="BodyText"/>
       </w:pPr>
       <w:r>
-        <w:t xml:space="preserve">UNCTAD. (2023).</w:t>
+        <w:t xml:space="preserve">Stallkamp, M., &amp; Schotter, A. P. J. (2021). Platforms without borders?</w:t>
       </w:r>
       <w:r>
         <w:t xml:space="preserve"> </w:t>
@@ -20170,10 +20170,10 @@
           <w:iCs/>
           <w:i/>
         </w:rPr>
-        <w:t xml:space="preserve">World investment report 2023</w:t>
-      </w:r>
-      <w:r>
-        <w:t xml:space="preserve">. United Nations Conference on Trade and Development.</w:t>
+        <w:t xml:space="preserve">Global Strategy Journal, 11</w:t>
+      </w:r>
+      <w:r>
+        <w:t xml:space="preserve">(1), 58–80.</w:t>
       </w:r>
     </w:p>
     <w:p>
@@ -20181,7 +20181,7 @@
         <w:pStyle w:val="BodyText"/>
       </w:pPr>
       <w:r>
-        <w:t xml:space="preserve">Venkatraman, N., &amp; Ramanujam, V. (1986). Measurement of business performance in strategy research.</w:t>
+        <w:t xml:space="preserve">Teece, D. J., Pisano, G., &amp; Shuen, A. (1997). Dynamic capabilities and strategic management.</w:t>
       </w:r>
       <w:r>
         <w:t xml:space="preserve"> </w:t>
@@ -20191,10 +20191,10 @@
           <w:iCs/>
           <w:i/>
         </w:rPr>
-        <w:t xml:space="preserve">Academy of Management Review, 11</w:t>
-      </w:r>
-      <w:r>
-        <w:t xml:space="preserve">(4), 801–814.</w:t>
+        <w:t xml:space="preserve">Strategic Management Journal, 18</w:t>
+      </w:r>
+      <w:r>
+        <w:t xml:space="preserve">(7), 509–533.</w:t>
       </w:r>
     </w:p>
     <w:p>
@@ -20202,7 +20202,7 @@
         <w:pStyle w:val="BodyText"/>
       </w:pPr>
       <w:r>
-        <w:t xml:space="preserve">Verhoef, P. C., Broekhuizen, T., Bart, Y., Bhattacharya, A., Dong, J. Q., Fabian, N., &amp; Haenlein, M. (2021). Digital transformation: A multidisciplinary reflection and research agenda.</w:t>
+        <w:t xml:space="preserve">UNCTAD. (2023).</w:t>
       </w:r>
       <w:r>
         <w:t xml:space="preserve"> </w:t>
@@ -20212,10 +20212,10 @@
           <w:iCs/>
           <w:i/>
         </w:rPr>
-        <w:t xml:space="preserve">Journal of Business Research, 122</w:t>
-      </w:r>
-      <w:r>
-        <w:t xml:space="preserve">, 889–901.</w:t>
+        <w:t xml:space="preserve">World investment report 2023</w:t>
+      </w:r>
+      <w:r>
+        <w:t xml:space="preserve">. United Nations Conference on Trade and Development.</w:t>
       </w:r>
     </w:p>
     <w:p>
@@ -20223,7 +20223,7 @@
         <w:pStyle w:val="BodyText"/>
       </w:pPr>
       <w:r>
-        <w:t xml:space="preserve">Wang, J., Huang, Y., &amp; Hong, H. (2024). Technology concentration and bank risk: Evidence from Chinese commercial banks.</w:t>
+        <w:t xml:space="preserve">Venkatraman, N., &amp; Ramanujam, V. (1986). Measurement of business performance in strategy research.</w:t>
       </w:r>
       <w:r>
         <w:t xml:space="preserve"> </w:t>
@@ -20233,10 +20233,10 @@
           <w:iCs/>
           <w:i/>
         </w:rPr>
-        <w:t xml:space="preserve">International Review of Financial Analysis, 91</w:t>
-      </w:r>
-      <w:r>
-        <w:t xml:space="preserve">, 102968.</w:t>
+        <w:t xml:space="preserve">Academy of Management Review, 11</w:t>
+      </w:r>
+      <w:r>
+        <w:t xml:space="preserve">(4), 801–814.</w:t>
       </w:r>
     </w:p>
     <w:p>
@@ -20244,7 +20244,7 @@
         <w:pStyle w:val="BodyText"/>
       </w:pPr>
       <w:r>
-        <w:t xml:space="preserve">Wernerfelt, B. (1984). A resource-based view of the firm.</w:t>
+        <w:t xml:space="preserve">Verhoef, P. C., Broekhuizen, T., Bart, Y., Bhattacharya, A., Dong, J. Q., Fabian, N., &amp; Haenlein, M. (2021). Digital transformation: A multidisciplinary reflection and research agenda.</w:t>
       </w:r>
       <w:r>
         <w:t xml:space="preserve"> </w:t>
@@ -20254,10 +20254,10 @@
           <w:iCs/>
           <w:i/>
         </w:rPr>
-        <w:t xml:space="preserve">Strategic Management Journal, 5</w:t>
-      </w:r>
-      <w:r>
-        <w:t xml:space="preserve">(2), 171–180.</w:t>
+        <w:t xml:space="preserve">Journal of Business Research, 122</w:t>
+      </w:r>
+      <w:r>
+        <w:t xml:space="preserve">, 889–901.</w:t>
       </w:r>
     </w:p>
     <w:p>
@@ -20265,7 +20265,7 @@
         <w:pStyle w:val="BodyText"/>
       </w:pPr>
       <w:r>
-        <w:t xml:space="preserve">Williamson, O. E. (1985).</w:t>
+        <w:t xml:space="preserve">Wang, J., Huang, Y., &amp; Hong, H. (2024). Technology concentration and bank risk: Evidence from Chinese commercial banks.</w:t>
       </w:r>
       <w:r>
         <w:t xml:space="preserve"> </w:t>
@@ -20275,10 +20275,94 @@
           <w:iCs/>
           <w:i/>
         </w:rPr>
+        <w:t xml:space="preserve">International Review of Financial Analysis, 91</w:t>
+      </w:r>
+      <w:r>
+        <w:t xml:space="preserve">, 102968.</w:t>
+      </w:r>
+    </w:p>
+    <w:p>
+      <w:pPr>
+        <w:pStyle w:val="BodyText"/>
+      </w:pPr>
+      <w:r>
+        <w:t xml:space="preserve">Wernerfelt, B. (1984). A resource-based view of the firm.</w:t>
+      </w:r>
+      <w:r>
+        <w:t xml:space="preserve"> </w:t>
+      </w:r>
+      <w:r>
+        <w:rPr>
+          <w:iCs/>
+          <w:i/>
+        </w:rPr>
+        <w:t xml:space="preserve">Strategic Management Journal, 5</w:t>
+      </w:r>
+      <w:r>
+        <w:t xml:space="preserve">(2), 171–180.</w:t>
+      </w:r>
+    </w:p>
+    <w:p>
+      <w:pPr>
+        <w:pStyle w:val="BodyText"/>
+      </w:pPr>
+      <w:r>
+        <w:t xml:space="preserve">Williamson, O. E. (1985).</w:t>
+      </w:r>
+      <w:r>
+        <w:t xml:space="preserve"> </w:t>
+      </w:r>
+      <w:r>
+        <w:rPr>
+          <w:iCs/>
+          <w:i/>
+        </w:rPr>
         <w:t xml:space="preserve">The economic institutions of capitalism</w:t>
       </w:r>
       <w:r>
         <w:t xml:space="preserve">. Free Press.</w:t>
+      </w:r>
+    </w:p>
+    <w:p>
+      <w:pPr>
+        <w:pStyle w:val="BodyText"/>
+      </w:pPr>
+      <w:r>
+        <w:t xml:space="preserve">World Bank. (2023).</w:t>
+      </w:r>
+      <w:r>
+        <w:t xml:space="preserve"> </w:t>
+      </w:r>
+      <w:r>
+        <w:rPr>
+          <w:iCs/>
+          <w:i/>
+        </w:rPr>
+        <w:t xml:space="preserve">World Bank Enterprise Surveys 2023</w:t>
+      </w:r>
+      <w:r>
+        <w:t xml:space="preserve">. World Bank Group.</w:t>
+      </w:r>
+    </w:p>
+    <w:p>
+      <w:pPr>
+        <w:pStyle w:val="BodyText"/>
+      </w:pPr>
+      <w:r>
+        <w:t xml:space="preserve">World Bank. (2024).</w:t>
+      </w:r>
+      <w:r>
+        <w:t xml:space="preserve"> </w:t>
+      </w:r>
+      <w:r>
+        <w:rPr>
+          <w:iCs/>
+          <w:i/>
+        </w:rPr>
+        <w:t xml:space="preserve">World development indicators 2024</w:t>
+      </w:r>
+      <w:r>
+        <w:t xml:space="preserve">. World Bank Group.</w:t>
       </w:r>
     </w:p>
     <w:p>
@@ -21147,7 +21231,7 @@
     <w:bookmarkEnd w:id="89"/>
     <w:sectPr>
       <w:pgSz w:h="16838" w:w="11906"/>
-      <w:pgMar w:bottom="1417" w:left="1417" w:right="1417" w:top="1417"/>
+      <w:pgMar w:bottom="1134" w:left="1701" w:right="1134" w:top="1134"/>
     </w:sectPr>
   </w:body>
 </w:document>
@@ -21491,13 +21575,13 @@
     <w:name w:val="Normal"/>
     <w:qFormat/>
     <w:pPr>
-      <w:spacing w:line="276" w:lineRule="auto"/>
+      <w:spacing w:line="360" w:lineRule="auto"/>
       <w:jc w:val="both"/>
     </w:pPr>
     <w:rPr>
       <w:rFonts w:ascii="Times New Roman" w:eastAsia="Times New Roman" w:hAnsi="Times New Roman"/>
       <w:color w:val="000000"/>
-      <w:sz w:val="24"/>
+      <w:sz w:val="26"/>
     </w:rPr>
   </w:style>
   <w:style w:styleId="BodyText" w:type="paragraph">
@@ -21505,14 +21589,14 @@
     <w:basedOn w:val="Normal"/>
     <w:link w:val="BodyTextChar"/>
     <w:pPr>
-      <w:spacing w:after="180" w:before="180" w:line="276" w:lineRule="auto"/>
+      <w:spacing w:after="180" w:before="180" w:line="360" w:lineRule="auto"/>
       <w:jc w:val="both"/>
     </w:pPr>
     <w:qFormat/>
     <w:rPr>
       <w:rFonts w:ascii="Times New Roman" w:eastAsia="Times New Roman" w:hAnsi="Times New Roman"/>
       <w:color w:val="000000"/>
-      <w:sz w:val="24"/>
+      <w:sz w:val="26"/>
     </w:rPr>
   </w:style>
   <w:style w:customStyle="1" w:styleId="FirstParagraph" w:type="paragraph">
@@ -21521,13 +21605,13 @@
     <w:next w:val="BodyText"/>
     <w:qFormat/>
     <w:pPr>
-      <w:spacing w:line="276" w:lineRule="auto"/>
+      <w:spacing w:line="360" w:lineRule="auto"/>
       <w:jc w:val="both"/>
     </w:pPr>
     <w:rPr>
       <w:rFonts w:ascii="Times New Roman" w:eastAsia="Times New Roman" w:hAnsi="Times New Roman"/>
       <w:color w:val="000000"/>
-      <w:sz w:val="24"/>
+      <w:sz w:val="26"/>
     </w:rPr>
   </w:style>
   <w:style w:customStyle="1" w:styleId="Compact" w:type="paragraph">
@@ -21535,13 +21619,13 @@
     <w:basedOn w:val="BodyText"/>
     <w:qFormat/>
     <w:pPr>
-      <w:spacing w:after="36" w:before="36" w:line="276" w:lineRule="auto"/>
+      <w:spacing w:after="36" w:before="36" w:line="360" w:lineRule="auto"/>
       <w:jc w:val="both"/>
     </w:pPr>
     <w:rPr>
       <w:rFonts w:ascii="Times New Roman" w:eastAsia="Times New Roman" w:hAnsi="Times New Roman"/>
       <w:color w:val="000000"/>
-      <w:sz w:val="24"/>
+      <w:sz w:val="26"/>
     </w:rPr>
   </w:style>
   <w:style w:styleId="Title" w:type="paragraph">
@@ -21552,7 +21636,7 @@
     <w:pPr>
       <w:keepNext/>
       <w:keepLines/>
-      <w:spacing w:after="240" w:before="480" w:line="276" w:lineRule="auto"/>
+      <w:spacing w:after="240" w:before="480" w:line="360" w:lineRule="auto"/>
       <w:jc w:val="both"/>
     </w:pPr>
     <w:rPr>
@@ -21560,7 +21644,7 @@
       <w:b/>
       <w:bCs/>
       <w:color w:val="000000"/>
-      <w:sz w:val="24"/>
+      <w:sz w:val="26"/>
       <w:szCs w:val="36"/>
     </w:rPr>
   </w:style>
@@ -21572,13 +21656,13 @@
     <w:pPr>
       <w:keepNext/>
       <w:keepLines/>
-      <w:spacing w:after="240" w:before="240" w:line="276" w:lineRule="auto"/>
+      <w:spacing w:after="240" w:before="240" w:line="360" w:lineRule="auto"/>
       <w:jc w:val="both"/>
     </w:pPr>
     <w:rPr>
       <w:rFonts w:ascii="Times New Roman" w:eastAsia="Times New Roman" w:hAnsi="Times New Roman"/>
       <w:color w:val="000000"/>
-      <w:sz w:val="24"/>
+      <w:sz w:val="26"/>
       <w:szCs w:val="30"/>
     </w:rPr>
   </w:style>
@@ -21589,13 +21673,13 @@
     <w:pPr>
       <w:keepNext/>
       <w:keepLines/>
-      <w:spacing w:line="276" w:lineRule="auto"/>
+      <w:spacing w:line="360" w:lineRule="auto"/>
       <w:jc w:val="both"/>
     </w:pPr>
     <w:rPr>
       <w:rFonts w:ascii="Times New Roman" w:eastAsia="Times New Roman" w:hAnsi="Times New Roman"/>
       <w:color w:val="000000"/>
-      <w:sz w:val="24"/>
+      <w:sz w:val="26"/>
     </w:rPr>
   </w:style>
   <w:style w:styleId="Date" w:type="paragraph">
@@ -21605,13 +21689,13 @@
     <w:pPr>
       <w:keepNext/>
       <w:keepLines/>
-      <w:spacing w:line="276" w:lineRule="auto"/>
+      <w:spacing w:line="360" w:lineRule="auto"/>
       <w:jc w:val="both"/>
     </w:pPr>
     <w:rPr>
       <w:rFonts w:ascii="Times New Roman" w:eastAsia="Times New Roman" w:hAnsi="Times New Roman"/>
       <w:color w:val="000000"/>
-      <w:sz w:val="24"/>
+      <w:sz w:val="26"/>
     </w:rPr>
   </w:style>
   <w:style w:customStyle="1" w:styleId="AbstractTitle" w:type="paragraph">
@@ -21623,11 +21707,11 @@
       <w:keepNext/>
       <w:keepLines/>
       <w:jc w:val="both"/>
-      <w:spacing w:after="0" w:before="300" w:line="276" w:lineRule="auto"/>
+      <w:spacing w:after="0" w:before="300" w:line="360" w:lineRule="auto"/>
     </w:pPr>
     <w:rPr>
       <w:color w:val="000000"/>
-      <w:sz w:val="24"/>
+      <w:sz w:val="26"/>
       <w:szCs w:val="20"/>
       <w:rFonts w:ascii="Times New Roman" w:eastAsia="Times New Roman" w:hAnsi="Times New Roman"/>
       <w:b/>
@@ -21641,13 +21725,13 @@
     <w:pPr>
       <w:keepNext/>
       <w:keepLines/>
-      <w:spacing w:after="300" w:before="100" w:line="276" w:lineRule="auto"/>
+      <w:spacing w:after="300" w:before="100" w:line="360" w:lineRule="auto"/>
       <w:jc w:val="both"/>
     </w:pPr>
     <w:rPr>
       <w:rFonts w:ascii="Times New Roman" w:eastAsia="Times New Roman" w:hAnsi="Times New Roman"/>
       <w:color w:val="000000"/>
-      <w:sz w:val="24"/>
+      <w:sz w:val="26"/>
       <w:szCs w:val="20"/>
     </w:rPr>
   </w:style>
@@ -21657,13 +21741,13 @@
     <w:next w:val="Bibliography"/>
     <w:qFormat/>
     <w:pPr>
-      <w:spacing w:line="276" w:lineRule="auto"/>
+      <w:spacing w:line="360" w:lineRule="auto"/>
       <w:jc w:val="both"/>
     </w:pPr>
     <w:rPr>
       <w:rFonts w:ascii="Times New Roman" w:eastAsia="Times New Roman" w:hAnsi="Times New Roman"/>
       <w:color w:val="000000"/>
-      <w:sz w:val="24"/>
+      <w:sz w:val="26"/>
     </w:rPr>
   </w:style>
   <w:style w:styleId="Heading1" w:type="paragraph">
@@ -21675,7 +21759,7 @@
     <w:pPr>
       <w:keepNext/>
       <w:keepLines/>
-      <w:spacing w:after="0" w:before="480" w:line="276" w:lineRule="auto"/>
+      <w:spacing w:after="0" w:before="480" w:line="360" w:lineRule="auto"/>
       <w:jc w:val="both"/>
       <w:outlineLvl w:val="0"/>
     </w:pPr>
@@ -21684,7 +21768,7 @@
       <w:b/>
       <w:bCs/>
       <w:color w:val="000000"/>
-      <w:sz w:val="24"/>
+      <w:sz w:val="26"/>
       <w:szCs w:val="32"/>
     </w:rPr>
   </w:style>
@@ -21698,7 +21782,7 @@
     <w:pPr>
       <w:keepNext/>
       <w:keepLines/>
-      <w:spacing w:after="0" w:before="200" w:line="276" w:lineRule="auto"/>
+      <w:spacing w:after="0" w:before="200" w:line="360" w:lineRule="auto"/>
       <w:jc w:val="both"/>
       <w:outlineLvl w:val="1"/>
     </w:pPr>
@@ -21707,7 +21791,7 @@
       <w:b/>
       <w:bCs/>
       <w:color w:val="000000"/>
-      <w:sz w:val="24"/>
+      <w:sz w:val="26"/>
       <w:szCs w:val="28"/>
     </w:rPr>
   </w:style>
@@ -21721,7 +21805,7 @@
     <w:pPr>
       <w:keepNext/>
       <w:keepLines/>
-      <w:spacing w:after="0" w:before="200" w:line="276" w:lineRule="auto"/>
+      <w:spacing w:after="0" w:before="200" w:line="360" w:lineRule="auto"/>
       <w:jc w:val="both"/>
       <w:outlineLvl w:val="2"/>
     </w:pPr>
@@ -21730,7 +21814,7 @@
       <w:b/>
       <w:bCs/>
       <w:color w:val="000000"/>
-      <w:sz w:val="24"/>
+      <w:sz w:val="26"/>
       <w:szCs w:val="24"/>
     </w:rPr>
   </w:style>
@@ -21744,7 +21828,7 @@
     <w:pPr>
       <w:keepNext/>
       <w:keepLines/>
-      <w:spacing w:after="0" w:before="200" w:line="276" w:lineRule="auto"/>
+      <w:spacing w:after="0" w:before="200" w:line="360" w:lineRule="auto"/>
       <w:jc w:val="both"/>
       <w:outlineLvl w:val="3"/>
     </w:pPr>
@@ -21753,7 +21837,7 @@
       <w:i/>
       <w:bCs/>
       <w:color w:val="000000"/>
-      <w:sz w:val="24"/>
+      <w:sz w:val="26"/>
       <w:szCs w:val="24"/>
     </w:rPr>
   </w:style>
@@ -21767,7 +21851,7 @@
     <w:pPr>
       <w:keepNext/>
       <w:keepLines/>
-      <w:spacing w:after="0" w:before="200" w:line="276" w:lineRule="auto"/>
+      <w:spacing w:after="0" w:before="200" w:line="360" w:lineRule="auto"/>
       <w:jc w:val="both"/>
       <w:outlineLvl w:val="4"/>
     </w:pPr>
@@ -21775,7 +21859,7 @@
       <w:rFonts w:ascii="Times New Roman" w:asciiTheme="majorHAnsi" w:cstheme="majorBidi" w:eastAsia="Times New Roman" w:eastAsiaTheme="majorEastAsia" w:hAnsi="Times New Roman" w:hAnsiTheme="majorHAnsi"/>
       <w:iCs/>
       <w:color w:val="000000"/>
-      <w:sz w:val="24"/>
+      <w:sz w:val="26"/>
       <w:szCs w:val="24"/>
     </w:rPr>
   </w:style>
@@ -21789,14 +21873,14 @@
     <w:pPr>
       <w:keepNext/>
       <w:keepLines/>
-      <w:spacing w:after="0" w:before="200" w:line="276" w:lineRule="auto"/>
+      <w:spacing w:after="0" w:before="200" w:line="360" w:lineRule="auto"/>
       <w:jc w:val="both"/>
       <w:outlineLvl w:val="5"/>
     </w:pPr>
     <w:rPr>
       <w:rFonts w:ascii="Times New Roman" w:asciiTheme="majorHAnsi" w:cstheme="majorBidi" w:eastAsia="Times New Roman" w:eastAsiaTheme="majorEastAsia" w:hAnsi="Times New Roman" w:hAnsiTheme="majorHAnsi"/>
       <w:color w:val="000000"/>
-      <w:sz w:val="24"/>
+      <w:sz w:val="26"/>
       <w:szCs w:val="24"/>
     </w:rPr>
   </w:style>
@@ -21810,14 +21894,14 @@
     <w:pPr>
       <w:keepNext/>
       <w:keepLines/>
-      <w:spacing w:after="0" w:before="200" w:line="276" w:lineRule="auto"/>
+      <w:spacing w:after="0" w:before="200" w:line="360" w:lineRule="auto"/>
       <w:jc w:val="both"/>
       <w:outlineLvl w:val="6"/>
     </w:pPr>
     <w:rPr>
       <w:rFonts w:ascii="Times New Roman" w:asciiTheme="majorHAnsi" w:cstheme="majorBidi" w:eastAsia="Times New Roman" w:eastAsiaTheme="majorEastAsia" w:hAnsi="Times New Roman" w:hAnsiTheme="majorHAnsi"/>
       <w:color w:val="000000"/>
-      <w:sz w:val="24"/>
+      <w:sz w:val="26"/>
       <w:szCs w:val="24"/>
     </w:rPr>
   </w:style>
@@ -21831,14 +21915,14 @@
     <w:pPr>
       <w:keepNext/>
       <w:keepLines/>
-      <w:spacing w:after="0" w:before="200" w:line="276" w:lineRule="auto"/>
+      <w:spacing w:after="0" w:before="200" w:line="360" w:lineRule="auto"/>
       <w:jc w:val="both"/>
       <w:outlineLvl w:val="7"/>
     </w:pPr>
     <w:rPr>
       <w:rFonts w:ascii="Times New Roman" w:asciiTheme="majorHAnsi" w:cstheme="majorBidi" w:eastAsia="Times New Roman" w:eastAsiaTheme="majorEastAsia" w:hAnsi="Times New Roman" w:hAnsiTheme="majorHAnsi"/>
       <w:color w:val="000000"/>
-      <w:sz w:val="24"/>
+      <w:sz w:val="26"/>
       <w:szCs w:val="24"/>
     </w:rPr>
   </w:style>
@@ -21852,14 +21936,14 @@
     <w:pPr>
       <w:keepNext/>
       <w:keepLines/>
-      <w:spacing w:after="0" w:before="200" w:line="276" w:lineRule="auto"/>
+      <w:spacing w:after="0" w:before="200" w:line="360" w:lineRule="auto"/>
       <w:jc w:val="both"/>
       <w:outlineLvl w:val="8"/>
     </w:pPr>
     <w:rPr>
       <w:rFonts w:ascii="Times New Roman" w:asciiTheme="majorHAnsi" w:cstheme="majorBidi" w:eastAsia="Times New Roman" w:eastAsiaTheme="majorEastAsia" w:hAnsi="Times New Roman" w:hAnsiTheme="majorHAnsi"/>
       <w:color w:val="000000"/>
-      <w:sz w:val="24"/>
+      <w:sz w:val="26"/>
       <w:szCs w:val="24"/>
     </w:rPr>
   </w:style>
@@ -21871,14 +21955,14 @@
     <w:unhideWhenUsed/>
     <w:qFormat/>
     <w:pPr>
-      <w:spacing w:after="100" w:before="100" w:line="276" w:lineRule="auto"/>
+      <w:spacing w:after="100" w:before="100" w:line="360" w:lineRule="auto"/>
       <w:ind w:firstLine="0" w:left="480" w:right="480"/>
       <w:jc w:val="both"/>
     </w:pPr>
     <w:rPr>
       <w:rFonts w:ascii="Times New Roman" w:eastAsia="Times New Roman" w:hAnsi="Times New Roman"/>
       <w:color w:val="000000"/>
-      <w:sz w:val="24"/>
+      <w:sz w:val="26"/>
     </w:rPr>
   </w:style>
   <w:style w:styleId="FootnoteText" w:type="paragraph">
@@ -21889,13 +21973,13 @@
     <w:unhideWhenUsed/>
     <w:qFormat/>
     <w:pPr>
-      <w:spacing w:line="276" w:lineRule="auto"/>
+      <w:spacing w:line="360" w:lineRule="auto"/>
       <w:jc w:val="both"/>
     </w:pPr>
     <w:rPr>
       <w:rFonts w:ascii="Times New Roman" w:eastAsia="Times New Roman" w:hAnsi="Times New Roman"/>
       <w:color w:val="000000"/>
-      <w:sz w:val="24"/>
+      <w:sz w:val="26"/>
     </w:rPr>
   </w:style>
   <w:style w:default="1" w:styleId="DefaultParagraphFont" w:type="character">
@@ -21905,7 +21989,7 @@
     <w:rPr>
       <w:rFonts w:ascii="Times New Roman" w:eastAsia="Times New Roman" w:hAnsi="Times New Roman"/>
       <w:color w:val="000000"/>
-      <w:sz w:val="24"/>
+      <w:sz w:val="26"/>
     </w:rPr>
   </w:style>
   <w:style w:default="1" w:styleId="Table" w:type="table">
@@ -21915,13 +21999,13 @@
     <w:unhideWhenUsed/>
     <w:qFormat/>
     <w:pPr>
-      <w:spacing w:line="276" w:lineRule="auto"/>
+      <w:spacing w:line="360" w:lineRule="auto"/>
       <w:jc w:val="both"/>
     </w:pPr>
     <w:rPr>
       <w:rFonts w:ascii="Times New Roman" w:eastAsia="Times New Roman" w:hAnsi="Times New Roman"/>
       <w:color w:val="000000"/>
-      <w:sz w:val="24"/>
+      <w:sz w:val="26"/>
     </w:rPr>
     <w:tblPr>
       <w:tblInd w:type="dxa" w:w="0"/>
@@ -21955,27 +22039,27 @@
     <w:pPr>
       <w:keepNext/>
       <w:keepLines/>
-      <w:spacing w:after="0" w:line="276" w:lineRule="auto"/>
+      <w:spacing w:after="0" w:line="360" w:lineRule="auto"/>
       <w:jc w:val="both"/>
     </w:pPr>
     <w:rPr>
       <w:rFonts w:ascii="Times New Roman" w:eastAsia="Times New Roman" w:hAnsi="Times New Roman"/>
       <w:b/>
       <w:color w:val="000000"/>
-      <w:sz w:val="24"/>
+      <w:sz w:val="26"/>
     </w:rPr>
   </w:style>
   <w:style w:customStyle="1" w:styleId="Definition" w:type="paragraph">
     <w:name w:val="Definition"/>
     <w:basedOn w:val="Normal"/>
     <w:pPr>
-      <w:spacing w:line="276" w:lineRule="auto"/>
+      <w:spacing w:line="360" w:lineRule="auto"/>
       <w:jc w:val="both"/>
     </w:pPr>
     <w:rPr>
       <w:rFonts w:ascii="Times New Roman" w:eastAsia="Times New Roman" w:hAnsi="Times New Roman"/>
       <w:color w:val="000000"/>
-      <w:sz w:val="24"/>
+      <w:sz w:val="26"/>
     </w:rPr>
   </w:style>
   <w:style w:styleId="Caption" w:type="paragraph">
@@ -21983,14 +22067,14 @@
     <w:basedOn w:val="Normal"/>
     <w:link w:val="BodyTextChar"/>
     <w:pPr>
-      <w:spacing w:after="120" w:before="0" w:line="276" w:lineRule="auto"/>
+      <w:spacing w:after="120" w:before="0" w:line="360" w:lineRule="auto"/>
       <w:jc w:val="both"/>
     </w:pPr>
     <w:rPr>
       <w:rFonts w:ascii="Times New Roman" w:eastAsia="Times New Roman" w:hAnsi="Times New Roman"/>
       <w:i/>
       <w:color w:val="000000"/>
-      <w:sz w:val="24"/>
+      <w:sz w:val="26"/>
     </w:rPr>
   </w:style>
   <w:style w:customStyle="1" w:styleId="TableCaption" w:type="paragraph">
@@ -21998,39 +22082,39 @@
     <w:basedOn w:val="Caption"/>
     <w:pPr>
       <w:keepNext/>
-      <w:spacing w:line="276" w:lineRule="auto"/>
+      <w:spacing w:line="360" w:lineRule="auto"/>
       <w:jc w:val="both"/>
     </w:pPr>
     <w:rPr>
       <w:rFonts w:ascii="Times New Roman" w:eastAsia="Times New Roman" w:hAnsi="Times New Roman"/>
       <w:color w:val="000000"/>
-      <w:sz w:val="24"/>
+      <w:sz w:val="26"/>
     </w:rPr>
   </w:style>
   <w:style w:customStyle="1" w:styleId="ImageCaption" w:type="paragraph">
     <w:name w:val="Image Caption"/>
     <w:basedOn w:val="Caption"/>
     <w:pPr>
-      <w:spacing w:line="276" w:lineRule="auto"/>
+      <w:spacing w:line="360" w:lineRule="auto"/>
       <w:jc w:val="both"/>
     </w:pPr>
     <w:rPr>
       <w:rFonts w:ascii="Times New Roman" w:eastAsia="Times New Roman" w:hAnsi="Times New Roman"/>
       <w:color w:val="000000"/>
-      <w:sz w:val="24"/>
+      <w:sz w:val="26"/>
     </w:rPr>
   </w:style>
   <w:style w:customStyle="1" w:styleId="Figure" w:type="paragraph">
     <w:name w:val="Figure"/>
     <w:basedOn w:val="Normal"/>
     <w:pPr>
-      <w:spacing w:line="276" w:lineRule="auto"/>
+      <w:spacing w:line="360" w:lineRule="auto"/>
       <w:jc w:val="both"/>
     </w:pPr>
     <w:rPr>
       <w:rFonts w:ascii="Times New Roman" w:eastAsia="Times New Roman" w:hAnsi="Times New Roman"/>
       <w:color w:val="000000"/>
-      <w:sz w:val="24"/>
+      <w:sz w:val="26"/>
     </w:rPr>
   </w:style>
   <w:style w:customStyle="1" w:styleId="CaptionedFigure" w:type="paragraph">
@@ -22038,13 +22122,13 @@
     <w:basedOn w:val="Figure"/>
     <w:pPr>
       <w:keepNext/>
-      <w:spacing w:line="276" w:lineRule="auto"/>
+      <w:spacing w:line="360" w:lineRule="auto"/>
       <w:jc w:val="both"/>
     </w:pPr>
     <w:rPr>
       <w:rFonts w:ascii="Times New Roman" w:eastAsia="Times New Roman" w:hAnsi="Times New Roman"/>
       <w:color w:val="000000"/>
-      <w:sz w:val="24"/>
+      <w:sz w:val="26"/>
     </w:rPr>
   </w:style>
   <w:style w:customStyle="1" w:styleId="BodyTextChar" w:type="character">
@@ -22054,7 +22138,7 @@
     <w:rPr>
       <w:rFonts w:ascii="Times New Roman" w:eastAsia="Times New Roman" w:hAnsi="Times New Roman"/>
       <w:color w:val="000000"/>
-      <w:sz w:val="24"/>
+      <w:sz w:val="26"/>
     </w:rPr>
   </w:style>
   <w:style w:customStyle="1" w:styleId="VerbatimChar" w:type="character">
@@ -22063,7 +22147,7 @@
     <w:rPr>
       <w:rFonts w:ascii="Times New Roman" w:eastAsia="Times New Roman" w:hAnsi="Times New Roman"/>
       <w:color w:val="000000"/>
-      <w:sz w:val="24"/>
+      <w:sz w:val="26"/>
     </w:rPr>
   </w:style>
   <w:style w:customStyle="1" w:styleId="SectionNumber" w:type="character">
@@ -22072,7 +22156,7 @@
     <w:rPr>
       <w:rFonts w:ascii="Times New Roman" w:eastAsia="Times New Roman" w:hAnsi="Times New Roman"/>
       <w:color w:val="000000"/>
-      <w:sz w:val="24"/>
+      <w:sz w:val="26"/>
     </w:rPr>
   </w:style>
   <w:style w:styleId="FootnoteReference" w:type="character">
@@ -22081,7 +22165,7 @@
     <w:rPr>
       <w:rFonts w:ascii="Times New Roman" w:eastAsia="Times New Roman" w:hAnsi="Times New Roman"/>
       <w:color w:val="000000"/>
-      <w:sz w:val="24"/>
+      <w:sz w:val="26"/>
       <w:vertAlign w:val="superscript"/>
     </w:rPr>
   </w:style>
@@ -22091,7 +22175,7 @@
     <w:rPr>
       <w:rFonts w:ascii="Times New Roman" w:eastAsia="Times New Roman" w:hAnsi="Times New Roman"/>
       <w:color w:val="000000"/>
-      <w:sz w:val="24"/>
+      <w:sz w:val="26"/>
     </w:rPr>
   </w:style>
   <w:style w:styleId="TOCHeading" w:type="paragraph">
@@ -22102,7 +22186,7 @@
     <w:unhideWhenUsed/>
     <w:qFormat/>
     <w:pPr>
-      <w:spacing w:before="240" w:line="276" w:lineRule="auto"/>
+      <w:spacing w:before="240" w:line="360" w:lineRule="auto"/>
       <w:jc w:val="both"/>
       <w:outlineLvl w:val="9"/>
     </w:pPr>
@@ -22111,7 +22195,7 @@
       <w:b w:val="0"/>
       <w:bCs w:val="0"/>
       <w:color w:val="000000"/>
-      <w:sz w:val="24"/>
+      <w:sz w:val="26"/>
     </w:rPr>
   </w:style>
   <w:style w:type="paragraph" w:customStyle="1" w:styleId="SourceCode">

</xml_diff>

<commit_message>
fix(thesis): correct "bắt buộc" typo, malformed table cells, thousands sep
- "tắt buộc" -> "bắt buộc" (18×, CĐ2 forced-internationalization passages)
- repair 30 table cells corrupted to "|, " by the earlier em-dash→comma
  pass, restored as "| - |" N/A markers (CĐ1, CĐ2, ch3, ch4)
- Vietnamese-context thousands 84,910/42,396 -> 84.910/42.396 (English
  abstract and APA references keep comma)
- rebuild affected docx+PDF and refresh CTU docx

https://claude.ai/code/session_01TqgqRfCDLY39798jcQXCr9
</commit_message>
<xml_diff>
--- a/dist/chuyen_de_1/00_cd1_ctu_final_vi.docx
+++ b/dist/chuyen_de_1/00_cd1_ctu_final_vi.docx
@@ -2079,7 +2079,7 @@
               <w:jc w:val="left"/>
             </w:pPr>
             <w:r>
-              <w:t xml:space="preserve">,</w:t>
+              <w:t xml:space="preserve">-</w:t>
             </w:r>
           </w:p>
         </w:tc>
@@ -3827,7 +3827,7 @@
               <w:jc w:val="left"/>
             </w:pPr>
             <w:r>
-              <w:t xml:space="preserve">,</w:t>
+              <w:t xml:space="preserve">-</w:t>
             </w:r>
           </w:p>
         </w:tc>
@@ -7630,19 +7630,19 @@
               <w:jc w:val="left"/>
             </w:pPr>
             <w:r>
-              <w:t xml:space="preserve">,</w:t>
-            </w:r>
-          </w:p>
-        </w:tc>
-        <w:tc>
-          <w:tcPr/>
-          <w:p>
-            <w:pPr>
-              <w:pStyle w:val="Compact"/>
-              <w:jc w:val="left"/>
-            </w:pPr>
-            <w:r>
-              <w:t xml:space="preserve">,</w:t>
+              <w:t xml:space="preserve">-</w:t>
+            </w:r>
+          </w:p>
+        </w:tc>
+        <w:tc>
+          <w:tcPr/>
+          <w:p>
+            <w:pPr>
+              <w:pStyle w:val="Compact"/>
+              <w:jc w:val="left"/>
+            </w:pPr>
+            <w:r>
+              <w:t xml:space="preserve">-</w:t>
             </w:r>
           </w:p>
         </w:tc>
@@ -7722,19 +7722,19 @@
               <w:jc w:val="left"/>
             </w:pPr>
             <w:r>
-              <w:t xml:space="preserve">,</w:t>
-            </w:r>
-          </w:p>
-        </w:tc>
-        <w:tc>
-          <w:tcPr/>
-          <w:p>
-            <w:pPr>
-              <w:pStyle w:val="Compact"/>
-              <w:jc w:val="left"/>
-            </w:pPr>
-            <w:r>
-              <w:t xml:space="preserve">,</w:t>
+              <w:t xml:space="preserve">-</w:t>
+            </w:r>
+          </w:p>
+        </w:tc>
+        <w:tc>
+          <w:tcPr/>
+          <w:p>
+            <w:pPr>
+              <w:pStyle w:val="Compact"/>
+              <w:jc w:val="left"/>
+            </w:pPr>
+            <w:r>
+              <w:t xml:space="preserve">-</w:t>
             </w:r>
           </w:p>
         </w:tc>
@@ -8112,19 +8112,19 @@
               <w:jc w:val="left"/>
             </w:pPr>
             <w:r>
-              <w:t xml:space="preserve">,</w:t>
-            </w:r>
-          </w:p>
-        </w:tc>
-        <w:tc>
-          <w:tcPr/>
-          <w:p>
-            <w:pPr>
-              <w:pStyle w:val="Compact"/>
-              <w:jc w:val="left"/>
-            </w:pPr>
-            <w:r>
-              <w:t xml:space="preserve">,</w:t>
+              <w:t xml:space="preserve">-</w:t>
+            </w:r>
+          </w:p>
+        </w:tc>
+        <w:tc>
+          <w:tcPr/>
+          <w:p>
+            <w:pPr>
+              <w:pStyle w:val="Compact"/>
+              <w:jc w:val="left"/>
+            </w:pPr>
+            <w:r>
+              <w:t xml:space="preserve">-</w:t>
             </w:r>
           </w:p>
         </w:tc>
@@ -14716,19 +14716,19 @@
               <w:jc w:val="left"/>
             </w:pPr>
             <w:r>
-              <w:t xml:space="preserve">,</w:t>
-            </w:r>
-          </w:p>
-        </w:tc>
-        <w:tc>
-          <w:tcPr/>
-          <w:p>
-            <w:pPr>
-              <w:pStyle w:val="Compact"/>
-              <w:jc w:val="left"/>
-            </w:pPr>
-            <w:r>
-              <w:t xml:space="preserve">,</w:t>
+              <w:t xml:space="preserve">-</w:t>
+            </w:r>
+          </w:p>
+        </w:tc>
+        <w:tc>
+          <w:tcPr/>
+          <w:p>
+            <w:pPr>
+              <w:pStyle w:val="Compact"/>
+              <w:jc w:val="left"/>
+            </w:pPr>
+            <w:r>
+              <w:t xml:space="preserve">-</w:t>
             </w:r>
           </w:p>
         </w:tc>
@@ -14782,19 +14782,19 @@
               <w:jc w:val="left"/>
             </w:pPr>
             <w:r>
-              <w:t xml:space="preserve">,</w:t>
-            </w:r>
-          </w:p>
-        </w:tc>
-        <w:tc>
-          <w:tcPr/>
-          <w:p>
-            <w:pPr>
-              <w:pStyle w:val="Compact"/>
-              <w:jc w:val="left"/>
-            </w:pPr>
-            <w:r>
-              <w:t xml:space="preserve">,</w:t>
+              <w:t xml:space="preserve">-</w:t>
+            </w:r>
+          </w:p>
+        </w:tc>
+        <w:tc>
+          <w:tcPr/>
+          <w:p>
+            <w:pPr>
+              <w:pStyle w:val="Compact"/>
+              <w:jc w:val="left"/>
+            </w:pPr>
+            <w:r>
+              <w:t xml:space="preserve">-</w:t>
             </w:r>
           </w:p>
         </w:tc>
@@ -15825,7 +15825,7 @@
         <w:t xml:space="preserve">Asian Development Review, 43</w:t>
       </w:r>
       <w:r>
-        <w:t xml:space="preserve">(1), 37-75), panel 4.293 doanh nghiệp Ấn Độ 2006-2019: FDI là kênh lan tỏa ngang quan trọng nhất; doanh nghiệp lớn thu nhận lan tỏa nhiều hơn; FDI tăng từ 1,705 triệu USD (1990-2000) lên 42,396 triệu USD (2012-2022); R&amp;D trì trệ ở 0,7% GDP.</w:t>
+        <w:t xml:space="preserve">(1), 37-75), panel 4.293 doanh nghiệp Ấn Độ 2006-2019: FDI là kênh lan tỏa ngang quan trọng nhất; doanh nghiệp lớn thu nhận lan tỏa nhiều hơn; FDI tăng từ 1,705 triệu USD (1990-2000) lên 42.396 triệu USD (2012-2022); R&amp;D trì trệ ở 0,7% GDP.</w:t>
       </w:r>
     </w:p>
     <w:bookmarkEnd w:id="62"/>

</xml_diff>

<commit_message>
build(dist): refresh deliverables after review pass
https://claude.ai/code/session_01TqgqRfCDLY39798jcQXCr9
</commit_message>
<xml_diff>
--- a/dist/chuyen_de_1/00_cd1_ctu_final_vi.docx
+++ b/dist/chuyen_de_1/00_cd1_ctu_final_vi.docx
@@ -403,7 +403,7 @@
           <w:bCs/>
           <w:b/>
         </w:rPr>
-        <w:t xml:space="preserve">101,185 firms · 108 country-year pairs · 14 survey waves</w:t>
+        <w:t xml:space="preserve">101,185 firms, 108 country-year pairs, 14 survey waves</w:t>
       </w:r>
       <w:r>
         <w:t xml:space="preserve"> </w:t>
@@ -8850,7 +8850,7 @@
               <w:jc w:val="left"/>
             </w:pPr>
             <w:r>
-              <w:t xml:space="preserve">(gợi ý, §2.3.5.2 rào cản #1)</w:t>
+              <w:t xml:space="preserve">(gợi ý, Mục 2.3.5.2 rào cản #1)</w:t>
             </w:r>
           </w:p>
         </w:tc>
@@ -8915,7 +8915,7 @@
               <w:jc w:val="left"/>
             </w:pPr>
             <w:r>
-              <w:t xml:space="preserve">§2.3.5.2 rào cản #4</w:t>
+              <w:t xml:space="preserve">Mục 2.3.5.2 rào cản #4</w:t>
             </w:r>
           </w:p>
         </w:tc>
@@ -8986,7 +8986,7 @@
               <w:jc w:val="left"/>
             </w:pPr>
             <w:r>
-              <w:t xml:space="preserve">FSTS đã đo §2.3.3</w:t>
+              <w:t xml:space="preserve">FSTS đã đo Mục 2.3.3</w:t>
             </w:r>
           </w:p>
         </w:tc>
@@ -9066,7 +9066,7 @@
               <w:jc w:val="left"/>
             </w:pPr>
             <w:r>
-              <w:t xml:space="preserve">§2.3.6.2</w:t>
+              <w:t xml:space="preserve">Mục 2.3.6.2</w:t>
             </w:r>
           </w:p>
         </w:tc>
@@ -17397,7 +17397,7 @@
         <w:t xml:space="preserve">Cảnh báo schema BREADY 2025</w:t>
       </w:r>
       <w:r>
-        <w:t xml:space="preserve">: Bảng 2.3.8.1 có thể bị nhiễu hiệu ứng schema, cần kiểm chứng qua hệ thống phòng thủ ba tầng (§2.2) trước khi suy diễn nhân quả.</w:t>
+        <w:t xml:space="preserve">: Bảng 2.3.8.1 có thể bị nhiễu hiệu ứng schema, cần kiểm chứng qua hệ thống phòng thủ ba tầng (Mục 2.2) trước khi suy diễn nhân quả.</w:t>
       </w:r>
     </w:p>
     <w:bookmarkEnd w:id="67"/>
@@ -18267,7 +18267,7 @@
         <w:t xml:space="preserve"> </w:t>
       </w:r>
       <w:r>
-        <w:t xml:space="preserve">(đang phát triển). Hệ số âm DAI Advanced (-0,129) là tạo phẩm bão hòa Tier-1, xem kiểm định loại trừ ICT tại §2.3.4.3.</w:t>
+        <w:t xml:space="preserve">(đang phát triển). Hệ số âm DAI Advanced (-0,129) là tạo phẩm bão hòa Tier-1, xem kiểm định loại trừ ICT tại Mục 2.3.4.3.</w:t>
       </w:r>
     </w:p>
     <w:p>
@@ -19278,7 +19278,7 @@
         <w:t xml:space="preserve">(8) Kiểm định ranh giới schema</w:t>
       </w:r>
       <w:r>
-        <w:t xml:space="preserve">: Hệ thống phòng thủ ba tầng tại §2.2, điều kiện tiên quyết trước khi báo cáo BREADY 2025 như bằng chứng nhân quả.</w:t>
+        <w:t xml:space="preserve">: Hệ thống phòng thủ ba tầng tại Mục 2.2, điều kiện tiên quyết trước khi báo cáo BREADY 2025 như bằng chứng nhân quả.</w:t>
       </w:r>
     </w:p>
     <w:p>
@@ -21065,7 +21065,7 @@
         <w:pStyle w:val="BodyText"/>
       </w:pPr>
       <w:r>
-        <w:t xml:space="preserve">Hệ thống phòng thủ ba tầng (§2.2) đảm bảo kết quả từ BREADY 2025 không bị nhiễu hiệu ứng schema.</w:t>
+        <w:t xml:space="preserve">Hệ thống phòng thủ ba tầng (Mục 2.2) đảm bảo kết quả từ BREADY 2025 không bị nhiễu hiệu ứng schema.</w:t>
       </w:r>
     </w:p>
     <w:p>

</xml_diff>

<commit_message>
build(dist): rebuild deliverables after ✓/✗ conversion
https://claude.ai/code/session_01TqgqRfCDLY39798jcQXCr9
</commit_message>
<xml_diff>
--- a/dist/chuyen_de_1/00_cd1_ctu_final_vi.docx
+++ b/dist/chuyen_de_1/00_cd1_ctu_final_vi.docx
@@ -5860,7 +5860,7 @@
               <w:jc w:val="center"/>
             </w:pPr>
             <w:r>
-              <w:t xml:space="preserve">✓</w:t>
+              <w:t xml:space="preserve">Có</w:t>
             </w:r>
           </w:p>
         </w:tc>
@@ -5872,7 +5872,7 @@
               <w:jc w:val="center"/>
             </w:pPr>
             <w:r>
-              <w:t xml:space="preserve">✓</w:t>
+              <w:t xml:space="preserve">Có</w:t>
             </w:r>
           </w:p>
         </w:tc>
@@ -5884,7 +5884,7 @@
               <w:jc w:val="center"/>
             </w:pPr>
             <w:r>
-              <w:t xml:space="preserve">✓</w:t>
+              <w:t xml:space="preserve">Có</w:t>
             </w:r>
           </w:p>
         </w:tc>
@@ -5938,7 +5938,7 @@
               <w:jc w:val="center"/>
             </w:pPr>
             <w:r>
-              <w:t xml:space="preserve">✓</w:t>
+              <w:t xml:space="preserve">Có</w:t>
             </w:r>
           </w:p>
         </w:tc>
@@ -5950,7 +5950,7 @@
               <w:jc w:val="center"/>
             </w:pPr>
             <w:r>
-              <w:t xml:space="preserve">✓</w:t>
+              <w:t xml:space="preserve">Có</w:t>
             </w:r>
           </w:p>
         </w:tc>
@@ -5962,7 +5962,7 @@
               <w:jc w:val="center"/>
             </w:pPr>
             <w:r>
-              <w:t xml:space="preserve">⚠</w:t>
+              <w:t xml:space="preserve">Một phần</w:t>
             </w:r>
             <w:r>
               <w:t xml:space="preserve"> </w:t>
@@ -6026,7 +6026,7 @@
               <w:jc w:val="center"/>
             </w:pPr>
             <w:r>
-              <w:t xml:space="preserve">✗</w:t>
+              <w:t xml:space="preserve">Không</w:t>
             </w:r>
           </w:p>
         </w:tc>
@@ -6038,7 +6038,7 @@
               <w:jc w:val="center"/>
             </w:pPr>
             <w:r>
-              <w:t xml:space="preserve">✗</w:t>
+              <w:t xml:space="preserve">Không</w:t>
             </w:r>
           </w:p>
         </w:tc>
@@ -6050,7 +6050,7 @@
               <w:jc w:val="center"/>
             </w:pPr>
             <w:r>
-              <w:t xml:space="preserve">⚠-✗</w:t>
+              <w:t xml:space="preserve">Một phần/Không</w:t>
             </w:r>
           </w:p>
         </w:tc>

</xml_diff>

<commit_message>
build: rebuild parallel dist packages from canonical source (G2 numbers)
Rebuilds dist/luan_an/, dist/luan_an_ctu/ (incl. merged LUAN_AN_FULL_vi),
dist/chuyen_de_1/, and dist/manuscripts/ (EN+VI) DOCX from the updated source,
and syncs the tracked dist source_md copies' headline figures. All carry the
P7 geographical-Asia (G2) numbers and concavity reframing.

https://claude.ai/code/session_01TNqoRFY1vAVQL6GWg8X9M3
</commit_message>
<xml_diff>
--- a/dist/chuyen_de_1/00_cd1_ctu_final_vi.docx
+++ b/dist/chuyen_de_1/00_cd1_ctu_final_vi.docx
@@ -318,13 +318,26 @@
           <w:bCs/>
           <w:b/>
         </w:rPr>
-        <w:t xml:space="preserve">chi phí buộc phải quốc tế hóa</w:t>
-      </w:r>
-      <w:r>
-        <w:t xml:space="preserve"> </w:t>
-      </w:r>
-      <w:r>
-        <w:t xml:space="preserve">ở 7 SIDS Thái Bình Dương, đóng góp định hướng cho luận án và Chuyên đề tiến sĩ số 2.</w:t>
+        <w:t xml:space="preserve">gánh nặng quốc tế hóa bắt buộc (Forced Internationalization Penalty — FIP)</w:t>
+      </w:r>
+      <w:r>
+        <w:t xml:space="preserve"> </w:t>
+      </w:r>
+      <w:r>
+        <w:t xml:space="preserve">ở 7 SIDS Thái Bình Dương. Đọc tổng thể, bảy tiểu cảnh không phải các trường hợp rời rạc mà là các vùng trên một</w:t>
+      </w:r>
+      <w:r>
+        <w:t xml:space="preserve"> </w:t>
+      </w:r>
+      <w:r>
+        <w:rPr>
+          <w:bCs/>
+          <w:b/>
+        </w:rPr>
+        <w:t xml:space="preserve">bản đồ địa hình xuất khẩu chiến lược (strategic export topography)</w:t>
+      </w:r>
+      <w:r>
+        <w:t xml:space="preserve">, trên đó chế độ thể chế ICRV vận hành như một bộ lọc chi phí giao dịch định vị nơi hiệu quả quốc tế hóa đạt đỉnh hay sụp đổ; phát hiện này đóng góp định hướng cho luận án và Chuyên đề tiến sĩ số 2.</w:t>
       </w:r>
     </w:p>
     <w:p>
@@ -6980,7 +6993,7 @@
               <w:t xml:space="preserve"> </w:t>
             </w:r>
             <w:r>
-              <w:t xml:space="preserve">| Advanced, innovation-driven | Singapore, Hong Kong SAR, Hàn Quốc, Đài Loan, Israel | ~4.220 |</w:t>
+              <w:t xml:space="preserve">| Advanced, innovation-driven | Singapore, Hong Kong SAR, Hàn Quốc, Đài Loan, Israel | ~4.708 |</w:t>
             </w:r>
             <w:r>
               <w:t xml:space="preserve"> </w:t>
@@ -7146,7 +7159,7 @@
                 <w:iCs/>
                 <w:i/>
               </w:rPr>
-              <w:t xml:space="preserve">Ghi chú: n_firms là phân bố xấp xỉ theo pool 101.185; tổng 5 nhóm chính (I-V) = 99.814 (phạm vi chính 41 nước châu Á); SIDS Nhóm VI = 1.371 (1,4% pool).</w:t>
+              <w:t xml:space="preserve">Ghi chú: n_firms là phân bố theo pool 101.185; tổng 5 nhóm chính (I-V) = 99.814 (phạm vi chính 41 nước châu Á); SIDS Nhóm VI = 1.371 (1,4% pool). Nhóm Advanced (I + II = 6.640) lấy từ pool WBES đã hài hòa hóa; tỷ lệ innovation/resource là xấp xỉ, hao hụt do thiếu dữ liệu năng suất chi tiết ở Bảng 2.3.3.1 (mẫu phân tích Advanced gộp = 5.921).</w:t>
             </w:r>
           </w:p>
         </w:tc>
@@ -15173,7 +15186,7 @@
         <w:t xml:space="preserve"> </w:t>
       </w:r>
       <w:r>
-        <w:t xml:space="preserve">× DAI = 3,119 (p = 0,005); điểm uốn ~88,6%.</w:t>
+        <w:t xml:space="preserve">× DAI = 3,119 (p = 0,005); điểm uốn ~82%.</w:t>
       </w:r>
     </w:p>
     <w:p>
@@ -18715,7 +18728,7 @@
         <w:t xml:space="preserve">KL1, Phi tuyến xuyên chế độ thể chế là quy luật</w:t>
       </w:r>
       <w:r>
-        <w:t xml:space="preserve">: U ngược tại Emerging (Việt Nam điểm uốn 39-46%; Trung Quốc điểm uốn 47-49%); gần tuyến tính tại Advanced (Singapore điểm uốn 88,6%); chi phí buộc phải tại SIDS.</w:t>
+        <w:t xml:space="preserve">: U ngược tại Emerging (Việt Nam điểm uốn 39-46%; Trung Quốc điểm uốn 47-49%); gần tuyến tính tại Advanced (Singapore điểm uốn 82%); chi phí buộc phải tại SIDS.</w:t>
       </w:r>
     </w:p>
     <w:p>
@@ -21682,7 +21695,7 @@
     <w:name w:val="Normal"/>
     <w:qFormat/>
     <w:pPr>
-      <w:spacing w:line="360" w:lineRule="auto"/>
+      <w:spacing w:line="288" w:lineRule="auto"/>
       <w:jc w:val="both"/>
     </w:pPr>
     <w:rPr>
@@ -21696,7 +21709,7 @@
     <w:basedOn w:val="Normal"/>
     <w:link w:val="BodyTextChar"/>
     <w:pPr>
-      <w:spacing w:after="180" w:before="180" w:line="360" w:lineRule="auto"/>
+      <w:spacing w:after="180" w:before="180" w:line="288" w:lineRule="auto"/>
       <w:jc w:val="both"/>
     </w:pPr>
     <w:qFormat/>
@@ -21712,7 +21725,7 @@
     <w:next w:val="BodyText"/>
     <w:qFormat/>
     <w:pPr>
-      <w:spacing w:line="360" w:lineRule="auto"/>
+      <w:spacing w:line="288" w:lineRule="auto"/>
       <w:jc w:val="both"/>
     </w:pPr>
     <w:rPr>
@@ -21726,7 +21739,7 @@
     <w:basedOn w:val="BodyText"/>
     <w:qFormat/>
     <w:pPr>
-      <w:spacing w:after="36" w:before="36" w:line="360" w:lineRule="auto"/>
+      <w:spacing w:after="36" w:before="36" w:line="288" w:lineRule="auto"/>
       <w:jc w:val="both"/>
     </w:pPr>
     <w:rPr>
@@ -21743,7 +21756,7 @@
     <w:pPr>
       <w:keepNext/>
       <w:keepLines/>
-      <w:spacing w:after="240" w:before="480" w:line="360" w:lineRule="auto"/>
+      <w:spacing w:after="240" w:before="480" w:line="288" w:lineRule="auto"/>
       <w:jc w:val="both"/>
     </w:pPr>
     <w:rPr>
@@ -21763,7 +21776,7 @@
     <w:pPr>
       <w:keepNext/>
       <w:keepLines/>
-      <w:spacing w:after="240" w:before="240" w:line="360" w:lineRule="auto"/>
+      <w:spacing w:after="240" w:before="240" w:line="288" w:lineRule="auto"/>
       <w:jc w:val="both"/>
     </w:pPr>
     <w:rPr>
@@ -21780,7 +21793,7 @@
     <w:pPr>
       <w:keepNext/>
       <w:keepLines/>
-      <w:spacing w:line="360" w:lineRule="auto"/>
+      <w:spacing w:line="288" w:lineRule="auto"/>
       <w:jc w:val="both"/>
     </w:pPr>
     <w:rPr>
@@ -21796,7 +21809,7 @@
     <w:pPr>
       <w:keepNext/>
       <w:keepLines/>
-      <w:spacing w:line="360" w:lineRule="auto"/>
+      <w:spacing w:line="288" w:lineRule="auto"/>
       <w:jc w:val="both"/>
     </w:pPr>
     <w:rPr>
@@ -21814,7 +21827,7 @@
       <w:keepNext/>
       <w:keepLines/>
       <w:jc w:val="both"/>
-      <w:spacing w:after="0" w:before="300" w:line="360" w:lineRule="auto"/>
+      <w:spacing w:after="0" w:before="300" w:line="288" w:lineRule="auto"/>
     </w:pPr>
     <w:rPr>
       <w:color w:val="000000"/>
@@ -21832,7 +21845,7 @@
     <w:pPr>
       <w:keepNext/>
       <w:keepLines/>
-      <w:spacing w:after="300" w:before="100" w:line="360" w:lineRule="auto"/>
+      <w:spacing w:after="300" w:before="100" w:line="288" w:lineRule="auto"/>
       <w:jc w:val="both"/>
     </w:pPr>
     <w:rPr>
@@ -21848,7 +21861,7 @@
     <w:next w:val="Bibliography"/>
     <w:qFormat/>
     <w:pPr>
-      <w:spacing w:line="360" w:lineRule="auto"/>
+      <w:spacing w:line="288" w:lineRule="auto"/>
       <w:jc w:val="both"/>
     </w:pPr>
     <w:rPr>
@@ -21866,7 +21879,7 @@
     <w:pPr>
       <w:keepNext/>
       <w:keepLines/>
-      <w:spacing w:after="0" w:before="480" w:line="360" w:lineRule="auto"/>
+      <w:spacing w:after="0" w:before="480" w:line="288" w:lineRule="auto"/>
       <w:jc w:val="both"/>
       <w:outlineLvl w:val="0"/>
     </w:pPr>
@@ -21889,7 +21902,7 @@
     <w:pPr>
       <w:keepNext/>
       <w:keepLines/>
-      <w:spacing w:after="0" w:before="200" w:line="360" w:lineRule="auto"/>
+      <w:spacing w:after="0" w:before="200" w:line="288" w:lineRule="auto"/>
       <w:jc w:val="both"/>
       <w:outlineLvl w:val="1"/>
     </w:pPr>
@@ -21912,7 +21925,7 @@
     <w:pPr>
       <w:keepNext/>
       <w:keepLines/>
-      <w:spacing w:after="0" w:before="200" w:line="360" w:lineRule="auto"/>
+      <w:spacing w:after="0" w:before="200" w:line="288" w:lineRule="auto"/>
       <w:jc w:val="both"/>
       <w:outlineLvl w:val="2"/>
     </w:pPr>
@@ -21935,7 +21948,7 @@
     <w:pPr>
       <w:keepNext/>
       <w:keepLines/>
-      <w:spacing w:after="0" w:before="200" w:line="360" w:lineRule="auto"/>
+      <w:spacing w:after="0" w:before="200" w:line="288" w:lineRule="auto"/>
       <w:jc w:val="both"/>
       <w:outlineLvl w:val="3"/>
     </w:pPr>
@@ -21958,7 +21971,7 @@
     <w:pPr>
       <w:keepNext/>
       <w:keepLines/>
-      <w:spacing w:after="0" w:before="200" w:line="360" w:lineRule="auto"/>
+      <w:spacing w:after="0" w:before="200" w:line="288" w:lineRule="auto"/>
       <w:jc w:val="both"/>
       <w:outlineLvl w:val="4"/>
     </w:pPr>
@@ -21980,7 +21993,7 @@
     <w:pPr>
       <w:keepNext/>
       <w:keepLines/>
-      <w:spacing w:after="0" w:before="200" w:line="360" w:lineRule="auto"/>
+      <w:spacing w:after="0" w:before="200" w:line="288" w:lineRule="auto"/>
       <w:jc w:val="both"/>
       <w:outlineLvl w:val="5"/>
     </w:pPr>
@@ -22001,7 +22014,7 @@
     <w:pPr>
       <w:keepNext/>
       <w:keepLines/>
-      <w:spacing w:after="0" w:before="200" w:line="360" w:lineRule="auto"/>
+      <w:spacing w:after="0" w:before="200" w:line="288" w:lineRule="auto"/>
       <w:jc w:val="both"/>
       <w:outlineLvl w:val="6"/>
     </w:pPr>
@@ -22022,7 +22035,7 @@
     <w:pPr>
       <w:keepNext/>
       <w:keepLines/>
-      <w:spacing w:after="0" w:before="200" w:line="360" w:lineRule="auto"/>
+      <w:spacing w:after="0" w:before="200" w:line="288" w:lineRule="auto"/>
       <w:jc w:val="both"/>
       <w:outlineLvl w:val="7"/>
     </w:pPr>
@@ -22043,7 +22056,7 @@
     <w:pPr>
       <w:keepNext/>
       <w:keepLines/>
-      <w:spacing w:after="0" w:before="200" w:line="360" w:lineRule="auto"/>
+      <w:spacing w:after="0" w:before="200" w:line="288" w:lineRule="auto"/>
       <w:jc w:val="both"/>
       <w:outlineLvl w:val="8"/>
     </w:pPr>
@@ -22062,7 +22075,7 @@
     <w:unhideWhenUsed/>
     <w:qFormat/>
     <w:pPr>
-      <w:spacing w:after="100" w:before="100" w:line="360" w:lineRule="auto"/>
+      <w:spacing w:after="100" w:before="100" w:line="288" w:lineRule="auto"/>
       <w:ind w:firstLine="0" w:left="480" w:right="480"/>
       <w:jc w:val="both"/>
     </w:pPr>
@@ -22080,7 +22093,7 @@
     <w:unhideWhenUsed/>
     <w:qFormat/>
     <w:pPr>
-      <w:spacing w:line="360" w:lineRule="auto"/>
+      <w:spacing w:line="288" w:lineRule="auto"/>
       <w:jc w:val="both"/>
     </w:pPr>
     <w:rPr>
@@ -22106,7 +22119,7 @@
     <w:unhideWhenUsed/>
     <w:qFormat/>
     <w:pPr>
-      <w:spacing w:line="360" w:lineRule="auto"/>
+      <w:spacing w:line="288" w:lineRule="auto"/>
       <w:jc w:val="both"/>
     </w:pPr>
     <w:rPr>
@@ -22146,7 +22159,7 @@
     <w:pPr>
       <w:keepNext/>
       <w:keepLines/>
-      <w:spacing w:after="0" w:line="360" w:lineRule="auto"/>
+      <w:spacing w:after="0" w:line="288" w:lineRule="auto"/>
       <w:jc w:val="both"/>
     </w:pPr>
     <w:rPr>
@@ -22160,7 +22173,7 @@
     <w:name w:val="Definition"/>
     <w:basedOn w:val="Normal"/>
     <w:pPr>
-      <w:spacing w:line="360" w:lineRule="auto"/>
+      <w:spacing w:line="288" w:lineRule="auto"/>
       <w:jc w:val="both"/>
     </w:pPr>
     <w:rPr>
@@ -22174,7 +22187,7 @@
     <w:basedOn w:val="Normal"/>
     <w:link w:val="BodyTextChar"/>
     <w:pPr>
-      <w:spacing w:after="120" w:before="0" w:line="360" w:lineRule="auto"/>
+      <w:spacing w:after="120" w:before="0" w:line="288" w:lineRule="auto"/>
       <w:jc w:val="both"/>
     </w:pPr>
     <w:rPr>
@@ -22189,7 +22202,7 @@
     <w:basedOn w:val="Caption"/>
     <w:pPr>
       <w:keepNext/>
-      <w:spacing w:line="360" w:lineRule="auto"/>
+      <w:spacing w:line="288" w:lineRule="auto"/>
       <w:jc w:val="both"/>
     </w:pPr>
     <w:rPr>
@@ -22202,7 +22215,7 @@
     <w:name w:val="Image Caption"/>
     <w:basedOn w:val="Caption"/>
     <w:pPr>
-      <w:spacing w:line="360" w:lineRule="auto"/>
+      <w:spacing w:line="288" w:lineRule="auto"/>
       <w:jc w:val="both"/>
     </w:pPr>
     <w:rPr>
@@ -22215,7 +22228,7 @@
     <w:name w:val="Figure"/>
     <w:basedOn w:val="Normal"/>
     <w:pPr>
-      <w:spacing w:line="360" w:lineRule="auto"/>
+      <w:spacing w:line="288" w:lineRule="auto"/>
       <w:jc w:val="both"/>
     </w:pPr>
     <w:rPr>
@@ -22229,7 +22242,7 @@
     <w:basedOn w:val="Figure"/>
     <w:pPr>
       <w:keepNext/>
-      <w:spacing w:line="360" w:lineRule="auto"/>
+      <w:spacing w:line="288" w:lineRule="auto"/>
       <w:jc w:val="both"/>
     </w:pPr>
     <w:rPr>
@@ -22293,7 +22306,7 @@
     <w:unhideWhenUsed/>
     <w:qFormat/>
     <w:pPr>
-      <w:spacing w:before="240" w:line="360" w:lineRule="auto"/>
+      <w:spacing w:before="240" w:line="288" w:lineRule="auto"/>
       <w:jc w:val="both"/>
       <w:outlineLvl w:val="9"/>
     </w:pPr>

</xml_diff>

<commit_message>
refactor(P8): re-scope to 7 Pacific SIDS (drop Comoros+Timor-Leste); full re-analysis
Author decision: restrict to genuine Pacific Island SIDS on a definitional basis (Comoros is Indian
Ocean; Timor-Leste is a larger SE-Asian half-island), matching the monograph set. Re-ran the author's
own R pipeline (validated to reproduce the 9-economy manuscript exactly) on the 7-country subset.

P8 manuscripts (jid/world_development/ejdr, identical) fully rewritten: abstract, sample (959 firms,
seven economies), Table 1/2/3, all in-text coefficients, M1 FIP β=-1.339 p<.001, M3 TCI now a
significant level effect (+0.299, p=.003), bivariate/exporters now marginal/ns (selection claim
softened; FIP inference rests on FE models). Dissertation abstract + positioning doc -> seven Pacific
SIDS. CD1 data-update footnote added. 7-econ replication archived in p8/replication/reanalysis_7pacific.
docx rebuilt; em-dash-free.
</commit_message>
<xml_diff>
--- a/dist/chuyen_de_1/00_cd1_ctu_final_vi.docx
+++ b/dist/chuyen_de_1/00_cd1_ctu_final_vi.docx
@@ -250,7 +250,19 @@
     </w:p>
     <w:p>
       <w:pPr>
-        <w:pStyle w:val="BodyText"/>
+        <w:pStyle w:val="BlockText"/>
+      </w:pPr>
+      <w:r>
+        <w:rPr>
+          <w:iCs/>
+          <w:i/>
+        </w:rPr>
+        <w:t xml:space="preserve">Ghi chú dữ liệu: Số liệu tổng hợp nêu trong chuyên đề (101.185 doanh nghiệp · 47 nền kinh tế · 108 cặp quốc gia × năm) phản ánh bản khóa dữ liệu tại thời điểm thực hiện chuyên đề. Luận án tổng thể sử dụng bản khóa dữ liệu đã cập nhật (mẫu phân tích chính 91.982 doanh nghiệp · 49 nền kinh tế · 102 đợt quốc gia–năm) sau khi chuẩn hóa lại và xử lý trùng lặp dữ liệu panel; trường hợp biên SIDS gồm 7 nền kinh tế Thái Bình Dương.</w:t>
+      </w:r>
+    </w:p>
+    <w:p>
+      <w:pPr>
+        <w:pStyle w:val="FirstParagraph"/>
       </w:pPr>
       <w:r>
         <w:t xml:space="preserve">Phương pháp chủ đạo là thống kê mô tả đa chiều, kết hợp đồ thị, bảng so sánh xuyên quốc gia – xuyên ngành và phân tích hai biến. Hiệu quả hoạt động kinh doanh được tiếp cận theo bốn chiều: năng suất lao động, lợi nhuận và biên lợi nhuận, tăng trưởng, đổi mới sáng tạo và cấu trúc doanh nghiệp.</w:t>

</xml_diff>

<commit_message>
fix(consistency): harmonize ICRV terminology + robustness DV list (Fable-5)
Resolves review findings #08/#09 (text-only consistency), all anchored to a
source of truth, not arbitrary choice:

- #08 Robustness DV: thesis Ch2 §2.1.2 listed only 'ROS + sales growth'; align to
  the authoritative methodology Ch3 §3.5 (ROS, sales growth, employment growth,
  ln(sales)). This also reconciles CĐ1's employment-growth axis with the thesis.
- #09 ICRV gloss: CĐ1 said 'Biến thiên chế độ thể chế'; add 'bối cảnh' (3 places)
  to match the thesis prose 'Biến thiên chế độ bối cảnh thể chế' (Ch1/Ch2/Ch5).
- #09 ICRV expansion: internal files 09b_glossary + 09_standards carried a divergent
  expansion ('Institutional Capability-Resource Vitality'); align to the universal
  manuscript usage 'Institutional Context Regime Variation'.

4 files, 7 lines. No data/membership/group-label changes. CĐ1 docx regenerated;
consistency linter clean (0 issues).
</commit_message>
<xml_diff>
--- a/dist/chuyen_de_1/00_cd1_ctu_final_vi.docx
+++ b/dist/chuyen_de_1/00_cd1_ctu_final_vi.docx
@@ -263,7 +263,7 @@
         <w:t xml:space="preserve"> </w:t>
       </w:r>
       <w:r>
-        <w:t xml:space="preserve">với 6 phân nhóm con theo khung Biến thiên chế độ thể chế (ICRV): Advanced đổi mới sáng tạo dẫn dắt (5 nước), Advanced tài nguyên dẫn dắt (5 nước), trung bình cao (6 nước), đang nổi (7 nước), cận biên (17 nước), và SIDS Thái Bình Dương (7 nước, trường hợp biên mở rộng).</w:t>
+        <w:t xml:space="preserve">với 6 phân nhóm con theo khung Biến thiên chế độ bối cảnh thể chế (ICRV): Advanced đổi mới sáng tạo dẫn dắt (5 nước), Advanced tài nguyên dẫn dắt (5 nước), trung bình cao (6 nước), đang nổi (7 nước), cận biên (17 nước), và SIDS Thái Bình Dương (7 nước, trường hợp biên mở rộng).</w:t>
       </w:r>
     </w:p>
     <w:p>
@@ -2965,7 +2965,7 @@
               <w:jc w:val="left"/>
             </w:pPr>
             <w:r>
-              <w:t xml:space="preserve">Biến thiên chế độ thể chế</w:t>
+              <w:t xml:space="preserve">Biến thiên chế độ bối cảnh thể chế</w:t>
             </w:r>
           </w:p>
         </w:tc>
@@ -6733,7 +6733,7 @@
               <w:jc w:val="left"/>
             </w:pPr>
             <w:r>
-              <w:t xml:space="preserve">Châu Á không phải là một khối đồng nhất về thể chế. Các meta-analysis (Marano et al., 2016; Wu et al., 2022) đã ghi nhận rằng bối cảnh thể chế là biến điều tiết quan trọng nhất trong quan hệ quốc tế hóa → hiệu quả — nhưng không có nghiên cứu nào thiết lập hệ thống phân loại thể chế toàn diện cho 47 nền kinh tế châu Á. Khung phân loại ICRV (Institutional Context Regime Variation — Biến thiên chế độ thể chế) được đề xuất trong chuyên đề này nhằm lấp khoảng trống đó, dựa trên bốn nguyên tắc:</w:t>
+              <w:t xml:space="preserve">Châu Á không phải là một khối đồng nhất về thể chế. Các meta-analysis (Marano et al., 2016; Wu et al., 2022) đã ghi nhận rằng bối cảnh thể chế là biến điều tiết quan trọng nhất trong quan hệ quốc tế hóa → hiệu quả — nhưng không có nghiên cứu nào thiết lập hệ thống phân loại thể chế toàn diện cho 47 nền kinh tế châu Á. Khung phân loại ICRV (Institutional Context Regime Variation — Biến thiên chế độ bối cảnh thể chế) được đề xuất trong chuyên đề này nhằm lấp khoảng trống đó, dựa trên bốn nguyên tắc:</w:t>
             </w:r>
           </w:p>
         </w:tc>

</xml_diff>

<commit_message>
relock(cd1): pool headline → canonical 91.982/49 + 96.415/52, disclose descriptive pool 101.185 (I-08)
https://claude.ai/code/session_01Xumaoraa2DLWLXsgJJ62oq
</commit_message>
<xml_diff>
--- a/dist/chuyen_de_1/00_cd1_ctu_final_vi.docx
+++ b/dist/chuyen_de_1/00_cd1_ctu_final_vi.docx
@@ -231,39 +231,39 @@
         <w:t xml:space="preserve">2009–2025</w:t>
       </w:r>
       <w:r>
-        <w:t xml:space="preserve">, mở rộng so sánh với các quốc đảo nhỏ đang phát triển (SIDS) Thái Bình Dương như trường hợp biên. Cơ sở dữ liệu là tổng hợp dữ liệu vi mô gồm</w:t>
-      </w:r>
-      <w:r>
-        <w:t xml:space="preserve"> </w:t>
-      </w:r>
-      <w:r>
-        <w:rPr>
-          <w:bCs/>
-          <w:b/>
-        </w:rPr>
-        <w:t xml:space="preserve">101.185 doanh nghiệp, 108 cặp quốc gia × năm và 14 mốc khảo sát</w:t>
-      </w:r>
-      <w:r>
-        <w:t xml:space="preserve"> </w:t>
-      </w:r>
-      <w:r>
-        <w:t xml:space="preserve">từ World Bank Enterprise Surveys (WBES). Tổng hợp này kế thừa và mở rộng từ 17 nước châu Á mới nổi (~40.633 doanh nghiệp) đã được tác giả công bố trước đó (Đỗ &amp; Phan, 2026 — VEFR), bao trùm</w:t>
-      </w:r>
-      <w:r>
-        <w:t xml:space="preserve"> </w:t>
-      </w:r>
-      <w:r>
-        <w:rPr>
-          <w:bCs/>
-          <w:b/>
-        </w:rPr>
-        <w:t xml:space="preserve">47 nền kinh tế</w:t>
-      </w:r>
-      <w:r>
-        <w:t xml:space="preserve"> </w:t>
-      </w:r>
-      <w:r>
-        <w:t xml:space="preserve">với 6 phân nhóm con theo khung Biến thiên chế độ bối cảnh thể chế (ICRV): Advanced đổi mới sáng tạo dẫn dắt (5 nước), Advanced tài nguyên dẫn dắt (5 nước), trung bình cao (6 nước), đang nổi (7 nước), cận biên (17 nước), và SIDS Thái Bình Dương (7 nước, trường hợp biên mở rộng).</w:t>
+        <w:t xml:space="preserve">, mở rộng so sánh với các quốc đảo nhỏ đang phát triển (SIDS) Thái Bình Dương như trường hợp biên. Khung phân loại và phân tích được neo theo bản khóa canonical của luận án:</w:t>
+      </w:r>
+      <w:r>
+        <w:t xml:space="preserve"> </w:t>
+      </w:r>
+      <w:r>
+        <w:rPr>
+          <w:bCs/>
+          <w:b/>
+        </w:rPr>
+        <w:t xml:space="preserve">49 nền kinh tế</w:t>
+      </w:r>
+      <w:r>
+        <w:t xml:space="preserve"> </w:t>
+      </w:r>
+      <w:r>
+        <w:t xml:space="preserve">(khung phân tích 91.982 doanh nghiệp; pool phân loại 96.415 doanh nghiệp / 52 nền) với 6 phân nhóm con theo khung Biến thiên chế độ bối cảnh thể chế (ICRV): Advanced đổi mới sáng tạo dẫn dắt, Advanced tài nguyên dẫn dắt, trung bình cao, chuyển đổi thu nhập trung bình–thấp, đang nổi, và SIDS Thái Bình Dương (trường hợp biên mở rộng). Phần phân tích mô tả của chuyên đề (Bảng 2.3.3–2.3.8) được trình bày trên</w:t>
+      </w:r>
+      <w:r>
+        <w:t xml:space="preserve"> </w:t>
+      </w:r>
+      <w:r>
+        <w:rPr>
+          <w:bCs/>
+          <w:b/>
+        </w:rPr>
+        <w:t xml:space="preserve">pool mô tả rộng hơn gồm 101.185 doanh nghiệp · 47 nền · 108 cặp quốc gia × năm · 14 mốc khảo sát</w:t>
+      </w:r>
+      <w:r>
+        <w:t xml:space="preserve"> </w:t>
+      </w:r>
+      <w:r>
+        <w:t xml:space="preserve">từ World Bank Enterprise Surveys (WBES) theo bản khóa mô tả CĐ1, kế thừa và mở rộng từ 17 nước châu Á mới nổi (~40.633 doanh nghiệp) đã được tác giả công bố trước đó (Đỗ &amp; Phan, 2026 — VEFR).</w:t>
       </w:r>
     </w:p>
     <w:p>
@@ -275,7 +275,37 @@
           <w:iCs/>
           <w:i/>
         </w:rPr>
-        <w:t xml:space="preserve">Ghi chú dữ liệu: Số liệu tổng hợp nêu trong chuyên đề (101.185 doanh nghiệp · 47 nền kinh tế · 108 cặp quốc gia × năm) phản ánh bản khóa dữ liệu tại thời điểm thực hiện chuyên đề. Luận án tổng thể sử dụng bản khóa dữ liệu đã cập nhật (mẫu phân tích chính 91.982 doanh nghiệp · 49 nền kinh tế · 102 đợt quốc gia–năm) sau khi chuẩn hóa lại và xử lý trùng lặp dữ liệu panel; trường hợp biên SIDS gồm 7 nền kinh tế Thái Bình Dương.</w:t>
+        <w:t xml:space="preserve">Ghi chú dữ liệu: Headline của chuyên đề neo theo bản khóa canonical của luận án — 49 nền kinh tế (khung phân tích 91.982 doanh nghiệp; pool phân loại 96.415 doanh nghiệp / 52 nền) sau khi chuẩn hóa lại và xử lý trùng lặp dữ liệu panel; trường hợp biên SIDS gồm 7 nền kinh tế Thái Bình Dương. Riêng các bảng thống kê mô tả §2.3.3–2.3.8 (phân tán năng suất, FSTS, đổi mới, R&amp;D, tham nhũng, ngành) vẫn báo cáo trên</w:t>
+      </w:r>
+      <w:r>
+        <w:rPr>
+          <w:iCs/>
+          <w:i/>
+        </w:rPr>
+        <w:t xml:space="preserve"> </w:t>
+      </w:r>
+      <w:r>
+        <w:rPr>
+          <w:bCs/>
+          <w:b/>
+          <w:iCs/>
+          <w:i/>
+        </w:rPr>
+        <w:t xml:space="preserve">pool mô tả CĐ1 gồm 101.185 doanh nghiệp · 47 nền · 108 cặp</w:t>
+      </w:r>
+      <w:r>
+        <w:rPr>
+          <w:iCs/>
+          <w:i/>
+        </w:rPr>
+        <w:t xml:space="preserve"> </w:t>
+      </w:r>
+      <w:r>
+        <w:rPr>
+          <w:iCs/>
+          <w:i/>
+        </w:rPr>
+        <w:t xml:space="preserve">(102 cặp theo khung phân tích luận án) — đây là bản khóa mô tả riêng của chuyên đề, sẽ được đồng bộ về khung 49 nền / 91.982 khi dựng lại pipeline raw đa biến (R&amp;D, đổi mới, tham nhũng, ngành chưa có trong master phân tích).</w:t>
       </w:r>
     </w:p>
     <w:p>
@@ -405,7 +435,23 @@
         <w:t xml:space="preserve">2009–2025</w:t>
       </w:r>
       <w:r>
-        <w:t xml:space="preserve">, with comparative extension to Pacific SIDS as a boundary case. The microdata pool contains</w:t>
+        <w:t xml:space="preserve">, with comparative extension to Pacific SIDS as a boundary case. The classification and analytic frame is anchored to the dissertation’s canonical lock:</w:t>
+      </w:r>
+      <w:r>
+        <w:t xml:space="preserve"> </w:t>
+      </w:r>
+      <w:r>
+        <w:rPr>
+          <w:bCs/>
+          <w:b/>
+        </w:rPr>
+        <w:t xml:space="preserve">49 economies</w:t>
+      </w:r>
+      <w:r>
+        <w:t xml:space="preserve"> </w:t>
+      </w:r>
+      <w:r>
+        <w:t xml:space="preserve">(analytic frame 91,982 firms; classification pool 96,415 firms / 52 economies) with six sub-regimes of ICRV (Institutional Context Regime Variation): Advanced innovation-driven, Advanced resource-driven, Upper-middle, Lower-middle transition, Emerging, and Pacific SIDS (boundary case extension). The essay’s descriptive analysis (Tables 2.3.3–2.3.8) is reported over a broader CĐ1 descriptive pool of</w:t>
       </w:r>
       <w:r>
         <w:t xml:space="preserve"> </w:t>
@@ -421,23 +467,7 @@
         <w:t xml:space="preserve"> </w:t>
       </w:r>
       <w:r>
-        <w:t xml:space="preserve">from the World Bank Enterprise Surveys (WBES). Building on and extending the 17-economy pool of emerging Asia (~40,633 firms) previously published by the author (Do &amp; Phan, 2026 — VEFR), the pool covers</w:t>
-      </w:r>
-      <w:r>
-        <w:t xml:space="preserve"> </w:t>
-      </w:r>
-      <w:r>
-        <w:rPr>
-          <w:bCs/>
-          <w:b/>
-        </w:rPr>
-        <w:t xml:space="preserve">47 economies</w:t>
-      </w:r>
-      <w:r>
-        <w:t xml:space="preserve"> </w:t>
-      </w:r>
-      <w:r>
-        <w:t xml:space="preserve">with six sub-regimes of ICRV (Institutional Context Regime Variation): Advanced innovation-driven (5), Advanced resource-driven (5), Upper-middle (6), Emerging (7), Frontier (17), Pacific SIDS (7, boundary case extension).</w:t>
+        <w:t xml:space="preserve">from the World Bank Enterprise Surveys (WBES), building on and extending the 17-economy pool of emerging Asia (~40,633 firms) previously published by the author (Do &amp; Phan, 2026 — VEFR).</w:t>
       </w:r>
     </w:p>
     <w:p>
@@ -949,7 +979,7 @@
               <w:jc w:val="left"/>
             </w:pPr>
             <w:r>
-              <w:t xml:space="preserve">47 nền kinh tế phân theo 6 nhóm ICRV</w:t>
+              <w:t xml:space="preserve">49 nền kinh tế phân theo 6 nhóm ICRV</w:t>
             </w:r>
           </w:p>
         </w:tc>
@@ -4058,23 +4088,39 @@
         <w:pStyle w:val="BodyText"/>
       </w:pPr>
       <w:r>
-        <w:t xml:space="preserve">Trong bối cảnh đó, hệ thống thông tin về hiệu quả doanh nghiệp châu Á còn phân mảnh. World Bank Enterprise Surveys (WBES) là cơ sở dữ liệu vi mô tin cậy nhất hiện có (World Bank Enterprise Surveys, 2025). Đỗ và Phan (2026 — VEFR) đã mở rộng phạm vi WBES đến 17 nền kinh tế châu Á mới nổi với ~40.633 doanh nghiệp. Tuy nhiên, vẫn còn ít tổng hợp xuyên 47 nền kinh tế trên giai đoạn dài 2009–2025. Chuyên đề này lấp khoảng trống thực tiễn đó bằng cách tổng hợp dữ liệu</w:t>
-      </w:r>
-      <w:r>
-        <w:t xml:space="preserve"> </w:t>
-      </w:r>
-      <w:r>
-        <w:rPr>
-          <w:bCs/>
-          <w:b/>
-        </w:rPr>
-        <w:t xml:space="preserve">101.185 doanh nghiệp xuyên 47 nền kinh tế × 108 cặp quốc gia × năm × 14 mốc khảo sát</w:t>
-      </w:r>
-      <w:r>
-        <w:t xml:space="preserve"> </w:t>
-      </w:r>
-      <w:r>
-        <w:t xml:space="preserve">— gấp 2,5 lần phạm vi của Đỗ &amp; Phan (2026 — VEFR).</w:t>
+        <w:t xml:space="preserve">Trong bối cảnh đó, hệ thống thông tin về hiệu quả doanh nghiệp châu Á còn phân mảnh. World Bank Enterprise Surveys (WBES) là cơ sở dữ liệu vi mô tin cậy nhất hiện có (World Bank Enterprise Surveys, 2025). Đỗ và Phan (2026 — VEFR) đã mở rộng phạm vi WBES đến 17 nền kinh tế châu Á mới nổi với ~40.633 doanh nghiệp. Tuy nhiên, vẫn còn ít tổng hợp xuyên</w:t>
+      </w:r>
+      <w:r>
+        <w:t xml:space="preserve"> </w:t>
+      </w:r>
+      <w:r>
+        <w:rPr>
+          <w:bCs/>
+          <w:b/>
+        </w:rPr>
+        <w:t xml:space="preserve">49 nền kinh tế</w:t>
+      </w:r>
+      <w:r>
+        <w:t xml:space="preserve"> </w:t>
+      </w:r>
+      <w:r>
+        <w:t xml:space="preserve">(khung phân tích 91.982 doanh nghiệp; pool phân loại 96.415 DN / 52 nền) trên giai đoạn dài 2009–2025. Chuyên đề này lấp khoảng trống thực tiễn đó: headline neo theo bản khóa canonical 49 nền / 91.982 doanh nghiệp, trong khi phần thống kê mô tả §2.3.3–2.3.8 được tính trên</w:t>
+      </w:r>
+      <w:r>
+        <w:t xml:space="preserve"> </w:t>
+      </w:r>
+      <w:r>
+        <w:rPr>
+          <w:bCs/>
+          <w:b/>
+        </w:rPr>
+        <w:t xml:space="preserve">pool mô tả CĐ1 gồm 101.185 doanh nghiệp xuyên 47 nền × 108 cặp quốc gia × năm × 14 mốc khảo sát</w:t>
+      </w:r>
+      <w:r>
+        <w:t xml:space="preserve"> </w:t>
+      </w:r>
+      <w:r>
+        <w:t xml:space="preserve">— gấp ~2,5 lần phạm vi của Đỗ &amp; Phan (2026 — VEFR).</w:t>
       </w:r>
     </w:p>
     <w:p>
@@ -4157,13 +4203,13 @@
           <w:bCs/>
           <w:b/>
         </w:rPr>
-        <w:t xml:space="preserve">47 nền kinh tế châu Á và Thái Bình Dương</w:t>
-      </w:r>
-      <w:r>
-        <w:t xml:space="preserve"> </w:t>
-      </w:r>
-      <w:r>
-        <w:t xml:space="preserve">(40 nền kinh tế châu Á + 7 SIDS Thái Bình Dương mở rộng trường hợp biên; pool 101.185 doanh nghiệp) trong giai đoạn</w:t>
+        <w:t xml:space="preserve">49 nền kinh tế châu Á và Thái Bình Dương</w:t>
+      </w:r>
+      <w:r>
+        <w:t xml:space="preserve"> </w:t>
+      </w:r>
+      <w:r>
+        <w:t xml:space="preserve">theo bản khóa canonical (khung phân tích 91.982 doanh nghiệp; pool phân loại 96.415 DN / 52 nền; phạm vi chính châu Á + SIDS Thái Bình Dương mở rộng trường hợp biên) trong giai đoạn</w:t>
       </w:r>
       <w:r>
         <w:t xml:space="preserve"> </w:t>
@@ -4176,7 +4222,7 @@
         <w:t xml:space="preserve">2009–2025</w:t>
       </w:r>
       <w:r>
-        <w:t xml:space="preserve">.</w:t>
+        <w:t xml:space="preserve">. Các bảng thống kê mô tả §2.3.3–2.3.8 hiển thị theo pool mô tả CĐ1 (101.185 doanh nghiệp / 47 nền) — xem ghi chú dữ liệu ở Tóm tắt.</w:t>
       </w:r>
     </w:p>
     <w:p>
@@ -4215,7 +4261,7 @@
         <w:pStyle w:val="Compact"/>
       </w:pPr>
       <w:r>
-        <w:t xml:space="preserve">Đề xuất khung phân loại 6 phân nhóm con ICRV cho 47 nền kinh tế;</w:t>
+        <w:t xml:space="preserve">Đề xuất khung phân loại 6 phân nhóm con ICRV cho 49 nền kinh tế (khung phân tích; pool phân loại 52 nền);</w:t>
       </w:r>
     </w:p>
     <w:p>
@@ -4617,7 +4663,7 @@
         <w:t xml:space="preserve">(1) Cross-sectional không cho phép suy luận nhân quả mạnh</w:t>
       </w:r>
       <w:r>
-        <w:t xml:space="preserve">: WBES là repeated cross-sections, không phải panel cân bằng. Kết luận nhân quả dựa trên ước lượng biến công cụ từ nghiên cứu Việt Nam và không thể khái quát trực tiếp sang 47 nền kinh tế.</w:t>
+        <w:t xml:space="preserve">: WBES là repeated cross-sections, không phải panel cân bằng. Kết luận nhân quả dựa trên ước lượng biến công cụ từ nghiên cứu Việt Nam và không thể khái quát trực tiếp sang 49 nền kinh tế trong khung phân tích.</w:t>
       </w:r>
     </w:p>
     <w:p>
@@ -4810,7 +4856,7 @@
         <w:t xml:space="preserve"> </w:t>
       </w:r>
       <w:r>
-        <w:t xml:space="preserve">ở Frontier và Emerging châu Á 2018–2025 — mở rộng pattern từ 17 nước lên 47 nước. Phân tách Tier-1 (website nhị phân, đã bão hòa ở Advanced) và Tier-2 (tổng hợp đa thành phần, đang phát triển ở Emerging/Frontier).</w:t>
+        <w:t xml:space="preserve">ở Frontier và Emerging châu Á 2018–2025 — mở rộng pattern từ 17 nước lên 47 nước. Phân tách Tier-1 (website nhị phân, đã bão hòa ở Advanced) và Tier-2 (tổng hợp đa thành phần, đang phát triển ở Emerging/Frontier). (Phạm vi mô tả ở §2.3.4 dựa trên pool mô tả CĐ1 101.185 DN / 47 nền.)</w:t>
       </w:r>
     </w:p>
     <w:p>
@@ -4922,20 +4968,39 @@
         <w:t xml:space="preserve">Nguồn dữ liệu</w:t>
       </w:r>
       <w:r>
-        <w:t xml:space="preserve">: World Bank Enterprise Surveys (WBES) — cơ sở dữ liệu vi mô doanh nghiệp cấp quốc gia lớn nhất toàn cầu, được thiết kế theo phương pháp lấy mẫu xác suất phân tầng đảm bảo tính đại diện (World Bank Enterprise Surveys, 2025). Pool tổng hợp gồm</w:t>
-      </w:r>
-      <w:r>
-        <w:t xml:space="preserve"> </w:t>
-      </w:r>
-      <w:r>
-        <w:rPr>
-          <w:bCs/>
-          <w:b/>
-        </w:rPr>
-        <w:t xml:space="preserve">101.185 doanh nghiệp</w:t>
-      </w:r>
-      <w:r>
-        <w:t xml:space="preserve">, 47 nền kinh tế, 108 cặp quốc gia × năm, 14 sóng khảo sát, 2009–2025.</w:t>
+        <w:t xml:space="preserve">: World Bank Enterprise Surveys (WBES) — cơ sở dữ liệu vi mô doanh nghiệp cấp quốc gia lớn nhất toàn cầu, được thiết kế theo phương pháp lấy mẫu xác suất phân tầng đảm bảo tính đại diện (World Bank Enterprise Surveys, 2025). Khung phân loại/phân tích neo theo bản khóa canonical:</w:t>
+      </w:r>
+      <w:r>
+        <w:t xml:space="preserve"> </w:t>
+      </w:r>
+      <w:r>
+        <w:rPr>
+          <w:bCs/>
+          <w:b/>
+        </w:rPr>
+        <w:t xml:space="preserve">49 nền kinh tế</w:t>
+      </w:r>
+      <w:r>
+        <w:t xml:space="preserve"> </w:t>
+      </w:r>
+      <w:r>
+        <w:t xml:space="preserve">(khung phân tích 91.982 doanh nghiệp; pool phân loại 96.415 DN / 52 nền). Các bảng thống kê mô tả §2.3.3–2.3.8 dưới đây được tính trên</w:t>
+      </w:r>
+      <w:r>
+        <w:t xml:space="preserve"> </w:t>
+      </w:r>
+      <w:r>
+        <w:rPr>
+          <w:bCs/>
+          <w:b/>
+        </w:rPr>
+        <w:t xml:space="preserve">pool mô tả CĐ1 gồm 101.185 doanh nghiệp, 47 nền, 108 cặp quốc gia × năm, 14 sóng khảo sát, 2009–2025</w:t>
+      </w:r>
+      <w:r>
+        <w:t xml:space="preserve"> </w:t>
+      </w:r>
+      <w:r>
+        <w:t xml:space="preserve">(bản khóa mô tả riêng — xem ghi chú dữ liệu ở Tóm tắt).</w:t>
       </w:r>
     </w:p>
     <w:p>
@@ -5136,7 +5201,7 @@
         <w:t xml:space="preserve"> </w:t>
       </w:r>
       <w:r>
-        <w:t xml:space="preserve">(Aguinis et al., 2019): chuyên đề trình bày rõ (i) định nghĩa tổng thể (47 nền kinh tế châu Á và Thái Bình Dương, phân tách 41 và 7); (ii) quy trình lấy mẫu (lấy mẫu chính thức WBES); (iii) lý giải quy mô mẫu (pool 101.185); (iv) xử lý giá trị thiếu (FSTS = d3b + d3c, winsorize 1/99); (v) xây dựng biến; (vi) độ tin cậy và giá trị (TCI đa thành phần; DAI đơn thành phần Spec 1, đa thành phần Spec 2); (vii) phương pháp ước lượng (mô tả trong CĐ1; OLS và biến công cụ trong CĐ2); (viii) khoa học mở.</w:t>
+        <w:t xml:space="preserve">(Aguinis et al., 2019): chuyên đề trình bày rõ (i) định nghĩa tổng thể (khung canonical 49 nền kinh tế châu Á và Thái Bình Dương; pool mô tả CĐ1 cho thống kê §2.3.3–2.3.8 gồm 47 nền, phân tách 40 và 7); (ii) quy trình lấy mẫu (lấy mẫu chính thức WBES); (iii) lý giải quy mô mẫu (khung phân tích 91.982 DN; pool phân loại 96.415 DN; pool mô tả CĐ1 101.185); (iv) xử lý giá trị thiếu (FSTS = d3b + d3c, winsorize 1/99); (v) xây dựng biến; (vi) độ tin cậy và giá trị (TCI đa thành phần; DAI đơn thành phần Spec 1, đa thành phần Spec 2); (vii) phương pháp ước lượng (mô tả trong CĐ1; OLS và biến công cụ trong CĐ2); (viii) khoa học mở.</w:t>
       </w:r>
     </w:p>
     <w:p>
@@ -5713,7 +5778,7 @@
         <w:t xml:space="preserve">Khoảng trống từ 5 meta-analyses</w:t>
       </w:r>
       <w:r>
-        <w:t xml:space="preserve">: Không một meta-analysis nào trong số trên có dữ liệu WBES xuyên 47 nền kinh tế với phân loại ICRV 6 nhóm. Không có nghiên cứu nào phân biệt tường minh Tier-1 và Tier-2 áp dụng số như biến điều tiết riêng biệt. Khoảng trống này là nền tảng cho phần thảo luận về các khoảng trống nghiên cứu trong mục 2.3.9.</w:t>
+        <w:t xml:space="preserve">: Không một meta-analysis nào trong số trên có dữ liệu WBES xuyên 49 nền kinh tế với phân loại ICRV 6 nhóm. Không có nghiên cứu nào phân biệt tường minh Tier-1 và Tier-2 áp dụng số như biến điều tiết riêng biệt. Khoảng trống này là nền tảng cho phần thảo luận về các khoảng trống nghiên cứu trong mục 2.3.9.</w:t>
       </w:r>
     </w:p>
     <w:bookmarkEnd w:id="36"/>
@@ -6649,7 +6714,7 @@
         <w:t xml:space="preserve">Tuyên bố ranh giới đo lường</w:t>
       </w:r>
       <w:r>
-        <w:t xml:space="preserve">: Pool 101.185 doanh nghiệp WBES quan sát Tier 1–2, không Tier 3–4. Mọi lập luận về</w:t>
+        <w:t xml:space="preserve">: Pool mô tả CĐ1 (101.185 doanh nghiệp WBES; khung phân tích canonical 91.982 DN / 49 nền) quan sát Tier 1–2, không Tier 3–4. Mọi lập luận về</w:t>
       </w:r>
       <w:r>
         <w:t xml:space="preserve"> </w:t>
@@ -6867,7 +6932,7 @@
               <w:jc w:val="left"/>
             </w:pPr>
             <w:r>
-              <w:t xml:space="preserve">Châu Á không phải là một khối đồng nhất về thể chế. Các meta-analysis (Marano et al., 2016; Wu et al., 2022) đã ghi nhận rằng bối cảnh thể chế là biến điều tiết quan trọng nhất trong quan hệ quốc tế hóa → hiệu quả — nhưng không có nghiên cứu nào thiết lập hệ thống phân loại thể chế toàn diện cho 47 nền kinh tế châu Á. Khung phân loại ICRV (Institutional Context Regime Variation — Biến thiên chế độ bối cảnh thể chế) được đề xuất trong chuyên đề này nhằm lấp khoảng trống đó, dựa trên bốn nguyên tắc:</w:t>
+              <w:t xml:space="preserve">Châu Á không phải là một khối đồng nhất về thể chế. Các meta-analysis (Marano et al., 2016; Wu et al., 2022) đã ghi nhận rằng bối cảnh thể chế là biến điều tiết quan trọng nhất trong quan hệ quốc tế hóa → hiệu quả — nhưng không có nghiên cứu nào thiết lập hệ thống phân loại thể chế toàn diện cho 49 nền kinh tế châu Á (khung phân tích). Khung phân loại ICRV (Institutional Context Regime Variation — Biến thiên chế độ bối cảnh thể chế) được đề xuất trong chuyên đề này nhằm lấp khoảng trống đó, dựa trên bốn nguyên tắc:</w:t>
             </w:r>
           </w:p>
         </w:tc>
@@ -7952,6 +8017,100 @@
       </w:pPr>
       <w:r>
         <w:t xml:space="preserve">2.3.3.1 Nguồn dữ liệu và cấu trúc pool</w:t>
+      </w:r>
+    </w:p>
+    <w:p>
+      <w:pPr>
+        <w:pStyle w:val="BlockText"/>
+      </w:pPr>
+      <w:r>
+        <w:rPr>
+          <w:iCs/>
+          <w:i/>
+        </w:rPr>
+        <w:t xml:space="preserve">Ghi chú khung số liệu (§2.3.3–2.3.8): Các bảng thống kê mô tả trong các tiểu mục này theo</w:t>
+      </w:r>
+      <w:r>
+        <w:rPr>
+          <w:iCs/>
+          <w:i/>
+        </w:rPr>
+        <w:t xml:space="preserve"> </w:t>
+      </w:r>
+      <w:r>
+        <w:rPr>
+          <w:bCs/>
+          <w:b/>
+          <w:iCs/>
+          <w:i/>
+        </w:rPr>
+        <w:t xml:space="preserve">bản khóa mô tả CĐ1</w:t>
+      </w:r>
+      <w:r>
+        <w:rPr>
+          <w:iCs/>
+          <w:i/>
+        </w:rPr>
+        <w:t xml:space="preserve"> </w:t>
+      </w:r>
+      <w:r>
+        <w:rPr>
+          <w:iCs/>
+          <w:i/>
+        </w:rPr>
+        <w:t xml:space="preserve">(pool 101.185 doanh nghiệp / 47 nền / 108 cặp); chúng sẽ đồng bộ về</w:t>
+      </w:r>
+      <w:r>
+        <w:rPr>
+          <w:iCs/>
+          <w:i/>
+        </w:rPr>
+        <w:t xml:space="preserve"> </w:t>
+      </w:r>
+      <w:r>
+        <w:rPr>
+          <w:bCs/>
+          <w:b/>
+          <w:iCs/>
+          <w:i/>
+        </w:rPr>
+        <w:t xml:space="preserve">khung canonical 49 nền / 91.982 doanh nghiệp</w:t>
+      </w:r>
+      <w:r>
+        <w:rPr>
+          <w:iCs/>
+          <w:i/>
+        </w:rPr>
+        <w:t xml:space="preserve"> </w:t>
+      </w:r>
+      <w:r>
+        <w:rPr>
+          <w:iCs/>
+          <w:i/>
+        </w:rPr>
+        <w:t xml:space="preserve">khi dựng lại pipeline raw đa biến (R&amp;D, đổi mới, tham nhũng, ngành chưa có trong master phân tích</w:t>
+      </w:r>
+      <w:r>
+        <w:rPr>
+          <w:iCs/>
+          <w:i/>
+        </w:rPr>
+        <w:t xml:space="preserve"> </w:t>
+      </w:r>
+      <w:r>
+        <w:rPr>
+          <w:rStyle w:val="VerbatimChar"/>
+          <w:iCs/>
+          <w:i/>
+        </w:rPr>
+        <w:t xml:space="preserve">p7_pooled_clean.csv</w:t>
+      </w:r>
+      <w:r>
+        <w:rPr>
+          <w:iCs/>
+          <w:i/>
+        </w:rPr>
+        <w:t xml:space="preserve">). Headline và khung phân loại của chuyên đề (Tóm tắt, §2.1, §2.2, Bảng 2.3.2.1) đã neo theo canonical.</w:t>
       </w:r>
     </w:p>
     <w:p>
@@ -19372,7 +19531,7 @@
         <w:t xml:space="preserve">(1) Pool WBES xuyên quốc gia như nền tảng dữ liệu cho kinh doanh quốc tế thị trường mới nổi</w:t>
       </w:r>
       <w:r>
-        <w:t xml:space="preserve">: 101.185 doanh nghiệp từ 47 nền kinh tế là mẫu lớn nhất từ trước đến nay cho phân tích quốc tế hóa – hiệu quả toàn diện tại châu Á–Thái Bình Dương.</w:t>
+        <w:t xml:space="preserve">: Khung canonical 49 nền / 91.982 doanh nghiệp (pool phân loại 96.415 DN / 52 nền; pool mô tả CĐ1 101.185 DN / 47 nền) là một trong những mẫu lớn nhất từ trước đến nay cho phân tích quốc tế hóa – hiệu quả toàn diện tại châu Á–Thái Bình Dương.</w:t>
       </w:r>
     </w:p>
     <w:p>
@@ -19468,7 +19627,7 @@
         <w:pStyle w:val="FirstParagraph"/>
       </w:pPr>
       <w:r>
-        <w:t xml:space="preserve">Tám kết luận từ 101.185 doanh nghiệp, 47 nền kinh tế, 108 cặp quốc gia–năm, 14 sóng WBES 2009–2025:</w:t>
+        <w:t xml:space="preserve">Tám kết luận từ khung canonical 49 nền kinh tế / 91.982 doanh nghiệp (pool phân loại 96.415 DN / 52 nền; phần thống kê mô tả §2.3.3–2.3.8 trên pool mô tả CĐ1 101.185 DN / 47 nền / 108 cặp), 14 sóng WBES 2009–2025:</w:t>
       </w:r>
     </w:p>
     <w:p>

</xml_diff>

<commit_message>
feat(pipeline): CD1 multi-variable descriptives from raw WBES (84 cross-sections, 49-frame)
scripts/cd1_descriptives_pipeline.py recomputes innovation (h1/h5), R&D (h8),
ISO (b8), website (c22b), female mgr/owner (b7a/b4), FSTS=d3b+d3c, exporter,
corruption obstacle (j30f), bribery %sales (j7a), firm age (b5) per ICRV group.
Clear institutional gradients: R&D 20.5→5.7%, ISO 35→6.6%, website 62→29%,
corruption-major 2.9→24.9% (I→VI). Coverage: I/III/IV/V full, II=2/6 (needs GCC
raw), VI=2/8 (needs Pacific raw) — group II/VI numbers flagged non-representative.
CD1 sync notes updated to point at pipeline results; per-table prose sync left
for author approval. Results: data_wbes/analysis/CD1_PIPELINE_RESULTS.md
</commit_message>
<xml_diff>
--- a/dist/chuyen_de_1/00_cd1_ctu_final_vi.docx
+++ b/dist/chuyen_de_1/00_cd1_ctu_final_vi.docx
@@ -4566,22 +4566,47 @@
         <w:t xml:space="preserve"> </w:t>
       </w:r>
       <w:r>
-        <w:t xml:space="preserve">(47 nền/101.185 DN) để bảo toàn nhất quán nội bộ; chúng đang được tái tính trên khung 49 nền/91.982 bằng pipeline</w:t>
-      </w:r>
-      <w:r>
-        <w:t xml:space="preserve"> </w:t>
+        <w:t xml:space="preserve">(47 nền/101.185 DN) để bảo toàn nhất quán nội bộ; pipeline raw đa biến</w:t>
+      </w:r>
+      <w:r>
+        <w:t xml:space="preserve"> </w:t>
+      </w:r>
+      <w:r>
+        <w:rPr>
+          <w:bCs/>
+          <w:b/>
+        </w:rPr>
+        <w:t xml:space="preserve">đã được dựng và chạy</w:t>
+      </w:r>
+      <w:r>
+        <w:t xml:space="preserve"> </w:t>
+      </w:r>
+      <w:r>
+        <w:t xml:space="preserve">(</w:t>
       </w:r>
       <w:r>
         <w:rPr>
           <w:rStyle w:val="VerbatimChar"/>
         </w:rPr>
-        <w:t xml:space="preserve">scripts/cd1_relock_descriptives.py</w:t>
-      </w:r>
-      <w:r>
-        <w:t xml:space="preserve"> </w:t>
-      </w:r>
-      <w:r>
-        <w:t xml:space="preserve">(đã kiểm chứng phương pháp) và sẽ cập nhật khi re-lock với dữ liệu thô còn thiếu. Phạm vi chính (40 nước) và Oman ở Nhóm II được đồng bộ ở đợt re-lock headline.</w:t>
+        <w:t xml:space="preserve">scripts/cd1_descriptives_pipeline.py</w:t>
+      </w:r>
+      <w:r>
+        <w:t xml:space="preserve">; kết quả tái tính tại</w:t>
+      </w:r>
+      <w:r>
+        <w:t xml:space="preserve"> </w:t>
+      </w:r>
+      <w:r>
+        <w:rPr>
+          <w:rStyle w:val="VerbatimChar"/>
+        </w:rPr>
+        <w:t xml:space="preserve">data_wbes/analysis/CD1_PIPELINE_RESULTS.md</w:t>
+      </w:r>
+      <w:r>
+        <w:t xml:space="preserve"> </w:t>
+      </w:r>
+      <w:r>
+        <w:t xml:space="preserve">— coverage I/III/IV/V đủ, II và VI còn thiếu raw GCC + Pacific) và bảng sẽ được thay số theo từng nhóm khi tác giả duyệt. Phạm vi chính (40 nước) và Oman ở Nhóm II được đồng bộ ở đợt re-lock headline.</w:t>
       </w:r>
     </w:p>
     <w:p>
@@ -7845,7 +7870,7 @@
                 <w:iCs/>
                 <w:i/>
               </w:rPr>
-              <w:t xml:space="preserve">(47 nền/101.185); chúng đang được tái tính trên khung 49 nền/91.982 bằng pipeline tái lập</w:t>
+              <w:t xml:space="preserve">(47 nền/101.185); pipeline raw đa biến</w:t>
             </w:r>
             <w:r>
               <w:rPr>
@@ -7856,11 +7881,12 @@
             </w:r>
             <w:r>
               <w:rPr>
-                <w:rStyle w:val="VerbatimChar"/>
+                <w:bCs/>
+                <w:b/>
                 <w:iCs/>
                 <w:i/>
               </w:rPr>
-              <w:t xml:space="preserve">scripts/cd1_relock_descriptives.py</w:t>
+              <w:t xml:space="preserve">đã được dựng và chạy</w:t>
             </w:r>
             <w:r>
               <w:rPr>
@@ -7874,7 +7900,44 @@
                 <w:iCs/>
                 <w:i/>
               </w:rPr>
-              <w:t xml:space="preserve">(đã kiểm chứng phương pháp) và sẽ cập nhật ở đợt re-lock dữ liệu.</w:t>
+              <w:t xml:space="preserve">(</w:t>
+            </w:r>
+            <w:r>
+              <w:rPr>
+                <w:rStyle w:val="VerbatimChar"/>
+                <w:iCs/>
+                <w:i/>
+              </w:rPr>
+              <w:t xml:space="preserve">scripts/cd1_descriptives_pipeline.py</w:t>
+            </w:r>
+            <w:r>
+              <w:rPr>
+                <w:iCs/>
+                <w:i/>
+              </w:rPr>
+              <w:t xml:space="preserve">; kết quả tại</w:t>
+            </w:r>
+            <w:r>
+              <w:rPr>
+                <w:iCs/>
+                <w:i/>
+              </w:rPr>
+              <w:t xml:space="preserve"> </w:t>
+            </w:r>
+            <w:r>
+              <w:rPr>
+                <w:rStyle w:val="VerbatimChar"/>
+                <w:iCs/>
+                <w:i/>
+              </w:rPr>
+              <w:t xml:space="preserve">data_wbes/analysis/CD1_PIPELINE_RESULTS.md</w:t>
+            </w:r>
+            <w:r>
+              <w:rPr>
+                <w:iCs/>
+                <w:i/>
+              </w:rPr>
+              <w:t xml:space="preserve">) — nhóm I/III/IV/V đủ coverage để đồng bộ; nhóm II/VI chờ raw GCC + Pacific.</w:t>
             </w:r>
           </w:p>
         </w:tc>

</xml_diff>

<commit_message>
relock(cd1): sync Bảng 2.3.3.2/2.3.4.1/2.3.5.1 to 49-frame pipeline (6 data-label groups)
Tables restructured to 6 ICRV data-label rows with raw-pipeline values; groups
II/VI flagged (coverage 2/6, 2/8) with master full-coverage cross-checks and
7-Pacific descriptive-lock values preserved in footnotes (incl. SIDS digital-
leapfrog 41.5%/58.9% claim pending full Pacific raw). Pipeline extended with
b2b FDI≥10%, SME (l1<100), employment CAGR (l1/l2) — validation: III row exact
match to prior lock (FSTS 10.3, ISO 31.4, website 56.9, SME 76.2, FDI 8.4, CAGR
4.3≈4.25) confirming methodology reproduction. Narratives + lock notes updated;
remaining tables (2.3.3.1 dispersion, 2.3.6.x, 2.3.7.1, 2.3.8.x) stay at
descriptive lock pending pipeline extension. Linter clean; docx regenerated.
</commit_message>
<xml_diff>
--- a/dist/chuyen_de_1/00_cd1_ctu_final_vi.docx
+++ b/dist/chuyen_de_1/00_cd1_ctu_final_vi.docx
@@ -4544,45 +4544,13 @@
           <w:bCs/>
           <w:b/>
         </w:rPr>
-        <w:t xml:space="preserve">Các bảng thống kê mô tả theo nhóm (§2.3.3–2.3.8)</w:t>
-      </w:r>
-      <w:r>
-        <w:t xml:space="preserve"> </w:t>
-      </w:r>
-      <w:r>
-        <w:t xml:space="preserve">vẫn hiển thị số theo</w:t>
-      </w:r>
-      <w:r>
-        <w:t xml:space="preserve"> </w:t>
-      </w:r>
-      <w:r>
-        <w:rPr>
-          <w:bCs/>
-          <w:b/>
-        </w:rPr>
-        <w:t xml:space="preserve">bản khóa mô tả trước</w:t>
-      </w:r>
-      <w:r>
-        <w:t xml:space="preserve"> </w:t>
-      </w:r>
-      <w:r>
-        <w:t xml:space="preserve">(47 nền/101.185 DN) để bảo toàn nhất quán nội bộ; pipeline raw đa biến</w:t>
-      </w:r>
-      <w:r>
-        <w:t xml:space="preserve"> </w:t>
-      </w:r>
-      <w:r>
-        <w:rPr>
-          <w:bCs/>
-          <w:b/>
-        </w:rPr>
-        <w:t xml:space="preserve">đã được dựng và chạy</w:t>
-      </w:r>
-      <w:r>
-        <w:t xml:space="preserve"> </w:t>
-      </w:r>
-      <w:r>
-        <w:t xml:space="preserve">(</w:t>
+        <w:t xml:space="preserve">Các bảng Bảng 2.3.3.2, 2.3.4.1, 2.3.5.1 đã được đồng bộ</w:t>
+      </w:r>
+      <w:r>
+        <w:t xml:space="preserve"> </w:t>
+      </w:r>
+      <w:r>
+        <w:t xml:space="preserve">sang khung 49 nền/6 nhóm nhãn dữ liệu bằng pipeline raw (</w:t>
       </w:r>
       <w:r>
         <w:rPr>
@@ -4591,7 +4559,7 @@
         <w:t xml:space="preserve">scripts/cd1_descriptives_pipeline.py</w:t>
       </w:r>
       <w:r>
-        <w:t xml:space="preserve">; kết quả tái tính tại</w:t>
+        <w:t xml:space="preserve">; kết quả:</w:t>
       </w:r>
       <w:r>
         <w:t xml:space="preserve"> </w:t>
@@ -4603,10 +4571,23 @@
         <w:t xml:space="preserve">data_wbes/analysis/CD1_PIPELINE_RESULTS.md</w:t>
       </w:r>
       <w:r>
-        <w:t xml:space="preserve"> </w:t>
-      </w:r>
-      <w:r>
-        <w:t xml:space="preserve">— coverage I/III/IV/V đủ, II và VI còn thiếu raw GCC + Pacific) và bảng sẽ được thay số theo từng nhóm khi tác giả duyệt. Phạm vi chính (40 nước) và Oman ở Nhóm II được đồng bộ ở đợt re-lock headline.</w:t>
+        <w:t xml:space="preserve">) — nhóm II/VI gắn cờ coverage (2/6, 2/8) với giá trị bản khóa 7-Pacific lưu trong ghi chú.</w:t>
+      </w:r>
+      <w:r>
+        <w:t xml:space="preserve"> </w:t>
+      </w:r>
+      <w:r>
+        <w:rPr>
+          <w:bCs/>
+          <w:b/>
+        </w:rPr>
+        <w:t xml:space="preserve">Các bảng còn lại</w:t>
+      </w:r>
+      <w:r>
+        <w:t xml:space="preserve"> </w:t>
+      </w:r>
+      <w:r>
+        <w:t xml:space="preserve">(2.3.3.1 phân tán năng suất, 2.3.6.x temporal/tham nhũng chi tiết, 2.3.7.1 tiểu cảnh, 2.3.8.x tương quan) vẫn theo bản khóa mô tả (101.185) chờ mở rộng pipeline. Phạm vi chính (40 nước) và Oman ở Nhóm II được đồng bộ ở đợt re-lock headline.</w:t>
       </w:r>
     </w:p>
     <w:p>
@@ -7810,7 +7791,7 @@
                 <w:iCs/>
                 <w:i/>
               </w:rPr>
-              <w:t xml:space="preserve">các bảng</w:t>
+              <w:t xml:space="preserve">các bảng R&amp;D/ISO/đổi mới (2.3.4.1), cấu trúc (2.3.5.1) và FSTS/xuất khẩu (2.3.3.2)</w:t>
             </w:r>
             <w:r>
               <w:rPr>
@@ -7826,7 +7807,7 @@
                 <w:iCs/>
                 <w:i/>
               </w:rPr>
-              <w:t xml:space="preserve">thống kê mô tả</w:t>
+              <w:t xml:space="preserve">đã đồng bộ</w:t>
             </w:r>
             <w:r>
               <w:rPr>
@@ -7840,67 +7821,7 @@
                 <w:iCs/>
                 <w:i/>
               </w:rPr>
-              <w:t xml:space="preserve">theo nhóm ở §2.3.3–2.3.8 (sd năng suất, R&amp;D/ISO/đổi mới, cấu trúc, tương quan) hiện còn hiển thị theo</w:t>
-            </w:r>
-            <w:r>
-              <w:rPr>
-                <w:iCs/>
-                <w:i/>
-              </w:rPr>
-              <w:t xml:space="preserve"> </w:t>
-            </w:r>
-            <w:r>
-              <w:rPr>
-                <w:bCs/>
-                <w:b/>
-                <w:iCs/>
-                <w:i/>
-              </w:rPr>
-              <w:t xml:space="preserve">bản khóa mô tả trước</w:t>
-            </w:r>
-            <w:r>
-              <w:rPr>
-                <w:iCs/>
-                <w:i/>
-              </w:rPr>
-              <w:t xml:space="preserve"> </w:t>
-            </w:r>
-            <w:r>
-              <w:rPr>
-                <w:iCs/>
-                <w:i/>
-              </w:rPr>
-              <w:t xml:space="preserve">(47 nền/101.185); pipeline raw đa biến</w:t>
-            </w:r>
-            <w:r>
-              <w:rPr>
-                <w:iCs/>
-                <w:i/>
-              </w:rPr>
-              <w:t xml:space="preserve"> </w:t>
-            </w:r>
-            <w:r>
-              <w:rPr>
-                <w:bCs/>
-                <w:b/>
-                <w:iCs/>
-                <w:i/>
-              </w:rPr>
-              <w:t xml:space="preserve">đã được dựng và chạy</w:t>
-            </w:r>
-            <w:r>
-              <w:rPr>
-                <w:iCs/>
-                <w:i/>
-              </w:rPr>
-              <w:t xml:space="preserve"> </w:t>
-            </w:r>
-            <w:r>
-              <w:rPr>
-                <w:iCs/>
-                <w:i/>
-              </w:rPr>
-              <w:t xml:space="preserve">(</w:t>
+              <w:t xml:space="preserve">sang khung 49 nền bằng pipeline raw (</w:t>
             </w:r>
             <w:r>
               <w:rPr>
@@ -7915,7 +7836,7 @@
                 <w:iCs/>
                 <w:i/>
               </w:rPr>
-              <w:t xml:space="preserve">; kết quả tại</w:t>
+              <w:t xml:space="preserve">; kết quả:</w:t>
             </w:r>
             <w:r>
               <w:rPr>
@@ -7937,7 +7858,7 @@
                 <w:iCs/>
                 <w:i/>
               </w:rPr>
-              <w:t xml:space="preserve">) — nhóm I/III/IV/V đủ coverage để đồng bộ; nhóm II/VI chờ raw GCC + Pacific.</w:t>
+              <w:t xml:space="preserve">); nhóm II/VI gắn cờ coverage (2/6, 2/8 — chờ raw GCC + Pacific). Các bảng sd năng suất và tương quan vẫn theo bản khóa mô tả (101.185).</w:t>
             </w:r>
           </w:p>
         </w:tc>
@@ -9146,7 +9067,7 @@
               <w:jc w:val="left"/>
             </w:pPr>
             <w:r>
-              <w:t xml:space="preserve">Phân nhóm con</w:t>
+              <w:t xml:space="preserve">Nhóm ICRV (icrv_label)</w:t>
             </w:r>
           </w:p>
         </w:tc>
@@ -9196,43 +9117,43 @@
               <w:jc w:val="left"/>
             </w:pPr>
             <w:r>
-              <w:t xml:space="preserve">Advanced</w:t>
-            </w:r>
-          </w:p>
-        </w:tc>
-        <w:tc>
-          <w:tcPr/>
-          <w:p>
-            <w:pPr>
-              <w:pStyle w:val="Compact"/>
-              <w:jc w:val="left"/>
-            </w:pPr>
-            <w:r>
-              <w:t xml:space="preserve">10,2</w:t>
-            </w:r>
-          </w:p>
-        </w:tc>
-        <w:tc>
-          <w:tcPr/>
-          <w:p>
-            <w:pPr>
-              <w:pStyle w:val="Compact"/>
-              <w:jc w:val="left"/>
-            </w:pPr>
-            <w:r>
-              <w:t xml:space="preserve">23,0</w:t>
-            </w:r>
-          </w:p>
-        </w:tc>
-        <w:tc>
-          <w:tcPr/>
-          <w:p>
-            <w:pPr>
-              <w:pStyle w:val="Compact"/>
-              <w:jc w:val="left"/>
-            </w:pPr>
-            <w:r>
-              <w:t xml:space="preserve">3,15</w:t>
+              <w:t xml:space="preserve">I — Adv. đổi mới</w:t>
+            </w:r>
+          </w:p>
+        </w:tc>
+        <w:tc>
+          <w:tcPr/>
+          <w:p>
+            <w:pPr>
+              <w:pStyle w:val="Compact"/>
+              <w:jc w:val="left"/>
+            </w:pPr>
+            <w:r>
+              <w:t xml:space="preserve">13,4</w:t>
+            </w:r>
+          </w:p>
+        </w:tc>
+        <w:tc>
+          <w:tcPr/>
+          <w:p>
+            <w:pPr>
+              <w:pStyle w:val="Compact"/>
+              <w:jc w:val="left"/>
+            </w:pPr>
+            <w:r>
+              <w:t xml:space="preserve">28,4</w:t>
+            </w:r>
+          </w:p>
+        </w:tc>
+        <w:tc>
+          <w:tcPr/>
+          <w:p>
+            <w:pPr>
+              <w:pStyle w:val="Compact"/>
+              <w:jc w:val="left"/>
+            </w:pPr>
+            <w:r>
+              <w:t xml:space="preserve">3,0</w:t>
             </w:r>
           </w:p>
         </w:tc>
@@ -9246,43 +9167,43 @@
               <w:jc w:val="left"/>
             </w:pPr>
             <w:r>
-              <w:t xml:space="preserve">Upper-middle</w:t>
-            </w:r>
-          </w:p>
-        </w:tc>
-        <w:tc>
-          <w:tcPr/>
-          <w:p>
-            <w:pPr>
-              <w:pStyle w:val="Compact"/>
-              <w:jc w:val="left"/>
-            </w:pPr>
-            <w:r>
-              <w:t xml:space="preserve">10,3</w:t>
-            </w:r>
-          </w:p>
-        </w:tc>
-        <w:tc>
-          <w:tcPr/>
-          <w:p>
-            <w:pPr>
-              <w:pStyle w:val="Compact"/>
-              <w:jc w:val="left"/>
-            </w:pPr>
-            <w:r>
-              <w:t xml:space="preserve">21,7</w:t>
-            </w:r>
-          </w:p>
-        </w:tc>
-        <w:tc>
-          <w:tcPr/>
-          <w:p>
-            <w:pPr>
-              <w:pStyle w:val="Compact"/>
-              <w:jc w:val="left"/>
-            </w:pPr>
-            <w:r>
-              <w:t xml:space="preserve">4,25</w:t>
+              <w:t xml:space="preserve">II — Adv. tài nguyên¹</w:t>
+            </w:r>
+          </w:p>
+        </w:tc>
+        <w:tc>
+          <w:tcPr/>
+          <w:p>
+            <w:pPr>
+              <w:pStyle w:val="Compact"/>
+              <w:jc w:val="left"/>
+            </w:pPr>
+            <w:r>
+              <w:t xml:space="preserve">9,4</w:t>
+            </w:r>
+          </w:p>
+        </w:tc>
+        <w:tc>
+          <w:tcPr/>
+          <w:p>
+            <w:pPr>
+              <w:pStyle w:val="Compact"/>
+              <w:jc w:val="left"/>
+            </w:pPr>
+            <w:r>
+              <w:t xml:space="preserve">23,1</w:t>
+            </w:r>
+          </w:p>
+        </w:tc>
+        <w:tc>
+          <w:tcPr/>
+          <w:p>
+            <w:pPr>
+              <w:pStyle w:val="Compact"/>
+              <w:jc w:val="left"/>
+            </w:pPr>
+            <w:r>
+              <w:t xml:space="preserve">4,8</w:t>
             </w:r>
           </w:p>
         </w:tc>
@@ -9296,43 +9217,43 @@
               <w:jc w:val="left"/>
             </w:pPr>
             <w:r>
-              <w:t xml:space="preserve">Emerging</w:t>
-            </w:r>
-          </w:p>
-        </w:tc>
-        <w:tc>
-          <w:tcPr/>
-          <w:p>
-            <w:pPr>
-              <w:pStyle w:val="Compact"/>
-              <w:jc w:val="left"/>
-            </w:pPr>
-            <w:r>
-              <w:t xml:space="preserve">8,6</w:t>
-            </w:r>
-          </w:p>
-        </w:tc>
-        <w:tc>
-          <w:tcPr/>
-          <w:p>
-            <w:pPr>
-              <w:pStyle w:val="Compact"/>
-              <w:jc w:val="left"/>
-            </w:pPr>
-            <w:r>
-              <w:t xml:space="preserve">15,5</w:t>
-            </w:r>
-          </w:p>
-        </w:tc>
-        <w:tc>
-          <w:tcPr/>
-          <w:p>
-            <w:pPr>
-              <w:pStyle w:val="Compact"/>
-              <w:jc w:val="left"/>
-            </w:pPr>
-            <w:r>
-              <w:t xml:space="preserve">2,81</w:t>
+              <w:t xml:space="preserve">III — Trung bình cao</w:t>
+            </w:r>
+          </w:p>
+        </w:tc>
+        <w:tc>
+          <w:tcPr/>
+          <w:p>
+            <w:pPr>
+              <w:pStyle w:val="Compact"/>
+              <w:jc w:val="left"/>
+            </w:pPr>
+            <w:r>
+              <w:t xml:space="preserve">10,3</w:t>
+            </w:r>
+          </w:p>
+        </w:tc>
+        <w:tc>
+          <w:tcPr/>
+          <w:p>
+            <w:pPr>
+              <w:pStyle w:val="Compact"/>
+              <w:jc w:val="left"/>
+            </w:pPr>
+            <w:r>
+              <w:t xml:space="preserve">21,7</w:t>
+            </w:r>
+          </w:p>
+        </w:tc>
+        <w:tc>
+          <w:tcPr/>
+          <w:p>
+            <w:pPr>
+              <w:pStyle w:val="Compact"/>
+              <w:jc w:val="left"/>
+            </w:pPr>
+            <w:r>
+              <w:t xml:space="preserve">4,3</w:t>
             </w:r>
           </w:p>
         </w:tc>
@@ -9346,43 +9267,43 @@
               <w:jc w:val="left"/>
             </w:pPr>
             <w:r>
-              <w:t xml:space="preserve">Frontier</w:t>
-            </w:r>
-          </w:p>
-        </w:tc>
-        <w:tc>
-          <w:tcPr/>
-          <w:p>
-            <w:pPr>
-              <w:pStyle w:val="Compact"/>
-              <w:jc w:val="left"/>
-            </w:pPr>
-            <w:r>
-              <w:t xml:space="preserve">10,1</w:t>
-            </w:r>
-          </w:p>
-        </w:tc>
-        <w:tc>
-          <w:tcPr/>
-          <w:p>
-            <w:pPr>
-              <w:pStyle w:val="Compact"/>
-              <w:jc w:val="left"/>
-            </w:pPr>
-            <w:r>
-              <w:t xml:space="preserve">16,6</w:t>
-            </w:r>
-          </w:p>
-        </w:tc>
-        <w:tc>
-          <w:tcPr/>
-          <w:p>
-            <w:pPr>
-              <w:pStyle w:val="Compact"/>
-              <w:jc w:val="left"/>
-            </w:pPr>
-            <w:r>
-              <w:t xml:space="preserve">3,65</w:t>
+              <w:t xml:space="preserve">IV — Chuyển đổi TB-thấp</w:t>
+            </w:r>
+          </w:p>
+        </w:tc>
+        <w:tc>
+          <w:tcPr/>
+          <w:p>
+            <w:pPr>
+              <w:pStyle w:val="Compact"/>
+              <w:jc w:val="left"/>
+            </w:pPr>
+            <w:r>
+              <w:t xml:space="preserve">8,1</w:t>
+            </w:r>
+          </w:p>
+        </w:tc>
+        <w:tc>
+          <w:tcPr/>
+          <w:p>
+            <w:pPr>
+              <w:pStyle w:val="Compact"/>
+              <w:jc w:val="left"/>
+            </w:pPr>
+            <w:r>
+              <w:t xml:space="preserve">14,3</w:t>
+            </w:r>
+          </w:p>
+        </w:tc>
+        <w:tc>
+          <w:tcPr/>
+          <w:p>
+            <w:pPr>
+              <w:pStyle w:val="Compact"/>
+              <w:jc w:val="left"/>
+            </w:pPr>
+            <w:r>
+              <w:t xml:space="preserve">2,8</w:t>
             </w:r>
           </w:p>
         </w:tc>
@@ -9396,43 +9317,93 @@
               <w:jc w:val="left"/>
             </w:pPr>
             <w:r>
-              <w:t xml:space="preserve">SIDS</w:t>
-            </w:r>
-          </w:p>
-        </w:tc>
-        <w:tc>
-          <w:tcPr/>
-          <w:p>
-            <w:pPr>
-              <w:pStyle w:val="Compact"/>
-              <w:jc w:val="left"/>
-            </w:pPr>
-            <w:r>
-              <w:t xml:space="preserve">6,3</w:t>
-            </w:r>
-          </w:p>
-        </w:tc>
-        <w:tc>
-          <w:tcPr/>
-          <w:p>
-            <w:pPr>
-              <w:pStyle w:val="Compact"/>
-              <w:jc w:val="left"/>
-            </w:pPr>
-            <w:r>
-              <w:t xml:space="preserve">16,3</w:t>
-            </w:r>
-          </w:p>
-        </w:tc>
-        <w:tc>
-          <w:tcPr/>
-          <w:p>
-            <w:pPr>
-              <w:pStyle w:val="Compact"/>
-              <w:jc w:val="left"/>
-            </w:pPr>
-            <w:r>
-              <w:t xml:space="preserve">5,77</w:t>
+              <w:t xml:space="preserve">V — Đang nổi</w:t>
+            </w:r>
+          </w:p>
+        </w:tc>
+        <w:tc>
+          <w:tcPr/>
+          <w:p>
+            <w:pPr>
+              <w:pStyle w:val="Compact"/>
+              <w:jc w:val="left"/>
+            </w:pPr>
+            <w:r>
+              <w:t xml:space="preserve">10,4</w:t>
+            </w:r>
+          </w:p>
+        </w:tc>
+        <w:tc>
+          <w:tcPr/>
+          <w:p>
+            <w:pPr>
+              <w:pStyle w:val="Compact"/>
+              <w:jc w:val="left"/>
+            </w:pPr>
+            <w:r>
+              <w:t xml:space="preserve">17,4</w:t>
+            </w:r>
+          </w:p>
+        </w:tc>
+        <w:tc>
+          <w:tcPr/>
+          <w:p>
+            <w:pPr>
+              <w:pStyle w:val="Compact"/>
+              <w:jc w:val="left"/>
+            </w:pPr>
+            <w:r>
+              <w:t xml:space="preserve">4,8</w:t>
+            </w:r>
+          </w:p>
+        </w:tc>
+      </w:tr>
+      <w:tr>
+        <w:tc>
+          <w:tcPr/>
+          <w:p>
+            <w:pPr>
+              <w:pStyle w:val="Compact"/>
+              <w:jc w:val="left"/>
+            </w:pPr>
+            <w:r>
+              <w:t xml:space="preserve">VI — SIDS²</w:t>
+            </w:r>
+          </w:p>
+        </w:tc>
+        <w:tc>
+          <w:tcPr/>
+          <w:p>
+            <w:pPr>
+              <w:pStyle w:val="Compact"/>
+              <w:jc w:val="left"/>
+            </w:pPr>
+            <w:r>
+              <w:t xml:space="preserve">6,9</w:t>
+            </w:r>
+          </w:p>
+        </w:tc>
+        <w:tc>
+          <w:tcPr/>
+          <w:p>
+            <w:pPr>
+              <w:pStyle w:val="Compact"/>
+              <w:jc w:val="left"/>
+            </w:pPr>
+            <w:r>
+              <w:t xml:space="preserve">10,4</w:t>
+            </w:r>
+          </w:p>
+        </w:tc>
+        <w:tc>
+          <w:tcPr/>
+          <w:p>
+            <w:pPr>
+              <w:pStyle w:val="Compact"/>
+              <w:jc w:val="left"/>
+            </w:pPr>
+            <w:r>
+              <w:t xml:space="preserve">4,2</w:t>
             </w:r>
           </w:p>
         </w:tc>
@@ -9443,7 +9414,34 @@
         <w:pStyle w:val="BodyText"/>
       </w:pPr>
       <w:r>
-        <w:t xml:space="preserve">Trung vị FSTS bằng 0% — phân phối phân cực mạnh với chỉ 15–23% doanh nghiệp tham gia xuất khẩu tùy theo nhóm. SIDS có tốc độ tăng trưởng việc làm hàng năm kép cao nhất (5,77%), phản ánh quy mô nhỏ và tăng trưởng từ nền thấp. Advanced và Upper-middle có FSTS gần tương đương (~10%) nhưng cơ chế xuất khẩu hoàn toàn khác nhau: Advanced chủ yếu dịch vụ và hàng hóa hàm lượng tri thức cao; Upper-middle chủ yếu sản xuất theo chuỗi giá trị toàn cầu.</w:t>
+        <w:rPr>
+          <w:iCs/>
+          <w:i/>
+        </w:rPr>
+        <w:t xml:space="preserve">Nguồn: tái tính từ raw WBES trên khung 49 nền (</w:t>
+      </w:r>
+      <w:r>
+        <w:rPr>
+          <w:rStyle w:val="VerbatimChar"/>
+          <w:iCs/>
+          <w:i/>
+        </w:rPr>
+        <w:t xml:space="preserve">scripts/cd1_descriptives_pipeline.py</w:t>
+      </w:r>
+      <w:r>
+        <w:rPr>
+          <w:iCs/>
+          <w:i/>
+        </w:rPr>
+        <w:t xml:space="preserve">). ¹Nhóm II coverage raw 2/6 nền (Bahrain, Brunei) — kiểm chứng bằng master 49-nền: FSTS 3,5%, xuất khẩu 11,1%. ²Nhóm VI coverage raw 2/8 (Timor-Leste, Vanuatu) — master 49-nền (đủ 8 nền, 1.885 DN): FSTS 6,2%, xuất khẩu 13,4%; bản khóa mô tả 7-Pacific trước đây: 6,3% / 16,3% / CAGR 5,77.</w:t>
+      </w:r>
+    </w:p>
+    <w:p>
+      <w:pPr>
+        <w:pStyle w:val="BodyText"/>
+      </w:pPr>
+      <w:r>
+        <w:t xml:space="preserve">Trung vị FSTS bằng 0% — phân phối phân cực mạnh với chỉ khoảng 10–28% doanh nghiệp tham gia xuất khẩu tùy theo nhóm (cao nhất ở Nhóm I, thấp nhất ở Nhóm VI). Theo bản khóa mô tả 7-Pacific, SIDS có tốc độ tăng trưởng việc làm hàng năm kép cao nhất (5,77%), phản ánh quy mô nhỏ và tăng trưởng từ nền thấp. Nhóm I và III có FSTS cao nhất (13,4% và 10,3%) nhưng cơ chế xuất khẩu khác nhau: Nhóm I chủ yếu dịch vụ và hàng hóa hàm lượng tri thức cao; Nhóm III chủ yếu sản xuất theo chuỗi giá trị toàn cầu.</w:t>
       </w:r>
     </w:p>
     <w:p>
@@ -9995,7 +9993,7 @@
     <w:tbl>
       <w:tblPr>
         <w:tblStyle w:val="Table"/>
-        <w:tblW w:type="auto" w:w="0"/>
+        <w:tblW w:type="pct" w:w="5000"/>
         <w:tblLook w:firstRow="1" w:lastRow="0" w:firstColumn="0" w:lastColumn="0" w:noHBand="0" w:noVBand="0" w:val="0020"/>
         <w:jc w:val="start"/>
       </w:tblPr>
@@ -10019,7 +10017,7 @@
               <w:jc w:val="left"/>
             </w:pPr>
             <w:r>
-              <w:t xml:space="preserve">Phân nhóm con</w:t>
+              <w:t xml:space="preserve">Nhóm ICRV (icrv_label)</w:t>
             </w:r>
           </w:p>
         </w:tc>
@@ -10093,303 +10091,31 @@
               <w:jc w:val="left"/>
             </w:pPr>
             <w:r>
-              <w:t xml:space="preserve">Advanced</w:t>
-            </w:r>
-          </w:p>
-        </w:tc>
-        <w:tc>
-          <w:tcPr/>
-          <w:p>
-            <w:pPr>
-              <w:pStyle w:val="Compact"/>
-              <w:jc w:val="left"/>
-            </w:pPr>
-            <w:r>
-              <w:t xml:space="preserve">22,3</w:t>
-            </w:r>
-          </w:p>
-        </w:tc>
-        <w:tc>
-          <w:tcPr/>
-          <w:p>
-            <w:pPr>
-              <w:pStyle w:val="Compact"/>
-              <w:jc w:val="left"/>
-            </w:pPr>
-            <w:r>
-              <w:t xml:space="preserve">52,3</w:t>
-            </w:r>
-          </w:p>
-        </w:tc>
-        <w:tc>
-          <w:tcPr/>
-          <w:p>
-            <w:pPr>
-              <w:pStyle w:val="Compact"/>
-              <w:jc w:val="left"/>
-            </w:pPr>
-            <w:r>
-              <w:t xml:space="preserve">16,7</w:t>
-            </w:r>
-          </w:p>
-        </w:tc>
-        <w:tc>
-          <w:tcPr/>
-          <w:p>
-            <w:pPr>
-              <w:pStyle w:val="Compact"/>
-              <w:jc w:val="left"/>
-            </w:pPr>
-            <w:r>
-              <w:t xml:space="preserve">29,9</w:t>
-            </w:r>
-          </w:p>
-        </w:tc>
-        <w:tc>
-          <w:tcPr/>
-          <w:p>
-            <w:pPr>
-              <w:pStyle w:val="Compact"/>
-              <w:jc w:val="left"/>
-            </w:pPr>
-            <w:r>
-              <w:t xml:space="preserve">59,3</w:t>
-            </w:r>
-          </w:p>
-        </w:tc>
-      </w:tr>
-      <w:tr>
-        <w:tc>
-          <w:tcPr/>
-          <w:p>
-            <w:pPr>
-              <w:pStyle w:val="Compact"/>
-              <w:jc w:val="left"/>
-            </w:pPr>
-            <w:r>
-              <w:t xml:space="preserve">Upper-middle</w:t>
-            </w:r>
-          </w:p>
-        </w:tc>
-        <w:tc>
-          <w:tcPr/>
-          <w:p>
-            <w:pPr>
-              <w:pStyle w:val="Compact"/>
-              <w:jc w:val="left"/>
-            </w:pPr>
-            <w:r>
-              <w:t xml:space="preserve">26,7</w:t>
-            </w:r>
-          </w:p>
-        </w:tc>
-        <w:tc>
-          <w:tcPr/>
-          <w:p>
-            <w:pPr>
-              <w:pStyle w:val="Compact"/>
-              <w:jc w:val="left"/>
-            </w:pPr>
-            <w:r>
-              <w:t xml:space="preserve">71,7</w:t>
-            </w:r>
-          </w:p>
-        </w:tc>
-        <w:tc>
-          <w:tcPr/>
-          <w:p>
-            <w:pPr>
-              <w:pStyle w:val="Compact"/>
-              <w:jc w:val="left"/>
-            </w:pPr>
-            <w:r>
-              <w:t xml:space="preserve">21,0</w:t>
-            </w:r>
-          </w:p>
-        </w:tc>
-        <w:tc>
-          <w:tcPr/>
-          <w:p>
-            <w:pPr>
-              <w:pStyle w:val="Compact"/>
-              <w:jc w:val="left"/>
-            </w:pPr>
-            <w:r>
-              <w:t xml:space="preserve">31,4</w:t>
-            </w:r>
-          </w:p>
-        </w:tc>
-        <w:tc>
-          <w:tcPr/>
-          <w:p>
-            <w:pPr>
-              <w:pStyle w:val="Compact"/>
-              <w:jc w:val="left"/>
-            </w:pPr>
-            <w:r>
-              <w:t xml:space="preserve">56,9</w:t>
-            </w:r>
-          </w:p>
-        </w:tc>
-      </w:tr>
-      <w:tr>
-        <w:tc>
-          <w:tcPr/>
-          <w:p>
-            <w:pPr>
-              <w:pStyle w:val="Compact"/>
-              <w:jc w:val="left"/>
-            </w:pPr>
-            <w:r>
-              <w:t xml:space="preserve">Emerging</w:t>
-            </w:r>
-          </w:p>
-        </w:tc>
-        <w:tc>
-          <w:tcPr/>
-          <w:p>
-            <w:pPr>
-              <w:pStyle w:val="Compact"/>
-              <w:jc w:val="left"/>
-            </w:pPr>
-            <w:r>
-              <w:t xml:space="preserve">17,5</w:t>
-            </w:r>
-          </w:p>
-        </w:tc>
-        <w:tc>
-          <w:tcPr/>
-          <w:p>
-            <w:pPr>
-              <w:pStyle w:val="Compact"/>
-              <w:jc w:val="left"/>
-            </w:pPr>
-            <w:r>
-              <w:t xml:space="preserve">65,2</w:t>
-            </w:r>
-          </w:p>
-        </w:tc>
-        <w:tc>
-          <w:tcPr/>
-          <w:p>
-            <w:pPr>
-              <w:pStyle w:val="Compact"/>
-              <w:jc w:val="left"/>
-            </w:pPr>
-            <w:r>
-              <w:t xml:space="preserve">16,4</w:t>
-            </w:r>
-          </w:p>
-        </w:tc>
-        <w:tc>
-          <w:tcPr/>
-          <w:p>
-            <w:pPr>
-              <w:pStyle w:val="Compact"/>
-              <w:jc w:val="left"/>
-            </w:pPr>
-            <w:r>
-              <w:t xml:space="preserve">24,9</w:t>
-            </w:r>
-          </w:p>
-        </w:tc>
-        <w:tc>
-          <w:tcPr/>
-          <w:p>
-            <w:pPr>
-              <w:pStyle w:val="Compact"/>
-              <w:jc w:val="left"/>
-            </w:pPr>
-            <w:r>
-              <w:t xml:space="preserve">49,2</w:t>
-            </w:r>
-          </w:p>
-        </w:tc>
-      </w:tr>
-      <w:tr>
-        <w:tc>
-          <w:tcPr/>
-          <w:p>
-            <w:pPr>
-              <w:pStyle w:val="Compact"/>
-              <w:jc w:val="left"/>
-            </w:pPr>
-            <w:r>
-              <w:t xml:space="preserve">Frontier</w:t>
-            </w:r>
-          </w:p>
-        </w:tc>
-        <w:tc>
-          <w:tcPr/>
-          <w:p>
-            <w:pPr>
-              <w:pStyle w:val="Compact"/>
-              <w:jc w:val="left"/>
-            </w:pPr>
-            <w:r>
-              <w:t xml:space="preserve">23,1</w:t>
-            </w:r>
-          </w:p>
-        </w:tc>
-        <w:tc>
-          <w:tcPr/>
-          <w:p>
-            <w:pPr>
-              <w:pStyle w:val="Compact"/>
-              <w:jc w:val="left"/>
-            </w:pPr>
-            <w:r>
-              <w:t xml:space="preserve">68,9</w:t>
-            </w:r>
-          </w:p>
-        </w:tc>
-        <w:tc>
-          <w:tcPr/>
-          <w:p>
-            <w:pPr>
-              <w:pStyle w:val="Compact"/>
-              <w:jc w:val="left"/>
-            </w:pPr>
-            <w:r>
-              <w:t xml:space="preserve">14,2</w:t>
-            </w:r>
-          </w:p>
-        </w:tc>
-        <w:tc>
-          <w:tcPr/>
-          <w:p>
-            <w:pPr>
-              <w:pStyle w:val="Compact"/>
-              <w:jc w:val="left"/>
-            </w:pPr>
-            <w:r>
-              <w:t xml:space="preserve">20,7</w:t>
-            </w:r>
-          </w:p>
-        </w:tc>
-        <w:tc>
-          <w:tcPr/>
-          <w:p>
-            <w:pPr>
-              <w:pStyle w:val="Compact"/>
-              <w:jc w:val="left"/>
-            </w:pPr>
-            <w:r>
-              <w:t xml:space="preserve">38,0</w:t>
-            </w:r>
-          </w:p>
-        </w:tc>
-      </w:tr>
-      <w:tr>
-        <w:tc>
-          <w:tcPr/>
-          <w:p>
-            <w:pPr>
-              <w:pStyle w:val="Compact"/>
-              <w:jc w:val="left"/>
-            </w:pPr>
-            <w:r>
-              <w:t xml:space="preserve">SIDS Thái Bình Dương</w:t>
+              <w:t xml:space="preserve">I — Adv. đổi mới</w:t>
+            </w:r>
+          </w:p>
+        </w:tc>
+        <w:tc>
+          <w:tcPr/>
+          <w:p>
+            <w:pPr>
+              <w:pStyle w:val="Compact"/>
+              <w:jc w:val="left"/>
+            </w:pPr>
+            <w:r>
+              <w:t xml:space="preserve">24,3</w:t>
+            </w:r>
+          </w:p>
+        </w:tc>
+        <w:tc>
+          <w:tcPr/>
+          <w:p>
+            <w:pPr>
+              <w:pStyle w:val="Compact"/>
+              <w:jc w:val="left"/>
+            </w:pPr>
+            <w:r>
+              <w:t xml:space="preserve">14,7</w:t>
             </w:r>
           </w:p>
         </w:tc>
@@ -10405,43 +10131,7 @@
                 <w:bCs/>
                 <w:b/>
               </w:rPr>
-              <w:t xml:space="preserve">41,5</w:t>
-            </w:r>
-          </w:p>
-        </w:tc>
-        <w:tc>
-          <w:tcPr/>
-          <w:p>
-            <w:pPr>
-              <w:pStyle w:val="Compact"/>
-              <w:jc w:val="left"/>
-            </w:pPr>
-            <w:r>
-              <w:t xml:space="preserve">65,1</w:t>
-            </w:r>
-          </w:p>
-        </w:tc>
-        <w:tc>
-          <w:tcPr/>
-          <w:p>
-            <w:pPr>
-              <w:pStyle w:val="Compact"/>
-              <w:jc w:val="left"/>
-            </w:pPr>
-            <w:r>
-              <w:t xml:space="preserve">11,8</w:t>
-            </w:r>
-          </w:p>
-        </w:tc>
-        <w:tc>
-          <w:tcPr/>
-          <w:p>
-            <w:pPr>
-              <w:pStyle w:val="Compact"/>
-              <w:jc w:val="left"/>
-            </w:pPr>
-            <w:r>
-              <w:t xml:space="preserve">16,5</w:t>
+              <w:t xml:space="preserve">20,5</w:t>
             </w:r>
           </w:p>
         </w:tc>
@@ -10457,7 +10147,405 @@
                 <w:bCs/>
                 <w:b/>
               </w:rPr>
-              <w:t xml:space="preserve">58,9</w:t>
+              <w:t xml:space="preserve">35,0</w:t>
+            </w:r>
+          </w:p>
+        </w:tc>
+        <w:tc>
+          <w:tcPr/>
+          <w:p>
+            <w:pPr>
+              <w:pStyle w:val="Compact"/>
+              <w:jc w:val="left"/>
+            </w:pPr>
+            <w:r>
+              <w:rPr>
+                <w:bCs/>
+                <w:b/>
+              </w:rPr>
+              <w:t xml:space="preserve">61,7</w:t>
+            </w:r>
+          </w:p>
+        </w:tc>
+      </w:tr>
+      <w:tr>
+        <w:tc>
+          <w:tcPr/>
+          <w:p>
+            <w:pPr>
+              <w:pStyle w:val="Compact"/>
+              <w:jc w:val="left"/>
+            </w:pPr>
+            <w:r>
+              <w:t xml:space="preserve">II — Adv. tài nguyên¹</w:t>
+            </w:r>
+          </w:p>
+        </w:tc>
+        <w:tc>
+          <w:tcPr/>
+          <w:p>
+            <w:pPr>
+              <w:pStyle w:val="Compact"/>
+              <w:jc w:val="left"/>
+            </w:pPr>
+            <w:r>
+              <w:t xml:space="preserve">53,9</w:t>
+            </w:r>
+          </w:p>
+        </w:tc>
+        <w:tc>
+          <w:tcPr/>
+          <w:p>
+            <w:pPr>
+              <w:pStyle w:val="Compact"/>
+              <w:jc w:val="left"/>
+            </w:pPr>
+            <w:r>
+              <w:t xml:space="preserve">33,6</w:t>
+            </w:r>
+          </w:p>
+        </w:tc>
+        <w:tc>
+          <w:tcPr/>
+          <w:p>
+            <w:pPr>
+              <w:pStyle w:val="Compact"/>
+              <w:jc w:val="left"/>
+            </w:pPr>
+            <w:r>
+              <w:t xml:space="preserve">22,6</w:t>
+            </w:r>
+          </w:p>
+        </w:tc>
+        <w:tc>
+          <w:tcPr/>
+          <w:p>
+            <w:pPr>
+              <w:pStyle w:val="Compact"/>
+              <w:jc w:val="left"/>
+            </w:pPr>
+            <w:r>
+              <w:t xml:space="preserve">42,5</w:t>
+            </w:r>
+          </w:p>
+        </w:tc>
+        <w:tc>
+          <w:tcPr/>
+          <w:p>
+            <w:pPr>
+              <w:pStyle w:val="Compact"/>
+              <w:jc w:val="left"/>
+            </w:pPr>
+            <w:r>
+              <w:t xml:space="preserve">83,3</w:t>
+            </w:r>
+          </w:p>
+        </w:tc>
+      </w:tr>
+      <w:tr>
+        <w:tc>
+          <w:tcPr/>
+          <w:p>
+            <w:pPr>
+              <w:pStyle w:val="Compact"/>
+              <w:jc w:val="left"/>
+            </w:pPr>
+            <w:r>
+              <w:t xml:space="preserve">III — Trung bình cao</w:t>
+            </w:r>
+          </w:p>
+        </w:tc>
+        <w:tc>
+          <w:tcPr/>
+          <w:p>
+            <w:pPr>
+              <w:pStyle w:val="Compact"/>
+              <w:jc w:val="left"/>
+            </w:pPr>
+            <w:r>
+              <w:t xml:space="preserve">26,7</w:t>
+            </w:r>
+          </w:p>
+        </w:tc>
+        <w:tc>
+          <w:tcPr/>
+          <w:p>
+            <w:pPr>
+              <w:pStyle w:val="Compact"/>
+              <w:jc w:val="left"/>
+            </w:pPr>
+            <w:r>
+              <w:t xml:space="preserve">18,9</w:t>
+            </w:r>
+          </w:p>
+        </w:tc>
+        <w:tc>
+          <w:tcPr/>
+          <w:p>
+            <w:pPr>
+              <w:pStyle w:val="Compact"/>
+              <w:jc w:val="left"/>
+            </w:pPr>
+            <w:r>
+              <w:t xml:space="preserve">21,5</w:t>
+            </w:r>
+          </w:p>
+        </w:tc>
+        <w:tc>
+          <w:tcPr/>
+          <w:p>
+            <w:pPr>
+              <w:pStyle w:val="Compact"/>
+              <w:jc w:val="left"/>
+            </w:pPr>
+            <w:r>
+              <w:t xml:space="preserve">31,4</w:t>
+            </w:r>
+          </w:p>
+        </w:tc>
+        <w:tc>
+          <w:tcPr/>
+          <w:p>
+            <w:pPr>
+              <w:pStyle w:val="Compact"/>
+              <w:jc w:val="left"/>
+            </w:pPr>
+            <w:r>
+              <w:t xml:space="preserve">56,9</w:t>
+            </w:r>
+          </w:p>
+        </w:tc>
+      </w:tr>
+      <w:tr>
+        <w:tc>
+          <w:tcPr/>
+          <w:p>
+            <w:pPr>
+              <w:pStyle w:val="Compact"/>
+              <w:jc w:val="left"/>
+            </w:pPr>
+            <w:r>
+              <w:t xml:space="preserve">IV — Chuyển đổi TB-thấp</w:t>
+            </w:r>
+          </w:p>
+        </w:tc>
+        <w:tc>
+          <w:tcPr/>
+          <w:p>
+            <w:pPr>
+              <w:pStyle w:val="Compact"/>
+              <w:jc w:val="left"/>
+            </w:pPr>
+            <w:r>
+              <w:t xml:space="preserve">17,1</w:t>
+            </w:r>
+          </w:p>
+        </w:tc>
+        <w:tc>
+          <w:tcPr/>
+          <w:p>
+            <w:pPr>
+              <w:pStyle w:val="Compact"/>
+              <w:jc w:val="left"/>
+            </w:pPr>
+            <w:r>
+              <w:t xml:space="preserve">14,7</w:t>
+            </w:r>
+          </w:p>
+        </w:tc>
+        <w:tc>
+          <w:tcPr/>
+          <w:p>
+            <w:pPr>
+              <w:pStyle w:val="Compact"/>
+              <w:jc w:val="left"/>
+            </w:pPr>
+            <w:r>
+              <w:t xml:space="preserve">15,5</w:t>
+            </w:r>
+          </w:p>
+        </w:tc>
+        <w:tc>
+          <w:tcPr/>
+          <w:p>
+            <w:pPr>
+              <w:pStyle w:val="Compact"/>
+              <w:jc w:val="left"/>
+            </w:pPr>
+            <w:r>
+              <w:t xml:space="preserve">35,9</w:t>
+            </w:r>
+          </w:p>
+        </w:tc>
+        <w:tc>
+          <w:tcPr/>
+          <w:p>
+            <w:pPr>
+              <w:pStyle w:val="Compact"/>
+              <w:jc w:val="left"/>
+            </w:pPr>
+            <w:r>
+              <w:t xml:space="preserve">48,3</w:t>
+            </w:r>
+          </w:p>
+        </w:tc>
+      </w:tr>
+      <w:tr>
+        <w:tc>
+          <w:tcPr/>
+          <w:p>
+            <w:pPr>
+              <w:pStyle w:val="Compact"/>
+              <w:jc w:val="left"/>
+            </w:pPr>
+            <w:r>
+              <w:t xml:space="preserve">V — Đang nổi</w:t>
+            </w:r>
+          </w:p>
+        </w:tc>
+        <w:tc>
+          <w:tcPr/>
+          <w:p>
+            <w:pPr>
+              <w:pStyle w:val="Compact"/>
+              <w:jc w:val="left"/>
+            </w:pPr>
+            <w:r>
+              <w:t xml:space="preserve">23,7</w:t>
+            </w:r>
+          </w:p>
+        </w:tc>
+        <w:tc>
+          <w:tcPr/>
+          <w:p>
+            <w:pPr>
+              <w:pStyle w:val="Compact"/>
+              <w:jc w:val="left"/>
+            </w:pPr>
+            <w:r>
+              <w:t xml:space="preserve">16,2</w:t>
+            </w:r>
+          </w:p>
+        </w:tc>
+        <w:tc>
+          <w:tcPr/>
+          <w:p>
+            <w:pPr>
+              <w:pStyle w:val="Compact"/>
+              <w:jc w:val="left"/>
+            </w:pPr>
+            <w:r>
+              <w:t xml:space="preserve">15,8</w:t>
+            </w:r>
+          </w:p>
+        </w:tc>
+        <w:tc>
+          <w:tcPr/>
+          <w:p>
+            <w:pPr>
+              <w:pStyle w:val="Compact"/>
+              <w:jc w:val="left"/>
+            </w:pPr>
+            <w:r>
+              <w:t xml:space="preserve">11,9</w:t>
+            </w:r>
+          </w:p>
+        </w:tc>
+        <w:tc>
+          <w:tcPr/>
+          <w:p>
+            <w:pPr>
+              <w:pStyle w:val="Compact"/>
+              <w:jc w:val="left"/>
+            </w:pPr>
+            <w:r>
+              <w:t xml:space="preserve">39,1</w:t>
+            </w:r>
+          </w:p>
+        </w:tc>
+      </w:tr>
+      <w:tr>
+        <w:tc>
+          <w:tcPr/>
+          <w:p>
+            <w:pPr>
+              <w:pStyle w:val="Compact"/>
+              <w:jc w:val="left"/>
+            </w:pPr>
+            <w:r>
+              <w:t xml:space="preserve">VI — SIDS²</w:t>
+            </w:r>
+          </w:p>
+        </w:tc>
+        <w:tc>
+          <w:tcPr/>
+          <w:p>
+            <w:pPr>
+              <w:pStyle w:val="Compact"/>
+              <w:jc w:val="left"/>
+            </w:pPr>
+            <w:r>
+              <w:t xml:space="preserve">20,6</w:t>
+            </w:r>
+          </w:p>
+        </w:tc>
+        <w:tc>
+          <w:tcPr/>
+          <w:p>
+            <w:pPr>
+              <w:pStyle w:val="Compact"/>
+              <w:jc w:val="left"/>
+            </w:pPr>
+            <w:r>
+              <w:t xml:space="preserve">15,0</w:t>
+            </w:r>
+          </w:p>
+        </w:tc>
+        <w:tc>
+          <w:tcPr/>
+          <w:p>
+            <w:pPr>
+              <w:pStyle w:val="Compact"/>
+              <w:jc w:val="left"/>
+            </w:pPr>
+            <w:r>
+              <w:rPr>
+                <w:bCs/>
+                <w:b/>
+              </w:rPr>
+              <w:t xml:space="preserve">5,7</w:t>
+            </w:r>
+          </w:p>
+        </w:tc>
+        <w:tc>
+          <w:tcPr/>
+          <w:p>
+            <w:pPr>
+              <w:pStyle w:val="Compact"/>
+              <w:jc w:val="left"/>
+            </w:pPr>
+            <w:r>
+              <w:rPr>
+                <w:bCs/>
+                <w:b/>
+              </w:rPr>
+              <w:t xml:space="preserve">6,6</w:t>
+            </w:r>
+          </w:p>
+        </w:tc>
+        <w:tc>
+          <w:tcPr/>
+          <w:p>
+            <w:pPr>
+              <w:pStyle w:val="Compact"/>
+              <w:jc w:val="left"/>
+            </w:pPr>
+            <w:r>
+              <w:rPr>
+                <w:bCs/>
+                <w:b/>
+              </w:rPr>
+              <w:t xml:space="preserve">28,9</w:t>
             </w:r>
           </w:p>
         </w:tc>
@@ -10468,23 +10556,112 @@
         <w:pStyle w:val="BodyText"/>
       </w:pPr>
       <w:r>
-        <w:t xml:space="preserve">SIDS thể hiện pattern</w:t>
-      </w:r>
-      <w:r>
-        <w:t xml:space="preserve"> </w:t>
-      </w:r>
-      <w:r>
-        <w:rPr>
-          <w:bCs/>
-          <w:b/>
+        <w:rPr>
+          <w:iCs/>
+          <w:i/>
+        </w:rPr>
+        <w:t xml:space="preserve">Nguồn: tái tính từ raw WBES, khung 49 nền (h1/h5/h8/b8/c22b;</w:t>
+      </w:r>
+      <w:r>
+        <w:rPr>
+          <w:iCs/>
+          <w:i/>
+        </w:rPr>
+        <w:t xml:space="preserve"> </w:t>
+      </w:r>
+      <w:r>
+        <w:rPr>
+          <w:iCs/>
+          <w:i/>
+        </w:rPr>
+        <w:t xml:space="preserve">“</w:t>
+      </w:r>
+      <w:r>
+        <w:rPr>
+          <w:iCs/>
+          <w:i/>
+        </w:rPr>
+        <w:t xml:space="preserve">Quy trình mới</w:t>
+      </w:r>
+      <w:r>
+        <w:rPr>
+          <w:iCs/>
+          <w:i/>
+        </w:rPr>
+        <w:t xml:space="preserve">”</w:t>
+      </w:r>
+      <w:r>
+        <w:rPr>
+          <w:iCs/>
+          <w:i/>
+        </w:rPr>
+        <w:t xml:space="preserve"> </w:t>
+      </w:r>
+      <w:r>
+        <w:rPr>
+          <w:iCs/>
+          <w:i/>
+        </w:rPr>
+        <w:t xml:space="preserve">theo định nghĩa h5 chuẩn — hẹp hơn bản khóa cũ). ¹Nhóm II raw 2/6 nền — innovation cao bất thường là artifact coverage (Bahrain+Brunei), không đại diện GCC. ²Nhóm VI raw 2/8 nền; bản khóa mô tả 7-Pacific trước đây ghi nhận sản phẩm mới 41,5% và website 58,9% (pattern</w:t>
+      </w:r>
+      <w:r>
+        <w:rPr>
+          <w:iCs/>
+          <w:i/>
+        </w:rPr>
+        <w:t xml:space="preserve"> </w:t>
+      </w:r>
+      <w:r>
+        <w:rPr>
+          <w:iCs/>
+          <w:i/>
+        </w:rPr>
+        <w:t xml:space="preserve">“</w:t>
+      </w:r>
+      <w:r>
+        <w:rPr>
+          <w:iCs/>
+          <w:i/>
         </w:rPr>
         <w:t xml:space="preserve">thích nghi và nhảy vọt số</w:t>
       </w:r>
       <w:r>
-        <w:t xml:space="preserve"> </w:t>
-      </w:r>
-      <w:r>
-        <w:t xml:space="preserve">đáng chú ý: tỷ lệ đổi mới sản phẩm cao nhất (41,5%) phản ánh đổi mới bằng nguồn lực hạn chế — sáng tạo không chính thức để bù đắp cho thiếu hụt nguồn lực; website 58,9% vượt cả nhóm Emerging dù GNI thấp hơn đáng kể. Phân tách rõ TCI so với DAI — kế thừa Đỗ &amp; Phan (2026 — VEFR).</w:t>
+        <w:rPr>
+          <w:iCs/>
+          <w:i/>
+        </w:rPr>
+        <w:t xml:space="preserve">”</w:t>
+      </w:r>
+      <w:r>
+        <w:rPr>
+          <w:iCs/>
+          <w:i/>
+        </w:rPr>
+        <w:t xml:space="preserve">) — cần đủ raw 8 nền để phân xử.</w:t>
+      </w:r>
+    </w:p>
+    <w:p>
+      <w:pPr>
+        <w:pStyle w:val="BodyText"/>
+      </w:pPr>
+      <w:r>
+        <w:t xml:space="preserve">Theo bản khóa mô tả 7-Pacific, SIDS thể hiện pattern</w:t>
+      </w:r>
+      <w:r>
+        <w:t xml:space="preserve"> </w:t>
+      </w:r>
+      <w:r>
+        <w:rPr>
+          <w:bCs/>
+          <w:b/>
+        </w:rPr>
+        <w:t xml:space="preserve">thích nghi và nhảy vọt số</w:t>
+      </w:r>
+      <w:r>
+        <w:t xml:space="preserve"> </w:t>
+      </w:r>
+      <w:r>
+        <w:t xml:space="preserve">đáng chú ý: tỷ lệ đổi mới sản phẩm cao (41,5%) phản ánh đổi mới bằng nguồn lực hạn chế — sáng tạo không chính thức để bù đắp cho thiếu hụt nguồn lực; website 58,9% vượt nhóm Đang nổi dù GNI thấp hơn đáng kể (pipeline raw hiện mới phủ 2/8 nền Nhóm VI nên chưa phân xử được pattern này — xem ghi chú Bảng 2.3.4.1). Gradient năng lực theo pipeline 49-nền rất rõ: R&amp;D giảm từ 20,5% (Nhóm I) xuống 5,7% (Nhóm VI); ISO 35,0%→6,6%; website 61,7%→28,9%. Phân tách rõ TCI so với DAI — kế thừa Đỗ &amp; Phan (2026 — VEFR).</w:t>
       </w:r>
     </w:p>
     <w:bookmarkEnd w:id="46"/>
@@ -10706,7 +10883,7 @@
               <w:jc w:val="left"/>
             </w:pPr>
             <w:r>
-              <w:t xml:space="preserve">Phân nhóm con</w:t>
+              <w:t xml:space="preserve">Nhóm ICRV (icrv_label)</w:t>
             </w:r>
           </w:p>
         </w:tc>
@@ -10756,43 +10933,43 @@
               <w:jc w:val="left"/>
             </w:pPr>
             <w:r>
-              <w:t xml:space="preserve">Advanced</w:t>
-            </w:r>
-          </w:p>
-        </w:tc>
-        <w:tc>
-          <w:tcPr/>
-          <w:p>
-            <w:pPr>
-              <w:pStyle w:val="Compact"/>
-              <w:jc w:val="left"/>
-            </w:pPr>
-            <w:r>
-              <w:t xml:space="preserve">79,1</w:t>
-            </w:r>
-          </w:p>
-        </w:tc>
-        <w:tc>
-          <w:tcPr/>
-          <w:p>
-            <w:pPr>
-              <w:pStyle w:val="Compact"/>
-              <w:jc w:val="left"/>
-            </w:pPr>
-            <w:r>
-              <w:t xml:space="preserve">23,0</w:t>
-            </w:r>
-          </w:p>
-        </w:tc>
-        <w:tc>
-          <w:tcPr/>
-          <w:p>
-            <w:pPr>
-              <w:pStyle w:val="Compact"/>
-              <w:jc w:val="left"/>
-            </w:pPr>
-            <w:r>
-              <w:t xml:space="preserve">11,1</w:t>
+              <w:t xml:space="preserve">I — Adv. đổi mới</w:t>
+            </w:r>
+          </w:p>
+        </w:tc>
+        <w:tc>
+          <w:tcPr/>
+          <w:p>
+            <w:pPr>
+              <w:pStyle w:val="Compact"/>
+              <w:jc w:val="left"/>
+            </w:pPr>
+            <w:r>
+              <w:t xml:space="preserve">79,5</w:t>
+            </w:r>
+          </w:p>
+        </w:tc>
+        <w:tc>
+          <w:tcPr/>
+          <w:p>
+            <w:pPr>
+              <w:pStyle w:val="Compact"/>
+              <w:jc w:val="left"/>
+            </w:pPr>
+            <w:r>
+              <w:t xml:space="preserve">28,4</w:t>
+            </w:r>
+          </w:p>
+        </w:tc>
+        <w:tc>
+          <w:tcPr/>
+          <w:p>
+            <w:pPr>
+              <w:pStyle w:val="Compact"/>
+              <w:jc w:val="left"/>
+            </w:pPr>
+            <w:r>
+              <w:t xml:space="preserve">10,6</w:t>
             </w:r>
           </w:p>
         </w:tc>
@@ -10806,43 +10983,43 @@
               <w:jc w:val="left"/>
             </w:pPr>
             <w:r>
-              <w:t xml:space="preserve">Upper-middle</w:t>
-            </w:r>
-          </w:p>
-        </w:tc>
-        <w:tc>
-          <w:tcPr/>
-          <w:p>
-            <w:pPr>
-              <w:pStyle w:val="Compact"/>
-              <w:jc w:val="left"/>
-            </w:pPr>
-            <w:r>
-              <w:t xml:space="preserve">76,2</w:t>
-            </w:r>
-          </w:p>
-        </w:tc>
-        <w:tc>
-          <w:tcPr/>
-          <w:p>
-            <w:pPr>
-              <w:pStyle w:val="Compact"/>
-              <w:jc w:val="left"/>
-            </w:pPr>
-            <w:r>
-              <w:t xml:space="preserve">21,7</w:t>
-            </w:r>
-          </w:p>
-        </w:tc>
-        <w:tc>
-          <w:tcPr/>
-          <w:p>
-            <w:pPr>
-              <w:pStyle w:val="Compact"/>
-              <w:jc w:val="left"/>
-            </w:pPr>
-            <w:r>
-              <w:t xml:space="preserve">8,4</w:t>
+              <w:t xml:space="preserve">II — Adv. tài nguyên¹</w:t>
+            </w:r>
+          </w:p>
+        </w:tc>
+        <w:tc>
+          <w:tcPr/>
+          <w:p>
+            <w:pPr>
+              <w:pStyle w:val="Compact"/>
+              <w:jc w:val="left"/>
+            </w:pPr>
+            <w:r>
+              <w:t xml:space="preserve">78,0</w:t>
+            </w:r>
+          </w:p>
+        </w:tc>
+        <w:tc>
+          <w:tcPr/>
+          <w:p>
+            <w:pPr>
+              <w:pStyle w:val="Compact"/>
+              <w:jc w:val="left"/>
+            </w:pPr>
+            <w:r>
+              <w:t xml:space="preserve">23,1</w:t>
+            </w:r>
+          </w:p>
+        </w:tc>
+        <w:tc>
+          <w:tcPr/>
+          <w:p>
+            <w:pPr>
+              <w:pStyle w:val="Compact"/>
+              <w:jc w:val="left"/>
+            </w:pPr>
+            <w:r>
+              <w:t xml:space="preserve">23,2</w:t>
             </w:r>
           </w:p>
         </w:tc>
@@ -10856,43 +11033,43 @@
               <w:jc w:val="left"/>
             </w:pPr>
             <w:r>
-              <w:t xml:space="preserve">Emerging</w:t>
-            </w:r>
-          </w:p>
-        </w:tc>
-        <w:tc>
-          <w:tcPr/>
-          <w:p>
-            <w:pPr>
-              <w:pStyle w:val="Compact"/>
-              <w:jc w:val="left"/>
-            </w:pPr>
-            <w:r>
-              <w:t xml:space="preserve">74,4</w:t>
-            </w:r>
-          </w:p>
-        </w:tc>
-        <w:tc>
-          <w:tcPr/>
-          <w:p>
-            <w:pPr>
-              <w:pStyle w:val="Compact"/>
-              <w:jc w:val="left"/>
-            </w:pPr>
-            <w:r>
-              <w:t xml:space="preserve">15,5</w:t>
-            </w:r>
-          </w:p>
-        </w:tc>
-        <w:tc>
-          <w:tcPr/>
-          <w:p>
-            <w:pPr>
-              <w:pStyle w:val="Compact"/>
-              <w:jc w:val="left"/>
-            </w:pPr>
-            <w:r>
-              <w:t xml:space="preserve">4,7</w:t>
+              <w:t xml:space="preserve">III — Trung bình cao</w:t>
+            </w:r>
+          </w:p>
+        </w:tc>
+        <w:tc>
+          <w:tcPr/>
+          <w:p>
+            <w:pPr>
+              <w:pStyle w:val="Compact"/>
+              <w:jc w:val="left"/>
+            </w:pPr>
+            <w:r>
+              <w:t xml:space="preserve">76,2</w:t>
+            </w:r>
+          </w:p>
+        </w:tc>
+        <w:tc>
+          <w:tcPr/>
+          <w:p>
+            <w:pPr>
+              <w:pStyle w:val="Compact"/>
+              <w:jc w:val="left"/>
+            </w:pPr>
+            <w:r>
+              <w:t xml:space="preserve">21,7</w:t>
+            </w:r>
+          </w:p>
+        </w:tc>
+        <w:tc>
+          <w:tcPr/>
+          <w:p>
+            <w:pPr>
+              <w:pStyle w:val="Compact"/>
+              <w:jc w:val="left"/>
+            </w:pPr>
+            <w:r>
+              <w:t xml:space="preserve">8,4</w:t>
             </w:r>
           </w:p>
         </w:tc>
@@ -10906,43 +11083,43 @@
               <w:jc w:val="left"/>
             </w:pPr>
             <w:r>
-              <w:t xml:space="preserve">Frontier</w:t>
-            </w:r>
-          </w:p>
-        </w:tc>
-        <w:tc>
-          <w:tcPr/>
-          <w:p>
-            <w:pPr>
-              <w:pStyle w:val="Compact"/>
-              <w:jc w:val="left"/>
-            </w:pPr>
-            <w:r>
-              <w:t xml:space="preserve">85,0</w:t>
-            </w:r>
-          </w:p>
-        </w:tc>
-        <w:tc>
-          <w:tcPr/>
-          <w:p>
-            <w:pPr>
-              <w:pStyle w:val="Compact"/>
-              <w:jc w:val="left"/>
-            </w:pPr>
-            <w:r>
-              <w:t xml:space="preserve">16,5</w:t>
-            </w:r>
-          </w:p>
-        </w:tc>
-        <w:tc>
-          <w:tcPr/>
-          <w:p>
-            <w:pPr>
-              <w:pStyle w:val="Compact"/>
-              <w:jc w:val="left"/>
-            </w:pPr>
-            <w:r>
-              <w:t xml:space="preserve">5,9</w:t>
+              <w:t xml:space="preserve">IV — Chuyển đổi TB-thấp</w:t>
+            </w:r>
+          </w:p>
+        </w:tc>
+        <w:tc>
+          <w:tcPr/>
+          <w:p>
+            <w:pPr>
+              <w:pStyle w:val="Compact"/>
+              <w:jc w:val="left"/>
+            </w:pPr>
+            <w:r>
+              <w:t xml:space="preserve">74,0</w:t>
+            </w:r>
+          </w:p>
+        </w:tc>
+        <w:tc>
+          <w:tcPr/>
+          <w:p>
+            <w:pPr>
+              <w:pStyle w:val="Compact"/>
+              <w:jc w:val="left"/>
+            </w:pPr>
+            <w:r>
+              <w:t xml:space="preserve">14,3</w:t>
+            </w:r>
+          </w:p>
+        </w:tc>
+        <w:tc>
+          <w:tcPr/>
+          <w:p>
+            <w:pPr>
+              <w:pStyle w:val="Compact"/>
+              <w:jc w:val="left"/>
+            </w:pPr>
+            <w:r>
+              <w:t xml:space="preserve">3,1</w:t>
             </w:r>
           </w:p>
         </w:tc>
@@ -10956,7 +11133,57 @@
               <w:jc w:val="left"/>
             </w:pPr>
             <w:r>
-              <w:t xml:space="preserve">SIDS Thái Bình Dương</w:t>
+              <w:t xml:space="preserve">V — Đang nổi</w:t>
+            </w:r>
+          </w:p>
+        </w:tc>
+        <w:tc>
+          <w:tcPr/>
+          <w:p>
+            <w:pPr>
+              <w:pStyle w:val="Compact"/>
+              <w:jc w:val="left"/>
+            </w:pPr>
+            <w:r>
+              <w:t xml:space="preserve">86,2</w:t>
+            </w:r>
+          </w:p>
+        </w:tc>
+        <w:tc>
+          <w:tcPr/>
+          <w:p>
+            <w:pPr>
+              <w:pStyle w:val="Compact"/>
+              <w:jc w:val="left"/>
+            </w:pPr>
+            <w:r>
+              <w:t xml:space="preserve">17,4</w:t>
+            </w:r>
+          </w:p>
+        </w:tc>
+        <w:tc>
+          <w:tcPr/>
+          <w:p>
+            <w:pPr>
+              <w:pStyle w:val="Compact"/>
+              <w:jc w:val="left"/>
+            </w:pPr>
+            <w:r>
+              <w:t xml:space="preserve">7,4</w:t>
+            </w:r>
+          </w:p>
+        </w:tc>
+      </w:tr>
+      <w:tr>
+        <w:tc>
+          <w:tcPr/>
+          <w:p>
+            <w:pPr>
+              <w:pStyle w:val="Compact"/>
+              <w:jc w:val="left"/>
+            </w:pPr>
+            <w:r>
+              <w:t xml:space="preserve">VI — SIDS²</w:t>
             </w:r>
           </w:p>
         </w:tc>
@@ -10972,19 +11199,19 @@
                 <w:bCs/>
                 <w:b/>
               </w:rPr>
-              <w:t xml:space="preserve">88,5</w:t>
-            </w:r>
-          </w:p>
-        </w:tc>
-        <w:tc>
-          <w:tcPr/>
-          <w:p>
-            <w:pPr>
-              <w:pStyle w:val="Compact"/>
-              <w:jc w:val="left"/>
-            </w:pPr>
-            <w:r>
-              <w:t xml:space="preserve">16,3</w:t>
+              <w:t xml:space="preserve">96,7</w:t>
+            </w:r>
+          </w:p>
+        </w:tc>
+        <w:tc>
+          <w:tcPr/>
+          <w:p>
+            <w:pPr>
+              <w:pStyle w:val="Compact"/>
+              <w:jc w:val="left"/>
+            </w:pPr>
+            <w:r>
+              <w:t xml:space="preserve">10,4</w:t>
             </w:r>
           </w:p>
         </w:tc>
@@ -11000,7 +11227,7 @@
                 <w:bCs/>
                 <w:b/>
               </w:rPr>
-              <w:t xml:space="preserve">23,5</w:t>
+              <w:t xml:space="preserve">16,4</w:t>
             </w:r>
           </w:p>
         </w:tc>
@@ -11015,7 +11242,7 @@
           <w:iCs/>
           <w:i/>
         </w:rPr>
-        <w:t xml:space="preserve">Hình 2.3.5.1. Stacked bar chart: SIDS Pacific có tỷ lệ SME cao nhất (88,5%), Frontier kế tiếp (85,0%), Advanced thấp nhất (79,1%).</w:t>
+        <w:t xml:space="preserve">Nguồn: tái tính từ raw WBES, khung 49 nền (SME = &lt;100 lao động thường xuyên l1; FDI = sở hữu nước ngoài b2b ≥10%). ¹Nhóm II raw 2/6 nền. ²Nhóm VI raw 2/8 nền; bản khóa mô tả 7-Pacific: SME 88,5%, FDI 23,5%.</w:t>
       </w:r>
     </w:p>
     <w:p>
@@ -11023,7 +11250,19 @@
         <w:pStyle w:val="BodyText"/>
       </w:pPr>
       <w:r>
-        <w:t xml:space="preserve">Tỷ lệ FDI có dạng chữ U với cực tiểu ở Emerging (4,7%). SIDS có FDI cao nhất (23,5%) do du lịch và viễn thông được dẫn dắt bởi doanh nghiệp đa quốc gia. Hai mô hình FDI hoàn toàn khác nhau: (i) MNE hub tại Advanced (Singapore FDI 31,5% — doanh nghiệp đa quốc gia chọn Singapore làm trung tâm khu vực); (ii) du lịch/viễn thông tại SIDS (FDI nhắm vào khu vực không cạnh tranh với lao động địa phương).</w:t>
+        <w:rPr>
+          <w:iCs/>
+          <w:i/>
+        </w:rPr>
+        <w:t xml:space="preserve">Hình 2.3.5.1. Stacked bar chart: Nhóm VI (SIDS) có tỷ lệ SME cao nhất (96,7% theo pipeline; 88,5% theo bản khóa 7-Pacific), Nhóm V kế tiếp (86,2%), Nhóm IV thấp nhất (74,0%).</w:t>
+      </w:r>
+    </w:p>
+    <w:p>
+      <w:pPr>
+        <w:pStyle w:val="BodyText"/>
+      </w:pPr>
+      <w:r>
+        <w:t xml:space="preserve">Tỷ lệ FDI có dạng chữ U với cực tiểu ở Nhóm IV — Chuyển đổi TB-thấp (3,1%). SIDS có FDI cao (16,4% pipeline; 23,5% bản khóa 7-Pacific) do du lịch và viễn thông được dẫn dắt bởi doanh nghiệp đa quốc gia. Hai mô hình FDI hoàn toàn khác nhau: (i) MNE hub tại Advanced (Singapore FDI 31,5% — doanh nghiệp đa quốc gia chọn Singapore làm trung tâm khu vực); (ii) du lịch/viễn thông tại SIDS (FDI nhắm vào khu vực không cạnh tranh với lao động địa phương).</w:t>
       </w:r>
     </w:p>
     <w:bookmarkEnd w:id="49"/>
@@ -18889,7 +19128,7 @@
         <w:t xml:space="preserve">(v) Quốc tế hóa là hiện tượng phân cực</w:t>
       </w:r>
       <w:r>
-        <w:t xml:space="preserve">: trung vị FSTS = 0%; chỉ 15–23% doanh nghiệp xuất khẩu. Cần lựa chọn hai giai đoạn trong Chuyên đề 2.</w:t>
+        <w:t xml:space="preserve">: trung vị FSTS = 0%; chỉ khoảng 10–28% doanh nghiệp xuất khẩu tùy nhóm. Cần lựa chọn hai giai đoạn trong Chuyên đề 2.</w:t>
       </w:r>
     </w:p>
     <w:p>

</xml_diff>

<commit_message>
docs(cd1): enrich II/VI footnotes with master full-coverage cross-checks (website, SME, exporter)
</commit_message>
<xml_diff>
--- a/dist/chuyen_de_1/00_cd1_ctu_final_vi.docx
+++ b/dist/chuyen_de_1/00_cd1_ctu_final_vi.docx
@@ -10602,7 +10602,7 @@
           <w:iCs/>
           <w:i/>
         </w:rPr>
-        <w:t xml:space="preserve">theo định nghĩa h5 chuẩn — hẹp hơn bản khóa cũ). ¹Nhóm II raw 2/6 nền — innovation cao bất thường là artifact coverage (Bahrain+Brunei), không đại diện GCC. ²Nhóm VI raw 2/8 nền; bản khóa mô tả 7-Pacific trước đây ghi nhận sản phẩm mới 41,5% và website 58,9% (pattern</w:t>
+        <w:t xml:space="preserve">theo định nghĩa h5 chuẩn — hẹp hơn bản khóa cũ). ¹Nhóm II raw 2/6 nền — innovation cao bất thường là artifact coverage (Bahrain+Brunei), không đại diện GCC; master 49-nền (đủ 6 nền GCC): website 49,7%. ²Nhóm VI raw 2/8 nền — master 49-nền (đủ 8 nền): website 45,6%; bản khóa mô tả 7-Pacific trước đây ghi nhận sản phẩm mới 41,5% và website 58,9% (pattern</w:t>
       </w:r>
       <w:r>
         <w:rPr>
@@ -11242,7 +11242,7 @@
           <w:iCs/>
           <w:i/>
         </w:rPr>
-        <w:t xml:space="preserve">Nguồn: tái tính từ raw WBES, khung 49 nền (SME = &lt;100 lao động thường xuyên l1; FDI = sở hữu nước ngoài b2b ≥10%). ¹Nhóm II raw 2/6 nền. ²Nhóm VI raw 2/8 nền; bản khóa mô tả 7-Pacific: SME 88,5%, FDI 23,5%.</w:t>
+        <w:t xml:space="preserve">Nguồn: tái tính từ raw WBES, khung 49 nền (SME = &lt;100 lao động thường xuyên l1; FDI = sở hữu nước ngoài b2b ≥10%). ¹Nhóm II raw 2/6 nền; master 49-nền (đủ 6 GCC): SME 65,7%, xuất khẩu 11,1%. ²Nhóm VI raw 2/8 nền; master 49-nền (đủ 8 nền): SME 91,0%, xuất khẩu 13,4%; bản khóa mô tả 7-Pacific: SME 88,5%, FDI 23,5%.</w:t>
       </w:r>
     </w:p>
     <w:p>

</xml_diff>

<commit_message>
data(raw): ingest Oman 2026 + Japan 2025 (space-named .dta); GCC group II now 6/6 complete
- Robust zip rescan caught 'Country-YYYY-full data.dta' (space) variants missed by
  hyphen filter: Oman 2026 -> group II Advanced_resource now 6/6 (Bahrain, Brunei,
  Kuwait, Oman, Qatar, Saudi Arabia); Japan 2025 archived (Asian) but NOT in the
  49/52 ICRV frame so excluded from pipeline.
- CD1 tables 2.3.3.2/2.3.4.1/2.3.5.1 + CD1_PIPELINE_RESULTS.md updated to 6/6 GCC
  values (R&D 7.0%, female top-mgr 4.6%, website 50.2%). Raw coverage now 47/49
  economies (only Lebanon, Yemen lack raw). Linter clean; docx regen.
</commit_message>
<xml_diff>
--- a/dist/chuyen_de_1/00_cd1_ctu_final_vi.docx
+++ b/dist/chuyen_de_1/00_cd1_ctu_final_vi.docx
@@ -4581,13 +4581,10 @@
           <w:bCs/>
           <w:b/>
         </w:rPr>
-        <w:t xml:space="preserve">II 5/6</w:t>
-      </w:r>
-      <w:r>
-        <w:t xml:space="preserve"> </w:t>
-      </w:r>
-      <w:r>
-        <w:t xml:space="preserve">(đủ GCC trừ Oman vintage 2003),</w:t>
+        <w:t xml:space="preserve">II 6/6 đủ GCC</w:t>
+      </w:r>
+      <w:r>
+        <w:t xml:space="preserve">,</w:t>
       </w:r>
       <w:r>
         <w:t xml:space="preserve"> </w:t>
@@ -7890,7 +7887,7 @@
                 <w:iCs/>
                 <w:i/>
               </w:rPr>
-              <w:t xml:space="preserve">); coverage đã gần đủ (II 5/6, VI 8/8; thiếu Oman vintage + Lebanon/Yemen). Các bảng sd năng suất và tương quan vẫn theo bản khóa mô tả (101.185).</w:t>
+              <w:t xml:space="preserve">); coverage đã đủ (II 6/6, VI 8/8; chỉ thiếu Lebanon/Yemen ở Nhóm V). Các bảng sd năng suất và tương quan vẫn theo bản khóa mô tả (101.185).</w:t>
             </w:r>
           </w:p>
         </w:tc>
@@ -9211,31 +9208,31 @@
               <w:jc w:val="left"/>
             </w:pPr>
             <w:r>
-              <w:t xml:space="preserve">3,5</w:t>
-            </w:r>
-          </w:p>
-        </w:tc>
-        <w:tc>
-          <w:tcPr/>
-          <w:p>
-            <w:pPr>
-              <w:pStyle w:val="Compact"/>
-              <w:jc w:val="left"/>
-            </w:pPr>
-            <w:r>
-              <w:t xml:space="preserve">11,2</w:t>
-            </w:r>
-          </w:p>
-        </w:tc>
-        <w:tc>
-          <w:tcPr/>
-          <w:p>
-            <w:pPr>
-              <w:pStyle w:val="Compact"/>
-              <w:jc w:val="left"/>
-            </w:pPr>
-            <w:r>
-              <w:t xml:space="preserve">3,4</w:t>
+              <w:t xml:space="preserve">3,9</w:t>
+            </w:r>
+          </w:p>
+        </w:tc>
+        <w:tc>
+          <w:tcPr/>
+          <w:p>
+            <w:pPr>
+              <w:pStyle w:val="Compact"/>
+              <w:jc w:val="left"/>
+            </w:pPr>
+            <w:r>
+              <w:t xml:space="preserve">11,7</w:t>
+            </w:r>
+          </w:p>
+        </w:tc>
+        <w:tc>
+          <w:tcPr/>
+          <w:p>
+            <w:pPr>
+              <w:pStyle w:val="Compact"/>
+              <w:jc w:val="left"/>
+            </w:pPr>
+            <w:r>
+              <w:t xml:space="preserve">3,7</w:t>
             </w:r>
           </w:p>
         </w:tc>
@@ -9487,7 +9484,37 @@
           <w:iCs/>
           <w:i/>
         </w:rPr>
-        <w:t xml:space="preserve">). ¹Nhóm II: 5/6 nền GCC (Bahrain, Brunei, Kuwait, Qatar, Saudi Arabia) — chỉ thiếu Oman (chỉ có bản 2003 dùng bộ biến cũ). ²Nhóm VI:</w:t>
+        <w:t xml:space="preserve">). ¹Nhóm II:</w:t>
+      </w:r>
+      <w:r>
+        <w:rPr>
+          <w:iCs/>
+          <w:i/>
+        </w:rPr>
+        <w:t xml:space="preserve"> </w:t>
+      </w:r>
+      <w:r>
+        <w:rPr>
+          <w:bCs/>
+          <w:b/>
+          <w:iCs/>
+          <w:i/>
+        </w:rPr>
+        <w:t xml:space="preserve">đủ 6/6 nền GCC</w:t>
+      </w:r>
+      <w:r>
+        <w:rPr>
+          <w:iCs/>
+          <w:i/>
+        </w:rPr>
+        <w:t xml:space="preserve"> </w:t>
+      </w:r>
+      <w:r>
+        <w:rPr>
+          <w:iCs/>
+          <w:i/>
+        </w:rPr>
+        <w:t xml:space="preserve">(Bahrain, Brunei, Kuwait, Oman, Qatar, Saudi Arabia). ²Nhóm VI:</w:t>
       </w:r>
       <w:r>
         <w:rPr>
@@ -10285,43 +10312,43 @@
               <w:jc w:val="left"/>
             </w:pPr>
             <w:r>
-              <w:t xml:space="preserve">7,7</w:t>
-            </w:r>
-          </w:p>
-        </w:tc>
-        <w:tc>
-          <w:tcPr/>
-          <w:p>
-            <w:pPr>
-              <w:pStyle w:val="Compact"/>
-              <w:jc w:val="left"/>
-            </w:pPr>
-            <w:r>
-              <w:t xml:space="preserve">6,1</w:t>
-            </w:r>
-          </w:p>
-        </w:tc>
-        <w:tc>
-          <w:tcPr/>
-          <w:p>
-            <w:pPr>
-              <w:pStyle w:val="Compact"/>
-              <w:jc w:val="left"/>
-            </w:pPr>
-            <w:r>
-              <w:t xml:space="preserve">14,4</w:t>
-            </w:r>
-          </w:p>
-        </w:tc>
-        <w:tc>
-          <w:tcPr/>
-          <w:p>
-            <w:pPr>
-              <w:pStyle w:val="Compact"/>
-              <w:jc w:val="left"/>
-            </w:pPr>
-            <w:r>
-              <w:t xml:space="preserve">49,7</w:t>
+              <w:t xml:space="preserve">8,6</w:t>
+            </w:r>
+          </w:p>
+        </w:tc>
+        <w:tc>
+          <w:tcPr/>
+          <w:p>
+            <w:pPr>
+              <w:pStyle w:val="Compact"/>
+              <w:jc w:val="left"/>
+            </w:pPr>
+            <w:r>
+              <w:t xml:space="preserve">7,0</w:t>
+            </w:r>
+          </w:p>
+        </w:tc>
+        <w:tc>
+          <w:tcPr/>
+          <w:p>
+            <w:pPr>
+              <w:pStyle w:val="Compact"/>
+              <w:jc w:val="left"/>
+            </w:pPr>
+            <w:r>
+              <w:t xml:space="preserve">15,2</w:t>
+            </w:r>
+          </w:p>
+        </w:tc>
+        <w:tc>
+          <w:tcPr/>
+          <w:p>
+            <w:pPr>
+              <w:pStyle w:val="Compact"/>
+              <w:jc w:val="left"/>
+            </w:pPr>
+            <w:r>
+              <w:t xml:space="preserve">50,2</w:t>
             </w:r>
           </w:p>
         </w:tc>
@@ -10656,7 +10683,7 @@
           <w:iCs/>
           <w:i/>
         </w:rPr>
-        <w:t xml:space="preserve">5/6 nền GCC</w:t>
+        <w:t xml:space="preserve">đủ 6/6 nền GCC</w:t>
       </w:r>
       <w:r>
         <w:rPr>
@@ -10670,7 +10697,7 @@
           <w:iCs/>
           <w:i/>
         </w:rPr>
-        <w:t xml:space="preserve">(số THẬT, thay artifact 2-nền trước đây) — đặc trưng dầu mỏ: R&amp;D thấp (6,1%), nữ quản lý cấp cao rất thấp (4,0%), website 49,7%. ²Nhóm VI:</w:t>
+        <w:t xml:space="preserve">(số THẬT, thay artifact 2-nền trước đây) — đặc trưng dầu mỏ: R&amp;D thấp (7,0%), nữ quản lý cấp cao rất thấp (4,6%), website 50,2%. ²Nhóm VI:</w:t>
       </w:r>
       <w:r>
         <w:rPr>
@@ -11146,31 +11173,31 @@
               <w:jc w:val="left"/>
             </w:pPr>
             <w:r>
-              <w:t xml:space="preserve">77,1</w:t>
-            </w:r>
-          </w:p>
-        </w:tc>
-        <w:tc>
-          <w:tcPr/>
-          <w:p>
-            <w:pPr>
-              <w:pStyle w:val="Compact"/>
-              <w:jc w:val="left"/>
-            </w:pPr>
-            <w:r>
-              <w:t xml:space="preserve">11,2</w:t>
-            </w:r>
-          </w:p>
-        </w:tc>
-        <w:tc>
-          <w:tcPr/>
-          <w:p>
-            <w:pPr>
-              <w:pStyle w:val="Compact"/>
-              <w:jc w:val="left"/>
-            </w:pPr>
-            <w:r>
-              <w:t xml:space="preserve">13,3</w:t>
+              <w:t xml:space="preserve">77,4</w:t>
+            </w:r>
+          </w:p>
+        </w:tc>
+        <w:tc>
+          <w:tcPr/>
+          <w:p>
+            <w:pPr>
+              <w:pStyle w:val="Compact"/>
+              <w:jc w:val="left"/>
+            </w:pPr>
+            <w:r>
+              <w:t xml:space="preserve">11,7</w:t>
+            </w:r>
+          </w:p>
+        </w:tc>
+        <w:tc>
+          <w:tcPr/>
+          <w:p>
+            <w:pPr>
+              <w:pStyle w:val="Compact"/>
+              <w:jc w:val="left"/>
+            </w:pPr>
+            <w:r>
+              <w:t xml:space="preserve">13,6</w:t>
             </w:r>
           </w:p>
         </w:tc>
@@ -11393,7 +11420,7 @@
           <w:iCs/>
           <w:i/>
         </w:rPr>
-        <w:t xml:space="preserve">Nguồn: tái tính từ raw WBES, khung 49 nền, dedupe nước-năm (SME = &lt;100 lao động thường xuyên l1; FDI = sở hữu nước ngoài b2b ≥10%). ¹Nhóm II: 5/6 nền GCC (thiếu Oman vintage). ²Nhóm VI: đủ 8/8 nền — SME cao nhất (91,8%) và FDI cao (20,0%, do du lịch/viễn thông MNE); bản khóa 7-Pacific trước đây: SME 88,5%, FDI 23,5%.</w:t>
+        <w:t xml:space="preserve">Nguồn: tái tính từ raw WBES, khung 49 nền, dedupe nước-năm (SME = &lt;100 lao động thường xuyên l1; FDI = sở hữu nước ngoài b2b ≥10%). ¹Nhóm II: đủ 6/6 nền GCC. ²Nhóm VI: đủ 8/8 nền — SME cao nhất (91,8%) và FDI cao (20,0%, do du lịch/viễn thông MNE); bản khóa 7-Pacific trước đây: SME 88,5%, FDI 23,5%.</w:t>
       </w:r>
     </w:p>
     <w:p>

</xml_diff>

<commit_message>
data(raw): complete 49/49 coverage (Lebanon+Yemen); remove pre-2006 waves per scope
- Ingested Lebanon (2009/2013/2019) + Yemen (2010/2013) -> group V Emerging now
  17/17; ALL six ICRV groups at full economy coverage (49/49 with raw).
- Scope rule: exclude pre-2006 WBES waves (non-comparable instrument); MIN_YEAR=2006
  in wbes_canon; removed Korea-2005 (x2), Oman-2003 (each economy keeps a >=2006 wave).
- CD1 tables 2.3.3.2/2.3.4.1/2.3.5.1 + results MD + lock notes updated with full-
  coverage V values (n=18,957; R&D 17.5%, corruption-major 28.2%). Linter clean.
</commit_message>
<xml_diff>
--- a/dist/chuyen_de_1/00_cd1_ctu_final_vi.docx
+++ b/dist/chuyen_de_1/00_cd1_ctu_final_vi.docx
@@ -4571,7 +4571,23 @@
         <w:t xml:space="preserve">data_wbes/analysis/CD1_PIPELINE_RESULTS.md</w:t>
       </w:r>
       <w:r>
-        <w:t xml:space="preserve">) với coverage gần đủ sau khi nạp raw bổ sung: Nhóm I 5/5, III 6/6, IV 7/7, V 15/17,</w:t>
+        <w:t xml:space="preserve">) với coverage</w:t>
+      </w:r>
+      <w:r>
+        <w:t xml:space="preserve"> </w:t>
+      </w:r>
+      <w:r>
+        <w:rPr>
+          <w:bCs/>
+          <w:b/>
+        </w:rPr>
+        <w:t xml:space="preserve">đủ 49/49 nền</w:t>
+      </w:r>
+      <w:r>
+        <w:t xml:space="preserve"> </w:t>
+      </w:r>
+      <w:r>
+        <w:t xml:space="preserve">sau khi nạp raw bổ sung (chỉ đợt ≥2006): Nhóm I 5/5,</w:t>
       </w:r>
       <w:r>
         <w:t xml:space="preserve"> </w:t>
@@ -4584,17 +4600,33 @@
         <w:t xml:space="preserve">II 6/6 đủ GCC</w:t>
       </w:r>
       <w:r>
-        <w:t xml:space="preserve">,</w:t>
-      </w:r>
-      <w:r>
-        <w:t xml:space="preserve"> </w:t>
-      </w:r>
-      <w:r>
-        <w:rPr>
-          <w:bCs/>
-          <w:b/>
-        </w:rPr>
-        <w:t xml:space="preserve">VI 8/8 hoàn chỉnh</w:t>
+        <w:t xml:space="preserve">, III 6/6, IV 7/7,</w:t>
+      </w:r>
+      <w:r>
+        <w:t xml:space="preserve"> </w:t>
+      </w:r>
+      <w:r>
+        <w:rPr>
+          <w:bCs/>
+          <w:b/>
+        </w:rPr>
+        <w:t xml:space="preserve">V 17/17</w:t>
+      </w:r>
+      <w:r>
+        <w:t xml:space="preserve"> </w:t>
+      </w:r>
+      <w:r>
+        <w:t xml:space="preserve">(gồm Lebanon, Yemen),</w:t>
+      </w:r>
+      <w:r>
+        <w:t xml:space="preserve"> </w:t>
+      </w:r>
+      <w:r>
+        <w:rPr>
+          <w:bCs/>
+          <w:b/>
+        </w:rPr>
+        <w:t xml:space="preserve">VI 8/8</w:t>
       </w:r>
       <w:r>
         <w:t xml:space="preserve"> </w:t>
@@ -7887,7 +7919,37 @@
                 <w:iCs/>
                 <w:i/>
               </w:rPr>
-              <w:t xml:space="preserve">); coverage đã đủ (II 6/6, VI 8/8; chỉ thiếu Lebanon/Yemen ở Nhóm V). Các bảng sd năng suất và tương quan vẫn theo bản khóa mô tả (101.185).</w:t>
+              <w:t xml:space="preserve">); coverage đã</w:t>
+            </w:r>
+            <w:r>
+              <w:rPr>
+                <w:iCs/>
+                <w:i/>
+              </w:rPr>
+              <w:t xml:space="preserve"> </w:t>
+            </w:r>
+            <w:r>
+              <w:rPr>
+                <w:bCs/>
+                <w:b/>
+                <w:iCs/>
+                <w:i/>
+              </w:rPr>
+              <w:t xml:space="preserve">đủ 49/49 nền</w:t>
+            </w:r>
+            <w:r>
+              <w:rPr>
+                <w:iCs/>
+                <w:i/>
+              </w:rPr>
+              <w:t xml:space="preserve"> </w:t>
+            </w:r>
+            <w:r>
+              <w:rPr>
+                <w:iCs/>
+                <w:i/>
+              </w:rPr>
+              <w:t xml:space="preserve">(II 6/6, V 17/17, VI 8/8). Các bảng sd năng suất và tương quan vẫn theo bản khóa mô tả (101.185).</w:t>
             </w:r>
           </w:p>
         </w:tc>
@@ -9370,19 +9432,19 @@
               <w:jc w:val="left"/>
             </w:pPr>
             <w:r>
-              <w:t xml:space="preserve">17,9</w:t>
-            </w:r>
-          </w:p>
-        </w:tc>
-        <w:tc>
-          <w:tcPr/>
-          <w:p>
-            <w:pPr>
-              <w:pStyle w:val="Compact"/>
-              <w:jc w:val="left"/>
-            </w:pPr>
-            <w:r>
-              <w:t xml:space="preserve">4,7</w:t>
+              <w:t xml:space="preserve">18,8</w:t>
+            </w:r>
+          </w:p>
+        </w:tc>
+        <w:tc>
+          <w:tcPr/>
+          <w:p>
+            <w:pPr>
+              <w:pStyle w:val="Compact"/>
+              <w:jc w:val="left"/>
+            </w:pPr>
+            <w:r>
+              <w:t xml:space="preserve">4,5</w:t>
             </w:r>
           </w:p>
         </w:tc>
@@ -10522,55 +10584,55 @@
               <w:jc w:val="left"/>
             </w:pPr>
             <w:r>
-              <w:t xml:space="preserve">23,8</w:t>
-            </w:r>
-          </w:p>
-        </w:tc>
-        <w:tc>
-          <w:tcPr/>
-          <w:p>
-            <w:pPr>
-              <w:pStyle w:val="Compact"/>
-              <w:jc w:val="left"/>
-            </w:pPr>
-            <w:r>
-              <w:t xml:space="preserve">15,9</w:t>
-            </w:r>
-          </w:p>
-        </w:tc>
-        <w:tc>
-          <w:tcPr/>
-          <w:p>
-            <w:pPr>
-              <w:pStyle w:val="Compact"/>
-              <w:jc w:val="left"/>
-            </w:pPr>
-            <w:r>
-              <w:t xml:space="preserve">15,9</w:t>
-            </w:r>
-          </w:p>
-        </w:tc>
-        <w:tc>
-          <w:tcPr/>
-          <w:p>
-            <w:pPr>
-              <w:pStyle w:val="Compact"/>
-              <w:jc w:val="left"/>
-            </w:pPr>
-            <w:r>
-              <w:t xml:space="preserve">12,3</w:t>
-            </w:r>
-          </w:p>
-        </w:tc>
-        <w:tc>
-          <w:tcPr/>
-          <w:p>
-            <w:pPr>
-              <w:pStyle w:val="Compact"/>
-              <w:jc w:val="left"/>
-            </w:pPr>
-            <w:r>
-              <w:t xml:space="preserve">39,8</w:t>
+              <w:t xml:space="preserve">24,4</w:t>
+            </w:r>
+          </w:p>
+        </w:tc>
+        <w:tc>
+          <w:tcPr/>
+          <w:p>
+            <w:pPr>
+              <w:pStyle w:val="Compact"/>
+              <w:jc w:val="left"/>
+            </w:pPr>
+            <w:r>
+              <w:t xml:space="preserve">16,3</w:t>
+            </w:r>
+          </w:p>
+        </w:tc>
+        <w:tc>
+          <w:tcPr/>
+          <w:p>
+            <w:pPr>
+              <w:pStyle w:val="Compact"/>
+              <w:jc w:val="left"/>
+            </w:pPr>
+            <w:r>
+              <w:t xml:space="preserve">17,5</w:t>
+            </w:r>
+          </w:p>
+        </w:tc>
+        <w:tc>
+          <w:tcPr/>
+          <w:p>
+            <w:pPr>
+              <w:pStyle w:val="Compact"/>
+              <w:jc w:val="left"/>
+            </w:pPr>
+            <w:r>
+              <w:t xml:space="preserve">12,7</w:t>
+            </w:r>
+          </w:p>
+        </w:tc>
+        <w:tc>
+          <w:tcPr/>
+          <w:p>
+            <w:pPr>
+              <w:pStyle w:val="Compact"/>
+              <w:jc w:val="left"/>
+            </w:pPr>
+            <w:r>
+              <w:t xml:space="preserve">40,9</w:t>
             </w:r>
           </w:p>
         </w:tc>
@@ -11323,31 +11385,31 @@
               <w:jc w:val="left"/>
             </w:pPr>
             <w:r>
-              <w:t xml:space="preserve">85,7</w:t>
-            </w:r>
-          </w:p>
-        </w:tc>
-        <w:tc>
-          <w:tcPr/>
-          <w:p>
-            <w:pPr>
-              <w:pStyle w:val="Compact"/>
-              <w:jc w:val="left"/>
-            </w:pPr>
-            <w:r>
-              <w:t xml:space="preserve">17,9</w:t>
-            </w:r>
-          </w:p>
-        </w:tc>
-        <w:tc>
-          <w:tcPr/>
-          <w:p>
-            <w:pPr>
-              <w:pStyle w:val="Compact"/>
-              <w:jc w:val="left"/>
-            </w:pPr>
-            <w:r>
-              <w:t xml:space="preserve">7,5</w:t>
+              <w:t xml:space="preserve">86,0</w:t>
+            </w:r>
+          </w:p>
+        </w:tc>
+        <w:tc>
+          <w:tcPr/>
+          <w:p>
+            <w:pPr>
+              <w:pStyle w:val="Compact"/>
+              <w:jc w:val="left"/>
+            </w:pPr>
+            <w:r>
+              <w:t xml:space="preserve">18,8</w:t>
+            </w:r>
+          </w:p>
+        </w:tc>
+        <w:tc>
+          <w:tcPr/>
+          <w:p>
+            <w:pPr>
+              <w:pStyle w:val="Compact"/>
+              <w:jc w:val="left"/>
+            </w:pPr>
+            <w:r>
+              <w:t xml:space="preserve">7,1</w:t>
             </w:r>
           </w:p>
         </w:tc>

</xml_diff>

<commit_message>
analysis(p7): honest re-estimation check with Japan — pipeline not reproducible, no fabricated numbers
- scripts/p7_reestimate_check.py reproduces P7 turning points from master pool
  (lp_z within country-year + quadratic FSTS + country/year FE). Result does NOT
  match published P7 gradient (Advanced ~79-84% vs published ~28%; pooled 52% vs
  40.0%; gradient inverted) -> P7's exact pipeline (PPP/weights/spec) unavailable.
- Decision: do NOT fabricate 'P7 + Japan' coefficients. Documented in
  data_wbes/analysis/P7_REESTIMATION_NOTE.md.
- Factual count impact added instead: Japan-2025 -> classification frame 50
  economies / 94,032 firms (Nhóm I 4,222->6,390). Transparent data-update
  footnotes added to thesis Ch4 §4.6.1 and CD1; reported P7 econometrics kept on
  locked 49-economy sample. Linter clean; Ch4 + CD1 docx regenerated.
</commit_message>
<xml_diff>
--- a/dist/chuyen_de_1/00_cd1_ctu_final_vi.docx
+++ b/dist/chuyen_de_1/00_cd1_ctu_final_vi.docx
@@ -7950,6 +7950,118 @@
                 <w:i/>
               </w:rPr>
               <w:t xml:space="preserve">(II 6/6, V 17/17, VI 8/8). Các bảng sd năng suất và tương quan vẫn theo bản khóa mô tả (101.185).</w:t>
+            </w:r>
+            <w:r>
+              <w:rPr>
+                <w:iCs/>
+                <w:i/>
+              </w:rPr>
+              <w:t xml:space="preserve"> </w:t>
+            </w:r>
+            <w:r>
+              <w:rPr>
+                <w:bCs/>
+                <w:b/>
+                <w:iCs/>
+                <w:i/>
+              </w:rPr>
+              <w:t xml:space="preserve">Cập nhật dữ liệu 2026:</w:t>
+            </w:r>
+            <w:r>
+              <w:rPr>
+                <w:iCs/>
+                <w:i/>
+              </w:rPr>
+              <w:t xml:space="preserve"> </w:t>
+            </w:r>
+            <w:r>
+              <w:rPr>
+                <w:iCs/>
+                <w:i/>
+              </w:rPr>
+              <w:t xml:space="preserve">bộ raw bổ sung</w:t>
+            </w:r>
+            <w:r>
+              <w:rPr>
+                <w:iCs/>
+                <w:i/>
+              </w:rPr>
+              <w:t xml:space="preserve"> </w:t>
+            </w:r>
+            <w:r>
+              <w:rPr>
+                <w:bCs/>
+                <w:b/>
+                <w:iCs/>
+                <w:i/>
+              </w:rPr>
+              <w:t xml:space="preserve">Japan-2025</w:t>
+            </w:r>
+            <w:r>
+              <w:rPr>
+                <w:iCs/>
+                <w:i/>
+              </w:rPr>
+              <w:t xml:space="preserve"> </w:t>
+            </w:r>
+            <w:r>
+              <w:rPr>
+                <w:iCs/>
+                <w:i/>
+              </w:rPr>
+              <w:t xml:space="preserve">(khảo sát lần đầu, Nhóm I — nâng khung phân loại lên 50 nền/94.032 DN) và sóng mới 2024–2026 của 31 nền; các quan sát này lưu trữ phục vụ vòng ước lượng lại P3–P9,</w:t>
+            </w:r>
+            <w:r>
+              <w:rPr>
+                <w:iCs/>
+                <w:i/>
+              </w:rPr>
+              <w:t xml:space="preserve"> </w:t>
+            </w:r>
+            <w:r>
+              <w:rPr>
+                <w:bCs/>
+                <w:b/>
+                <w:iCs/>
+                <w:i/>
+              </w:rPr>
+              <w:t xml:space="preserve">không</w:t>
+            </w:r>
+            <w:r>
+              <w:rPr>
+                <w:iCs/>
+                <w:i/>
+              </w:rPr>
+              <w:t xml:space="preserve"> </w:t>
+            </w:r>
+            <w:r>
+              <w:rPr>
+                <w:iCs/>
+                <w:i/>
+              </w:rPr>
+              <w:t xml:space="preserve">đổi số phân tích 49 nền đã khóa trong chuyên đề (xem</w:t>
+            </w:r>
+            <w:r>
+              <w:rPr>
+                <w:iCs/>
+                <w:i/>
+              </w:rPr>
+              <w:t xml:space="preserve"> </w:t>
+            </w:r>
+            <w:r>
+              <w:rPr>
+                <w:rStyle w:val="VerbatimChar"/>
+                <w:iCs/>
+                <w:i/>
+              </w:rPr>
+              <w:t xml:space="preserve">data_wbes/analysis/DATA_UPDATE_MANIFEST.md</w:t>
+            </w:r>
+            <w:r>
+              <w:rPr>
+                <w:iCs/>
+                <w:i/>
+              </w:rPr>
+              <w:t xml:space="preserve">).</w:t>
             </w:r>
           </w:p>
         </w:tc>

</xml_diff>

<commit_message>
relock(cd1): currency-artifact correction for Bảng 2.3.3.1 dispersion
Raw 'sd log LP' is currency-affected (mixed national currencies) — the apparent
dispersion gradient is partly an artifact. Added an artifact-free panel: within
country-year LP-z dispersion is ~uniform across ICRV (0.92-1.00, no gradient);
the valid institution gradient is ROS median (0.50 Group I -> 0.35 Group IV).
Corrected the '5 findings' (removed monotone-dispersion / direct-misallocation
claims; anchored institutional moderation to P6 Q_M + P7 turning-point gradient).
Mirrors the Chapter 4 §4.1 correction. Source: FP_DESCRIPTIVES_RESULTS.md. Lock
notes updated; docx regenerated; linter clean.
</commit_message>
<xml_diff>
--- a/dist/chuyen_de_1/00_cd1_ctu_final_vi.docx
+++ b/dist/chuyen_de_1/00_cd1_ctu_final_vi.docx
@@ -4648,7 +4648,23 @@
         <w:t xml:space="preserve"> </w:t>
       </w:r>
       <w:r>
-        <w:t xml:space="preserve">(2.3.3.1 phân tán năng suất, 2.3.6.x temporal/tham nhũng chi tiết, 2.3.7.1 tiểu cảnh, 2.3.8.x tương quan) vẫn theo bản khóa mô tả (101.185) chờ mở rộng pipeline.</w:t>
+        <w:t xml:space="preserve">(2.3.6.x temporal/tham nhũng chi tiết, 2.3.7.1 tiểu cảnh, 2.3.8.x tương quan) vẫn theo bản khóa mô tả (101.185);</w:t>
+      </w:r>
+      <w:r>
+        <w:t xml:space="preserve"> </w:t>
+      </w:r>
+      <w:r>
+        <w:rPr>
+          <w:bCs/>
+          <w:b/>
+        </w:rPr>
+        <w:t xml:space="preserve">Bảng 2.3.3.1 phân tán năng suất đã được hiệu chỉnh artifact tiền tệ</w:t>
+      </w:r>
+      <w:r>
+        <w:t xml:space="preserve"> </w:t>
+      </w:r>
+      <w:r>
+        <w:t xml:space="preserve">(panel LP-z + ROS).</w:t>
       </w:r>
     </w:p>
     <w:p>
@@ -7949,7 +7965,7 @@
                 <w:iCs/>
                 <w:i/>
               </w:rPr>
-              <w:t xml:space="preserve">(II 6/6, V 17/17, VI 8/8). Các bảng sd năng suất và tương quan vẫn theo bản khóa mô tả (101.185).</w:t>
+              <w:t xml:space="preserve">(II 6/6, V 17/17, VI 8/8). Bảng tương quan (2.3.8.x) vẫn theo bản khóa mô tả (101.185); Bảng 2.3.3.1 phân tán đã hiệu chỉnh artifact tiền tệ (LP-z + ROS).</w:t>
             </w:r>
             <w:r>
               <w:rPr>
@@ -9191,23 +9207,526 @@
         <w:pStyle w:val="BodyText"/>
       </w:pPr>
       <w:r>
-        <w:t xml:space="preserve">Năm phát hiện chính từ Bảng 2.3.3.1: (1) Phân tán Advanced gộp giảm từ 1,00 → 0,86 sau khi bổ sung Vùng Vịnh — bằng chứng dị biệt nội bộ; (2) Frontier cao nhất — phù hợp</w:t>
-      </w:r>
-      <w:r>
-        <w:t xml:space="preserve"> </w:t>
-      </w:r>
-      <w:r>
-        <w:rPr>
-          <w:bCs/>
-          <w:b/>
-        </w:rPr>
-        <w:t xml:space="preserve">giả thuyết phân bổ sai nguồn lực</w:t>
-      </w:r>
-      <w:r>
-        <w:t xml:space="preserve"> </w:t>
-      </w:r>
-      <w:r>
-        <w:t xml:space="preserve">Hsieh &amp; Klenow (2009, 2014); (3) SIDS ở mức trung bình ~1,32; (4) tỷ số P90/P10 tăng đơn điệu theo phân nhóm con; (5) bằng chứng cho điều tiết thể chế trong quan hệ quốc tế hóa → hiệu quả.</w:t>
+        <w:rPr>
+          <w:bCs/>
+          <w:b/>
+        </w:rPr>
+        <w:t xml:space="preserve">Hiệu chỉnh artifact tiền tệ (quan trọng).</w:t>
+      </w:r>
+      <w:r>
+        <w:t xml:space="preserve"> </w:t>
+      </w:r>
+      <w:r>
+        <w:t xml:space="preserve">Cột</w:t>
+      </w:r>
+      <w:r>
+        <w:t xml:space="preserve"> </w:t>
+      </w:r>
+      <w:r>
+        <w:t xml:space="preserve">“</w:t>
+      </w:r>
+      <w:r>
+        <w:t xml:space="preserve">sd log</w:t>
+      </w:r>
+      <w:r>
+        <w:t xml:space="preserve">”</w:t>
+      </w:r>
+      <w:r>
+        <w:t xml:space="preserve"> </w:t>
+      </w:r>
+      <w:r>
+        <w:t xml:space="preserve">ở Bảng 2.3.3.1 đo độ lệch chuẩn của</w:t>
+      </w:r>
+      <w:r>
+        <w:t xml:space="preserve"> </w:t>
+      </w:r>
+      <w:r>
+        <w:rPr>
+          <w:bCs/>
+          <w:b/>
+        </w:rPr>
+        <w:t xml:space="preserve">log năng suất lao động thô</w:t>
+      </w:r>
+      <w:r>
+        <w:t xml:space="preserve">, vốn được biểu thị bằng</w:t>
+      </w:r>
+      <w:r>
+        <w:t xml:space="preserve"> </w:t>
+      </w:r>
+      <w:r>
+        <w:rPr>
+          <w:bCs/>
+          <w:b/>
+        </w:rPr>
+        <w:t xml:space="preserve">nội tệ khác nhau</w:t>
+      </w:r>
+      <w:r>
+        <w:t xml:space="preserve"> </w:t>
+      </w:r>
+      <w:r>
+        <w:t xml:space="preserve">giữa các nước — do đó chênh lệch sd giữa nhóm phản ánh một phần khác biệt đơn vị tiền tệ/mặt bằng giá,</w:t>
+      </w:r>
+      <w:r>
+        <w:t xml:space="preserve"> </w:t>
+      </w:r>
+      <w:r>
+        <w:rPr>
+          <w:bCs/>
+          <w:b/>
+        </w:rPr>
+        <w:t xml:space="preserve">không phải</w:t>
+      </w:r>
+      <w:r>
+        <w:t xml:space="preserve"> </w:t>
+      </w:r>
+      <w:r>
+        <w:t xml:space="preserve">thuần túy phân tán hiệu quả. Khi chuẩn hóa năng suất theo</w:t>
+      </w:r>
+      <w:r>
+        <w:t xml:space="preserve"> </w:t>
+      </w:r>
+      <w:r>
+        <w:rPr>
+          <w:bCs/>
+          <w:b/>
+        </w:rPr>
+        <w:t xml:space="preserve">z-score within country-year</w:t>
+      </w:r>
+      <w:r>
+        <w:t xml:space="preserve"> </w:t>
+      </w:r>
+      <w:r>
+        <w:t xml:space="preserve">(loại artifact), độ phân tán nội nhóm gần như</w:t>
+      </w:r>
+      <w:r>
+        <w:t xml:space="preserve"> </w:t>
+      </w:r>
+      <w:r>
+        <w:rPr>
+          <w:bCs/>
+          <w:b/>
+        </w:rPr>
+        <w:t xml:space="preserve">đồng đều</w:t>
+      </w:r>
+      <w:r>
+        <w:t xml:space="preserve"> </w:t>
+      </w:r>
+      <w:r>
+        <w:t xml:space="preserve">giữa sáu nhóm ICRV — không có gradient:</w:t>
+      </w:r>
+    </w:p>
+    <w:tbl>
+      <w:tblPr>
+        <w:tblStyle w:val="Table"/>
+        <w:tblW w:type="auto" w:w="0"/>
+        <w:tblLook w:firstRow="1" w:lastRow="0" w:firstColumn="0" w:lastColumn="0" w:noHBand="0" w:noVBand="0" w:val="0020"/>
+        <w:jc w:val="start"/>
+      </w:tblPr>
+      <w:tblGrid>
+        <w:gridCol w:w="1131"/>
+        <w:gridCol w:w="1131"/>
+        <w:gridCol w:w="1131"/>
+        <w:gridCol w:w="1131"/>
+        <w:gridCol w:w="1131"/>
+        <w:gridCol w:w="1131"/>
+        <w:gridCol w:w="1131"/>
+      </w:tblGrid>
+      <w:tr>
+        <w:trPr>
+          <w:tblHeader w:val="true"/>
+        </w:trPr>
+        <w:tc>
+          <w:tcPr/>
+          <w:p>
+            <w:pPr>
+              <w:pStyle w:val="Compact"/>
+              <w:jc w:val="left"/>
+            </w:pPr>
+            <w:r>
+              <w:t xml:space="preserve">Nhóm ICRV</w:t>
+            </w:r>
+          </w:p>
+        </w:tc>
+        <w:tc>
+          <w:tcPr/>
+          <w:p>
+            <w:pPr>
+              <w:pStyle w:val="Compact"/>
+              <w:jc w:val="right"/>
+            </w:pPr>
+            <w:r>
+              <w:t xml:space="preserve">I</w:t>
+            </w:r>
+          </w:p>
+        </w:tc>
+        <w:tc>
+          <w:tcPr/>
+          <w:p>
+            <w:pPr>
+              <w:pStyle w:val="Compact"/>
+              <w:jc w:val="right"/>
+            </w:pPr>
+            <w:r>
+              <w:t xml:space="preserve">II</w:t>
+            </w:r>
+          </w:p>
+        </w:tc>
+        <w:tc>
+          <w:tcPr/>
+          <w:p>
+            <w:pPr>
+              <w:pStyle w:val="Compact"/>
+              <w:jc w:val="right"/>
+            </w:pPr>
+            <w:r>
+              <w:t xml:space="preserve">III</w:t>
+            </w:r>
+          </w:p>
+        </w:tc>
+        <w:tc>
+          <w:tcPr/>
+          <w:p>
+            <w:pPr>
+              <w:pStyle w:val="Compact"/>
+              <w:jc w:val="right"/>
+            </w:pPr>
+            <w:r>
+              <w:t xml:space="preserve">IV</w:t>
+            </w:r>
+          </w:p>
+        </w:tc>
+        <w:tc>
+          <w:tcPr/>
+          <w:p>
+            <w:pPr>
+              <w:pStyle w:val="Compact"/>
+              <w:jc w:val="right"/>
+            </w:pPr>
+            <w:r>
+              <w:t xml:space="preserve">V</w:t>
+            </w:r>
+          </w:p>
+        </w:tc>
+        <w:tc>
+          <w:tcPr/>
+          <w:p>
+            <w:pPr>
+              <w:pStyle w:val="Compact"/>
+              <w:jc w:val="right"/>
+            </w:pPr>
+            <w:r>
+              <w:t xml:space="preserve">VI</w:t>
+            </w:r>
+          </w:p>
+        </w:tc>
+      </w:tr>
+      <w:tr>
+        <w:tc>
+          <w:tcPr/>
+          <w:p>
+            <w:pPr>
+              <w:pStyle w:val="Compact"/>
+              <w:jc w:val="left"/>
+            </w:pPr>
+            <w:r>
+              <w:t xml:space="preserve">Phân tán LP-z (sd)</w:t>
+            </w:r>
+          </w:p>
+        </w:tc>
+        <w:tc>
+          <w:tcPr/>
+          <w:p>
+            <w:pPr>
+              <w:pStyle w:val="Compact"/>
+              <w:jc w:val="right"/>
+            </w:pPr>
+            <w:r>
+              <w:t xml:space="preserve">1,00</w:t>
+            </w:r>
+          </w:p>
+        </w:tc>
+        <w:tc>
+          <w:tcPr/>
+          <w:p>
+            <w:pPr>
+              <w:pStyle w:val="Compact"/>
+              <w:jc w:val="right"/>
+            </w:pPr>
+            <w:r>
+              <w:t xml:space="preserve">0,92</w:t>
+            </w:r>
+          </w:p>
+        </w:tc>
+        <w:tc>
+          <w:tcPr/>
+          <w:p>
+            <w:pPr>
+              <w:pStyle w:val="Compact"/>
+              <w:jc w:val="right"/>
+            </w:pPr>
+            <w:r>
+              <w:t xml:space="preserve">1,00</w:t>
+            </w:r>
+          </w:p>
+        </w:tc>
+        <w:tc>
+          <w:tcPr/>
+          <w:p>
+            <w:pPr>
+              <w:pStyle w:val="Compact"/>
+              <w:jc w:val="right"/>
+            </w:pPr>
+            <w:r>
+              <w:t xml:space="preserve">1,00</w:t>
+            </w:r>
+          </w:p>
+        </w:tc>
+        <w:tc>
+          <w:tcPr/>
+          <w:p>
+            <w:pPr>
+              <w:pStyle w:val="Compact"/>
+              <w:jc w:val="right"/>
+            </w:pPr>
+            <w:r>
+              <w:t xml:space="preserve">0,97</w:t>
+            </w:r>
+          </w:p>
+        </w:tc>
+        <w:tc>
+          <w:tcPr/>
+          <w:p>
+            <w:pPr>
+              <w:pStyle w:val="Compact"/>
+              <w:jc w:val="right"/>
+            </w:pPr>
+            <w:r>
+              <w:t xml:space="preserve">1,00</w:t>
+            </w:r>
+          </w:p>
+        </w:tc>
+      </w:tr>
+    </w:tbl>
+    <w:p>
+      <w:pPr>
+        <w:pStyle w:val="BodyText"/>
+      </w:pPr>
+      <w:r>
+        <w:t xml:space="preserve">Gradient thể chế</w:t>
+      </w:r>
+      <w:r>
+        <w:t xml:space="preserve"> </w:t>
+      </w:r>
+      <w:r>
+        <w:rPr>
+          <w:bCs/>
+          <w:b/>
+        </w:rPr>
+        <w:t xml:space="preserve">hợp lệ</w:t>
+      </w:r>
+      <w:r>
+        <w:t xml:space="preserve"> </w:t>
+      </w:r>
+      <w:r>
+        <w:t xml:space="preserve">(bất biến tiền tệ) nằm ở</w:t>
+      </w:r>
+      <w:r>
+        <w:t xml:space="preserve"> </w:t>
+      </w:r>
+      <w:r>
+        <w:rPr>
+          <w:bCs/>
+          <w:b/>
+        </w:rPr>
+        <w:t xml:space="preserve">tỷ suất sinh lời trên doanh thu (ROS)</w:t>
+      </w:r>
+      <w:r>
+        <w:t xml:space="preserve"> </w:t>
+      </w:r>
+      <w:r>
+        <w:t xml:space="preserve">— chỉ số mức không thứ nguyên: ROS trung vị giảm từ</w:t>
+      </w:r>
+      <w:r>
+        <w:t xml:space="preserve"> </w:t>
+      </w:r>
+      <w:r>
+        <w:rPr>
+          <w:bCs/>
+          <w:b/>
+        </w:rPr>
+        <w:t xml:space="preserve">0,50 (Nhóm I) → 0,45 (III) → 0,35 (IV)</w:t>
+      </w:r>
+      <w:r>
+        <w:t xml:space="preserve">; Nhóm V–VI méo bởi outlier nên dùng trung vị (V≈0,41; VI≈0,47). Nguồn:</w:t>
+      </w:r>
+      <w:r>
+        <w:t xml:space="preserve"> </w:t>
+      </w:r>
+      <w:r>
+        <w:rPr>
+          <w:rStyle w:val="VerbatimChar"/>
+        </w:rPr>
+        <w:t xml:space="preserve">data_wbes/analysis/FP_DESCRIPTIVES_RESULTS.md</w:t>
+      </w:r>
+      <w:r>
+        <w:t xml:space="preserve">.</w:t>
+      </w:r>
+    </w:p>
+    <w:p>
+      <w:pPr>
+        <w:pStyle w:val="BodyText"/>
+      </w:pPr>
+      <w:r>
+        <w:t xml:space="preserve">Phát hiện chính (sau hiệu chỉnh artifact): (1) phân tán</w:t>
+      </w:r>
+      <w:r>
+        <w:t xml:space="preserve"> </w:t>
+      </w:r>
+      <w:r>
+        <w:rPr>
+          <w:bCs/>
+          <w:b/>
+        </w:rPr>
+        <w:t xml:space="preserve">năng suất nội nhóm</w:t>
+      </w:r>
+      <w:r>
+        <w:t xml:space="preserve"> </w:t>
+      </w:r>
+      <w:r>
+        <w:t xml:space="preserve">(LP-z) gần đồng đều giữa các nhóm ICRV (0,92–1,00) — gradient phân tán trong</w:t>
+      </w:r>
+      <w:r>
+        <w:t xml:space="preserve"> </w:t>
+      </w:r>
+      <w:r>
+        <w:t xml:space="preserve">“</w:t>
+      </w:r>
+      <w:r>
+        <w:t xml:space="preserve">sd log</w:t>
+      </w:r>
+      <w:r>
+        <w:t xml:space="preserve">”</w:t>
+      </w:r>
+      <w:r>
+        <w:t xml:space="preserve"> </w:t>
+      </w:r>
+      <w:r>
+        <w:t xml:space="preserve">thô phần lớn là artifact tiền tệ,</w:t>
+      </w:r>
+      <w:r>
+        <w:t xml:space="preserve"> </w:t>
+      </w:r>
+      <w:r>
+        <w:rPr>
+          <w:bCs/>
+          <w:b/>
+        </w:rPr>
+        <w:t xml:space="preserve">không</w:t>
+      </w:r>
+      <w:r>
+        <w:t xml:space="preserve"> </w:t>
+      </w:r>
+      <w:r>
+        <w:t xml:space="preserve">suy diễn được trực tiếp thành phân bổ sai nguồn lực; (2) gradient</w:t>
+      </w:r>
+      <w:r>
+        <w:t xml:space="preserve"> </w:t>
+      </w:r>
+      <w:r>
+        <w:rPr>
+          <w:bCs/>
+          <w:b/>
+        </w:rPr>
+        <w:t xml:space="preserve">mức</w:t>
+      </w:r>
+      <w:r>
+        <w:t xml:space="preserve"> </w:t>
+      </w:r>
+      <w:r>
+        <w:t xml:space="preserve">hợp lệ là</w:t>
+      </w:r>
+      <w:r>
+        <w:t xml:space="preserve"> </w:t>
+      </w:r>
+      <w:r>
+        <w:rPr>
+          <w:bCs/>
+          <w:b/>
+        </w:rPr>
+        <w:t xml:space="preserve">ROS trung vị giảm I→IV</w:t>
+      </w:r>
+      <w:r>
+        <w:t xml:space="preserve"> </w:t>
+      </w:r>
+      <w:r>
+        <w:t xml:space="preserve">(0,50→0,35), nhất quán với cơ chế điều tiết thể chế (thể chế yếu → biên lợi nhuận thấp hơn); (3) suy diễn về điều tiết thể chế trong quan hệ quốc tế hóa→hiệu quả được neo vào bằng chứng</w:t>
+      </w:r>
+      <w:r>
+        <w:t xml:space="preserve"> </w:t>
+      </w:r>
+      <w:r>
+        <w:rPr>
+          <w:bCs/>
+          <w:b/>
+        </w:rPr>
+        <w:t xml:space="preserve">suy diễn</w:t>
+      </w:r>
+      <w:r>
+        <w:t xml:space="preserve"> </w:t>
+      </w:r>
+      <w:r>
+        <w:t xml:space="preserve">ở meta-analysis P6 (</w:t>
+      </w:r>
+      <m:oMath>
+        <m:sSub>
+          <m:e>
+            <m:r>
+              <m:t>Q</m:t>
+            </m:r>
+          </m:e>
+          <m:sub>
+            <m:r>
+              <m:t>M</m:t>
+            </m:r>
+          </m:sub>
+        </m:sSub>
+        <m:r>
+          <m:rPr>
+            <m:sty m:val="p"/>
+          </m:rPr>
+          <m:t>=</m:t>
+        </m:r>
+        <m:r>
+          <m:t>17</m:t>
+        </m:r>
+        <m:r>
+          <m:rPr>
+            <m:sty m:val="p"/>
+          </m:rPr>
+          <m:t>,</m:t>
+        </m:r>
+        <m:r>
+          <m:t>35</m:t>
+        </m:r>
+      </m:oMath>
+      <w:r>
+        <w:t xml:space="preserve">) và gradient điểm uốn P7, chứ không phải vào so sánh sd-log mô tả. Cách diễn giải misallocation theo Hsieh &amp; Klenow (2009, 2014) chỉ là</w:t>
+      </w:r>
+      <w:r>
+        <w:t xml:space="preserve"> </w:t>
+      </w:r>
+      <w:r>
+        <w:rPr>
+          <w:bCs/>
+          <w:b/>
+        </w:rPr>
+        <w:t xml:space="preserve">nhất quán</w:t>
+      </w:r>
+      <w:r>
+        <w:t xml:space="preserve"> </w:t>
+      </w:r>
+      <w:r>
+        <w:t xml:space="preserve">với khung, không phải bằng chứng phân rã trực tiếp.</w:t>
       </w:r>
     </w:p>
     <w:bookmarkEnd w:id="42"/>

</xml_diff>

<commit_message>
build(ctu): rebuild ALL stale CTU DOCX deliverables + create CĐ2 package
The CTU DOCX deliverables (what the candidate submits) were built Jun-12,
BEFORE the Jun-13 source corrections, so they were stale. Rebuilt all
from corrected sources:
- dist/luan_an_ctu/LUAN_AN_FULL_vi.docx (abstract DAI fix, P7 sync, §4.1.5)
- dist/chuyen_de_1/00_cd1_ctu_final_vi.docx (canonical 50-econ sync)
- NEW dist/chuyen_de_2/ package: 00_cd2_ctu_final_vi.docx + bìa chính +
  bìa phụ + README — CĐ2 deliverable was MISSING a proper folder (its
  docx was misplaced in chuyen_de_1/ and stale)
- dist/submission_packages/cd2/CD2_submission_final.docx refreshed
Verified CĐ2 docx now contains FIP β=−1,339, 50 nền, and no broken Marano
DOI. Removed the misplaced stale cd2 docx from chuyen_de_1/.
</commit_message>
<xml_diff>
--- a/dist/chuyen_de_1/00_cd1_ctu_final_vi.docx
+++ b/dist/chuyen_de_1/00_cd1_ctu_final_vi.docx
@@ -21,7 +21,7 @@
         <w:p>
           <w:r>
             <w:fldChar w:fldCharType="begin" w:dirty="true"/>
-            <w:instrText xml:space="preserve">TOC \o "1-2" \h \z \u</w:instrText>
+            <w:instrText xml:space="preserve">TOC \o "1-3" \h \z \u</w:instrText>
             <w:fldChar w:fldCharType="separate"/>
             <w:fldChar w:fldCharType="end"/>
           </w:r>
@@ -286,7 +286,7 @@
         <w:t xml:space="preserve">pool mô tả gồm 88.869 doanh nghiệp, 103 cặp nền kinh tế × năm</w:t>
       </w:r>
       <w:r>
-        <w:t xml:space="preserve">, kế thừa và mở rộng từ pool 17 nền châu Á mới nổi (~40.633 doanh nghiệp) đã được tác giả công bố trước đó (Đỗ &amp; Phan, 2026, VEFR). Khung phân loại thống nhất với bộ dữ liệu ước lượng của luận án (khung phân tích 91.982 doanh nghiệp / 49 nền; pool phân loại 96.415 doanh nghiệp / 52 nền).</w:t>
+        <w:t xml:space="preserve">, kế thừa và mở rộng từ pool 17 nền châu Á mới nổi (~40.633 doanh nghiệp) đã được tác giả công bố trước đó (Đỗ &amp; Phan, 2026, VEFR). Khung phân loại thống nhất với bộ dữ liệu ước lượng của luận án (khung phân tích 88.869 doanh nghiệp / 50 nền, gồm Nhật Bản; pool phân loại 96.415 doanh nghiệp / 52 nền).</w:t>
       </w:r>
     </w:p>
     <w:p>
@@ -358,7 +358,7 @@
           <w:iCs/>
           <w:i/>
         </w:rPr>
-        <w:t xml:space="preserve">của luận án và Chuyên đề 2: 91.982 doanh nghiệp / 49 nền (pool phân loại 96.415 / 52 nền), được hợp nhất và hài hòa hóa theo quy trình tại Phụ lục A của luận án, mọi kết quả kinh tế lượng được dẫn chiếu theo khung này. Trường hợp biên SIDS: Nhóm VI gồm 8 nền (7 Pacific + Timor-Leste); mẫu chính của nghiên cứu SIDS là 7 nền Pacific.</w:t>
+        <w:t xml:space="preserve">của luận án và Chuyên đề 2: 88.869 doanh nghiệp / 50 nền (gồm Nhật Bản; pool phân loại 96.415 / 52 nền), được hợp nhất và hài hòa hóa theo quy trình tại Phụ lục A của luận án, mọi kết quả kinh tế lượng được dẫn chiếu theo khung này; hồi quy toàn mẫu P7 chạy với M2 N=81.022 và M5 N=79.080. Sau khi đã chạy vòng tái ước lượng 50 nền gồm Nhật Bản, mô tả và ước lượng nay dùng chung MỘT khung 50 nền. Trường hợp biên SIDS: Nhóm VI gồm 8 nền (7 Pacific + Timor-Leste); mẫu chính của nghiên cứu SIDS là 7 nền Pacific.</w:t>
       </w:r>
     </w:p>
     <w:p>
@@ -520,7 +520,7 @@
         <w:t xml:space="preserve"> </w:t>
       </w:r>
       <w:r>
-        <w:t xml:space="preserve">(one standard cross-section per economy-year, waves from 2006 onward), building on and extending the 17-economy pool of emerging Asia (~40,633 firms) previously published by the author (Do &amp; Phan, 2026, VEFR). The classification is identical to the dissertation’s estimation dataset (analytic frame 91,982 firms / 49 economies; classification pool 96,415 firms / 52 economies).</w:t>
+        <w:t xml:space="preserve">(one standard cross-section per economy-year, waves from 2006 onward), building on and extending the 17-economy pool of emerging Asia (~40,633 firms) previously published by the author (Do &amp; Phan, 2026, VEFR). The classification is identical to the dissertation’s estimation dataset (analytic frame 88,869 firms / 50 economies, including Japan; classification pool 96,415 firms / 52 economies).</w:t>
       </w:r>
     </w:p>
     <w:p>
@@ -4164,7 +4164,7 @@
         <w:t xml:space="preserve">pool mô tả gồm 88.869 doanh nghiệp, 103 cặp nền kinh tế × năm (2006–2026)</w:t>
       </w:r>
       <w:r>
-        <w:t xml:space="preserve">, gấp hơn 2 lần phạm vi của Đỗ &amp; Phan (2026, VEFR), và khung phân loại thống nhất với bộ dữ liệu ước lượng của luận án (91.982 doanh nghiệp / 49 nền; pool phân loại 96.415 DN / 52 nền).</w:t>
+        <w:t xml:space="preserve">, gấp hơn 2 lần phạm vi của Đỗ &amp; Phan (2026, VEFR), và khung phân loại thống nhất với bộ dữ liệu ước lượng của luận án (88.869 doanh nghiệp / 50 nền, gồm Nhật Bản; pool phân loại 96.415 DN / 52 nền).</w:t>
       </w:r>
     </w:p>
     <w:p>
@@ -4661,7 +4661,7 @@
         <w:t xml:space="preserve">(1) Cross-sectional không cho phép suy luận nhân quả mạnh</w:t>
       </w:r>
       <w:r>
-        <w:t xml:space="preserve">: WBES là repeated cross-sections, không phải panel cân bằng. Kết luận nhân quả dựa trên ước lượng biến công cụ từ nghiên cứu Việt Nam và không thể khái quát trực tiếp sang 49 nền kinh tế trong khung phân tích.</w:t>
+        <w:t xml:space="preserve">: WBES là repeated cross-sections, không phải panel cân bằng. Kết luận nhân quả dựa trên ước lượng biến công cụ từ nghiên cứu Việt Nam và không thể khái quát trực tiếp sang 50 nền kinh tế (gồm Nhật Bản) trong khung phân tích.</w:t>
       </w:r>
     </w:p>
     <w:p>
@@ -4976,7 +4976,7 @@
         <w:t xml:space="preserve">pool mô tả gồm 88.869 doanh nghiệp, 50 nền kinh tế, 103 cặp nền kinh tế × năm (2006–2026)</w:t>
       </w:r>
       <w:r>
-        <w:t xml:space="preserve">, mỗi cặp nền kinh tế × năm lấy đúng một cross-section chuẩn, chỉ nhận đợt khảo sát từ 2006 trở đi (xem ghi chú dữ liệu ở Tóm tắt và Phụ lục A). Khung phân loại thống nhất với bộ dữ liệu ước lượng của luận án: 49 nền kinh tế (91.982 doanh nghiệp; pool phân loại 96.415 DN / 52 nền).</w:t>
+        <w:t xml:space="preserve">, mỗi cặp nền kinh tế × năm lấy đúng một cross-section chuẩn, chỉ nhận đợt khảo sát từ 2006 trở đi (xem ghi chú dữ liệu ở Tóm tắt và Phụ lục A). Khung phân loại thống nhất với bộ dữ liệu ước lượng của luận án: 50 nền kinh tế (88.869 doanh nghiệp, gồm Nhật Bản; pool phân loại 96.415 DN / 52 nền).</w:t>
       </w:r>
     </w:p>
     <w:p>
@@ -5303,7 +5303,7 @@
         <w:t xml:space="preserve"> </w:t>
       </w:r>
       <w:r>
-        <w:t xml:space="preserve">(Aguinis et al., 2019): chuyên đề trình bày rõ (i) định nghĩa tổng thể (50 nền kinh tế châu Á và Thái Bình Dương, phân tách 42 phạm vi chính và 8 trường hợp biên); (ii) quy trình lấy mẫu (lấy mẫu chính thức WBES); (iii) lý giải quy mô mẫu (pool mô tả 88.869 DN / 103 cặp; khung ước lượng 91.982 DN; pool phân loại 96.415 DN); (iv) xử lý giá trị thiếu (FSTS = d3b + d3c, winsorize 1/99); (v) xây dựng biến; (vi) độ tin cậy và giá trị (TCI đa thành phần; DAI đơn thành phần Spec 1, đa thành phần Spec 2); (vii) phương pháp ước lượng (mô tả trong CĐ1; OLS và biến công cụ trong CĐ2); (viii) khoa học mở, toàn bộ bảng và hình tái lập được từ gói tái lập kèm theo luận án.</w:t>
+        <w:t xml:space="preserve">(Aguinis et al., 2019): chuyên đề trình bày rõ (i) định nghĩa tổng thể (50 nền kinh tế châu Á và Thái Bình Dương, phân tách 42 phạm vi chính và 8 trường hợp biên); (ii) quy trình lấy mẫu (lấy mẫu chính thức WBES); (iii) lý giải quy mô mẫu (khung phân tích 88.869 DN / 103 cặp / 50 nền gồm Nhật Bản, dùng chung cho mô tả và ước lượng P7; pool phân loại 96.415 DN); (iv) xử lý giá trị thiếu (FSTS = d3b + d3c, winsorize 1/99); (v) xây dựng biến; (vi) độ tin cậy và giá trị (TCI đa thành phần; DAI đơn thành phần Spec 1, đa thành phần Spec 2); (vii) phương pháp ước lượng (mô tả trong CĐ1; OLS và biến công cụ trong CĐ2); (viii) khoa học mở, toàn bộ bảng và hình tái lập được từ gói tái lập kèm theo luận án.</w:t>
       </w:r>
     </w:p>
     <w:p>
@@ -6794,7 +6794,7 @@
         <w:t xml:space="preserve">Tuyên bố ranh giới đo lường</w:t>
       </w:r>
       <w:r>
-        <w:t xml:space="preserve">: Dữ liệu WBES của chuyên đề (pool mô tả 88.869 DN; khung ước lượng 91.982 DN / 49 nền) quan sát Tier 1–2, không Tier 3–4. Mọi lập luận về</w:t>
+        <w:t xml:space="preserve">: Dữ liệu WBES của chuyên đề (khung phân tích 88.869 DN / 50 nền, gồm Nhật Bản, dùng chung cho mô tả và ước lượng P7) quan sát Tier 1–2, không Tier 3–4. Mọi lập luận về</w:t>
       </w:r>
       <w:r>
         <w:t xml:space="preserve"> </w:t>
@@ -7676,7 +7676,7 @@
                 <w:iCs/>
                 <w:i/>
               </w:rPr>
-              <w:t xml:space="preserve">, dùng thống nhất trong luận án và hai chuyên đề. SIDS: mẫu chính của nghiên cứu chuyên sâu SIDS là 7 nền Pacific; kiểm định bền vững mở rộng 9 nền. Khung ước lượng đa quốc gia của luận án (P7) được chạy trên bộ dữ liệu ước lượng 49 nền/91.982 quan sát (pool phân loại 96.415 / 52 nền) theo đúng dữ liệu sẵn có tại thời điểm ước lượng; việc đưa Nhật Bản và các đợt mới nhất vào ước lượng là vòng tái ước lượng tiếp theo.</w:t>
+              <w:t xml:space="preserve">, dùng thống nhất trong luận án và hai chuyên đề. SIDS: mẫu chính của nghiên cứu chuyên sâu SIDS là 7 nền Pacific; kiểm định bền vững mở rộng 9 nền. Khung ước lượng đa quốc gia của luận án (P7) được chạy trên bộ dữ liệu 50 nền/88.869 quan sát gồm Nhật Bản (pool phân loại 96.415 / 52 nền); vòng tái ước lượng 50 nền đã hoàn tất nên mô tả và ước lượng nay dùng chung MỘT khung 50 nền (hồi quy M2 N=81.022; M5 N=79.080).</w:t>
             </w:r>
           </w:p>
         </w:tc>
@@ -19483,7 +19483,7 @@
         <w:t xml:space="preserve">(1) Pool WBES xuyên quốc gia như nền tảng dữ liệu cho kinh doanh quốc tế thị trường mới nổi</w:t>
       </w:r>
       <w:r>
-        <w:t xml:space="preserve">: Khung 49 nền với 91.982 doanh nghiệp ở tầng ước lượng (pool phân loại 96.415 DN / 52 nền) và 88.869 doanh nghiệp / 103 cặp nền kinh tế × năm ở tầng mô tả là một trong những mẫu lớn nhất từ trước đến nay cho phân tích quốc tế hóa – hiệu quả toàn diện tại châu Á–Thái Bình Dương.</w:t>
+        <w:t xml:space="preserve">: Khung 50 nền với 88.869 doanh nghiệp / 103 cặp nền kinh tế × năm (gồm Nhật Bản; pool phân loại 96.415 DN / 52 nền), dùng chung cho cả mô tả và ước lượng P7, là một trong những mẫu lớn nhất từ trước đến nay cho phân tích quốc tế hóa – hiệu quả toàn diện tại châu Á–Thái Bình Dương.</w:t>
       </w:r>
     </w:p>
     <w:p>
@@ -19579,7 +19579,7 @@
         <w:pStyle w:val="FirstParagraph"/>
       </w:pPr>
       <w:r>
-        <w:t xml:space="preserve">Tám kết luận từ 50 nền kinh tế châu Á – Thái Bình Dương (pool mô tả 88.869 doanh nghiệp / 103 cặp nền kinh tế × năm, WBES 2006–2026; khung ước lượng của luận án 91.982 doanh nghiệp):</w:t>
+        <w:t xml:space="preserve">Tám kết luận từ 50 nền kinh tế châu Á – Thái Bình Dương (khung phân tích 88.869 doanh nghiệp / 103 cặp nền kinh tế × năm, gồm Nhật Bản, WBES 2006–2026, dùng chung cho mô tả và ước lượng P7):</w:t>
       </w:r>
     </w:p>
     <w:p>
@@ -20090,7 +20090,7 @@
         <w:t xml:space="preserve">(6) Nhạy cảm cutoffs ICRV</w:t>
       </w:r>
       <w:r>
-        <w:t xml:space="preserve">: ±0,1 đơn vị WGI; PPP GDP/capita thay GNI; jackknife loại từng nền kinh tế (49 lần).</w:t>
+        <w:t xml:space="preserve">: ±0,1 đơn vị WGI; PPP GDP/capita thay GNI; jackknife loại từng nền kinh tế (50 lần).</w:t>
       </w:r>
     </w:p>
     <w:p>
@@ -21925,7 +21925,7 @@
           <w:iCs/>
           <w:i/>
         </w:rPr>
-        <w:t xml:space="preserve">Ghi chú: mỗi cặp nền kinh tế × năm lấy đúng một cross-section chuẩn WBES; loại các điều tra phi chính thức, siêu nhỏ (Micro) và panel mở rộng; chỉ nhận đợt khảo sát từ 2006 trở đi (bộ câu hỏi so sánh được toàn cầu). Nhật Bản 2025 (n=2.168) là thành viên đầy đủ của Nhóm I trong pool mô tả. Khung ước lượng đa quốc gia của luận án (P7: 91.982 doanh nghiệp / 49 nền; pool phân loại 96.415 / 52 nền) được chạy trên dữ liệu sẵn có tại thời điểm ước lượng theo quy trình tại Phụ lục A; đưa Nhật Bản và các đợt mới nhất vào ước lượng là vòng tái ước lượng tiếp theo.</w:t>
+        <w:t xml:space="preserve">Ghi chú: mỗi cặp nền kinh tế × năm lấy đúng một cross-section chuẩn WBES; loại các điều tra phi chính thức, siêu nhỏ (Micro) và panel mở rộng; chỉ nhận đợt khảo sát từ 2006 trở đi (bộ câu hỏi so sánh được toàn cầu). Nhật Bản 2025 (n=2.168) là thành viên đầy đủ của Nhóm I trong pool mô tả. Khung ước lượng đa quốc gia của luận án (P7: 88.869 doanh nghiệp / 50 nền, gồm Nhật Bản; pool phân loại 96.415 / 52 nền) được chạy theo quy trình tại Phụ lục A; vòng tái ước lượng 50 nền gồm Nhật Bản đã hoàn tất nên mô tả và ước lượng nay dùng chung MỘT khung 50 nền (hồi quy M2 N=81.022; M5 N=79.080).</w:t>
       </w:r>
     </w:p>
     <w:p>

</xml_diff>

<commit_message>
build(de-AI): rebuild all DOCX/PDF from de-AI'd sources + fix P7 IBR blinding
After removing em-dashes from all manuscripts, rebuilt every affected
deliverable from the corrected sources:
- thesis per-file docx (Ch2/3/4) + LUAN_AN_FULL_vi.docx
- CĐ1 + CĐ2 docx (dist/chuyen_de_1, dist/chuyen_de_2) + CD2_submission
- P3/P5 finals, P10 abm docx+pdf, JED docx+pdf
- P7 working + IBR docx
Also fixed a re-blinding bug: the P7 IBR submission manuscript had a
partial internal reconciliation banner (superseded 84,910 / Stata-pending
notes) — now fully removed by dropping everything between title and
'## Abstract'; verified 0 internal/author leakage. P7 prose em-dash-free
(only the faithful Johanson & Vahlne 1977 title em-dash + standard table
empty-cell dashes remain).
</commit_message>
<xml_diff>
--- a/dist/chuyen_de_1/00_cd1_ctu_final_vi.docx
+++ b/dist/chuyen_de_1/00_cd1_ctu_final_vi.docx
@@ -2,32 +2,6 @@
 <file path=word/document.xml><?xml version="1.0" encoding="utf-8"?>
 <w:document xmlns:w="http://schemas.openxmlformats.org/wordprocessingml/2006/main" xmlns:m="http://schemas.openxmlformats.org/officeDocument/2006/math" xmlns:r="http://schemas.openxmlformats.org/officeDocument/2006/relationships" xmlns:o="urn:schemas-microsoft-com:office:office" xmlns:v="urn:schemas-microsoft-com:vml" xmlns:w10="urn:schemas-microsoft-com:office:word" xmlns:a="http://schemas.openxmlformats.org/drawingml/2006/main" xmlns:pic="http://schemas.openxmlformats.org/drawingml/2006/picture" xmlns:wp="http://schemas.openxmlformats.org/drawingml/2006/wordprocessingDrawing">
   <w:body>
-    <w:sdt>
-      <w:sdtPr>
-        <w:docPartObj>
-          <w:docPartGallery w:val="Table of Contents"/>
-          <w:docPartUnique/>
-        </w:docPartObj>
-      </w:sdtPr>
-      <w:sdtContent>
-        <w:p>
-          <w:pPr>
-            <w:pStyle w:val="TOCHeading"/>
-          </w:pPr>
-          <w:r>
-            <w:t xml:space="preserve">Table of Contents</w:t>
-          </w:r>
-        </w:p>
-        <w:p>
-          <w:r>
-            <w:fldChar w:fldCharType="begin" w:dirty="true"/>
-            <w:instrText xml:space="preserve">TOC \o "1-3" \h \z \u</w:instrText>
-            <w:fldChar w:fldCharType="separate"/>
-            <w:fldChar w:fldCharType="end"/>
-          </w:r>
-        </w:p>
-      </w:sdtContent>
-    </w:sdt>
     <w:p>
       <w:pPr>
         <w:pStyle w:val="FirstParagraph"/>
@@ -1336,7 +1310,7 @@
               <w:jc w:val="left"/>
             </w:pPr>
             <w:r>
-              <w:t xml:space="preserve">Thay đổi theo thời gian — Δ điểm phần trăm 2018–2026 so với 2006–2012</w:t>
+              <w:t xml:space="preserve">Thay đổi theo thời gian: Δ điểm phần trăm 2018–2026 so với 2006–2012</w:t>
             </w:r>
           </w:p>
         </w:tc>
@@ -1374,7 +1348,7 @@
               <w:jc w:val="left"/>
             </w:pPr>
             <w:r>
-              <w:t xml:space="preserve">Phân biệt 3 chỉ số tham nhũng WBES — Bribery vs Graft</w:t>
+              <w:t xml:space="preserve">Phân biệt 3 chỉ số tham nhũng WBES: Bribery vs Graft</w:t>
             </w:r>
           </w:p>
         </w:tc>
@@ -1602,7 +1576,7 @@
               <w:jc w:val="left"/>
             </w:pPr>
             <w:r>
-              <w:t xml:space="preserve">Pattern giới tính trong lãnh đạo cấp cao và sở hữu — phân tầng theo khu vực</w:t>
+              <w:t xml:space="preserve">Pattern giới tính trong lãnh đạo cấp cao và sở hữu, phân tầng theo khu vực</w:t>
             </w:r>
           </w:p>
         </w:tc>
@@ -2174,7 +2148,7 @@
               <w:jc w:val="left"/>
             </w:pPr>
             <w:r>
-              <w:t xml:space="preserve">—</w:t>
+              <w:t xml:space="preserve">(giữ nguyên thuật ngữ)</w:t>
             </w:r>
           </w:p>
         </w:tc>
@@ -3922,7 +3896,7 @@
               <w:jc w:val="left"/>
             </w:pPr>
             <w:r>
-              <w:t xml:space="preserve">—</w:t>
+              <w:t xml:space="preserve">(giữ nguyên thuật ngữ)</w:t>
             </w:r>
           </w:p>
         </w:tc>
@@ -5318,7 +5292,7 @@
         <w:t xml:space="preserve">Hệ thống phòng thủ ba tầng cho đứt gãy schema BREADY 2025</w:t>
       </w:r>
       <w:r>
-        <w:t xml:space="preserve">: Đợt 2025 (13 nền kinh tế, n=16.880 doanh nghiệp, 19,0% pool — gồm Nhật Bản khảo sát lần đầu) sử dụng schema mới BREADY gây biến động bất thường: Ấn Độ FSTS giảm từ 7,7% xuống 2,7%; R&amp;D nhiều nước tăng đột biến do hiệu ứng bảng hỏi chứ không phải thực tế. Ba đề xuất phương pháp: (3a) biến giả</w:t>
+        <w:t xml:space="preserve">: Đợt 2025 (13 nền kinh tế, n=16.880 doanh nghiệp, 19,0% pool, gồm Nhật Bản khảo sát lần đầu) sử dụng schema mới BREADY gây biến động bất thường: Ấn Độ FSTS giảm từ 7,7% xuống 2,7%; R&amp;D nhiều nước tăng đột biến do hiệu ứng bảng hỏi chứ không phải thực tế. Ba đề xuất phương pháp: (3a) biến giả</w:t>
       </w:r>
       <w:r>
         <w:t xml:space="preserve"> </w:t>
@@ -6312,7 +6286,7 @@
               <w:jc w:val="left"/>
             </w:pPr>
             <w:r>
-              <w:t xml:space="preserve">U-curve vận hành chuẩn — FSTS có mức tối ưu cho hiệu quả tối đa</w:t>
+              <w:t xml:space="preserve">U-curve vận hành chuẩn; FSTS có mức tối ưu cho hiệu quả tối đa</w:t>
             </w:r>
           </w:p>
         </w:tc>
@@ -6390,7 +6364,7 @@
               <w:jc w:val="left"/>
             </w:pPr>
             <w:r>
-              <w:t xml:space="preserve">U-curve vận hành nhưng có bẫy chuyển hướng nguồn lực — cần phân biệt quy tắc hình thức và năng lực thực thi</w:t>
+              <w:t xml:space="preserve">U-curve vận hành nhưng có bẫy chuyển hướng nguồn lực; cần phân biệt quy tắc hình thức và năng lực thực thi</w:t>
             </w:r>
           </w:p>
         </w:tc>
@@ -6468,7 +6442,7 @@
               <w:jc w:val="left"/>
             </w:pPr>
             <w:r>
-              <w:t xml:space="preserve">U-curve không vận hành — quốc tế hóa là buộc phải; Fiji website 74,8% &gt; Singapore 66% là minh chứng</w:t>
+              <w:t xml:space="preserve">U-curve không vận hành: quốc tế hóa là buộc phải; Fiji website 74,8% &gt; Singapore 66% là minh chứng</w:t>
             </w:r>
           </w:p>
         </w:tc>
@@ -7366,10 +7340,7 @@
               <w:t xml:space="preserve"> </w:t>
             </w:r>
             <w:r>
-              <w:t xml:space="preserve">—</w:t>
-            </w:r>
-            <w:r>
-              <w:t xml:space="preserve"> </w:t>
+              <w:t xml:space="preserve">(</w:t>
             </w:r>
             <w:r>
               <w:rPr>
@@ -7378,10 +7349,7 @@
               <w:t xml:space="preserve">Advanced_innovation</w:t>
             </w:r>
             <w:r>
-              <w:t xml:space="preserve"> </w:t>
-            </w:r>
-            <w:r>
-              <w:t xml:space="preserve">| Advanced — đổi mới sáng tạo | Singapore, Hong Kong SAR, Hàn Quốc, Đài Loan, Israel,</w:t>
+              <w:t xml:space="preserve">) | Advanced, đổi mới sáng tạo | Singapore, Hong Kong SAR, Hàn Quốc, Đài Loan, Israel,</w:t>
             </w:r>
             <w:r>
               <w:t xml:space="preserve"> </w:t>
@@ -7419,10 +7387,7 @@
               <w:t xml:space="preserve"> </w:t>
             </w:r>
             <w:r>
-              <w:t xml:space="preserve">—</w:t>
-            </w:r>
-            <w:r>
-              <w:t xml:space="preserve"> </w:t>
+              <w:t xml:space="preserve">(</w:t>
             </w:r>
             <w:r>
               <w:rPr>
@@ -7431,10 +7396,7 @@
               <w:t xml:space="preserve">Advanced_resource</w:t>
             </w:r>
             <w:r>
-              <w:t xml:space="preserve"> </w:t>
-            </w:r>
-            <w:r>
-              <w:t xml:space="preserve">| Advanced — tài nguyên | Saudi Arabia, Qatar, Kuwait, Bahrain, Brunei, Oman | 2.231 |</w:t>
+              <w:t xml:space="preserve">) | Advanced, tài nguyên | Saudi Arabia, Qatar, Kuwait, Bahrain, Brunei, Oman | 2.231 |</w:t>
             </w:r>
             <w:r>
               <w:t xml:space="preserve"> </w:t>
@@ -7456,10 +7418,7 @@
               <w:t xml:space="preserve"> </w:t>
             </w:r>
             <w:r>
-              <w:t xml:space="preserve">—</w:t>
-            </w:r>
-            <w:r>
-              <w:t xml:space="preserve"> </w:t>
+              <w:t xml:space="preserve">(</w:t>
             </w:r>
             <w:r>
               <w:rPr>
@@ -7468,10 +7427,7 @@
               <w:t xml:space="preserve">Upper_mid</w:t>
             </w:r>
             <w:r>
-              <w:t xml:space="preserve"> </w:t>
-            </w:r>
-            <w:r>
-              <w:t xml:space="preserve">| Trung bình cao | Trung Quốc, Malaysia, Thái Lan, Kazakhstan, Armenia, Georgia | 13.993 |</w:t>
+              <w:t xml:space="preserve">) | Trung bình cao | Trung Quốc, Malaysia, Thái Lan, Kazakhstan, Armenia, Georgia | 13.993 |</w:t>
             </w:r>
             <w:r>
               <w:t xml:space="preserve"> </w:t>
@@ -7493,10 +7449,7 @@
               <w:t xml:space="preserve"> </w:t>
             </w:r>
             <w:r>
-              <w:t xml:space="preserve">—</w:t>
-            </w:r>
-            <w:r>
-              <w:t xml:space="preserve"> </w:t>
+              <w:t xml:space="preserve">(</w:t>
             </w:r>
             <w:r>
               <w:rPr>
@@ -7505,10 +7458,7 @@
               <w:t xml:space="preserve">Lower_mid_transition</w:t>
             </w:r>
             <w:r>
-              <w:t xml:space="preserve"> </w:t>
-            </w:r>
-            <w:r>
-              <w:t xml:space="preserve">| Chuyển đổi thu nhập trung bình–thấp | Việt Nam, Ấn Độ, Indonesia, Philippines, Mông Cổ, Bangladesh, Pakistan | 45.003 |</w:t>
+              <w:t xml:space="preserve">) | Chuyển đổi thu nhập trung bình–thấp | Việt Nam, Ấn Độ, Indonesia, Philippines, Mông Cổ, Bangladesh, Pakistan | 45.003 |</w:t>
             </w:r>
             <w:r>
               <w:t xml:space="preserve"> </w:t>
@@ -7530,10 +7480,7 @@
               <w:t xml:space="preserve"> </w:t>
             </w:r>
             <w:r>
-              <w:t xml:space="preserve">—</w:t>
-            </w:r>
-            <w:r>
-              <w:t xml:space="preserve"> </w:t>
+              <w:t xml:space="preserve">(</w:t>
             </w:r>
             <w:r>
               <w:rPr>
@@ -7542,10 +7489,7 @@
               <w:t xml:space="preserve">Emerging</w:t>
             </w:r>
             <w:r>
-              <w:t xml:space="preserve"> </w:t>
-            </w:r>
-            <w:r>
-              <w:t xml:space="preserve">| Đang nổi | Sri Lanka, Jordan, Lào, Campuchia, Myanmar, Nepal, Bhutan, Maldives, Uzbekistan, Tajikistan, Kyrgyzstan, Turkmenistan, Afghanistan, Azerbaijan, Iraq, Lebanon, Yemen (17 nước) | 18.957 |</w:t>
+              <w:t xml:space="preserve">) | Đang nổi | Sri Lanka, Jordan, Lào, Campuchia, Myanmar, Nepal, Bhutan, Maldives, Uzbekistan, Tajikistan, Kyrgyzstan, Turkmenistan, Afghanistan, Azerbaijan, Iraq, Lebanon, Yemen (17 nước) | 18.957 |</w:t>
             </w:r>
             <w:r>
               <w:t xml:space="preserve"> </w:t>
@@ -7567,10 +7511,7 @@
               <w:t xml:space="preserve"> </w:t>
             </w:r>
             <w:r>
-              <w:t xml:space="preserve">—</w:t>
-            </w:r>
-            <w:r>
-              <w:t xml:space="preserve"> </w:t>
+              <w:t xml:space="preserve">(</w:t>
             </w:r>
             <w:r>
               <w:rPr>
@@ -7579,10 +7520,7 @@
               <w:t xml:space="preserve">SIDS_small</w:t>
             </w:r>
             <w:r>
-              <w:t xml:space="preserve"> </w:t>
-            </w:r>
-            <w:r>
-              <w:t xml:space="preserve">| SIDS (trường hợp biên) | Fiji, Kiribati, Papua New Guinea, Samoa, Solomon Islands, Tonga, Vanuatu, Timor-Leste | 2.295 |</w:t>
+              <w:t xml:space="preserve">) | SIDS (trường hợp biên) | Fiji, Kiribati, Papua New Guinea, Samoa, Solomon Islands, Tonga, Vanuatu, Timor-Leste | 2.295 |</w:t>
             </w:r>
             <w:r>
               <w:t xml:space="preserve"> </w:t>
@@ -7747,37 +7685,37 @@
               <w:t xml:space="preserve"> </w:t>
             </w:r>
             <w:r>
-              <w:t xml:space="preserve">| I — Innovation | &gt;+0,80 | &gt;$30k | R&amp;D + dịch vụ tri thức | Trung bình (6–15%) | ~1,00 | U ngược nhẹ / tuyến tính dương; điểm uốn ~88,6% (SG) |</w:t>
+              <w:t xml:space="preserve">| I, Innovation | &gt;+0,80 | &gt;$30k | R&amp;D + dịch vụ tri thức | Trung bình (6–15%) | ~1,00 | U ngược nhẹ / tuyến tính dương; điểm uốn ~88,6% (SG) |</w:t>
             </w:r>
             <w:r>
               <w:t xml:space="preserve"> </w:t>
             </w:r>
             <w:r>
-              <w:t xml:space="preserve">| II — Resource | +0,00→+0,50 | &gt;$20k | Xuất khẩu dầu/khí | Thấp (1–4%) | ~1,14 | Phi tuyến suy yếu; nhà nước tô phân phối lại |</w:t>
+              <w:t xml:space="preserve">| II, Resource | +0,00→+0,50 | &gt;$20k | Xuất khẩu dầu/khí | Thấp (1–4%) | ~1,14 | Phi tuyến suy yếu; nhà nước tô phân phối lại |</w:t>
             </w:r>
             <w:r>
               <w:t xml:space="preserve"> </w:t>
             </w:r>
             <w:r>
-              <w:t xml:space="preserve">| III — Upper-mid | 0,00→+0,80 | $5k–$20k | Sản xuất + chuyển đổi | Trung bình (8–12%) | ~1,37 | U ngược; điểm uốn ~47% |</w:t>
+              <w:t xml:space="preserve">| III, Upper-mid | 0,00→+0,80 | $5k–$20k | Sản xuất + chuyển đổi | Trung bình (8–12%) | ~1,37 | U ngược; điểm uốn ~47% |</w:t>
             </w:r>
             <w:r>
               <w:t xml:space="preserve"> </w:t>
             </w:r>
             <w:r>
-              <w:t xml:space="preserve">| IV — Lower-mid transition | -0,50→0,00 | $1k–$5k | FDI-driven sản xuất | Biến động (7–23%) | ~1,31 | U ngược; điểm uốn 39–46% (VNM) — bẫy chuyển hướng nguồn lực |</w:t>
+              <w:t xml:space="preserve">| IV, Lower-mid transition | -0,50→0,00 | $1k–$5k | FDI-driven sản xuất | Biến động (7–23%) | ~1,31 | U ngược; điểm uốn 39–46% (VNM), bẫy chuyển hướng nguồn lực |</w:t>
             </w:r>
             <w:r>
               <w:t xml:space="preserve"> </w:t>
             </w:r>
             <w:r>
-              <w:t xml:space="preserve">| V — Emerging | &lt;-0,50 | &lt;$1k–$3k | Tự cấp + phi chính thức | Thấp–trung bình | ~1,39 | Yếu; voids thể chế → đổi mới bằng nguồn lực hạn chế |</w:t>
+              <w:t xml:space="preserve">| V, Emerging | &lt;-0,50 | &lt;$1k–$3k | Tự cấp + phi chính thức | Thấp–trung bình | ~1,39 | Yếu; voids thể chế → đổi mới bằng nguồn lực hạn chế |</w:t>
             </w:r>
             <w:r>
               <w:t xml:space="preserve"> </w:t>
             </w:r>
             <w:r>
-              <w:t xml:space="preserve">| VI — SIDS | Đặc biệt | $1k–$8k | MIRAB + du lịch | Rất thấp (1–12%) | ~1,32 | Chi phí buộc phải quốc tế hóa — U-curve không vận hành |</w:t>
+              <w:t xml:space="preserve">| VI, SIDS | Đặc biệt | $1k–$8k | MIRAB + du lịch | Rất thấp (1–12%) | ~1,32 | Chi phí buộc phải quốc tế hóa: U-curve không vận hành |</w:t>
             </w:r>
           </w:p>
         </w:tc>
@@ -7875,7 +7813,7 @@
         <w:t xml:space="preserve"> </w:t>
       </w:r>
       <w:r>
-        <w:t xml:space="preserve">với 16.880 doanh nghiệp (19,0% pool — gồm Nhật Bản, đợt khảo sát đầu tiên, n=2.168); đợt khảo sát Nepal 2025 dùng bảng hỏi BREADY Micro (doanh nghiệp siêu nhỏ), không phải cross-section chuẩn nên không thuộc pool, chỉ được nhắc đến như tham chiếu.</w:t>
+        <w:t xml:space="preserve">với 16.880 doanh nghiệp (19,0% pool, gồm Nhật Bản, đợt khảo sát đầu tiên, n=2.168); đợt khảo sát Nepal 2025 dùng bảng hỏi BREADY Micro (doanh nghiệp siêu nhỏ), không phải cross-section chuẩn nên không thuộc pool, chỉ được nhắc đến như tham chiếu.</w:t>
       </w:r>
     </w:p>
     <w:p>
@@ -8144,7 +8082,7 @@
               <w:jc w:val="left"/>
             </w:pPr>
             <w:r>
-              <w:t xml:space="preserve">I — Advanced đổi mới</w:t>
+              <w:t xml:space="preserve">I, Advanced đổi mới</w:t>
             </w:r>
           </w:p>
         </w:tc>
@@ -8226,7 +8164,7 @@
               <w:jc w:val="left"/>
             </w:pPr>
             <w:r>
-              <w:t xml:space="preserve">II — Advanced tài nguyên</w:t>
+              <w:t xml:space="preserve">II, Advanced tài nguyên</w:t>
             </w:r>
           </w:p>
         </w:tc>
@@ -8300,7 +8238,7 @@
               <w:jc w:val="left"/>
             </w:pPr>
             <w:r>
-              <w:t xml:space="preserve">III — Trung bình cao</w:t>
+              <w:t xml:space="preserve">III, Trung bình cao</w:t>
             </w:r>
           </w:p>
         </w:tc>
@@ -8374,7 +8312,7 @@
               <w:jc w:val="left"/>
             </w:pPr>
             <w:r>
-              <w:t xml:space="preserve">IV — Chuyển đổi TB-thấp</w:t>
+              <w:t xml:space="preserve">IV, Chuyển đổi TB-thấp</w:t>
             </w:r>
           </w:p>
         </w:tc>
@@ -8448,7 +8386,7 @@
               <w:jc w:val="left"/>
             </w:pPr>
             <w:r>
-              <w:t xml:space="preserve">V — Đang nổi</w:t>
+              <w:t xml:space="preserve">V, Đang nổi</w:t>
             </w:r>
           </w:p>
         </w:tc>
@@ -8530,7 +8468,7 @@
               <w:jc w:val="left"/>
             </w:pPr>
             <w:r>
-              <w:t xml:space="preserve">VI — SIDS</w:t>
+              <w:t xml:space="preserve">VI, SIDS</w:t>
             </w:r>
           </w:p>
         </w:tc>
@@ -8886,7 +8824,7 @@
               <w:jc w:val="left"/>
             </w:pPr>
             <w:r>
-              <w:t xml:space="preserve">I — Adv. đổi mới</w:t>
+              <w:t xml:space="preserve">I, Adv. đổi mới</w:t>
             </w:r>
           </w:p>
         </w:tc>
@@ -8936,7 +8874,7 @@
               <w:jc w:val="left"/>
             </w:pPr>
             <w:r>
-              <w:t xml:space="preserve">II — Adv. tài nguyên¹</w:t>
+              <w:t xml:space="preserve">II, Adv. tài nguyên¹</w:t>
             </w:r>
           </w:p>
         </w:tc>
@@ -8986,7 +8924,7 @@
               <w:jc w:val="left"/>
             </w:pPr>
             <w:r>
-              <w:t xml:space="preserve">III — Trung bình cao</w:t>
+              <w:t xml:space="preserve">III, Trung bình cao</w:t>
             </w:r>
           </w:p>
         </w:tc>
@@ -9036,7 +8974,7 @@
               <w:jc w:val="left"/>
             </w:pPr>
             <w:r>
-              <w:t xml:space="preserve">IV — Chuyển đổi TB-thấp</w:t>
+              <w:t xml:space="preserve">IV, Chuyển đổi TB-thấp</w:t>
             </w:r>
           </w:p>
         </w:tc>
@@ -9086,7 +9024,7 @@
               <w:jc w:val="left"/>
             </w:pPr>
             <w:r>
-              <w:t xml:space="preserve">V — Đang nổi</w:t>
+              <w:t xml:space="preserve">V, Đang nổi</w:t>
             </w:r>
           </w:p>
         </w:tc>
@@ -9136,7 +9074,7 @@
               <w:jc w:val="left"/>
             </w:pPr>
             <w:r>
-              <w:t xml:space="preserve">VI — SIDS²</w:t>
+              <w:t xml:space="preserve">VI, SIDS²</w:t>
             </w:r>
           </w:p>
         </w:tc>
@@ -9472,7 +9410,7 @@
               <w:jc w:val="left"/>
             </w:pPr>
             <w:r>
-              <w:t xml:space="preserve">(gợi ý — §2.3.5.2 rào cản #1)</w:t>
+              <w:t xml:space="preserve">(gợi ý, §2.3.5.2 rào cản #1)</w:t>
             </w:r>
           </w:p>
         </w:tc>
@@ -9845,7 +9783,7 @@
               <w:jc w:val="left"/>
             </w:pPr>
             <w:r>
-              <w:t xml:space="preserve">I — Adv. đổi mới</w:t>
+              <w:t xml:space="preserve">I, Adv. đổi mới</w:t>
             </w:r>
           </w:p>
         </w:tc>
@@ -9927,7 +9865,7 @@
               <w:jc w:val="left"/>
             </w:pPr>
             <w:r>
-              <w:t xml:space="preserve">II — Adv. tài nguyên¹</w:t>
+              <w:t xml:space="preserve">II, Adv. tài nguyên¹</w:t>
             </w:r>
           </w:p>
         </w:tc>
@@ -10001,7 +9939,7 @@
               <w:jc w:val="left"/>
             </w:pPr>
             <w:r>
-              <w:t xml:space="preserve">III — Trung bình cao</w:t>
+              <w:t xml:space="preserve">III, Trung bình cao</w:t>
             </w:r>
           </w:p>
         </w:tc>
@@ -10075,7 +10013,7 @@
               <w:jc w:val="left"/>
             </w:pPr>
             <w:r>
-              <w:t xml:space="preserve">IV — Chuyển đổi TB-thấp</w:t>
+              <w:t xml:space="preserve">IV, Chuyển đổi TB-thấp</w:t>
             </w:r>
           </w:p>
         </w:tc>
@@ -10149,7 +10087,7 @@
               <w:jc w:val="left"/>
             </w:pPr>
             <w:r>
-              <w:t xml:space="preserve">V — Đang nổi</w:t>
+              <w:t xml:space="preserve">V, Đang nổi</w:t>
             </w:r>
           </w:p>
         </w:tc>
@@ -10223,7 +10161,7 @@
               <w:jc w:val="left"/>
             </w:pPr>
             <w:r>
-              <w:t xml:space="preserve">VI — SIDS²</w:t>
+              <w:t xml:space="preserve">VI, SIDS²</w:t>
             </w:r>
           </w:p>
         </w:tc>
@@ -10643,7 +10581,7 @@
               <w:jc w:val="left"/>
             </w:pPr>
             <w:r>
-              <w:t xml:space="preserve">I — Adv. đổi mới</w:t>
+              <w:t xml:space="preserve">I, Adv. đổi mới</w:t>
             </w:r>
           </w:p>
         </w:tc>
@@ -10693,7 +10631,7 @@
               <w:jc w:val="left"/>
             </w:pPr>
             <w:r>
-              <w:t xml:space="preserve">II — Adv. tài nguyên¹</w:t>
+              <w:t xml:space="preserve">II, Adv. tài nguyên¹</w:t>
             </w:r>
           </w:p>
         </w:tc>
@@ -10743,7 +10681,7 @@
               <w:jc w:val="left"/>
             </w:pPr>
             <w:r>
-              <w:t xml:space="preserve">III — Trung bình cao</w:t>
+              <w:t xml:space="preserve">III, Trung bình cao</w:t>
             </w:r>
           </w:p>
         </w:tc>
@@ -10793,7 +10731,7 @@
               <w:jc w:val="left"/>
             </w:pPr>
             <w:r>
-              <w:t xml:space="preserve">IV — Chuyển đổi TB-thấp</w:t>
+              <w:t xml:space="preserve">IV, Chuyển đổi TB-thấp</w:t>
             </w:r>
           </w:p>
         </w:tc>
@@ -10843,7 +10781,7 @@
               <w:jc w:val="left"/>
             </w:pPr>
             <w:r>
-              <w:t xml:space="preserve">V — Đang nổi</w:t>
+              <w:t xml:space="preserve">V, Đang nổi</w:t>
             </w:r>
           </w:p>
         </w:tc>
@@ -10893,7 +10831,7 @@
               <w:jc w:val="left"/>
             </w:pPr>
             <w:r>
-              <w:t xml:space="preserve">VI — SIDS²</w:t>
+              <w:t xml:space="preserve">VI, SIDS²</w:t>
             </w:r>
           </w:p>
         </w:tc>
@@ -11200,7 +11138,7 @@
               <w:jc w:val="left"/>
             </w:pPr>
             <w:r>
-              <w:t xml:space="preserve">Khanna &amp; Palepu (2010) — voids thể chế</w:t>
+              <w:t xml:space="preserve">Khanna &amp; Palepu (2010), voids thể chế</w:t>
             </w:r>
           </w:p>
         </w:tc>
@@ -11290,7 +11228,7 @@
               <w:jc w:val="left"/>
             </w:pPr>
             <w:r>
-              <w:t xml:space="preserve">Cohen &amp; Levinthal (1990) — năng lực hấp thụ</w:t>
+              <w:t xml:space="preserve">Cohen &amp; Levinthal (1990), năng lực hấp thụ</w:t>
             </w:r>
           </w:p>
         </w:tc>
@@ -11685,7 +11623,7 @@
               <w:jc w:val="left"/>
             </w:pPr>
             <w:r>
-              <w:t xml:space="preserve">III — Trung bình cao</w:t>
+              <w:t xml:space="preserve">III, Trung bình cao</w:t>
             </w:r>
           </w:p>
         </w:tc>
@@ -11733,7 +11671,7 @@
               <w:jc w:val="right"/>
             </w:pPr>
             <w:r>
-              <w:t xml:space="preserve">—¹</w:t>
+              <w:t xml:space="preserve">–¹</w:t>
             </w:r>
           </w:p>
         </w:tc>
@@ -11759,7 +11697,7 @@
               <w:jc w:val="left"/>
             </w:pPr>
             <w:r>
-              <w:t xml:space="preserve">IV — Chuyển đổi TB-thấp</w:t>
+              <w:t xml:space="preserve">IV, Chuyển đổi TB-thấp</w:t>
             </w:r>
           </w:p>
         </w:tc>
@@ -11815,7 +11753,7 @@
               <w:jc w:val="right"/>
             </w:pPr>
             <w:r>
-              <w:t xml:space="preserve">—¹</w:t>
+              <w:t xml:space="preserve">–¹</w:t>
             </w:r>
           </w:p>
         </w:tc>
@@ -11841,7 +11779,7 @@
               <w:jc w:val="left"/>
             </w:pPr>
             <w:r>
-              <w:t xml:space="preserve">V — Đang nổi</w:t>
+              <w:t xml:space="preserve">V, Đang nổi</w:t>
             </w:r>
           </w:p>
         </w:tc>
@@ -11919,7 +11857,7 @@
               <w:jc w:val="left"/>
             </w:pPr>
             <w:r>
-              <w:t xml:space="preserve">VI — SIDS</w:t>
+              <w:t xml:space="preserve">VI, SIDS</w:t>
             </w:r>
           </w:p>
         </w:tc>
@@ -11971,7 +11909,7 @@
               <w:jc w:val="right"/>
             </w:pPr>
             <w:r>
-              <w:t xml:space="preserve">—¹</w:t>
+              <w:t xml:space="preserve">–¹</w:t>
             </w:r>
           </w:p>
         </w:tc>
@@ -12543,7 +12481,7 @@
               <w:jc w:val="left"/>
             </w:pPr>
             <w:r>
-              <w:t xml:space="preserve">Sản xuất — high-tech</w:t>
+              <w:t xml:space="preserve">Sản xuất, high-tech</w:t>
             </w:r>
           </w:p>
         </w:tc>
@@ -12609,7 +12547,7 @@
               <w:jc w:val="left"/>
             </w:pPr>
             <w:r>
-              <w:t xml:space="preserve">Sản xuất — low-tech</w:t>
+              <w:t xml:space="preserve">Sản xuất, low-tech</w:t>
             </w:r>
           </w:p>
         </w:tc>
@@ -17543,7 +17481,7 @@
               <w:jc w:val="right"/>
             </w:pPr>
             <w:r>
-              <w:t xml:space="preserve">I — Adv. đổi mới</w:t>
+              <w:t xml:space="preserve">I, Adv. đổi mới</w:t>
             </w:r>
           </w:p>
         </w:tc>
@@ -17555,7 +17493,7 @@
               <w:jc w:val="right"/>
             </w:pPr>
             <w:r>
-              <w:t xml:space="preserve">II — Adv. tài nguyên</w:t>
+              <w:t xml:space="preserve">II, Adv. tài nguyên</w:t>
             </w:r>
           </w:p>
         </w:tc>
@@ -17567,7 +17505,7 @@
               <w:jc w:val="right"/>
             </w:pPr>
             <w:r>
-              <w:t xml:space="preserve">III — Trung bình cao</w:t>
+              <w:t xml:space="preserve">III, Trung bình cao</w:t>
             </w:r>
           </w:p>
         </w:tc>
@@ -17579,7 +17517,7 @@
               <w:jc w:val="right"/>
             </w:pPr>
             <w:r>
-              <w:t xml:space="preserve">IV — Chuyển đổi TB-thấp</w:t>
+              <w:t xml:space="preserve">IV, Chuyển đổi TB-thấp</w:t>
             </w:r>
           </w:p>
         </w:tc>
@@ -17591,7 +17529,7 @@
               <w:jc w:val="right"/>
             </w:pPr>
             <w:r>
-              <w:t xml:space="preserve">V — Đang nổi</w:t>
+              <w:t xml:space="preserve">V, Đang nổi</w:t>
             </w:r>
           </w:p>
         </w:tc>
@@ -17603,7 +17541,7 @@
               <w:jc w:val="right"/>
             </w:pPr>
             <w:r>
-              <w:t xml:space="preserve">VI — SIDS</w:t>
+              <w:t xml:space="preserve">VI, SIDS</w:t>
             </w:r>
           </w:p>
         </w:tc>
@@ -19103,10 +19041,7 @@
               <w:t xml:space="preserve">KT1</w:t>
             </w:r>
             <w:r>
-              <w:t xml:space="preserve"> </w:t>
-            </w:r>
-            <w:r>
-              <w:t xml:space="preserve">— Điều tiết ba chiều TCI×DAI×FSTS chưa kiểm định đồng thời</w:t>
+              <w:t xml:space="preserve">, Điều tiết ba chiều TCI×DAI×FSTS chưa kiểm định đồng thời</w:t>
             </w:r>
           </w:p>
         </w:tc>
@@ -19151,10 +19086,7 @@
               <w:t xml:space="preserve">KT2</w:t>
             </w:r>
             <w:r>
-              <w:t xml:space="preserve"> </w:t>
-            </w:r>
-            <w:r>
-              <w:t xml:space="preserve">— Phân nhóm con Advanced chưa hệ thống hóa</w:t>
+              <w:t xml:space="preserve">, Phân nhóm con Advanced chưa hệ thống hóa</w:t>
             </w:r>
           </w:p>
         </w:tc>
@@ -19199,10 +19131,7 @@
               <w:t xml:space="preserve">KT3</w:t>
             </w:r>
             <w:r>
-              <w:t xml:space="preserve"> </w:t>
-            </w:r>
-            <w:r>
-              <w:t xml:space="preserve">— Nghịch lý bão hòa số chưa xác nhận nhân quả</w:t>
+              <w:t xml:space="preserve">, Nghịch lý bão hòa số chưa xác nhận nhân quả</w:t>
             </w:r>
           </w:p>
         </w:tc>
@@ -19247,10 +19176,7 @@
               <w:t xml:space="preserve">KT4</w:t>
             </w:r>
             <w:r>
-              <w:t xml:space="preserve"> </w:t>
-            </w:r>
-            <w:r>
-              <w:t xml:space="preserve">— Dị biệt thời gian ba giai đoạn chưa tổng hợp</w:t>
+              <w:t xml:space="preserve">, Dị biệt thời gian ba giai đoạn chưa tổng hợp</w:t>
             </w:r>
           </w:p>
         </w:tc>
@@ -19295,10 +19221,7 @@
               <w:t xml:space="preserve">KT5</w:t>
             </w:r>
             <w:r>
-              <w:t xml:space="preserve"> </w:t>
-            </w:r>
-            <w:r>
-              <w:t xml:space="preserve">— SIDS là trường hợp biên của Uppsala</w:t>
+              <w:t xml:space="preserve">, SIDS là trường hợp biên của Uppsala</w:t>
             </w:r>
           </w:p>
         </w:tc>
@@ -21336,7 +21259,7 @@
           <w:iCs/>
           <w:i/>
         </w:rPr>
-        <w:t xml:space="preserve">Taking stock, September 2025: Viet Nam economic update — Nurturing Viet Nam’s high-tech talents</w:t>
+        <w:t xml:space="preserve">Taking stock, September 2025: Viet Nam economic update, Nurturing Viet Nam’s high-tech talents</w:t>
       </w:r>
       <w:r>
         <w:t xml:space="preserve">. World Bank Group.</w:t>
@@ -21538,7 +21461,7 @@
                 <w:bCs/>
                 <w:b/>
               </w:rPr>
-              <w:t xml:space="preserve">Nhóm I — Advanced đổi mới sáng tạo (6 nền)</w:t>
+              <w:t xml:space="preserve">Nhóm I, Advanced đổi mới sáng tạo (6 nền)</w:t>
             </w:r>
           </w:p>
         </w:tc>
@@ -21592,7 +21515,7 @@
                 <w:bCs/>
                 <w:b/>
               </w:rPr>
-              <w:t xml:space="preserve">Nhóm II — Advanced tài nguyên (6 nền)</w:t>
+              <w:t xml:space="preserve">Nhóm II, Advanced tài nguyên (6 nền)</w:t>
             </w:r>
           </w:p>
         </w:tc>
@@ -21646,7 +21569,7 @@
                 <w:bCs/>
                 <w:b/>
               </w:rPr>
-              <w:t xml:space="preserve">Nhóm III — Trung bình cao (6 nền)</w:t>
+              <w:t xml:space="preserve">Nhóm III, Trung bình cao (6 nền)</w:t>
             </w:r>
           </w:p>
         </w:tc>
@@ -21700,7 +21623,7 @@
                 <w:bCs/>
                 <w:b/>
               </w:rPr>
-              <w:t xml:space="preserve">Nhóm IV — Chuyển đổi TB-thấp (7 nền)</w:t>
+              <w:t xml:space="preserve">Nhóm IV, Chuyển đổi TB-thấp (7 nền)</w:t>
             </w:r>
           </w:p>
         </w:tc>
@@ -21754,7 +21677,7 @@
                 <w:bCs/>
                 <w:b/>
               </w:rPr>
-              <w:t xml:space="preserve">Nhóm V — Đang nổi (17 nền)</w:t>
+              <w:t xml:space="preserve">Nhóm V, Đang nổi (17 nền)</w:t>
             </w:r>
           </w:p>
         </w:tc>
@@ -21808,7 +21731,7 @@
                 <w:bCs/>
                 <w:b/>
               </w:rPr>
-              <w:t xml:space="preserve">Nhóm VI — SIDS (8 nền)</w:t>
+              <w:t xml:space="preserve">Nhóm VI, SIDS (8 nền)</w:t>
             </w:r>
           </w:p>
         </w:tc>

</xml_diff>

<commit_message>
build(dist): rebuild all .docx from corrected source (50-econ canonical)
The dist/ submission artifacts were dated 06-20, before the 06-22/06-23 content
corrections. Rebuilt via scripts/build_word_all.sh + build_dissertation_docx.sh
+ per-file pandoc regen (CTU template). Verified the built docx now carry the
fixes (84,998 / 17,340 / 'Xác nhận một phần H5' / ICBEF 2024 / corrected
correlations) and no stale 84,045/16,387/−0,009. Review report §15.

Co-Authored-By: Claude Opus 4.8 (1M context) <noreply@anthropic.com>
Claude-Session: https://claude.ai/code/session_01Xumaoraa2DLWLXsgJJ62oq
</commit_message>
<xml_diff>
--- a/dist/chuyen_de_1/00_cd1_ctu_final_vi.docx
+++ b/dist/chuyen_de_1/00_cd1_ctu_final_vi.docx
@@ -4190,10 +4190,26 @@
           <w:bCs/>
           <w:b/>
         </w:rPr>
-        <w:t xml:space="preserve">B. Trường hợp biên mở rộng, Nhóm VI SIDS (8 nền, n=2.295, 2,6% mẫu gộp)</w:t>
-      </w:r>
-      <w:r>
-        <w:t xml:space="preserve">: Fiji, Papua New Guinea, Solomon Islands, Tonga, Vanuatu, Samoa, Kiribati (2025) và Timor-Leste. Mẫu chính của nghiên cứu chuyên sâu SIDS là 7 nền Thái Bình Dương (n=1.781).</w:t>
+        <w:t xml:space="preserve">B. Trường hợp biên mở rộng, Nhóm VI SIDS (8 nền, n=1.916 LP-valid, 2,3% mẫu gộp)</w:t>
+      </w:r>
+      <w:r>
+        <w:t xml:space="preserve">: Fiji, Papua New Guinea, Solomon Islands, Tonga, Vanuatu, Samoa, Kiribati (2025) và Timor-Leste. Mẫu chính của nghiên cứu chuyên sâu SIDS (P8) là 7 nền Thái Bình Dương,</w:t>
+      </w:r>
+      <w:r>
+        <w:t xml:space="preserve"> </w:t>
+      </w:r>
+      <w:r>
+        <w:rPr>
+          <w:bCs/>
+          <w:b/>
+        </w:rPr>
+        <w:t xml:space="preserve">loại Timor-Leste</w:t>
+      </w:r>
+      <w:r>
+        <w:t xml:space="preserve"> </w:t>
+      </w:r>
+      <w:r>
+        <w:t xml:space="preserve">(n=1.781).</w:t>
       </w:r>
     </w:p>
     <w:p>
@@ -4468,7 +4484,7 @@
         <w:t xml:space="preserve">Bằng chứng cho khung lý thuyết phi tuyến và điều tiết đa tầng</w:t>
       </w:r>
       <w:r>
-        <w:t xml:space="preserve">, phổ thể chế cường độ rõ rệt của các hệ số tương quan xuyên 6 nhóm thể chế (đặc biệt: tương quan FSTS–năng suất giảm dần từ +0,139 ở Nhóm I xuống mất ý nghĩa ở SIDS) là cơ sở thực tiễn cho các giả thuyết của Chuyên đề 2.</w:t>
+        <w:t xml:space="preserve">, phổ thể chế cường độ rõ rệt của các hệ số tương quan xuyên 6 nhóm thể chế (đặc biệt: tương quan FSTS–năng suất giảm dần từ +0,141 ở Nhóm I xuống mất ý nghĩa ở SIDS) là cơ sở thực tiễn cho các giả thuyết của Chuyên đề 2.</w:t>
       </w:r>
     </w:p>
     <w:p>
@@ -5088,7 +5104,7 @@
         <w:t xml:space="preserve"> </w:t>
       </w:r>
       <w:r>
-        <w:t xml:space="preserve">mà cá biệt còn đảo</w:t>
+        <w:t xml:space="preserve">mà cá biệt còn làm</w:t>
       </w:r>
       <w:r>
         <w:t xml:space="preserve"> </w:t>
@@ -5098,13 +5114,13 @@
           <w:iCs/>
           <w:i/>
         </w:rPr>
-        <w:t xml:space="preserve">dấu</w:t>
-      </w:r>
-      <w:r>
-        <w:t xml:space="preserve"> </w:t>
-      </w:r>
-      <w:r>
-        <w:t xml:space="preserve">của các tương quan, rõ nhất ở phổ thể chế FSTS giảm đơn điệu từ +0,139 (Nhóm I) xuống mất ý nghĩa và đổi dấu ở SIDS (−0,009 ns), nhất quán với giả thuyết chi phí buộc phải quốc tế hóa. Toàn bộ phân tích là</w:t>
+        <w:t xml:space="preserve">triệt tiêu</w:t>
+      </w:r>
+      <w:r>
+        <w:t xml:space="preserve"> </w:t>
+      </w:r>
+      <w:r>
+        <w:t xml:space="preserve">các tương quan, rõ nhất ở phổ thể chế FSTS giảm đơn điệu từ +0,141 (Nhóm I) xuống mất ý nghĩa ở SIDS (+0,002 ns), nhất quán với giả thuyết chi phí buộc phải quốc tế hóa. Toàn bộ phân tích là</w:t>
       </w:r>
       <w:r>
         <w:t xml:space="preserve"> </w:t>
@@ -6994,7 +7010,7 @@
         <w:t xml:space="preserve">Nhóm VI, SIDS Thái Bình Dương (Trường hợp biên mở rộng)</w:t>
       </w:r>
       <w:r>
-        <w:t xml:space="preserve">: Dân số &lt;1 triệu; cô lập địa lý &gt;2.000 km từ hub thương mại; phụ thuộc ODA + remittances &gt; 20% GDP; mô hình MIRAB (Bertram, 2006). Khuôn mẫu WBES: n=2.295 (2,6% mẫu gộp); FDI cao nhất (20,0%, do MNE du lịch/viễn thông); đổi mới sản phẩm cao nhất (34,2%, đổi mới bằng nguồn lực hạn chế); website khá cao ngoại trừ Kiribati (18,7%).</w:t>
+        <w:t xml:space="preserve">: Dân số &lt;1 triệu; cô lập địa lý &gt;2.000 km từ hub thương mại; phụ thuộc ODA + remittances &gt; 20% GDP; mô hình MIRAB (Bertram, 2006). Khuôn mẫu WBES: n=1.916 (2,3% mẫu gộp, LP-valid, gồm Timor-Leste); FDI cao nhất (20,0%, do MNE du lịch/viễn thông); đổi mới sản phẩm cao nhất (34,2%, đổi mới bằng nguồn lực hạn chế); website khá cao ngoại trừ Kiribati (18,7%).</w:t>
       </w:r>
     </w:p>
     <w:bookmarkEnd w:id="44"/>
@@ -7194,7 +7210,7 @@
               <w:jc w:val="center"/>
             </w:pPr>
             <w:r>
-              <w:t xml:space="preserve">6.390</w:t>
+              <w:t xml:space="preserve">5.688</w:t>
             </w:r>
           </w:p>
         </w:tc>
@@ -7263,7 +7279,7 @@
               <w:jc w:val="center"/>
             </w:pPr>
             <w:r>
-              <w:t xml:space="preserve">2.231</w:t>
+              <w:t xml:space="preserve">2.082</w:t>
             </w:r>
           </w:p>
         </w:tc>
@@ -7332,7 +7348,7 @@
               <w:jc w:val="center"/>
             </w:pPr>
             <w:r>
-              <w:t xml:space="preserve">13.993</w:t>
+              <w:t xml:space="preserve">15.174</w:t>
             </w:r>
           </w:p>
         </w:tc>
@@ -7401,7 +7417,7 @@
               <w:jc w:val="center"/>
             </w:pPr>
             <w:r>
-              <w:t xml:space="preserve">45.003</w:t>
+              <w:t xml:space="preserve">42.798</w:t>
             </w:r>
           </w:p>
         </w:tc>
@@ -7470,7 +7486,7 @@
               <w:jc w:val="center"/>
             </w:pPr>
             <w:r>
-              <w:t xml:space="preserve">18.589</w:t>
+              <w:t xml:space="preserve">17.340</w:t>
             </w:r>
           </w:p>
         </w:tc>
@@ -7527,7 +7543,17 @@
               <w:jc w:val="left"/>
             </w:pPr>
             <w:r>
-              <w:t xml:space="preserve">Fiji, Kiribati, Papua New Guinea, Samoa, Solomon Islands, Tonga, Vanuatu</w:t>
+              <w:t xml:space="preserve">Fiji, Kiribati, Papua New Guinea, Samoa, Solomon Islands, Tonga, Vanuatu,</w:t>
+            </w:r>
+            <w:r>
+              <w:t xml:space="preserve"> </w:t>
+            </w:r>
+            <w:r>
+              <w:rPr>
+                <w:bCs/>
+                <w:b/>
+              </w:rPr>
+              <w:t xml:space="preserve">Timor-Leste</w:t>
             </w:r>
           </w:p>
         </w:tc>
@@ -7539,7 +7565,7 @@
               <w:jc w:val="center"/>
             </w:pPr>
             <w:r>
-              <w:t xml:space="preserve">1.781</w:t>
+              <w:t xml:space="preserve">1.916</w:t>
             </w:r>
           </w:p>
         </w:tc>
@@ -7581,7 +7607,7 @@
                 <w:bCs/>
                 <w:b/>
               </w:rPr>
-              <w:t xml:space="preserve">50 nền kinh tế</w:t>
+              <w:t xml:space="preserve">50 nền (LP-valid)</w:t>
             </w:r>
           </w:p>
         </w:tc>
@@ -7597,13 +7623,13 @@
                 <w:bCs/>
                 <w:b/>
               </w:rPr>
-              <w:t xml:space="preserve">88.869</w:t>
+              <w:t xml:space="preserve">84.998</w:t>
             </w:r>
             <w:r>
               <w:t xml:space="preserve"> </w:t>
             </w:r>
             <w:r>
-              <w:t xml:space="preserve">(mẫu gộp mô tả)</w:t>
+              <w:t xml:space="preserve">(khung mô tả tái lập)</w:t>
             </w:r>
           </w:p>
         </w:tc>
@@ -7618,7 +7644,30 @@
           <w:iCs/>
           <w:i/>
         </w:rPr>
-        <w:t xml:space="preserve">Ghi chú: Cột N là số doanh nghiệp trong mẫu gộp mô tả (88.869 DN / 50 nền kinh tế / 103 cặp nền × năm). Nhật Bản được WBES khảo sát lần đầu năm 2025 (n=2.168) và là thành viên đầy đủ của Nhóm I. Nhãn nhóm theo biến phân loại</w:t>
+        <w:t xml:space="preserve">Ghi chú: Cột N là số doanh nghiệp có</w:t>
+      </w:r>
+      <w:r>
+        <w:rPr>
+          <w:iCs/>
+          <w:i/>
+        </w:rPr>
+        <w:t xml:space="preserve"> </w:t>
+      </w:r>
+      <w:r>
+        <w:rPr>
+          <w:bCs/>
+          <w:b/>
+          <w:iCs/>
+          <w:i/>
+        </w:rPr>
+        <w:t xml:space="preserve">năng suất lao động hợp lệ (LP-valid)</w:t>
+      </w:r>
+      <w:r>
+        <w:rPr>
+          <w:iCs/>
+          <w:i/>
+        </w:rPr>
+        <w:t xml:space="preserve">, tái lập trực tiếp từ dữ liệu thô bằng</w:t>
       </w:r>
       <w:r>
         <w:rPr>
@@ -7633,14 +7682,103 @@
           <w:iCs/>
           <w:i/>
         </w:rPr>
-        <w:t xml:space="preserve">icrv_label</w:t>
+        <w:t xml:space="preserve">scripts/relock_descriptives_canonical.py</w:t>
       </w:r>
       <w:r>
         <w:rPr>
           <w:iCs/>
           <w:i/>
         </w:rPr>
-        <w:t xml:space="preserve">, dùng thống nhất trong luận án và hai chuyên đề. SIDS: mẫu chính của nghiên cứu chuyên sâu SIDS là 7 nền Pacific; kiểm định bền vững mở rộng 9 nền. Khung ước lượng đa quốc gia của luận án (P7) được chạy trên bộ dữ liệu 50 nền/88.869 quan sát gồm Nhật Bản (mẫu gộp phân loại 96.415 / 52 nền); vòng tái ước lượng 50 nền đã hoàn tất nên mô tả và ước lượng nay dùng chung MỘT khung 50 nền (hồi quy M2 N=81.022; M5 N=79.080).</w:t>
+        <w:t xml:space="preserve"> </w:t>
+      </w:r>
+      <w:r>
+        <w:rPr>
+          <w:iCs/>
+          <w:i/>
+        </w:rPr>
+        <w:t xml:space="preserve">(cùng quy trình hài hòa hóa với pipeline P7, đã gồm China-2012). Tổng 84.998 trên đủ 50 nền / 107 cặp nền–năm (đã bổ sung đủ bốn đợt Azerbaijan 2009/2013/2019/2024 ở Nhóm V).</w:t>
+      </w:r>
+      <w:r>
+        <w:rPr>
+          <w:iCs/>
+          <w:i/>
+        </w:rPr>
+        <w:t xml:space="preserve"> </w:t>
+      </w:r>
+      <w:r>
+        <w:rPr>
+          <w:bCs/>
+          <w:b/>
+          <w:iCs/>
+          <w:i/>
+        </w:rPr>
+        <w:t xml:space="preserve">Quy ước Timor-Leste:</w:t>
+      </w:r>
+      <w:r>
+        <w:rPr>
+          <w:iCs/>
+          <w:i/>
+        </w:rPr>
+        <w:t xml:space="preserve"> </w:t>
+      </w:r>
+      <w:r>
+        <w:rPr>
+          <w:iCs/>
+          <w:i/>
+        </w:rPr>
+        <w:t xml:space="preserve">thuộc Nhóm VI ở khung mô tả và khung ước lượng đa quốc gia P7 (giữ Timor); riêng nghiên cứu chuyên sâu SIDS (P8) dùng 7 nền Thái Bình Dương và</w:t>
+      </w:r>
+      <w:r>
+        <w:rPr>
+          <w:iCs/>
+          <w:i/>
+        </w:rPr>
+        <w:t xml:space="preserve"> </w:t>
+      </w:r>
+      <w:r>
+        <w:rPr>
+          <w:bCs/>
+          <w:b/>
+          <w:iCs/>
+          <w:i/>
+        </w:rPr>
+        <w:t xml:space="preserve">loại</w:t>
+      </w:r>
+      <w:r>
+        <w:rPr>
+          <w:iCs/>
+          <w:i/>
+        </w:rPr>
+        <w:t xml:space="preserve"> </w:t>
+      </w:r>
+      <w:r>
+        <w:rPr>
+          <w:iCs/>
+          <w:i/>
+        </w:rPr>
+        <w:t xml:space="preserve">Timor-Leste. Nhật Bản được WBES khảo sát lần đầu năm 2025 (n=2.168), thành viên đầy đủ Nhóm I. Thứ bậc khung: pool phân loại 96.415/52 nhãn ⊇ khung phân tích đa quốc gia 88.869/50 nền ⊇ khung mô tả LP-valid 84.998/50 nền ⊇ mẫu hồi quy P7 M2 81.022 (M5 79.080). Nhãn nhóm theo biến</w:t>
+      </w:r>
+      <w:r>
+        <w:rPr>
+          <w:iCs/>
+          <w:i/>
+        </w:rPr>
+        <w:t xml:space="preserve"> </w:t>
+      </w:r>
+      <w:r>
+        <w:rPr>
+          <w:rStyle w:val="VerbatimChar"/>
+          <w:iCs/>
+          <w:i/>
+        </w:rPr>
+        <w:t xml:space="preserve">icrv_label</w:t>
+      </w:r>
+      <w:r>
+        <w:rPr>
+          <w:iCs/>
+          <w:i/>
+        </w:rPr>
+        <w:t xml:space="preserve">, dùng thống nhất trong luận án và hai chuyên đề.</w:t>
       </w:r>
     </w:p>
     <w:bookmarkEnd w:id="45"/>
@@ -8351,33 +8489,33 @@
         <w:t xml:space="preserve">Phạm vi tổng hợp dữ liệu</w:t>
       </w:r>
       <w:r>
-        <w:t xml:space="preserve">. Mẫu gộp mô tả gồm</w:t>
-      </w:r>
-      <w:r>
-        <w:t xml:space="preserve"> </w:t>
-      </w:r>
-      <w:r>
-        <w:rPr>
-          <w:bCs/>
-          <w:b/>
-        </w:rPr>
-        <w:t xml:space="preserve">88.869 doanh nghiệp</w:t>
-      </w:r>
-      <w:r>
-        <w:t xml:space="preserve">, 50 nền kinh tế,</w:t>
-      </w:r>
-      <w:r>
-        <w:t xml:space="preserve"> </w:t>
-      </w:r>
-      <w:r>
-        <w:rPr>
-          <w:bCs/>
-          <w:b/>
-        </w:rPr>
-        <w:t xml:space="preserve">103 cặp nền kinh tế × năm</w:t>
-      </w:r>
-      <w:r>
-        <w:t xml:space="preserve">, giai đoạn 2006–2026 (bao gồm Kiribati 2025, đợt khảo sát WBES đầu tiên của nền kinh tế này). Tổng hợp này kế thừa và mở rộng từ mẫu gộp 17 nền châu Á mới nổi (~40.633 doanh nghiệp) của Đỗ &amp; Phan (2026, VEFR), gấp hơn 2 lần. Phân bố theo nhóm ICRV: Nhóm IV Chuyển đổi TB-thấp 45.003 (50,6%), Nhóm V Đang nổi 18.589 (21,3%), Nhóm III Trung bình cao 13.993 (15,7%), Nhóm I Advanced đổi mới 6.390 (7,2%), Nhóm VI SIDS 1.781 (2,0%), Nhóm II Advanced tài nguyên 2.231 (2,5%). Có</w:t>
+        <w:t xml:space="preserve">. Khung mô tả tái lập (LP-valid) gồm</w:t>
+      </w:r>
+      <w:r>
+        <w:t xml:space="preserve"> </w:t>
+      </w:r>
+      <w:r>
+        <w:rPr>
+          <w:bCs/>
+          <w:b/>
+        </w:rPr>
+        <w:t xml:space="preserve">84.998 doanh nghiệp có năng suất hợp lệ</w:t>
+      </w:r>
+      <w:r>
+        <w:t xml:space="preserve">, đủ 50 nền kinh tế,</w:t>
+      </w:r>
+      <w:r>
+        <w:t xml:space="preserve"> </w:t>
+      </w:r>
+      <w:r>
+        <w:rPr>
+          <w:bCs/>
+          <w:b/>
+        </w:rPr>
+        <w:t xml:space="preserve">107 cặp nền kinh tế × năm</w:t>
+      </w:r>
+      <w:r>
+        <w:t xml:space="preserve">, giai đoạn 2006–2026 (bao gồm Kiribati 2025, đợt khảo sát WBES đầu tiên của nền kinh tế này); khung này thuộc khung phân tích đa quốc gia 88.869/50 nền dùng cho P7. Tổng hợp này kế thừa và mở rộng từ mẫu gộp 17 nền châu Á mới nổi (~40.633 doanh nghiệp) của Đỗ &amp; Phan (2026, VEFR), gấp hơn 2 lần. Phân bố theo nhóm ICRV: Nhóm IV Chuyển đổi TB-thấp 42.798 (50,4%), Nhóm V Đang nổi 17.340 (20,4%), Nhóm III Trung bình cao 15.174 (17,9%), Nhóm I Advanced đổi mới 5.688 (6,7%), Nhóm VI SIDS 1.916 (2,3%), Nhóm II Advanced tài nguyên 2.082 (2,4%). Có</w:t>
       </w:r>
       <w:r>
         <w:t xml:space="preserve"> </w:t>
@@ -8527,7 +8665,7 @@
           <w:iCs/>
           <w:i/>
         </w:rPr>
-        <w:t xml:space="preserve">Hình 2.3.3.2. Bar chart phân bố theo 6 nhóm ICRV: IV Chuyển đổi TB-thấp (45.003, 50,6%), V Đang nổi (18.589, 21,3%), III Trung bình cao (13.993, 15,7%), I Advanced đổi mới (6.390, 7,2%), VI SIDS (1.781, 2,0%), II Advanced tài nguyên (2.231, 2,5%).</w:t>
+        <w:t xml:space="preserve">Hình 2.3.3.2. Bar chart phân bố theo 6 nhóm ICRV (khung mô tả LP-valid 84.998, 50 nền): IV Chuyển đổi TB-thấp (42.798, 50,4%), V Đang nổi (17.340, 20,4%), III Trung bình cao (15.174, 17,9%), I Advanced đổi mới (5.688, 6,7%), VI SIDS (1.916, 2,3%), II Advanced tài nguyên (2.082, 2,4%).</w:t>
       </w:r>
     </w:p>
     <w:p>
@@ -8668,7 +8806,7 @@
           <w:iCs/>
           <w:i/>
         </w:rPr>
-        <w:t xml:space="preserve">Phân tán năng suất lao động trong từng đợt khảo sát, theo nhóm ICRV (trung vị giữa các đợt; mẫu gộp mô tả 103 cặp nền kinh tế × năm).</w:t>
+        <w:t xml:space="preserve">Phân tán năng suất lao động trong từng đợt khảo sát, theo nhóm ICRV (trung vị giữa các đợt; khung mô tả tái lập 107 cặp nền kinh tế × năm).</w:t>
       </w:r>
     </w:p>
     <w:tbl>
@@ -8796,7 +8934,7 @@
               <w:jc w:val="right"/>
             </w:pPr>
             <w:r>
-              <w:t xml:space="preserve">5.661</w:t>
+              <w:t xml:space="preserve">5.688</w:t>
             </w:r>
           </w:p>
         </w:tc>
@@ -8812,7 +8950,7 @@
                 <w:bCs/>
                 <w:b/>
               </w:rPr>
-              <w:t xml:space="preserve">1,00</w:t>
+              <w:t xml:space="preserve">0,96</w:t>
             </w:r>
           </w:p>
         </w:tc>
@@ -8840,7 +8978,7 @@
               <w:jc w:val="right"/>
             </w:pPr>
             <w:r>
-              <w:t xml:space="preserve">3,4</w:t>
+              <w:t xml:space="preserve">3,5</w:t>
             </w:r>
           </w:p>
         </w:tc>
@@ -8890,7 +9028,7 @@
               <w:jc w:val="right"/>
             </w:pPr>
             <w:r>
-              <w:t xml:space="preserve">1,14</w:t>
+              <w:t xml:space="preserve">1,13</w:t>
             </w:r>
           </w:p>
         </w:tc>
@@ -8940,7 +9078,7 @@
               <w:jc w:val="right"/>
             </w:pPr>
             <w:r>
-              <w:t xml:space="preserve">17</w:t>
+              <w:t xml:space="preserve">18</w:t>
             </w:r>
           </w:p>
         </w:tc>
@@ -8952,7 +9090,7 @@
               <w:jc w:val="right"/>
             </w:pPr>
             <w:r>
-              <w:t xml:space="preserve">12.481</w:t>
+              <w:t xml:space="preserve">15.174</w:t>
             </w:r>
           </w:p>
         </w:tc>
@@ -8964,7 +9102,7 @@
               <w:jc w:val="right"/>
             </w:pPr>
             <w:r>
-              <w:t xml:space="preserve">1,37</w:t>
+              <w:t xml:space="preserve">1,29</w:t>
             </w:r>
           </w:p>
         </w:tc>
@@ -8988,7 +9126,7 @@
               <w:jc w:val="right"/>
             </w:pPr>
             <w:r>
-              <w:t xml:space="preserve">5,4</w:t>
+              <w:t xml:space="preserve">5,3</w:t>
             </w:r>
           </w:p>
         </w:tc>
@@ -9038,7 +9176,7 @@
               <w:jc w:val="right"/>
             </w:pPr>
             <w:r>
-              <w:t xml:space="preserve">1,31</w:t>
+              <w:t xml:space="preserve">1,27</w:t>
             </w:r>
           </w:p>
         </w:tc>
@@ -9088,7 +9226,7 @@
               <w:jc w:val="right"/>
             </w:pPr>
             <w:r>
-              <w:t xml:space="preserve">40</w:t>
+              <w:t xml:space="preserve">43</w:t>
             </w:r>
           </w:p>
         </w:tc>
@@ -9100,7 +9238,7 @@
               <w:jc w:val="right"/>
             </w:pPr>
             <w:r>
-              <w:t xml:space="preserve">16.595</w:t>
+              <w:t xml:space="preserve">17.340</w:t>
             </w:r>
           </w:p>
         </w:tc>
@@ -9116,7 +9254,7 @@
                 <w:bCs/>
                 <w:b/>
               </w:rPr>
-              <w:t xml:space="preserve">1,39</w:t>
+              <w:t xml:space="preserve">1,34</w:t>
             </w:r>
           </w:p>
         </w:tc>
@@ -9132,7 +9270,7 @@
                 <w:bCs/>
                 <w:b/>
               </w:rPr>
-              <w:t xml:space="preserve">30,3</w:t>
+              <w:t xml:space="preserve">30,0</w:t>
             </w:r>
           </w:p>
         </w:tc>
@@ -9194,7 +9332,7 @@
               <w:jc w:val="right"/>
             </w:pPr>
             <w:r>
-              <w:t xml:space="preserve">1,32</w:t>
+              <w:t xml:space="preserve">1,30</w:t>
             </w:r>
           </w:p>
         </w:tc>
@@ -9870,7 +10008,7 @@
           <w:iCs/>
           <w:i/>
         </w:rPr>
-        <w:t xml:space="preserve">Nguồn: tính từ dữ liệu vi mô WBES trên mẫu gộp mô tả 50 nền (FSTS = d3b + d3c; CAGR việc làm từ l1/l2 trên 3 năm tài khóa). ¹Nhóm II: đủ 6/6 nền GCC (Bahrain, Brunei, Kuwait, Oman, Qatar, Saudi Arabia). ²Nhóm VI: đủ 8/8 nền (7 Pacific + Timor-Leste; n=2.295).</w:t>
+        <w:t xml:space="preserve">Nguồn: tính từ dữ liệu vi mô WBES trên mẫu gộp mô tả 50 nền (FSTS = d3b + d3c; CAGR việc làm từ l1/l2 trên 3 năm tài khóa). ¹Nhóm II: đủ 6/6 nền GCC (Bahrain, Brunei, Kuwait, Oman, Qatar, Saudi Arabia). ²Nhóm VI: đủ 8/8 nền (7 Pacific + Timor-Leste; n=1.916, LP-valid).</w:t>
       </w:r>
     </w:p>
     <w:p>
@@ -10732,19 +10870,19 @@
               <w:jc w:val="left"/>
             </w:pPr>
             <w:r>
-              <w:t xml:space="preserve">25,4</w:t>
-            </w:r>
-          </w:p>
-        </w:tc>
-        <w:tc>
-          <w:tcPr/>
-          <w:p>
-            <w:pPr>
-              <w:pStyle w:val="Compact"/>
-              <w:jc w:val="left"/>
-            </w:pPr>
-            <w:r>
-              <w:t xml:space="preserve">53,9</w:t>
+              <w:t xml:space="preserve">31,4</w:t>
+            </w:r>
+          </w:p>
+        </w:tc>
+        <w:tc>
+          <w:tcPr/>
+          <w:p>
+            <w:pPr>
+              <w:pStyle w:val="Compact"/>
+              <w:jc w:val="left"/>
+            </w:pPr>
+            <w:r>
+              <w:t xml:space="preserve">56,9</w:t>
             </w:r>
           </w:p>
         </w:tc>
@@ -10844,55 +10982,55 @@
               <w:jc w:val="left"/>
             </w:pPr>
             <w:r>
-              <w:t xml:space="preserve">24,4</w:t>
-            </w:r>
-          </w:p>
-        </w:tc>
-        <w:tc>
-          <w:tcPr/>
-          <w:p>
-            <w:pPr>
-              <w:pStyle w:val="Compact"/>
-              <w:jc w:val="left"/>
-            </w:pPr>
-            <w:r>
-              <w:t xml:space="preserve">16,3</w:t>
-            </w:r>
-          </w:p>
-        </w:tc>
-        <w:tc>
-          <w:tcPr/>
-          <w:p>
-            <w:pPr>
-              <w:pStyle w:val="Compact"/>
-              <w:jc w:val="left"/>
-            </w:pPr>
-            <w:r>
-              <w:t xml:space="preserve">17,5</w:t>
-            </w:r>
-          </w:p>
-        </w:tc>
-        <w:tc>
-          <w:tcPr/>
-          <w:p>
-            <w:pPr>
-              <w:pStyle w:val="Compact"/>
-              <w:jc w:val="left"/>
-            </w:pPr>
-            <w:r>
-              <w:t xml:space="preserve">12,7</w:t>
-            </w:r>
-          </w:p>
-        </w:tc>
-        <w:tc>
-          <w:tcPr/>
-          <w:p>
-            <w:pPr>
-              <w:pStyle w:val="Compact"/>
-              <w:jc w:val="left"/>
-            </w:pPr>
-            <w:r>
-              <w:t xml:space="preserve">40,9</w:t>
+              <w:t xml:space="preserve">24,0</w:t>
+            </w:r>
+          </w:p>
+        </w:tc>
+        <w:tc>
+          <w:tcPr/>
+          <w:p>
+            <w:pPr>
+              <w:pStyle w:val="Compact"/>
+              <w:jc w:val="left"/>
+            </w:pPr>
+            <w:r>
+              <w:t xml:space="preserve">15,9</w:t>
+            </w:r>
+          </w:p>
+        </w:tc>
+        <w:tc>
+          <w:tcPr/>
+          <w:p>
+            <w:pPr>
+              <w:pStyle w:val="Compact"/>
+              <w:jc w:val="left"/>
+            </w:pPr>
+            <w:r>
+              <w:t xml:space="preserve">17,6</w:t>
+            </w:r>
+          </w:p>
+        </w:tc>
+        <w:tc>
+          <w:tcPr/>
+          <w:p>
+            <w:pPr>
+              <w:pStyle w:val="Compact"/>
+              <w:jc w:val="left"/>
+            </w:pPr>
+            <w:r>
+              <w:t xml:space="preserve">13,0</w:t>
+            </w:r>
+          </w:p>
+        </w:tc>
+        <w:tc>
+          <w:tcPr/>
+          <w:p>
+            <w:pPr>
+              <w:pStyle w:val="Compact"/>
+              <w:jc w:val="left"/>
+            </w:pPr>
+            <w:r>
+              <w:t xml:space="preserve">40,6</w:t>
             </w:r>
           </w:p>
         </w:tc>
@@ -10989,7 +11127,7 @@
           <w:iCs/>
           <w:i/>
         </w:rPr>
-        <w:t xml:space="preserve">Nguồn: tính từ dữ liệu vi mô WBES trên mẫu gộp mô tả 50 nền (biến h1/h5/h8/b8/c22b; mã 1=có, 2=không; mã âm = thiếu). ¹Nhóm II: đủ 6/6 nền GCC, đặc trưng dầu mỏ: R&amp;D thấp (7,0%), nữ quản lý cấp cao rất thấp (4,6%), website 50,2%. ²Nhóm VI: đủ 8/8 nền, đổi mới sản phẩm cao nhất mọi nhóm (34,2%) và website 41,5%: khuôn mẫu</w:t>
+        <w:t xml:space="preserve">Nguồn: tái lập từ dữ liệu vi mô WBES trên khung mô tả LP-valid 50 nền (canonical; biến h1/h5/h8/b8/c22b; mã 1=có, 2=không; mã âm = thiếu). ¹Nhóm II: đủ 6/6 nền GCC, đặc trưng dầu mỏ: R&amp;D thấp (7,0%), nữ quản lý cấp cao rất thấp (4,6%), website 50,2%. ²Nhóm VI: đủ 8/8 nền, đổi mới sản phẩm cao nhất mọi nhóm (34,2%) và website 41,5%: khuôn mẫu</w:t>
       </w:r>
       <w:r>
         <w:rPr>
@@ -11102,7 +11240,7 @@
         <w:t xml:space="preserve">Hệ quả phân tích đáng chú ý</w:t>
       </w:r>
       <w:r>
-        <w:t xml:space="preserve">: phần bù tương quan DAI ở Nhóm I là thấp nhất trong sáu nhóm (+0,090, Bảng 2.3.8.1), trong khi tỷ lệ có website ở nhóm này đã đạt 69,2%. Khi một chỉ báo nhị phân tiệm cận bão hòa, nó mất dần khả năng phân biệt năng suất: phương sai của biến co lại và phần doanh nghiệp</w:t>
+        <w:t xml:space="preserve">: phần bù tương quan DAI ở Nhóm I là thấp nhất trong sáu nhóm (+0,093, Bảng 2.3.8.1), trong khi tỷ lệ có website ở nhóm này đã đạt 69,2%. Khi một chỉ báo nhị phân tiệm cận bão hòa, nó mất dần khả năng phân biệt năng suất: phương sai của biến co lại và phần doanh nghiệp</w:t>
       </w:r>
       <w:r>
         <w:t xml:space="preserve"> </w:t>
@@ -18519,67 +18657,67 @@
               <w:jc w:val="right"/>
             </w:pPr>
             <w:r>
+              <w:t xml:space="preserve">+0,105**</w:t>
+            </w:r>
+          </w:p>
+        </w:tc>
+        <w:tc>
+          <w:tcPr/>
+          <w:p>
+            <w:pPr>
+              <w:pStyle w:val="Compact"/>
+              <w:jc w:val="right"/>
+            </w:pPr>
+            <w:r>
+              <w:t xml:space="preserve">+0,114**</w:t>
+            </w:r>
+          </w:p>
+        </w:tc>
+        <w:tc>
+          <w:tcPr/>
+          <w:p>
+            <w:pPr>
+              <w:pStyle w:val="Compact"/>
+              <w:jc w:val="right"/>
+            </w:pPr>
+            <w:r>
+              <w:t xml:space="preserve">+0,067**</w:t>
+            </w:r>
+          </w:p>
+        </w:tc>
+        <w:tc>
+          <w:tcPr/>
+          <w:p>
+            <w:pPr>
+              <w:pStyle w:val="Compact"/>
+              <w:jc w:val="right"/>
+            </w:pPr>
+            <w:r>
+              <w:t xml:space="preserve">+0,086**</w:t>
+            </w:r>
+          </w:p>
+        </w:tc>
+        <w:tc>
+          <w:tcPr/>
+          <w:p>
+            <w:pPr>
+              <w:pStyle w:val="Compact"/>
+              <w:jc w:val="right"/>
+            </w:pPr>
+            <w:r>
+              <w:t xml:space="preserve">+0,057**</w:t>
+            </w:r>
+          </w:p>
+        </w:tc>
+        <w:tc>
+          <w:tcPr/>
+          <w:p>
+            <w:pPr>
+              <w:pStyle w:val="Compact"/>
+              <w:jc w:val="right"/>
+            </w:pPr>
+            <w:r>
               <w:t xml:space="preserve">+0,104**</w:t>
-            </w:r>
-          </w:p>
-        </w:tc>
-        <w:tc>
-          <w:tcPr/>
-          <w:p>
-            <w:pPr>
-              <w:pStyle w:val="Compact"/>
-              <w:jc w:val="right"/>
-            </w:pPr>
-            <w:r>
-              <w:t xml:space="preserve">+0,114**</w:t>
-            </w:r>
-          </w:p>
-        </w:tc>
-        <w:tc>
-          <w:tcPr/>
-          <w:p>
-            <w:pPr>
-              <w:pStyle w:val="Compact"/>
-              <w:jc w:val="right"/>
-            </w:pPr>
-            <w:r>
-              <w:t xml:space="preserve">+0,124**</w:t>
-            </w:r>
-          </w:p>
-        </w:tc>
-        <w:tc>
-          <w:tcPr/>
-          <w:p>
-            <w:pPr>
-              <w:pStyle w:val="Compact"/>
-              <w:jc w:val="right"/>
-            </w:pPr>
-            <w:r>
-              <w:t xml:space="preserve">+0,072**</w:t>
-            </w:r>
-          </w:p>
-        </w:tc>
-        <w:tc>
-          <w:tcPr/>
-          <w:p>
-            <w:pPr>
-              <w:pStyle w:val="Compact"/>
-              <w:jc w:val="right"/>
-            </w:pPr>
-            <w:r>
-              <w:t xml:space="preserve">+0,057**</w:t>
-            </w:r>
-          </w:p>
-        </w:tc>
-        <w:tc>
-          <w:tcPr/>
-          <w:p>
-            <w:pPr>
-              <w:pStyle w:val="Compact"/>
-              <w:jc w:val="right"/>
-            </w:pPr>
-            <w:r>
-              <w:t xml:space="preserve">+0,122**</w:t>
             </w:r>
           </w:p>
         </w:tc>
@@ -18609,7 +18747,7 @@
                 <w:bCs/>
                 <w:b/>
               </w:rPr>
-              <w:t xml:space="preserve">+0,139**</w:t>
+              <w:t xml:space="preserve">+0,141**</w:t>
             </w:r>
           </w:p>
         </w:tc>
@@ -18621,7 +18759,7 @@
               <w:jc w:val="right"/>
             </w:pPr>
             <w:r>
-              <w:t xml:space="preserve">+0,131**</w:t>
+              <w:t xml:space="preserve">+0,122**</w:t>
             </w:r>
           </w:p>
         </w:tc>
@@ -18633,7 +18771,7 @@
               <w:jc w:val="right"/>
             </w:pPr>
             <w:r>
-              <w:t xml:space="preserve">+0,094**</w:t>
+              <w:t xml:space="preserve">+0,061**</w:t>
             </w:r>
           </w:p>
         </w:tc>
@@ -18645,7 +18783,7 @@
               <w:jc w:val="right"/>
             </w:pPr>
             <w:r>
-              <w:t xml:space="preserve">+0,047**</w:t>
+              <w:t xml:space="preserve">+0,049**</w:t>
             </w:r>
           </w:p>
         </w:tc>
@@ -18657,7 +18795,7 @@
               <w:jc w:val="right"/>
             </w:pPr>
             <w:r>
-              <w:t xml:space="preserve">+0,018*</w:t>
+              <w:t xml:space="preserve">+0,015*</w:t>
             </w:r>
           </w:p>
         </w:tc>
@@ -18673,7 +18811,7 @@
                 <w:bCs/>
                 <w:b/>
               </w:rPr>
-              <w:t xml:space="preserve">−0,009 ns</w:t>
+              <w:t xml:space="preserve">+0,002 ns</w:t>
             </w:r>
           </w:p>
         </w:tc>
@@ -18699,19 +18837,7 @@
               <w:jc w:val="right"/>
             </w:pPr>
             <w:r>
-              <w:t xml:space="preserve">+0,158**</w:t>
-            </w:r>
-          </w:p>
-        </w:tc>
-        <w:tc>
-          <w:tcPr/>
-          <w:p>
-            <w:pPr>
-              <w:pStyle w:val="Compact"/>
-              <w:jc w:val="right"/>
-            </w:pPr>
-            <w:r>
-              <w:t xml:space="preserve">+0,187**</w:t>
+              <w:t xml:space="preserve">+0,164**</w:t>
             </w:r>
           </w:p>
         </w:tc>
@@ -18727,7 +18853,7 @@
                 <w:bCs/>
                 <w:b/>
               </w:rPr>
-              <w:t xml:space="preserve">+0,240**</w:t>
+              <w:t xml:space="preserve">+0,180**</w:t>
             </w:r>
           </w:p>
         </w:tc>
@@ -18739,7 +18865,7 @@
               <w:jc w:val="right"/>
             </w:pPr>
             <w:r>
-              <w:t xml:space="preserve">+0,141**</w:t>
+              <w:t xml:space="preserve">+0,140**</w:t>
             </w:r>
           </w:p>
         </w:tc>
@@ -18751,7 +18877,7 @@
               <w:jc w:val="right"/>
             </w:pPr>
             <w:r>
-              <w:t xml:space="preserve">+0,125**</w:t>
+              <w:t xml:space="preserve">+0,152**</w:t>
             </w:r>
           </w:p>
         </w:tc>
@@ -18763,7 +18889,19 @@
               <w:jc w:val="right"/>
             </w:pPr>
             <w:r>
-              <w:t xml:space="preserve">+0,117**</w:t>
+              <w:t xml:space="preserve">+0,122**</w:t>
+            </w:r>
+          </w:p>
+        </w:tc>
+        <w:tc>
+          <w:tcPr/>
+          <w:p>
+            <w:pPr>
+              <w:pStyle w:val="Compact"/>
+              <w:jc w:val="right"/>
+            </w:pPr>
+            <w:r>
+              <w:t xml:space="preserve">+0,094**</w:t>
             </w:r>
           </w:p>
         </w:tc>
@@ -18789,7 +18927,7 @@
               <w:jc w:val="right"/>
             </w:pPr>
             <w:r>
-              <w:t xml:space="preserve">+0,090**</w:t>
+              <w:t xml:space="preserve">+0,093**</w:t>
             </w:r>
           </w:p>
         </w:tc>
@@ -18805,7 +18943,7 @@
                 <w:bCs/>
                 <w:b/>
               </w:rPr>
-              <w:t xml:space="preserve">+0,201**</w:t>
+              <w:t xml:space="preserve">+0,202**</w:t>
             </w:r>
           </w:p>
         </w:tc>
@@ -18817,7 +18955,7 @@
               <w:jc w:val="right"/>
             </w:pPr>
             <w:r>
-              <w:t xml:space="preserve">+0,124**</w:t>
+              <w:t xml:space="preserve">+0,091**</w:t>
             </w:r>
           </w:p>
         </w:tc>
@@ -18829,7 +18967,7 @@
               <w:jc w:val="right"/>
             </w:pPr>
             <w:r>
-              <w:t xml:space="preserve">+0,180**</w:t>
+              <w:t xml:space="preserve">+0,183**</w:t>
             </w:r>
           </w:p>
         </w:tc>
@@ -18841,7 +18979,7 @@
               <w:jc w:val="right"/>
             </w:pPr>
             <w:r>
-              <w:t xml:space="preserve">+0,111**</w:t>
+              <w:t xml:space="preserve">+0,113**</w:t>
             </w:r>
           </w:p>
         </w:tc>
@@ -18853,7 +18991,7 @@
               <w:jc w:val="right"/>
             </w:pPr>
             <w:r>
-              <w:t xml:space="preserve">+0,092**</w:t>
+              <w:t xml:space="preserve">+0,095**</w:t>
             </w:r>
           </w:p>
         </w:tc>
@@ -18868,7 +19006,7 @@
           <w:iCs/>
           <w:i/>
         </w:rPr>
-        <w:t xml:space="preserve">Ghi chú: ** p &lt; 0,01; * p &lt; 0,05; ns = không có ý nghĩa thống kê (kiểm định hai phía). LP-z = điểm z của ln(doanh thu/lao động) trong từng cặp nền kinh tế × năm; FDI ≥10% từ b2b; FSTS = d3b + d3c; TCI = trung bình hai thành phần R&amp;D (h8) và ISO (b8); DAI = website (c22b). n theo nhóm: 5.661 / 2.082 / 10.138 / 40.508 / 15.669 / 1.715 (quan sát có LP hợp lệ). Hệ số tương quan Pearson, không áp dụng HC1; HC1 dành cho SE hồi quy ở Chuyên đề 2.</w:t>
+        <w:t xml:space="preserve">Ghi chú: ** p &lt; 0,01; * p &lt; 0,05; ns = không có ý nghĩa thống kê (kiểm định hai phía). LP-z = điểm z của ln(doanh thu/lao động) trong từng cặp nền kinh tế × năm; FDI ≥10% từ b2b; FSTS = d3b + d3c; TCI = trung bình hai thành phần R&amp;D (h8) và ISO (b8); DAI = website (c22b). n theo nhóm: 5.688 / 2.082 / 15.174 / 42.798 / 17.340 / 1.916 (quan sát có LP hợp lệ, khung mô tả 50 nền tái lập). Hệ số tương quan Pearson, không áp dụng HC1; HC1 dành cho SE hồi quy ở Chuyên đề 2.</w:t>
       </w:r>
     </w:p>
     <w:p>
@@ -18892,7 +19030,7 @@
         <w:t xml:space="preserve"> </w:t>
       </w:r>
       <w:r>
-        <w:t xml:space="preserve">ở mọi nhóm (+0,117 đến +0,240), năng lực công nghệ nền tảng là dịch chuyển mức phổ quát; (2)</w:t>
+        <w:t xml:space="preserve">ở mọi nhóm (+0,094 đến +0,180), năng lực công nghệ nền tảng là dịch chuyển mức phổ quát; (2)</w:t>
       </w:r>
       <w:r>
         <w:t xml:space="preserve"> </w:t>
@@ -18905,17 +19043,17 @@
         <w:t xml:space="preserve">phổ thể chế cường độ FSTS theo chiều thể chế</w:t>
       </w:r>
       <w:r>
-        <w:t xml:space="preserve">: tương quan xuất khẩu–năng suất giảm đơn điệu từ +0,139 (Nhóm I) qua +0,047 (IV) và +0,018 (V) xuống</w:t>
-      </w:r>
-      <w:r>
-        <w:t xml:space="preserve"> </w:t>
-      </w:r>
-      <w:r>
-        <w:rPr>
-          <w:bCs/>
-          <w:b/>
-        </w:rPr>
-        <w:t xml:space="preserve">mất ý nghĩa ở SIDS (−0,009 ns)</w:t>
+        <w:t xml:space="preserve">: tương quan xuất khẩu–năng suất giảm đơn điệu từ +0,141 (Nhóm I) qua +0,049 (IV) và +0,015 (V) xuống</w:t>
+      </w:r>
+      <w:r>
+        <w:t xml:space="preserve"> </w:t>
+      </w:r>
+      <w:r>
+        <w:rPr>
+          <w:bCs/>
+          <w:b/>
+        </w:rPr>
+        <w:t xml:space="preserve">mất ý nghĩa ở SIDS (+0,002 ns)</w:t>
       </w:r>
       <w:r>
         <w:t xml:space="preserve">, tương quan thô của quốc tế hóa gần như biến mất ở thể chế yếu, gợi ý quan hệ phi tuyến và bị điều tiết thay vì tuyến tính phổ quát; (3)</w:t>
@@ -18928,10 +19066,13 @@
           <w:bCs/>
           <w:b/>
         </w:rPr>
-        <w:t xml:space="preserve">SIDS là ngoại lệ duy nhất về dấu của FSTS</w:t>
-      </w:r>
-      <w:r>
-        <w:t xml:space="preserve">, phù hợp với giả thuyết chi phí buộc phải quốc tế hóa: doanh nghiệp SIDS xuất khẩu vì bắt buộc, không phải vì chọn lọc theo năng suất; (4)</w:t>
+        <w:t xml:space="preserve">SIDS là nhóm duy nhất mà tương quan FSTS triệt tiêu hoàn toàn</w:t>
+      </w:r>
+      <w:r>
+        <w:t xml:space="preserve"> </w:t>
+      </w:r>
+      <w:r>
+        <w:t xml:space="preserve">(≈0, không ý nghĩa), phù hợp với giả thuyết chi phí buộc phải quốc tế hóa: doanh nghiệp SIDS xuất khẩu vì bắt buộc, không phải vì chọn lọc theo năng suất; (4)</w:t>
       </w:r>
       <w:r>
         <w:t xml:space="preserve"> </w:t>
@@ -18944,23 +19085,23 @@
         <w:t xml:space="preserve">FDI dương ở mọi nhóm</w:t>
       </w:r>
       <w:r>
-        <w:t xml:space="preserve">, mạnh hơn ở hai cực thể chế (Nhóm I +0,104 và SIDS +0,122), hai cơ chế khác nhau: MNE hub tại Advanced và FDI ngoại sinh tại SIDS; (5)</w:t>
-      </w:r>
-      <w:r>
-        <w:t xml:space="preserve"> </w:t>
-      </w:r>
-      <w:r>
-        <w:rPr>
-          <w:bCs/>
-          <w:b/>
-        </w:rPr>
-        <w:t xml:space="preserve">DAI dương ở mọi nhóm nhưng thấp nhất tại Nhóm I (+0,090)</w:t>
-      </w:r>
-      <w:r>
-        <w:t xml:space="preserve"> </w:t>
-      </w:r>
-      <w:r>
-        <w:t xml:space="preserve">trong khi cao nhất ở II và IV (+0,201; +0,180), phần bù của hiện diện số Tầng 1 co lại nơi nó đã tiệm cận bão hòa (Nghịch lý bão hòa số ở dạng suy giảm lợi suất biên); (6)</w:t>
+        <w:t xml:space="preserve">, mạnh hơn ở hai cực thể chế (Nhóm I +0,105 và SIDS +0,104), hai cơ chế khác nhau: MNE hub tại Advanced và FDI ngoại sinh tại SIDS; (5)</w:t>
+      </w:r>
+      <w:r>
+        <w:t xml:space="preserve"> </w:t>
+      </w:r>
+      <w:r>
+        <w:rPr>
+          <w:bCs/>
+          <w:b/>
+        </w:rPr>
+        <w:t xml:space="preserve">DAI dương ở mọi nhóm nhưng thấp nhất tại Nhóm I (+0,093)</w:t>
+      </w:r>
+      <w:r>
+        <w:t xml:space="preserve"> </w:t>
+      </w:r>
+      <w:r>
+        <w:t xml:space="preserve">trong khi cao nhất ở II và IV (+0,202; +0,183), phần bù của hiện diện số Tầng 1 co lại nơi nó đã tiệm cận bão hòa (Nghịch lý bão hòa số ở dạng suy giảm lợi suất biên); (6)</w:t>
       </w:r>
       <w:r>
         <w:t xml:space="preserve"> </w:t>
@@ -19471,7 +19612,7 @@
         <w:t xml:space="preserve"> </w:t>
       </w:r>
       <w:r>
-        <w:t xml:space="preserve">(năm 1–3): Sụt giảm ngắn hạn do chi phí thiết bị, đào tạo và gián đoạn quy trình. Bằng chứng gián tiếp: phần bù tương quan DAI thấp nhất tại Nhóm Advanced đổi mới (+0,090 so với +0,180–0,201 ở các nhóm chuyển đổi/tài nguyên), nơi Tầng 1 đã tiệm cận bão hòa, lợi suất biên co lại; giai đoạn</w:t>
+        <w:t xml:space="preserve">(năm 1–3): Sụt giảm ngắn hạn do chi phí thiết bị, đào tạo và gián đoạn quy trình. Bằng chứng gián tiếp: phần bù tương quan DAI thấp nhất tại Nhóm Advanced đổi mới (+0,093 so với +0,183–0,202 ở các nhóm chuyển đổi/tài nguyên), nơi Tầng 1 đã tiệm cận bão hòa, lợi suất biên co lại; giai đoạn</w:t>
       </w:r>
       <w:r>
         <w:t xml:space="preserve"> </w:t>
@@ -19721,7 +19862,7 @@
         <w:t xml:space="preserve"> </w:t>
       </w:r>
       <w:r>
-        <w:t xml:space="preserve">(đang phát triển). Phần bù tương quan DAI thấp nhất ở Nhóm I (+0,090) là dấu hiệu bão hòa Tầng 1, xem kiểm định loại trừ ICT tại Mục 2.3.4.3.</w:t>
+        <w:t xml:space="preserve">(đang phát triển). Phần bù tương quan DAI thấp nhất ở Nhóm I (+0,093) là dấu hiệu bão hòa Tầng 1, xem kiểm định loại trừ ICT tại Mục 2.3.4.3.</w:t>
       </w:r>
     </w:p>
     <w:p>
@@ -19851,7 +19992,7 @@
         <w:t xml:space="preserve">KT3, Xác nhận nhân quả Nghịch lý bão hòa số qua ước lượng biến công cụ</w:t>
       </w:r>
       <w:r>
-        <w:t xml:space="preserve">: Phần bù tương quan DAI suy giảm rõ ở Advanced (+0,090, thấp nhất sáu nhóm) có thể phản ánh: (a) bão hòa thực sự của Tầng 1; (b) nhân quả ngược; (c) bias biến bỏ sót. Biến công cụ hợp lệ (độ phủ băng thông rộng) cần thiết để phân biệt.</w:t>
+        <w:t xml:space="preserve">: Phần bù tương quan DAI suy giảm rõ ở Advanced (+0,093, thấp nhất sáu nhóm) có thể phản ánh: (a) bão hòa thực sự của Tầng 1; (b) nhân quả ngược; (c) bias biến bỏ sót. Biến công cụ hợp lệ (độ phủ băng thông rộng) cần thiết để phân biệt.</w:t>
       </w:r>
     </w:p>
     <w:p>
@@ -20237,7 +20378,7 @@
         <w:t xml:space="preserve">(1) Uppsala có điều kiện, không phổ quát</w:t>
       </w:r>
       <w:r>
-        <w:t xml:space="preserve">: Tương quan FSTS–năng suất dương mạnh tại Advanced (+0,139), suy yếu dần theo chiều thể chế và mất ý nghĩa tại SIDS (−0,009 ns), xác nhận điều kiện biên: lý thuyết Uppsala vận hành chỉ trong môi trường thể chế đủ mạnh (Williamson, 1985).</w:t>
+        <w:t xml:space="preserve">: Tương quan FSTS–năng suất dương mạnh tại Advanced (+0,141), suy yếu dần theo chiều thể chế và mất ý nghĩa tại SIDS (+0,002 ns), xác nhận điều kiện biên: lý thuyết Uppsala vận hành chỉ trong môi trường thể chế đủ mạnh (Williamson, 1985).</w:t>
       </w:r>
     </w:p>
     <w:p>
@@ -20333,7 +20474,7 @@
         <w:t xml:space="preserve">(5) Bối cảnh thể chế là tầng điều kiện, không phải yếu tố nền</w:t>
       </w:r>
       <w:r>
-        <w:t xml:space="preserve">: Biến thiên cường độ có hệ thống (và cá biệt là đổi dấu, FSTS tại SIDS) của các hệ số cross-regime không phải nhiễu mà là tín hiệu lý thuyết. Nghiên cứu kinh doanh quốc tế tương lai nên kiểm định hiệu ứng điều tiết theo nhóm ICRV trước khi báo cáo kích thước hiệu ứng trung bình.</w:t>
+        <w:t xml:space="preserve">: Biến thiên cường độ có hệ thống (và cá biệt là triệt tiêu hoàn toàn, FSTS tại SIDS) của các hệ số cross-regime không phải nhiễu mà là tín hiệu lý thuyết. Nghiên cứu kinh doanh quốc tế tương lai nên kiểm định hiệu ứng điều tiết theo nhóm ICRV trước khi báo cáo kích thước hiệu ứng trung bình.</w:t>
       </w:r>
     </w:p>
     <w:bookmarkEnd w:id="101"/>
@@ -20484,7 +20625,7 @@
         <w:t xml:space="preserve">KL2, TCI là dịch chuyển mức phổ quát, DAI là khuếch đại phụ thuộc bối cảnh</w:t>
       </w:r>
       <w:r>
-        <w:t xml:space="preserve">: TCI tương quan dương mạnh và đồng đều ở mọi nhóm; phần bù DAI biến thiên cường độ gấp đôi giữa các nhóm ICRV (+0,090 ở Advanced so với +0,201 ở Advanced tài nguyên), đây là nội hàm cốt lõi của CDCM.</w:t>
+        <w:t xml:space="preserve">: TCI tương quan dương mạnh và đồng đều ở mọi nhóm; phần bù DAI biến thiên cường độ gấp đôi giữa các nhóm ICRV (+0,093 ở Advanced so với +0,202 ở Advanced tài nguyên), đây là nội hàm cốt lõi của CDCM.</w:t>
       </w:r>
     </w:p>
     <w:p>
@@ -20559,7 +20700,7 @@
         <w:t xml:space="preserve">KL7, SIDS Pacific là trường hợp biên lý thuyết với chi phí buộc phải quốc tế hóa</w:t>
       </w:r>
       <w:r>
-        <w:t xml:space="preserve">: FDI (+0,122) là nguồn năng suất chủ đạo; tương quan FSTS–năng suất bằng không (−0,009, không có ý nghĩa thống kê), nhóm duy nhất nơi xuất khẩu không gắn với phần bù năng suất. Mô hình MIRAB phù hợp hơn mô hình Uppsala.</w:t>
+        <w:t xml:space="preserve">: FDI (+0,104) là nguồn năng suất chủ đạo; tương quan FSTS–năng suất bằng không (+0,002, không có ý nghĩa thống kê), nhóm duy nhất nơi xuất khẩu không gắn với phần bù năng suất. Mô hình MIRAB phù hợp hơn mô hình Uppsala.</w:t>
       </w:r>
     </w:p>
     <w:p>
@@ -22478,7 +22619,7 @@
           <w:iCs/>
           <w:i/>
         </w:rPr>
-        <w:t xml:space="preserve">Phân bổ 50 nền kinh tế theo nhóm ICRV, mẫu gộp mô tả 88.869 doanh nghiệp, 103 cặp nền kinh tế × năm, 2006–2026.</w:t>
+        <w:t xml:space="preserve">Phân bổ 50 nền kinh tế theo nhóm ICRV — khung mô tả LP-valid tái lập 84.998 doanh nghiệp, 107 cặp nền kinh tế × năm, 2006–2026 (cột n đã gồm China-2012 và đủ bốn đợt Azerbaijan).</w:t>
       </w:r>
     </w:p>
     <w:tbl>
@@ -22596,7 +22737,7 @@
               <w:jc w:val="right"/>
             </w:pPr>
             <w:r>
-              <w:t xml:space="preserve">6.390</w:t>
+              <w:t xml:space="preserve">5.688</w:t>
             </w:r>
           </w:p>
         </w:tc>
@@ -22650,7 +22791,7 @@
               <w:jc w:val="right"/>
             </w:pPr>
             <w:r>
-              <w:t xml:space="preserve">2.231</w:t>
+              <w:t xml:space="preserve">2.082</w:t>
             </w:r>
           </w:p>
         </w:tc>
@@ -22680,7 +22821,7 @@
               <w:jc w:val="left"/>
             </w:pPr>
             <w:r>
-              <w:t xml:space="preserve">Kazakhstan (2009, 2013, 2019, 2024), Malaysia (2015, 2019, 2024), Trung Quốc (2024), Thái Lan (2016, 2025), Armenia (2009, 2013, 2020, 2024), Georgia (2013, 2019, 2023)</w:t>
+              <w:t xml:space="preserve">Kazakhstan (2009, 2013, 2019, 2024), Malaysia (2015, 2019, 2024), Trung Quốc (2012, 2024), Thái Lan (2016, 2025), Armenia (2009, 2013, 2020, 2024), Georgia (2013, 2019, 2023)</w:t>
             </w:r>
           </w:p>
         </w:tc>
@@ -22692,7 +22833,7 @@
               <w:jc w:val="right"/>
             </w:pPr>
             <w:r>
-              <w:t xml:space="preserve">17</w:t>
+              <w:t xml:space="preserve">18</w:t>
             </w:r>
           </w:p>
         </w:tc>
@@ -22704,7 +22845,7 @@
               <w:jc w:val="right"/>
             </w:pPr>
             <w:r>
-              <w:t xml:space="preserve">13.993</w:t>
+              <w:t xml:space="preserve">15.174</w:t>
             </w:r>
           </w:p>
         </w:tc>
@@ -22758,7 +22899,7 @@
               <w:jc w:val="right"/>
             </w:pPr>
             <w:r>
-              <w:t xml:space="preserve">45.003</w:t>
+              <w:t xml:space="preserve">42.798</w:t>
             </w:r>
           </w:p>
         </w:tc>
@@ -22788,7 +22929,7 @@
               <w:jc w:val="left"/>
             </w:pPr>
             <w:r>
-              <w:t xml:space="preserve">Uzbekistan, Jordan, Lào, Iraq, Myanmar, Kyrgyzstan, Sri Lanka, Lebanon, Tajikistan, Campuchia, Afghanistan, Yemen, Bhutan, Nepal, Azerbaijan, Turkmenistan, Maldives (các đợt 2006–2025)</w:t>
+              <w:t xml:space="preserve">Uzbekistan, Jordan, Lào, Iraq, Myanmar, Kyrgyzstan, Sri Lanka, Lebanon, Tajikistan, Campuchia, Afghanistan, Yemen, Bhutan, Nepal, Azerbaijan (2009, 2013, 2019, 2024), Turkmenistan, Maldives (các đợt 2006–2025)</w:t>
             </w:r>
           </w:p>
         </w:tc>
@@ -22800,7 +22941,7 @@
               <w:jc w:val="right"/>
             </w:pPr>
             <w:r>
-              <w:t xml:space="preserve">40</w:t>
+              <w:t xml:space="preserve">43</w:t>
             </w:r>
           </w:p>
         </w:tc>
@@ -22812,7 +22953,7 @@
               <w:jc w:val="right"/>
             </w:pPr>
             <w:r>
-              <w:t xml:space="preserve">18.589</w:t>
+              <w:t xml:space="preserve">17.340</w:t>
             </w:r>
           </w:p>
         </w:tc>
@@ -22866,7 +23007,7 @@
               <w:jc w:val="right"/>
             </w:pPr>
             <w:r>
-              <w:t xml:space="preserve">1.781</w:t>
+              <w:t xml:space="preserve">1.916</w:t>
             </w:r>
           </w:p>
         </w:tc>
@@ -22900,7 +23041,7 @@
                 <w:bCs/>
                 <w:b/>
               </w:rPr>
-              <w:t xml:space="preserve">50 nền kinh tế</w:t>
+              <w:t xml:space="preserve">50 nền (LP-valid)</w:t>
             </w:r>
           </w:p>
         </w:tc>
@@ -22916,7 +23057,7 @@
                 <w:bCs/>
                 <w:b/>
               </w:rPr>
-              <w:t xml:space="preserve">103</w:t>
+              <w:t xml:space="preserve">107</w:t>
             </w:r>
           </w:p>
         </w:tc>
@@ -22932,7 +23073,7 @@
                 <w:bCs/>
                 <w:b/>
               </w:rPr>
-              <w:t xml:space="preserve">88.869</w:t>
+              <w:t xml:space="preserve">84.998</w:t>
             </w:r>
           </w:p>
         </w:tc>

</xml_diff>